<commit_message>
Zerodha moved back, 'which', 'leading' added, 'Compiler' removed, and updated indentation
</commit_message>
<xml_diff>
--- a/Resume_latest - Copy.docx
+++ b/Resume_latest - Copy.docx
@@ -799,6 +799,9 @@
         <w:pBdr>
           <w:bottom w:val="single" w:sz="6" w:space="1" w:color="auto"/>
         </w:pBdr>
+        <w:tabs>
+          <w:tab w:val="right" w:pos="10490"/>
+        </w:tabs>
         <w:spacing w:line="240" w:lineRule="auto"/>
         <w:ind w:right="0"/>
         <w:rPr>
@@ -882,7 +885,7 @@
           <w:sz w:val="22"/>
           <w:szCs w:val="22"/>
         </w:rPr>
-        <w:t>–</w:t>
+        <w:t>-</w:t>
       </w:r>
       <w:r>
         <w:rPr>
@@ -930,8 +933,11 @@
     </w:p>
     <w:p>
       <w:pPr>
+        <w:tabs>
+          <w:tab w:val="right" w:pos="10490"/>
+        </w:tabs>
         <w:spacing w:after="0" w:line="240" w:lineRule="auto"/>
-        <w:ind w:right="281"/>
+        <w:ind w:right="48"/>
         <w:rPr>
           <w:sz w:val="22"/>
           <w:szCs w:val="22"/>
@@ -977,48 +983,33 @@
       </w:hyperlink>
       <w:r>
         <w:rPr>
-          <w:rStyle w:val="Hyperlink"/>
-          <w:bCs/>
-          <w:sz w:val="22"/>
-          <w:szCs w:val="22"/>
-          <w:u w:val="none"/>
-        </w:rPr>
-        <w:t xml:space="preserve"> </w:t>
-      </w:r>
-      <w:r>
-        <w:rPr>
-          <w:sz w:val="22"/>
-          <w:szCs w:val="22"/>
-        </w:rPr>
-        <w:t xml:space="preserve">| </w:t>
-      </w:r>
-      <w:r>
-        <w:rPr>
           <w:i/>
           <w:iCs/>
           <w:sz w:val="22"/>
           <w:szCs w:val="22"/>
         </w:rPr>
+        <w:tab/>
+      </w:r>
+      <w:r>
+        <w:rPr>
+          <w:sz w:val="22"/>
+          <w:szCs w:val="22"/>
+        </w:rPr>
         <w:t xml:space="preserve">February 2024 </w:t>
       </w:r>
       <w:r>
         <w:rPr>
-          <w:i/>
-          <w:iCs/>
-          <w:sz w:val="22"/>
-          <w:szCs w:val="22"/>
-          <w:cs/>
-        </w:rPr>
-        <w:t>–</w:t>
-      </w:r>
-      <w:r>
-        <w:rPr>
-          <w:i/>
-          <w:iCs/>
-          <w:sz w:val="22"/>
-          <w:szCs w:val="22"/>
-        </w:rPr>
-        <w:t xml:space="preserve"> Present</w:t>
+          <w:sz w:val="22"/>
+          <w:szCs w:val="22"/>
+        </w:rPr>
+        <w:t>-</w:t>
+      </w:r>
+      <w:r>
+        <w:rPr>
+          <w:sz w:val="22"/>
+          <w:szCs w:val="22"/>
+        </w:rPr>
+        <w:t xml:space="preserve"> August 2024</w:t>
       </w:r>
     </w:p>
     <w:p>
@@ -1029,7 +1020,7 @@
           <w:numId w:val="39"/>
         </w:numPr>
         <w:spacing w:after="0" w:line="240" w:lineRule="auto"/>
-        <w:ind w:right="281"/>
+        <w:ind w:right="48"/>
         <w:rPr>
           <w:sz w:val="22"/>
           <w:szCs w:val="22"/>
@@ -1085,7 +1076,7 @@
           <w:numId w:val="32"/>
         </w:numPr>
         <w:spacing w:line="240" w:lineRule="auto"/>
-        <w:ind w:right="0"/>
+        <w:ind w:right="48"/>
         <w:jc w:val="both"/>
         <w:rPr>
           <w:sz w:val="22"/>
@@ -1115,7 +1106,7 @@
           <w:numId w:val="32"/>
         </w:numPr>
         <w:spacing w:line="240" w:lineRule="auto"/>
-        <w:ind w:right="0"/>
+        <w:ind w:right="48"/>
         <w:jc w:val="both"/>
         <w:rPr>
           <w:sz w:val="22"/>
@@ -1145,7 +1136,7 @@
           <w:numId w:val="32"/>
         </w:numPr>
         <w:spacing w:line="240" w:lineRule="auto"/>
-        <w:ind w:right="0"/>
+        <w:ind w:right="48"/>
         <w:jc w:val="both"/>
         <w:rPr>
           <w:sz w:val="22"/>
@@ -1189,7 +1180,7 @@
           <w:numId w:val="32"/>
         </w:numPr>
         <w:spacing w:line="240" w:lineRule="auto"/>
-        <w:ind w:right="0"/>
+        <w:ind w:right="48"/>
         <w:jc w:val="both"/>
         <w:rPr>
           <w:sz w:val="22"/>
@@ -1275,7 +1266,7 @@
           <w:numId w:val="39"/>
         </w:numPr>
         <w:spacing w:line="240" w:lineRule="auto"/>
-        <w:ind w:right="0"/>
+        <w:ind w:right="48"/>
         <w:jc w:val="both"/>
         <w:rPr>
           <w:sz w:val="22"/>
@@ -1342,7 +1333,7 @@
           <w:numId w:val="32"/>
         </w:numPr>
         <w:spacing w:line="240" w:lineRule="auto"/>
-        <w:ind w:right="0"/>
+        <w:ind w:right="48"/>
         <w:jc w:val="both"/>
         <w:rPr>
           <w:sz w:val="22"/>
@@ -1386,7 +1377,7 @@
           <w:numId w:val="32"/>
         </w:numPr>
         <w:spacing w:line="240" w:lineRule="auto"/>
-        <w:ind w:right="0"/>
+        <w:ind w:right="48"/>
         <w:jc w:val="both"/>
         <w:rPr>
           <w:sz w:val="22"/>
@@ -1416,7 +1407,7 @@
           <w:numId w:val="32"/>
         </w:numPr>
         <w:spacing w:line="240" w:lineRule="auto"/>
-        <w:ind w:right="0"/>
+        <w:ind w:right="48"/>
         <w:jc w:val="both"/>
         <w:rPr>
           <w:sz w:val="22"/>
@@ -1512,8 +1503,11 @@
     </w:p>
     <w:p>
       <w:pPr>
+        <w:tabs>
+          <w:tab w:val="right" w:pos="10490"/>
+        </w:tabs>
         <w:spacing w:line="240" w:lineRule="auto"/>
-        <w:ind w:right="0"/>
+        <w:ind w:left="0" w:right="0" w:firstLine="0"/>
         <w:jc w:val="both"/>
         <w:rPr>
           <w:sz w:val="22"/>
@@ -1575,46 +1569,17 @@
           <w:szCs w:val="22"/>
           <w:u w:val="none"/>
         </w:rPr>
-        <w:t xml:space="preserve"> </w:t>
-      </w:r>
-      <w:r>
-        <w:rPr>
-          <w:sz w:val="22"/>
-          <w:szCs w:val="22"/>
-        </w:rPr>
-        <w:t xml:space="preserve">| </w:t>
-      </w:r>
-      <w:r>
-        <w:rPr>
-          <w:i/>
-          <w:iCs/>
-          <w:sz w:val="22"/>
-          <w:szCs w:val="22"/>
-        </w:rPr>
-        <w:t>D</w:t>
-      </w:r>
-      <w:r>
-        <w:rPr>
-          <w:i/>
-          <w:iCs/>
-          <w:sz w:val="22"/>
-          <w:szCs w:val="22"/>
-        </w:rPr>
-        <w:t xml:space="preserve">ecember </w:t>
-      </w:r>
-      <w:r>
-        <w:rPr>
-          <w:i/>
-          <w:iCs/>
-          <w:sz w:val="22"/>
-          <w:szCs w:val="22"/>
-        </w:rPr>
-        <w:t>202</w:t>
-      </w:r>
-      <w:r>
-        <w:rPr>
-          <w:i/>
-          <w:iCs/>
+        <w:tab/>
+      </w:r>
+      <w:r>
+        <w:rPr>
+          <w:sz w:val="22"/>
+          <w:szCs w:val="22"/>
+        </w:rPr>
+        <w:t>December 202</w:t>
+      </w:r>
+      <w:r>
+        <w:rPr>
           <w:sz w:val="22"/>
           <w:szCs w:val="22"/>
         </w:rPr>
@@ -2138,7 +2103,7 @@
           <w:numId w:val="31"/>
         </w:numPr>
         <w:spacing w:line="240" w:lineRule="auto"/>
-        <w:ind w:right="281"/>
+        <w:ind w:right="48"/>
         <w:jc w:val="both"/>
         <w:rPr>
           <w:sz w:val="22"/>
@@ -2188,7 +2153,21 @@
           <w:sz w:val="22"/>
           <w:szCs w:val="22"/>
         </w:rPr>
-        <w:t>): Hindi4All, is</w:t>
+        <w:t xml:space="preserve">): Hindi4All, </w:t>
+      </w:r>
+      <w:r>
+        <w:rPr>
+          <w:sz w:val="22"/>
+          <w:szCs w:val="22"/>
+        </w:rPr>
+        <w:t xml:space="preserve">which </w:t>
+      </w:r>
+      <w:r>
+        <w:rPr>
+          <w:sz w:val="22"/>
+          <w:szCs w:val="22"/>
+        </w:rPr>
+        <w:t>is</w:t>
       </w:r>
       <w:r>
         <w:rPr>
@@ -2223,14 +2202,14 @@
           <w:sz w:val="22"/>
           <w:szCs w:val="22"/>
         </w:rPr>
-        <w:t xml:space="preserve">a </w:t>
-      </w:r>
-      <w:r>
-        <w:rPr>
-          <w:sz w:val="22"/>
-          <w:szCs w:val="22"/>
-        </w:rPr>
-        <w:t>compiler</w:t>
+        <w:t xml:space="preserve">an </w:t>
+      </w:r>
+      <w:r>
+        <w:rPr>
+          <w:sz w:val="22"/>
+          <w:szCs w:val="22"/>
+        </w:rPr>
+        <w:t>editor</w:t>
       </w:r>
       <w:r>
         <w:rPr>
@@ -2244,21 +2223,28 @@
           <w:sz w:val="22"/>
           <w:szCs w:val="22"/>
         </w:rPr>
-        <w:t xml:space="preserve"> and </w:t>
-      </w:r>
-      <w:r>
-        <w:rPr>
-          <w:sz w:val="22"/>
-          <w:szCs w:val="22"/>
-        </w:rPr>
-        <w:t xml:space="preserve">an </w:t>
-      </w:r>
-      <w:r>
-        <w:rPr>
-          <w:sz w:val="22"/>
-          <w:szCs w:val="22"/>
-        </w:rPr>
-        <w:t>editor.</w:t>
+        <w:t xml:space="preserve"> </w:t>
+      </w:r>
+      <w:r>
+        <w:rPr>
+          <w:sz w:val="22"/>
+          <w:szCs w:val="22"/>
+        </w:rPr>
+        <w:t>a</w:t>
+      </w:r>
+      <w:r>
+        <w:rPr>
+          <w:sz w:val="22"/>
+          <w:szCs w:val="22"/>
+        </w:rPr>
+        <w:t>nd CLI support</w:t>
+      </w:r>
+      <w:r>
+        <w:rPr>
+          <w:sz w:val="22"/>
+          <w:szCs w:val="22"/>
+        </w:rPr>
+        <w:t>.</w:t>
       </w:r>
     </w:p>
     <w:p>
@@ -2269,7 +2255,7 @@
           <w:numId w:val="31"/>
         </w:numPr>
         <w:spacing w:line="240" w:lineRule="auto"/>
-        <w:ind w:right="281"/>
+        <w:ind w:right="48"/>
         <w:jc w:val="both"/>
         <w:rPr>
           <w:sz w:val="22"/>
@@ -2327,7 +2313,28 @@
           <w:sz w:val="22"/>
           <w:szCs w:val="22"/>
         </w:rPr>
-        <w:t>that operated APIs provided by Indian stock brokers</w:t>
+        <w:t>that operated APIs provided by</w:t>
+      </w:r>
+      <w:r>
+        <w:rPr>
+          <w:sz w:val="22"/>
+          <w:szCs w:val="22"/>
+        </w:rPr>
+        <w:t xml:space="preserve"> leading</w:t>
+      </w:r>
+      <w:r>
+        <w:rPr>
+          <w:sz w:val="22"/>
+          <w:szCs w:val="22"/>
+        </w:rPr>
+        <w:t xml:space="preserve"> Indian stock brokers, namely </w:t>
+      </w:r>
+      <w:r>
+        <w:rPr>
+          <w:sz w:val="22"/>
+          <w:szCs w:val="22"/>
+        </w:rPr>
+        <w:t>Kota Securities, Fyers</w:t>
       </w:r>
       <w:r>
         <w:rPr>
@@ -2341,7 +2348,14 @@
           <w:sz w:val="22"/>
           <w:szCs w:val="22"/>
         </w:rPr>
-        <w:t xml:space="preserve"> namely </w:t>
+        <w:t xml:space="preserve"> </w:t>
+      </w:r>
+      <w:r>
+        <w:rPr>
+          <w:sz w:val="22"/>
+          <w:szCs w:val="22"/>
+        </w:rPr>
+        <w:t xml:space="preserve">and </w:t>
       </w:r>
       <w:proofErr w:type="spellStart"/>
       <w:r>
@@ -2357,44 +2371,42 @@
           <w:sz w:val="22"/>
           <w:szCs w:val="22"/>
         </w:rPr>
-        <w:t xml:space="preserve"> and </w:t>
-      </w:r>
-      <w:r>
-        <w:rPr>
-          <w:sz w:val="22"/>
-          <w:szCs w:val="22"/>
-        </w:rPr>
-        <w:t xml:space="preserve">Kota </w:t>
-      </w:r>
-      <w:proofErr w:type="spellStart"/>
-      <w:r>
-        <w:rPr>
-          <w:sz w:val="22"/>
-          <w:szCs w:val="22"/>
-        </w:rPr>
-        <w:t>Securities</w:t>
-      </w:r>
-      <w:r>
-        <w:rPr>
-          <w:sz w:val="22"/>
-          <w:szCs w:val="22"/>
-        </w:rPr>
-        <w:t>’s</w:t>
-      </w:r>
-      <w:proofErr w:type="spellEnd"/>
-      <w:r>
-        <w:rPr>
-          <w:sz w:val="22"/>
-          <w:szCs w:val="22"/>
-        </w:rPr>
-        <w:t xml:space="preserve"> server</w:t>
-      </w:r>
-      <w:r>
-        <w:rPr>
-          <w:sz w:val="22"/>
-          <w:szCs w:val="22"/>
-        </w:rPr>
-        <w:t>s</w:t>
+        <w:t>, and</w:t>
+      </w:r>
+      <w:r>
+        <w:rPr>
+          <w:sz w:val="22"/>
+          <w:szCs w:val="22"/>
+        </w:rPr>
+        <w:t xml:space="preserve"> </w:t>
+      </w:r>
+      <w:r>
+        <w:rPr>
+          <w:sz w:val="22"/>
+          <w:szCs w:val="22"/>
+        </w:rPr>
+        <w:t>t</w:t>
+      </w:r>
+      <w:r>
+        <w:rPr>
+          <w:sz w:val="22"/>
+          <w:szCs w:val="22"/>
+        </w:rPr>
+        <w:t>rade</w:t>
+      </w:r>
+      <w:r>
+        <w:rPr>
+          <w:sz w:val="22"/>
+          <w:szCs w:val="22"/>
+        </w:rPr>
+        <w:t>d</w:t>
+      </w:r>
+      <w:r>
+        <w:rPr>
+          <w:sz w:val="22"/>
+          <w:szCs w:val="22"/>
+        </w:rPr>
+        <w:t xml:space="preserve"> stocks worth 10</w:t>
       </w:r>
       <w:r>
         <w:rPr>
@@ -2408,48 +2420,6 @@
           <w:sz w:val="22"/>
           <w:szCs w:val="22"/>
         </w:rPr>
-        <w:t xml:space="preserve"> </w:t>
-      </w:r>
-      <w:r>
-        <w:rPr>
-          <w:sz w:val="22"/>
-          <w:szCs w:val="22"/>
-        </w:rPr>
-        <w:t>t</w:t>
-      </w:r>
-      <w:r>
-        <w:rPr>
-          <w:sz w:val="22"/>
-          <w:szCs w:val="22"/>
-        </w:rPr>
-        <w:t>rade</w:t>
-      </w:r>
-      <w:r>
-        <w:rPr>
-          <w:sz w:val="22"/>
-          <w:szCs w:val="22"/>
-        </w:rPr>
-        <w:t>d</w:t>
-      </w:r>
-      <w:r>
-        <w:rPr>
-          <w:sz w:val="22"/>
-          <w:szCs w:val="22"/>
-        </w:rPr>
-        <w:t xml:space="preserve"> stocks worth 10</w:t>
-      </w:r>
-      <w:r>
-        <w:rPr>
-          <w:sz w:val="22"/>
-          <w:szCs w:val="22"/>
-        </w:rPr>
-        <w:t>,</w:t>
-      </w:r>
-      <w:r>
-        <w:rPr>
-          <w:sz w:val="22"/>
-          <w:szCs w:val="22"/>
-        </w:rPr>
         <w:t>000 INR</w:t>
       </w:r>
       <w:r>
@@ -2458,13 +2428,6 @@
           <w:szCs w:val="22"/>
         </w:rPr>
         <w:t>.</w:t>
-      </w:r>
-      <w:r>
-        <w:rPr>
-          <w:sz w:val="22"/>
-          <w:szCs w:val="22"/>
-        </w:rPr>
-        <w:t xml:space="preserve"> </w:t>
       </w:r>
     </w:p>
     <w:p>
@@ -2475,7 +2438,7 @@
           <w:numId w:val="31"/>
         </w:numPr>
         <w:spacing w:line="240" w:lineRule="auto"/>
-        <w:ind w:right="281"/>
+        <w:ind w:right="48"/>
         <w:jc w:val="both"/>
         <w:rPr>
           <w:sz w:val="22"/>
@@ -2548,7 +2511,7 @@
           <w:numId w:val="31"/>
         </w:numPr>
         <w:spacing w:line="240" w:lineRule="auto"/>
-        <w:ind w:right="281"/>
+        <w:ind w:right="48"/>
         <w:jc w:val="both"/>
         <w:rPr>
           <w:sz w:val="22"/>
@@ -3818,42 +3781,42 @@
         <v:path o:extrusionok="f" gradientshapeok="t" o:connecttype="rect"/>
         <o:lock v:ext="edit" aspectratio="t"/>
       </v:shapetype>
-      <v:shape id="_x0000_i1176" type="#_x0000_t75" style="width:512.25pt;height:512.25pt;rotation:180;flip:x y;visibility:visible;mso-wrap-style:square" o:bullet="t">
+      <v:shape id="_x0000_i1513" type="#_x0000_t75" style="width:512pt;height:512pt;rotation:180;flip:x y;visibility:visible;mso-wrap-style:square" o:bullet="t">
         <v:imagedata r:id="rId1" o:title="107161_circle_github_icon"/>
       </v:shape>
     </w:pict>
   </w:numPicBullet>
   <w:numPicBullet w:numPicBulletId="1">
     <w:pict>
-      <v:shape id="_x0000_i1177" type="#_x0000_t75" style="width:169.5pt;height:169.5pt;visibility:visible;mso-wrap-style:square" o:bullet="t">
+      <v:shape id="_x0000_i1514" type="#_x0000_t75" style="width:169pt;height:169pt;visibility:visible;mso-wrap-style:square" o:bullet="t">
         <v:imagedata r:id="rId2" o:title="941C13C7"/>
       </v:shape>
     </w:pict>
   </w:numPicBullet>
   <w:numPicBullet w:numPicBulletId="2">
     <w:pict>
-      <v:shape id="_x0000_i1178" type="#_x0000_t75" style="width:28.5pt;height:16.5pt;visibility:visible;mso-wrap-style:square" o:bullet="t">
+      <v:shape id="_x0000_i1515" type="#_x0000_t75" style="width:29pt;height:16pt;visibility:visible;mso-wrap-style:square" o:bullet="t">
         <v:imagedata r:id="rId3" o:title="107161_circle_github_icon"/>
       </v:shape>
     </w:pict>
   </w:numPicBullet>
   <w:numPicBullet w:numPicBulletId="3">
     <w:pict>
-      <v:shape id="_x0000_i1179" type="#_x0000_t75" style="width:240pt;height:234pt;visibility:visible;mso-wrap-style:square" o:bullet="t">
+      <v:shape id="_x0000_i1516" type="#_x0000_t75" style="width:240pt;height:234pt;visibility:visible;mso-wrap-style:square" o:bullet="t">
         <v:imagedata r:id="rId4" o:title="Indian_Institute_of_Technology_Bombay_Logo"/>
       </v:shape>
     </w:pict>
   </w:numPicBullet>
   <w:numPicBullet w:numPicBulletId="4">
     <w:pict>
-      <v:shape id="_x0000_i1180" type="#_x0000_t75" style="width:22.5pt;height:16.5pt;visibility:visible;mso-wrap-style:square" o:bullet="t">
+      <v:shape id="_x0000_i1517" type="#_x0000_t75" style="width:22pt;height:16pt;visibility:visible;mso-wrap-style:square" o:bullet="t">
         <v:imagedata r:id="rId5" o:title="Indian_Institute_of_Technology_Bombay_Logo"/>
       </v:shape>
     </w:pict>
   </w:numPicBullet>
   <w:numPicBullet w:numPicBulletId="5">
     <w:pict>
-      <v:shape id="_x0000_i1181" type="#_x0000_t75" style="width:76.5pt;height:76.5pt;visibility:visible;mso-wrap-style:square" o:bullet="t">
+      <v:shape id="_x0000_i1518" type="#_x0000_t75" style="width:77pt;height:77pt;visibility:visible;mso-wrap-style:square" o:bullet="t">
         <v:imagedata r:id="rId6" o:title=""/>
       </v:shape>
     </w:pict>
@@ -8861,6 +8824,29 @@
       <w:sz w:val="24"/>
     </w:rPr>
   </w:style>
+  <w:style w:type="paragraph" w:styleId="Heading3">
+    <w:name w:val="heading 3"/>
+    <w:basedOn w:val="Normal"/>
+    <w:next w:val="Normal"/>
+    <w:link w:val="Heading3Char"/>
+    <w:uiPriority w:val="9"/>
+    <w:semiHidden/>
+    <w:unhideWhenUsed/>
+    <w:qFormat/>
+    <w:rsid w:val="00173AF0"/>
+    <w:pPr>
+      <w:keepNext/>
+      <w:keepLines/>
+      <w:spacing w:before="40" w:after="0"/>
+      <w:outlineLvl w:val="2"/>
+    </w:pPr>
+    <w:rPr>
+      <w:rFonts w:asciiTheme="majorHAnsi" w:eastAsiaTheme="majorEastAsia" w:hAnsiTheme="majorHAnsi" w:cstheme="majorBidi"/>
+      <w:color w:val="1F3763" w:themeColor="accent1" w:themeShade="7F"/>
+      <w:sz w:val="24"/>
+      <w:szCs w:val="21"/>
+    </w:rPr>
+  </w:style>
   <w:style w:type="character" w:default="1" w:styleId="DefaultParagraphFont">
     <w:name w:val="Default Paragraph Font"/>
     <w:uiPriority w:val="1"/>
@@ -9071,6 +9057,20 @@
       <w:color w:val="000000"/>
       <w:sz w:val="18"/>
       <w:szCs w:val="16"/>
+    </w:rPr>
+  </w:style>
+  <w:style w:type="character" w:customStyle="1" w:styleId="Heading3Char">
+    <w:name w:val="Heading 3 Char"/>
+    <w:basedOn w:val="DefaultParagraphFont"/>
+    <w:link w:val="Heading3"/>
+    <w:uiPriority w:val="9"/>
+    <w:semiHidden/>
+    <w:rsid w:val="00173AF0"/>
+    <w:rPr>
+      <w:rFonts w:asciiTheme="majorHAnsi" w:eastAsiaTheme="majorEastAsia" w:hAnsiTheme="majorHAnsi" w:cstheme="majorBidi"/>
+      <w:color w:val="1F3763" w:themeColor="accent1" w:themeShade="7F"/>
+      <w:sz w:val="24"/>
+      <w:szCs w:val="21"/>
     </w:rPr>
   </w:style>
 </w:styles>

</xml_diff>

<commit_message>
New summary readded, reduced TEXT SIZES, also removed a line
Text size of all the elements was reduced, a "new" summary was readded an a line was reduced.
The commit lines are more in number as reducing tyext size rearranged the words.
Also now the horizontal line of skills and certifications section match all other horizontal lines.
</commit_message>
<xml_diff>
--- a/Resume_latest - Copy.docx
+++ b/Resume_latest - Copy.docx
@@ -9,44 +9,54 @@
         <w:ind w:left="0" w:firstLine="0"/>
         <w:jc w:val="both"/>
         <w:rPr>
-          <w:sz w:val="22"/>
-          <w:szCs w:val="22"/>
-        </w:rPr>
-      </w:pPr>
-      <w:r>
-        <w:rPr>
-          <w:sz w:val="32"/>
-          <w:szCs w:val="32"/>
+          <w:sz w:val="20"/>
+        </w:rPr>
+      </w:pPr>
+      <w:r>
+        <w:rPr>
+          <w:szCs w:val="28"/>
         </w:rPr>
         <w:t>P</w:t>
       </w:r>
       <w:r>
         <w:rPr>
-          <w:sz w:val="32"/>
-          <w:szCs w:val="32"/>
+          <w:szCs w:val="28"/>
         </w:rPr>
         <w:t xml:space="preserve">rathamesh </w:t>
       </w:r>
       <w:r>
         <w:rPr>
-          <w:sz w:val="32"/>
-          <w:szCs w:val="32"/>
+          <w:szCs w:val="28"/>
         </w:rPr>
         <w:t xml:space="preserve">Vivek </w:t>
       </w:r>
       <w:r>
         <w:rPr>
-          <w:sz w:val="32"/>
-          <w:szCs w:val="32"/>
+          <w:szCs w:val="28"/>
         </w:rPr>
         <w:t>Bhaga</w:t>
       </w:r>
       <w:r>
         <w:rPr>
-          <w:sz w:val="32"/>
-          <w:szCs w:val="32"/>
+          <w:szCs w:val="28"/>
         </w:rPr>
         <w:t>t</w:t>
+      </w:r>
+      <w:r>
+        <w:rPr>
+          <w:b w:val="0"/>
+          <w:bCs/>
+          <w:szCs w:val="28"/>
+        </w:rPr>
+        <w:t xml:space="preserve"> </w:t>
+      </w:r>
+      <w:r>
+        <w:rPr>
+          <w:b w:val="0"/>
+          <w:bCs/>
+          <w:szCs w:val="28"/>
+        </w:rPr>
+        <w:t>|</w:t>
       </w:r>
       <w:r>
         <w:rPr>
@@ -59,26 +69,7 @@
       </w:r>
       <w:r>
         <w:rPr>
-          <w:b w:val="0"/>
-          <w:bCs/>
-          <w:sz w:val="32"/>
-          <w:szCs w:val="32"/>
-        </w:rPr>
-        <w:t>|</w:t>
-      </w:r>
-      <w:r>
-        <w:rPr>
-          <w:b w:val="0"/>
-          <w:bCs/>
-          <w:sz w:val="36"/>
-          <w:szCs w:val="36"/>
-        </w:rPr>
-        <w:t xml:space="preserve"> </w:t>
-      </w:r>
-      <w:r>
-        <w:rPr>
-          <w:sz w:val="22"/>
-          <w:szCs w:val="22"/>
+          <w:sz w:val="20"/>
         </w:rPr>
         <w:t>Nagpur, Maharashtra, India [440027]</w:t>
       </w:r>
@@ -91,8 +82,7 @@
         <w:jc w:val="both"/>
         <w:rPr>
           <w:b w:val="0"/>
-          <w:sz w:val="22"/>
-          <w:szCs w:val="22"/>
+          <w:sz w:val="20"/>
         </w:rPr>
       </w:pPr>
       <w:hyperlink r:id="rId8" w:history="1">
@@ -102,8 +92,7 @@
             <w:b w:val="0"/>
             <w:bCs/>
             <w:noProof/>
-            <w:sz w:val="22"/>
-            <w:szCs w:val="22"/>
+            <w:sz w:val="20"/>
             <w:u w:val="none"/>
           </w:rPr>
           <w:drawing>
@@ -161,8 +150,7 @@
             <w:b w:val="0"/>
             <w:bCs/>
             <w:noProof/>
-            <w:sz w:val="22"/>
-            <w:szCs w:val="22"/>
+            <w:sz w:val="20"/>
             <w:u w:val="none"/>
           </w:rPr>
           <w:t xml:space="preserve"> </w:t>
@@ -172,8 +160,7 @@
             <w:rStyle w:val="Hyperlink"/>
             <w:b w:val="0"/>
             <w:bCs/>
-            <w:sz w:val="22"/>
-            <w:szCs w:val="22"/>
+            <w:sz w:val="20"/>
             <w:u w:val="none"/>
           </w:rPr>
           <w:t>prathameshbhagat0608@gmail.com</w:t>
@@ -184,8 +171,7 @@
           <w:rStyle w:val="Hyperlink"/>
           <w:b w:val="0"/>
           <w:bCs/>
-          <w:sz w:val="22"/>
-          <w:szCs w:val="22"/>
+          <w:sz w:val="20"/>
           <w:u w:val="none"/>
         </w:rPr>
         <w:t xml:space="preserve"> </w:t>
@@ -195,8 +181,7 @@
           <w:rStyle w:val="Hyperlink"/>
           <w:b w:val="0"/>
           <w:bCs/>
-          <w:sz w:val="22"/>
-          <w:szCs w:val="22"/>
+          <w:sz w:val="20"/>
           <w:u w:val="none"/>
         </w:rPr>
         <w:t>|</w:t>
@@ -206,8 +191,7 @@
           <w:rStyle w:val="Hyperlink"/>
           <w:b w:val="0"/>
           <w:bCs/>
-          <w:sz w:val="22"/>
-          <w:szCs w:val="22"/>
+          <w:sz w:val="20"/>
           <w:u w:val="none"/>
         </w:rPr>
         <w:t xml:space="preserve"> </w:t>
@@ -219,8 +203,7 @@
             <w:b w:val="0"/>
             <w:bCs/>
             <w:noProof/>
-            <w:sz w:val="22"/>
-            <w:szCs w:val="22"/>
+            <w:sz w:val="20"/>
             <w:u w:val="none"/>
           </w:rPr>
           <w:drawing>
@@ -276,6 +259,8 @@
           <w:rPr>
             <w:b w:val="0"/>
             <w:bCs/>
+            <w:sz w:val="24"/>
+            <w:szCs w:val="18"/>
           </w:rPr>
           <w:t xml:space="preserve"> </w:t>
         </w:r>
@@ -284,8 +269,7 @@
             <w:rStyle w:val="Hyperlink"/>
             <w:b w:val="0"/>
             <w:bCs/>
-            <w:sz w:val="22"/>
-            <w:szCs w:val="22"/>
+            <w:sz w:val="20"/>
             <w:u w:val="none"/>
             <w:shd w:val="clear" w:color="auto" w:fill="FFFFFF"/>
           </w:rPr>
@@ -296,8 +280,7 @@
             <w:rStyle w:val="Hyperlink"/>
             <w:b w:val="0"/>
             <w:bCs/>
-            <w:sz w:val="22"/>
-            <w:szCs w:val="22"/>
+            <w:sz w:val="20"/>
             <w:u w:val="none"/>
             <w:shd w:val="clear" w:color="auto" w:fill="FFFFFF"/>
           </w:rPr>
@@ -309,8 +292,7 @@
             <w:rStyle w:val="Hyperlink"/>
             <w:b w:val="0"/>
             <w:bCs/>
-            <w:sz w:val="22"/>
-            <w:szCs w:val="22"/>
+            <w:sz w:val="20"/>
             <w:u w:val="none"/>
             <w:shd w:val="clear" w:color="auto" w:fill="FFFFFF"/>
           </w:rPr>
@@ -323,30 +305,16 @@
           <w:rStyle w:val="Hyperlink"/>
           <w:b w:val="0"/>
           <w:bCs/>
-          <w:sz w:val="22"/>
-          <w:szCs w:val="22"/>
+          <w:sz w:val="20"/>
           <w:u w:val="none"/>
           <w:shd w:val="clear" w:color="auto" w:fill="FFFFFF"/>
         </w:rPr>
-        <w:t xml:space="preserve"> |</w:t>
-      </w:r>
-      <w:r>
-        <w:rPr>
-          <w:rStyle w:val="Hyperlink"/>
-          <w:b w:val="0"/>
-          <w:bCs/>
-          <w:sz w:val="22"/>
-          <w:szCs w:val="22"/>
-          <w:u w:val="none"/>
-          <w:shd w:val="clear" w:color="auto" w:fill="FFFFFF"/>
-        </w:rPr>
-        <w:t xml:space="preserve"> </w:t>
+        <w:t xml:space="preserve"> | </w:t>
       </w:r>
       <w:r>
         <w:rPr>
           <w:noProof/>
-          <w:sz w:val="22"/>
-          <w:szCs w:val="22"/>
+          <w:sz w:val="20"/>
         </w:rPr>
         <w:drawing>
           <wp:inline distT="0" distB="0" distL="0" distR="0" wp14:anchorId="1A5DAAEE" wp14:editId="212F7776">
@@ -402,8 +370,7 @@
           <w:rStyle w:val="Hyperlink"/>
           <w:b w:val="0"/>
           <w:bCs/>
-          <w:sz w:val="22"/>
-          <w:szCs w:val="22"/>
+          <w:sz w:val="20"/>
           <w:u w:val="none"/>
           <w:shd w:val="clear" w:color="auto" w:fill="FFFFFF"/>
         </w:rPr>
@@ -415,8 +382,7 @@
             <w:rStyle w:val="Hyperlink"/>
             <w:b w:val="0"/>
             <w:bCs/>
-            <w:sz w:val="22"/>
-            <w:szCs w:val="22"/>
+            <w:sz w:val="20"/>
             <w:u w:val="none"/>
           </w:rPr>
           <w:t>(+91 7058031648)</w:t>
@@ -426,8 +392,7 @@
         <w:rPr>
           <w:b w:val="0"/>
           <w:bCs/>
-          <w:sz w:val="22"/>
-          <w:szCs w:val="22"/>
+          <w:sz w:val="20"/>
         </w:rPr>
         <w:t xml:space="preserve"> </w:t>
       </w:r>
@@ -442,8 +407,6 @@
         <w:jc w:val="both"/>
         <w:rPr>
           <w:bCs/>
-          <w:sz w:val="22"/>
-          <w:szCs w:val="22"/>
         </w:rPr>
       </w:pPr>
       <w:hyperlink r:id="rId14" w:history="1">
@@ -451,8 +414,6 @@
           <w:rPr>
             <w:rStyle w:val="Hyperlink"/>
             <w:noProof/>
-            <w:sz w:val="22"/>
-            <w:szCs w:val="22"/>
             <w:u w:val="none"/>
           </w:rPr>
           <w:drawing>
@@ -507,8 +468,6 @@
         <w:r>
           <w:rPr>
             <w:rStyle w:val="Hyperlink"/>
-            <w:sz w:val="22"/>
-            <w:szCs w:val="22"/>
             <w:u w:val="none"/>
             <w:shd w:val="clear" w:color="auto" w:fill="FFFFFF"/>
           </w:rPr>
@@ -517,8 +476,6 @@
         <w:r>
           <w:rPr>
             <w:rStyle w:val="Hyperlink"/>
-            <w:sz w:val="22"/>
-            <w:szCs w:val="22"/>
             <w:u w:val="none"/>
           </w:rPr>
           <w:t>github.com/</w:t>
@@ -527,8 +484,6 @@
         <w:r>
           <w:rPr>
             <w:rStyle w:val="Hyperlink"/>
-            <w:sz w:val="22"/>
-            <w:szCs w:val="22"/>
             <w:u w:val="none"/>
           </w:rPr>
           <w:t>PrathameshBhagat</w:t>
@@ -537,8 +492,6 @@
         <w:r>
           <w:rPr>
             <w:rStyle w:val="Hyperlink"/>
-            <w:sz w:val="22"/>
-            <w:szCs w:val="22"/>
             <w:u w:val="none"/>
           </w:rPr>
           <w:t xml:space="preserve"> </w:t>
@@ -547,8 +500,6 @@
       <w:r>
         <w:rPr>
           <w:rStyle w:val="Hyperlink"/>
-          <w:sz w:val="22"/>
-          <w:szCs w:val="22"/>
           <w:u w:val="none"/>
         </w:rPr>
         <w:t>|</w:t>
@@ -558,8 +509,6 @@
           <w:rPr>
             <w:rStyle w:val="Hyperlink"/>
             <w:bCs/>
-            <w:sz w:val="22"/>
-            <w:szCs w:val="22"/>
             <w:u w:val="none"/>
           </w:rPr>
           <w:t xml:space="preserve"> </w:t>
@@ -569,8 +518,6 @@
             <w:rStyle w:val="Hyperlink"/>
             <w:bCs/>
             <w:noProof/>
-            <w:sz w:val="22"/>
-            <w:szCs w:val="22"/>
             <w:u w:val="none"/>
           </w:rPr>
           <w:drawing>
@@ -626,29 +573,15 @@
           <w:rPr>
             <w:rStyle w:val="Hyperlink"/>
             <w:bCs/>
-            <w:sz w:val="22"/>
-            <w:szCs w:val="22"/>
             <w:u w:val="none"/>
           </w:rPr>
-          <w:t xml:space="preserve"> </w:t>
-        </w:r>
-        <w:r>
-          <w:rPr>
-            <w:rStyle w:val="Hyperlink"/>
-            <w:bCs/>
-            <w:sz w:val="22"/>
-            <w:szCs w:val="22"/>
-            <w:u w:val="none"/>
-          </w:rPr>
-          <w:t>prathameshbhagat.github.io</w:t>
+          <w:t xml:space="preserve"> prathameshbhagat.github.io</w:t>
         </w:r>
       </w:hyperlink>
       <w:r>
         <w:rPr>
           <w:rStyle w:val="Hyperlink"/>
           <w:bCs/>
-          <w:sz w:val="22"/>
-          <w:szCs w:val="22"/>
           <w:u w:val="none"/>
         </w:rPr>
         <w:t xml:space="preserve"> </w:t>
@@ -657,8 +590,6 @@
         <w:rPr>
           <w:rStyle w:val="Hyperlink"/>
           <w:bCs/>
-          <w:sz w:val="22"/>
-          <w:szCs w:val="22"/>
           <w:u w:val="none"/>
         </w:rPr>
         <w:t xml:space="preserve">| </w:t>
@@ -666,6 +597,8 @@
       <w:r>
         <w:rPr>
           <w:noProof/>
+          <w:sz w:val="18"/>
+          <w:szCs w:val="18"/>
         </w:rPr>
         <w:drawing>
           <wp:inline distT="0" distB="0" distL="0" distR="0" wp14:anchorId="1D517CFA" wp14:editId="0B21AEEE">
@@ -720,8 +653,6 @@
         <w:r>
           <w:rPr>
             <w:rStyle w:val="Hyperlink"/>
-            <w:sz w:val="22"/>
-            <w:szCs w:val="22"/>
             <w:u w:val="none"/>
           </w:rPr>
           <w:t xml:space="preserve"> </w:t>
@@ -730,8 +661,6 @@
           <w:rPr>
             <w:rStyle w:val="Hyperlink"/>
             <w:noProof/>
-            <w:sz w:val="22"/>
-            <w:szCs w:val="22"/>
             <w:u w:val="none"/>
           </w:rPr>
           <w:t>leetcode.com/Prathamesh_Bhagat</w:t>
@@ -741,19 +670,163 @@
         <w:rPr>
           <w:rStyle w:val="Hyperlink"/>
           <w:noProof/>
-          <w:sz w:val="22"/>
-          <w:szCs w:val="22"/>
           <w:u w:val="none"/>
         </w:rPr>
         <w:t xml:space="preserve"> </w:t>
       </w:r>
       <w:r>
         <w:rPr>
+          <w:bCs/>
+        </w:rPr>
+        <w:t xml:space="preserve"> </w:t>
+      </w:r>
+    </w:p>
+    <w:p>
+      <w:pPr>
+        <w:pBdr>
+          <w:bottom w:val="single" w:sz="6" w:space="1" w:color="auto"/>
+        </w:pBdr>
+        <w:spacing w:line="240" w:lineRule="auto"/>
+        <w:ind w:left="0" w:right="0" w:firstLine="0"/>
+        <w:jc w:val="both"/>
+        <w:rPr>
+          <w:b/>
+          <w:bCs/>
+        </w:rPr>
+      </w:pPr>
+    </w:p>
+    <w:p>
+      <w:pPr>
+        <w:spacing w:line="240" w:lineRule="auto"/>
+        <w:ind w:right="0"/>
+        <w:jc w:val="center"/>
+        <w:rPr>
+          <w:b/>
           <w:bCs/>
           <w:sz w:val="22"/>
           <w:szCs w:val="22"/>
         </w:rPr>
+      </w:pPr>
+      <w:r>
+        <w:rPr>
+          <w:b/>
+          <w:bCs/>
+          <w:sz w:val="22"/>
+          <w:szCs w:val="22"/>
+        </w:rPr>
+        <w:t>Summary</w:t>
+      </w:r>
+    </w:p>
+    <w:p>
+      <w:pPr>
+        <w:spacing w:line="240" w:lineRule="auto"/>
+        <w:ind w:right="0"/>
+        <w:jc w:val="both"/>
+      </w:pPr>
+      <w:r>
+        <w:t xml:space="preserve">A versatile programmer, </w:t>
+      </w:r>
+      <w:r>
+        <w:t xml:space="preserve">with </w:t>
+      </w:r>
+      <w:r>
+        <w:t>6</w:t>
+      </w:r>
+      <w:r>
+        <w:t xml:space="preserve"> months of experience, h</w:t>
+      </w:r>
+      <w:r>
+        <w:t xml:space="preserve">aving </w:t>
+      </w:r>
+      <w:r>
+        <w:t xml:space="preserve">tackled over </w:t>
+      </w:r>
+      <w:r>
+        <w:t>2</w:t>
+      </w:r>
+      <w:r>
+        <w:t>5</w:t>
+      </w:r>
+      <w:r>
+        <w:t>0+ Leet</w:t>
+      </w:r>
+      <w:r>
         <w:t xml:space="preserve"> </w:t>
+      </w:r>
+      <w:r>
+        <w:t>code problems</w:t>
+      </w:r>
+      <w:r>
+        <w:t>,</w:t>
+      </w:r>
+      <w:r>
+        <w:t xml:space="preserve"> </w:t>
+      </w:r>
+      <w:r>
+        <w:t xml:space="preserve">and </w:t>
+      </w:r>
+      <w:r>
+        <w:t xml:space="preserve">expertise in Android and </w:t>
+      </w:r>
+      <w:r>
+        <w:t>W</w:t>
+      </w:r>
+      <w:r>
+        <w:t>eb development</w:t>
+      </w:r>
+      <w:r>
+        <w:t xml:space="preserve">. With </w:t>
+      </w:r>
+      <w:r>
+        <w:t>strong problem</w:t>
+      </w:r>
+      <w:r>
+        <w:t>-</w:t>
+      </w:r>
+      <w:r>
+        <w:t xml:space="preserve">solving </w:t>
+      </w:r>
+      <w:r>
+        <w:t xml:space="preserve">capabilities, technical proficiency, and </w:t>
+      </w:r>
+      <w:r>
+        <w:t>a</w:t>
+      </w:r>
+      <w:r>
+        <w:t xml:space="preserve"> proven</w:t>
+      </w:r>
+      <w:r>
+        <w:t xml:space="preserve"> track record of</w:t>
+      </w:r>
+      <w:r>
+        <w:t xml:space="preserve"> deliver</w:t>
+      </w:r>
+      <w:r>
+        <w:t>ing</w:t>
+      </w:r>
+      <w:r>
+        <w:t xml:space="preserve"> innovative</w:t>
+      </w:r>
+      <w:r>
+        <w:t xml:space="preserve"> </w:t>
+      </w:r>
+      <w:r>
+        <w:t>projects</w:t>
+      </w:r>
+      <w:r>
+        <w:t>, ready to take on</w:t>
+      </w:r>
+      <w:r>
+        <w:t xml:space="preserve"> the </w:t>
+      </w:r>
+      <w:r>
+        <w:t xml:space="preserve">most ambitious and impactful </w:t>
+      </w:r>
+      <w:r>
+        <w:t>problems</w:t>
+      </w:r>
+      <w:r>
+        <w:t>.</w:t>
       </w:r>
     </w:p>
     <w:p>
@@ -767,8 +840,6 @@
         <w:rPr>
           <w:b/>
           <w:bCs/>
-          <w:sz w:val="22"/>
-          <w:szCs w:val="22"/>
         </w:rPr>
       </w:pPr>
     </w:p>
@@ -780,16 +851,16 @@
         <w:rPr>
           <w:b/>
           <w:bCs/>
-          <w:sz w:val="24"/>
-          <w:szCs w:val="24"/>
+          <w:sz w:val="22"/>
+          <w:szCs w:val="22"/>
         </w:rPr>
       </w:pPr>
       <w:r>
         <w:rPr>
           <w:b/>
           <w:bCs/>
-          <w:sz w:val="24"/>
-          <w:szCs w:val="24"/>
+          <w:sz w:val="22"/>
+          <w:szCs w:val="22"/>
         </w:rPr>
         <w:t>Education</w:t>
       </w:r>
@@ -806,8 +877,6 @@
         <w:ind w:right="0"/>
         <w:rPr>
           <w:bCs/>
-          <w:sz w:val="22"/>
-          <w:szCs w:val="22"/>
         </w:rPr>
       </w:pPr>
       <w:hyperlink r:id="rId20" w:history="1">
@@ -815,8 +884,6 @@
           <w:rPr>
             <w:rStyle w:val="Hyperlink"/>
             <w:bCs/>
-            <w:sz w:val="22"/>
-            <w:szCs w:val="22"/>
             <w:u w:val="none"/>
           </w:rPr>
           <w:t>Bajaj Institute of Technology</w:t>
@@ -825,56 +892,40 @@
       <w:r>
         <w:rPr>
           <w:bCs/>
-          <w:sz w:val="22"/>
-          <w:szCs w:val="22"/>
           <w:cs/>
         </w:rPr>
         <w:t xml:space="preserve"> </w:t>
       </w:r>
       <w:r>
         <w:rPr>
-          <w:sz w:val="22"/>
-          <w:szCs w:val="22"/>
           <w:cs/>
         </w:rPr>
         <w:t>–</w:t>
       </w:r>
       <w:r>
-        <w:rPr>
-          <w:sz w:val="22"/>
-          <w:szCs w:val="22"/>
-        </w:rPr>
         <w:t xml:space="preserve"> </w:t>
       </w:r>
       <w:r>
         <w:rPr>
           <w:bCs/>
-          <w:sz w:val="22"/>
-          <w:szCs w:val="22"/>
         </w:rPr>
         <w:t>B. Tech. (Computer Eng</w:t>
       </w:r>
       <w:r>
         <w:rPr>
           <w:bCs/>
-          <w:sz w:val="22"/>
-          <w:szCs w:val="22"/>
         </w:rPr>
         <w:t>ineering</w:t>
       </w:r>
       <w:r>
         <w:rPr>
           <w:bCs/>
-          <w:sz w:val="22"/>
-          <w:szCs w:val="22"/>
         </w:rPr>
         <w:t>) [DBATU]</w:t>
       </w:r>
       <w:r>
         <w:rPr>
           <w:bCs/>
-          <w:sz w:val="22"/>
-          <w:szCs w:val="22"/>
         </w:rPr>
         <w:tab/>
         <w:t xml:space="preserve"> 2020 </w:t>
@@ -882,16 +933,12 @@
       <w:r>
         <w:rPr>
           <w:bCs/>
-          <w:sz w:val="22"/>
-          <w:szCs w:val="22"/>
         </w:rPr>
         <w:t>-</w:t>
       </w:r>
       <w:r>
         <w:rPr>
           <w:bCs/>
-          <w:sz w:val="22"/>
-          <w:szCs w:val="22"/>
         </w:rPr>
         <w:t xml:space="preserve"> 2024</w:t>
       </w:r>
@@ -905,8 +952,6 @@
         <w:ind w:right="0"/>
         <w:rPr>
           <w:bCs/>
-          <w:sz w:val="22"/>
-          <w:szCs w:val="22"/>
         </w:rPr>
       </w:pPr>
     </w:p>
@@ -917,16 +962,14 @@
         <w:jc w:val="center"/>
         <w:rPr>
           <w:rFonts w:cstheme="minorBidi"/>
+        </w:rPr>
+      </w:pPr>
+      <w:r>
+        <w:rPr>
+          <w:b/>
+          <w:bCs/>
           <w:sz w:val="22"/>
           <w:szCs w:val="22"/>
-        </w:rPr>
-      </w:pPr>
-      <w:r>
-        <w:rPr>
-          <w:b/>
-          <w:bCs/>
-          <w:sz w:val="24"/>
-          <w:szCs w:val="24"/>
         </w:rPr>
         <w:t>Experience</w:t>
       </w:r>
@@ -937,18 +980,12 @@
           <w:tab w:val="right" w:pos="10490"/>
         </w:tabs>
         <w:spacing w:after="0" w:line="240" w:lineRule="auto"/>
-        <w:ind w:right="48"/>
-        <w:rPr>
-          <w:sz w:val="22"/>
-          <w:szCs w:val="22"/>
-        </w:rPr>
+        <w:ind w:right="0"/>
       </w:pPr>
       <w:r>
         <w:rPr>
           <w:b/>
           <w:bCs/>
-          <w:sz w:val="22"/>
-          <w:szCs w:val="22"/>
         </w:rPr>
         <w:t>Software Developer</w:t>
       </w:r>
@@ -957,16 +994,10 @@
           <w:rFonts w:cstheme="minorBidi"/>
           <w:b/>
           <w:bCs/>
-          <w:sz w:val="22"/>
-          <w:szCs w:val="22"/>
         </w:rPr>
         <w:t xml:space="preserve"> Intern</w:t>
       </w:r>
       <w:r>
-        <w:rPr>
-          <w:sz w:val="22"/>
-          <w:szCs w:val="22"/>
-        </w:rPr>
         <w:t xml:space="preserve"> | </w:t>
       </w:r>
       <w:hyperlink r:id="rId21" w:history="1">
@@ -974,8 +1005,6 @@
           <w:rPr>
             <w:rStyle w:val="Hyperlink"/>
             <w:bCs/>
-            <w:sz w:val="22"/>
-            <w:szCs w:val="22"/>
             <w:u w:val="none"/>
           </w:rPr>
           <w:t>OFY Wellness, Nagpur</w:t>
@@ -985,30 +1014,16 @@
         <w:rPr>
           <w:i/>
           <w:iCs/>
-          <w:sz w:val="22"/>
-          <w:szCs w:val="22"/>
         </w:rPr>
         <w:tab/>
       </w:r>
       <w:r>
-        <w:rPr>
-          <w:sz w:val="22"/>
-          <w:szCs w:val="22"/>
-        </w:rPr>
         <w:t xml:space="preserve">February 2024 </w:t>
       </w:r>
       <w:r>
-        <w:rPr>
-          <w:sz w:val="22"/>
-          <w:szCs w:val="22"/>
-        </w:rPr>
         <w:t>-</w:t>
       </w:r>
       <w:r>
-        <w:rPr>
-          <w:sz w:val="22"/>
-          <w:szCs w:val="22"/>
-        </w:rPr>
         <w:t xml:space="preserve"> August 2024</w:t>
       </w:r>
     </w:p>
@@ -1020,18 +1035,17 @@
           <w:numId w:val="39"/>
         </w:numPr>
         <w:spacing w:after="0" w:line="240" w:lineRule="auto"/>
-        <w:ind w:right="48"/>
-        <w:rPr>
-          <w:sz w:val="22"/>
-          <w:szCs w:val="22"/>
+        <w:ind w:right="0"/>
+        <w:rPr>
+          <w:szCs w:val="20"/>
         </w:rPr>
       </w:pPr>
       <w:hyperlink r:id="rId22" w:history="1">
         <w:r>
           <w:rPr>
             <w:rStyle w:val="Hyperlink"/>
-            <w:sz w:val="24"/>
-            <w:szCs w:val="24"/>
+            <w:sz w:val="22"/>
+            <w:szCs w:val="22"/>
             <w:u w:val="none"/>
           </w:rPr>
           <w:t>OFY Wellness Android app</w:t>
@@ -1039,31 +1053,28 @@
       </w:hyperlink>
       <w:r>
         <w:rPr>
-          <w:sz w:val="24"/>
-          <w:szCs w:val="24"/>
-        </w:rPr>
-        <w:t xml:space="preserve"> </w:t>
-      </w:r>
-      <w:r>
-        <w:rPr>
           <w:sz w:val="22"/>
           <w:szCs w:val="22"/>
         </w:rPr>
+        <w:t xml:space="preserve"> </w:t>
+      </w:r>
+      <w:r>
+        <w:rPr>
+          <w:szCs w:val="20"/>
+        </w:rPr>
         <w:t>(</w:t>
       </w:r>
       <w:r>
         <w:rPr>
           <w:b/>
           <w:bCs/>
-          <w:sz w:val="22"/>
-          <w:szCs w:val="22"/>
+          <w:szCs w:val="20"/>
         </w:rPr>
         <w:t>Java</w:t>
       </w:r>
       <w:r>
         <w:rPr>
-          <w:sz w:val="22"/>
-          <w:szCs w:val="22"/>
+          <w:szCs w:val="20"/>
         </w:rPr>
         <w:t>)</w:t>
       </w:r>
@@ -1076,24 +1087,21 @@
           <w:numId w:val="32"/>
         </w:numPr>
         <w:spacing w:line="240" w:lineRule="auto"/>
-        <w:ind w:right="48"/>
+        <w:ind w:right="0"/>
         <w:jc w:val="both"/>
         <w:rPr>
-          <w:sz w:val="22"/>
-          <w:szCs w:val="22"/>
-        </w:rPr>
-      </w:pPr>
-      <w:r>
-        <w:rPr>
-          <w:sz w:val="22"/>
-          <w:szCs w:val="22"/>
+          <w:szCs w:val="20"/>
+        </w:rPr>
+      </w:pPr>
+      <w:r>
+        <w:rPr>
+          <w:szCs w:val="20"/>
         </w:rPr>
         <w:t>Worked on building the OFY Wellness Android app in Java using XML and Firebase database</w:t>
       </w:r>
       <w:r>
         <w:rPr>
-          <w:sz w:val="22"/>
-          <w:szCs w:val="22"/>
+          <w:szCs w:val="20"/>
         </w:rPr>
         <w:t xml:space="preserve">. </w:t>
       </w:r>
@@ -1106,24 +1114,21 @@
           <w:numId w:val="32"/>
         </w:numPr>
         <w:spacing w:line="240" w:lineRule="auto"/>
-        <w:ind w:right="48"/>
+        <w:ind w:right="0"/>
         <w:jc w:val="both"/>
         <w:rPr>
-          <w:sz w:val="22"/>
-          <w:szCs w:val="22"/>
-        </w:rPr>
-      </w:pPr>
-      <w:r>
-        <w:rPr>
-          <w:sz w:val="22"/>
-          <w:szCs w:val="22"/>
+          <w:szCs w:val="20"/>
+        </w:rPr>
+      </w:pPr>
+      <w:r>
+        <w:rPr>
+          <w:szCs w:val="20"/>
         </w:rPr>
         <w:t>Added daily diet logging, and viewing features using Firebase real-time database and cloud storage.</w:t>
       </w:r>
       <w:r>
         <w:rPr>
-          <w:sz w:val="22"/>
-          <w:szCs w:val="22"/>
+          <w:szCs w:val="20"/>
         </w:rPr>
         <w:t xml:space="preserve"> </w:t>
       </w:r>
@@ -1136,38 +1141,33 @@
           <w:numId w:val="32"/>
         </w:numPr>
         <w:spacing w:line="240" w:lineRule="auto"/>
-        <w:ind w:right="48"/>
+        <w:ind w:right="0"/>
         <w:jc w:val="both"/>
         <w:rPr>
-          <w:sz w:val="22"/>
-          <w:szCs w:val="22"/>
-        </w:rPr>
-      </w:pPr>
-      <w:r>
-        <w:rPr>
-          <w:sz w:val="22"/>
-          <w:szCs w:val="22"/>
+          <w:szCs w:val="20"/>
+        </w:rPr>
+      </w:pPr>
+      <w:r>
+        <w:rPr>
+          <w:szCs w:val="20"/>
         </w:rPr>
         <w:t xml:space="preserve">Implemented meal </w:t>
       </w:r>
       <w:r>
         <w:rPr>
-          <w:sz w:val="22"/>
-          <w:szCs w:val="22"/>
+          <w:szCs w:val="20"/>
         </w:rPr>
         <w:t>i</w:t>
       </w:r>
       <w:r>
         <w:rPr>
-          <w:sz w:val="22"/>
-          <w:szCs w:val="22"/>
+          <w:szCs w:val="20"/>
         </w:rPr>
         <w:t>mage and nutrient detection via Gemini Pro Vision AI/ML models and APIs</w:t>
       </w:r>
       <w:r>
         <w:rPr>
-          <w:sz w:val="22"/>
-          <w:szCs w:val="22"/>
+          <w:szCs w:val="20"/>
         </w:rPr>
         <w:t xml:space="preserve">. </w:t>
       </w:r>
@@ -1180,80 +1180,57 @@
           <w:numId w:val="32"/>
         </w:numPr>
         <w:spacing w:line="240" w:lineRule="auto"/>
-        <w:ind w:right="48"/>
+        <w:ind w:right="0"/>
         <w:jc w:val="both"/>
         <w:rPr>
-          <w:sz w:val="22"/>
-          <w:szCs w:val="22"/>
-        </w:rPr>
-      </w:pPr>
-      <w:r>
-        <w:rPr>
-          <w:sz w:val="22"/>
-          <w:szCs w:val="22"/>
+          <w:szCs w:val="20"/>
+        </w:rPr>
+      </w:pPr>
+      <w:r>
+        <w:rPr>
+          <w:szCs w:val="20"/>
         </w:rPr>
         <w:t>Tun</w:t>
       </w:r>
       <w:r>
         <w:rPr>
-          <w:sz w:val="22"/>
-          <w:szCs w:val="22"/>
+          <w:szCs w:val="20"/>
         </w:rPr>
         <w:t>ed</w:t>
       </w:r>
       <w:r>
         <w:rPr>
-          <w:sz w:val="22"/>
-          <w:szCs w:val="22"/>
-        </w:rPr>
-        <w:t xml:space="preserve"> the model</w:t>
-      </w:r>
-      <w:r>
-        <w:rPr>
-          <w:sz w:val="22"/>
-          <w:szCs w:val="22"/>
-        </w:rPr>
-        <w:t xml:space="preserve"> </w:t>
-      </w:r>
-      <w:r>
-        <w:rPr>
-          <w:sz w:val="22"/>
-          <w:szCs w:val="22"/>
-        </w:rPr>
-        <w:t>and i</w:t>
-      </w:r>
-      <w:r>
-        <w:rPr>
-          <w:sz w:val="22"/>
-          <w:szCs w:val="22"/>
+          <w:szCs w:val="20"/>
+        </w:rPr>
+        <w:t xml:space="preserve"> the model and i</w:t>
+      </w:r>
+      <w:r>
+        <w:rPr>
+          <w:szCs w:val="20"/>
         </w:rPr>
         <w:t>mproved meal image and nutrient detection by</w:t>
       </w:r>
       <w:r>
         <w:rPr>
-          <w:sz w:val="22"/>
-          <w:szCs w:val="22"/>
+          <w:szCs w:val="20"/>
         </w:rPr>
         <w:t xml:space="preserve"> ov</w:t>
       </w:r>
       <w:r>
         <w:rPr>
-          <w:sz w:val="22"/>
-          <w:szCs w:val="22"/>
+          <w:szCs w:val="20"/>
         </w:rPr>
         <w:t>e</w:t>
       </w:r>
       <w:r>
         <w:rPr>
-          <w:sz w:val="22"/>
-          <w:szCs w:val="22"/>
+          <w:szCs w:val="20"/>
         </w:rPr>
         <w:t xml:space="preserve">r </w:t>
       </w:r>
       <w:r>
         <w:rPr>
-          <w:sz w:val="22"/>
-          <w:szCs w:val="22"/>
+          <w:szCs w:val="20"/>
         </w:rPr>
         <w:t>50%.</w:t>
       </w:r>
@@ -1266,11 +1243,10 @@
           <w:numId w:val="39"/>
         </w:numPr>
         <w:spacing w:line="240" w:lineRule="auto"/>
-        <w:ind w:right="48"/>
+        <w:ind w:right="0"/>
         <w:jc w:val="both"/>
         <w:rPr>
-          <w:sz w:val="22"/>
-          <w:szCs w:val="22"/>
+          <w:szCs w:val="20"/>
         </w:rPr>
       </w:pPr>
       <w:hyperlink r:id="rId23" w:history="1">
@@ -1278,8 +1254,8 @@
           <w:rPr>
             <w:rStyle w:val="Hyperlink"/>
             <w:rFonts w:cs="Arial"/>
-            <w:sz w:val="24"/>
-            <w:szCs w:val="24"/>
+            <w:sz w:val="22"/>
+            <w:szCs w:val="22"/>
             <w:u w:val="none"/>
           </w:rPr>
           <w:t>A Spring Boot</w:t>
@@ -1287,8 +1263,8 @@
         <w:r>
           <w:rPr>
             <w:rStyle w:val="Hyperlink"/>
-            <w:sz w:val="24"/>
-            <w:szCs w:val="24"/>
+            <w:sz w:val="22"/>
+            <w:szCs w:val="22"/>
             <w:u w:val="none"/>
           </w:rPr>
           <w:t xml:space="preserve"> revenue converter</w:t>
@@ -1296,31 +1272,28 @@
       </w:hyperlink>
       <w:r>
         <w:rPr>
-          <w:sz w:val="24"/>
-          <w:szCs w:val="24"/>
-        </w:rPr>
-        <w:t xml:space="preserve"> </w:t>
-      </w:r>
-      <w:r>
-        <w:rPr>
           <w:sz w:val="22"/>
           <w:szCs w:val="22"/>
         </w:rPr>
+        <w:t xml:space="preserve"> </w:t>
+      </w:r>
+      <w:r>
+        <w:rPr>
+          <w:szCs w:val="20"/>
+        </w:rPr>
         <w:t>(</w:t>
       </w:r>
       <w:r>
         <w:rPr>
           <w:b/>
           <w:bCs/>
-          <w:sz w:val="22"/>
-          <w:szCs w:val="22"/>
+          <w:szCs w:val="20"/>
         </w:rPr>
         <w:t>Java</w:t>
       </w:r>
       <w:r>
         <w:rPr>
-          <w:sz w:val="22"/>
-          <w:szCs w:val="22"/>
+          <w:szCs w:val="20"/>
         </w:rPr>
         <w:t>)</w:t>
       </w:r>
@@ -1333,38 +1306,33 @@
           <w:numId w:val="32"/>
         </w:numPr>
         <w:spacing w:line="240" w:lineRule="auto"/>
-        <w:ind w:right="48"/>
+        <w:ind w:right="0"/>
         <w:jc w:val="both"/>
         <w:rPr>
-          <w:sz w:val="22"/>
-          <w:szCs w:val="22"/>
-        </w:rPr>
-      </w:pPr>
-      <w:r>
-        <w:rPr>
-          <w:sz w:val="22"/>
-          <w:szCs w:val="22"/>
+          <w:szCs w:val="20"/>
+        </w:rPr>
+      </w:pPr>
+      <w:r>
+        <w:rPr>
+          <w:szCs w:val="20"/>
         </w:rPr>
         <w:t>Developed a Spring Boot revenue converter to convert earnings into different time brackets to assist</w:t>
       </w:r>
       <w:r>
         <w:rPr>
-          <w:sz w:val="22"/>
-          <w:szCs w:val="22"/>
+          <w:szCs w:val="20"/>
         </w:rPr>
         <w:t xml:space="preserve"> </w:t>
       </w:r>
       <w:r>
         <w:rPr>
-          <w:sz w:val="22"/>
-          <w:szCs w:val="22"/>
+          <w:szCs w:val="20"/>
         </w:rPr>
         <w:t>freelancer and worker onboarding and revenue calculations</w:t>
       </w:r>
       <w:r>
         <w:rPr>
-          <w:sz w:val="22"/>
-          <w:szCs w:val="22"/>
+          <w:szCs w:val="20"/>
         </w:rPr>
         <w:t xml:space="preserve">. </w:t>
       </w:r>
@@ -1377,24 +1345,21 @@
           <w:numId w:val="32"/>
         </w:numPr>
         <w:spacing w:line="240" w:lineRule="auto"/>
-        <w:ind w:right="48"/>
+        <w:ind w:right="0"/>
         <w:jc w:val="both"/>
         <w:rPr>
-          <w:sz w:val="22"/>
-          <w:szCs w:val="22"/>
-        </w:rPr>
-      </w:pPr>
-      <w:r>
-        <w:rPr>
-          <w:sz w:val="22"/>
-          <w:szCs w:val="22"/>
+          <w:szCs w:val="20"/>
+        </w:rPr>
+      </w:pPr>
+      <w:r>
+        <w:rPr>
+          <w:szCs w:val="20"/>
         </w:rPr>
         <w:t>Supplemented currency conversion feature and scaled currency pairs to 10+ currency pairs</w:t>
       </w:r>
       <w:r>
         <w:rPr>
-          <w:sz w:val="22"/>
-          <w:szCs w:val="22"/>
+          <w:szCs w:val="20"/>
         </w:rPr>
         <w:t xml:space="preserve">. </w:t>
       </w:r>
@@ -1407,96 +1372,65 @@
           <w:numId w:val="32"/>
         </w:numPr>
         <w:spacing w:line="240" w:lineRule="auto"/>
-        <w:ind w:right="48"/>
+        <w:ind w:right="0"/>
         <w:jc w:val="both"/>
         <w:rPr>
-          <w:sz w:val="22"/>
-          <w:szCs w:val="22"/>
+          <w:szCs w:val="20"/>
         </w:rPr>
       </w:pPr>
       <w:proofErr w:type="spellStart"/>
       <w:r>
         <w:rPr>
-          <w:sz w:val="22"/>
-          <w:szCs w:val="22"/>
-        </w:rPr>
-        <w:t>Dockerize</w:t>
-      </w:r>
-      <w:r>
-        <w:rPr>
-          <w:sz w:val="22"/>
-          <w:szCs w:val="22"/>
-        </w:rPr>
-        <w:t>d</w:t>
+          <w:szCs w:val="20"/>
+        </w:rPr>
+        <w:t>Dockerized</w:t>
       </w:r>
       <w:proofErr w:type="spellEnd"/>
       <w:r>
         <w:rPr>
-          <w:sz w:val="22"/>
-          <w:szCs w:val="22"/>
+          <w:szCs w:val="20"/>
         </w:rPr>
         <w:t xml:space="preserve"> </w:t>
       </w:r>
       <w:r>
         <w:rPr>
-          <w:sz w:val="22"/>
-          <w:szCs w:val="22"/>
+          <w:szCs w:val="20"/>
         </w:rPr>
         <w:t>the Spring Boot application, and increased its availability by more than 10% by deploying it</w:t>
       </w:r>
       <w:r>
         <w:rPr>
-          <w:sz w:val="22"/>
-          <w:szCs w:val="22"/>
+          <w:szCs w:val="20"/>
         </w:rPr>
         <w:t xml:space="preserve"> to</w:t>
       </w:r>
       <w:r>
         <w:rPr>
-          <w:sz w:val="22"/>
-          <w:szCs w:val="22"/>
+          <w:szCs w:val="20"/>
         </w:rPr>
         <w:t xml:space="preserve"> </w:t>
       </w:r>
       <w:r>
         <w:rPr>
-          <w:sz w:val="22"/>
-          <w:szCs w:val="22"/>
-        </w:rPr>
-        <w:t xml:space="preserve">an </w:t>
-      </w:r>
-      <w:r>
-        <w:rPr>
-          <w:sz w:val="22"/>
-          <w:szCs w:val="22"/>
-        </w:rPr>
-        <w:t>AWS EC2 instance</w:t>
-      </w:r>
-      <w:r>
-        <w:rPr>
-          <w:sz w:val="22"/>
-          <w:szCs w:val="22"/>
-        </w:rPr>
-        <w:t xml:space="preserve"> and</w:t>
-      </w:r>
-      <w:r>
-        <w:rPr>
-          <w:sz w:val="22"/>
-          <w:szCs w:val="22"/>
+          <w:szCs w:val="20"/>
+        </w:rPr>
+        <w:t>an AWS EC2 instance and</w:t>
+      </w:r>
+      <w:r>
+        <w:rPr>
+          <w:szCs w:val="20"/>
         </w:rPr>
         <w:t xml:space="preserve"> multiple Docker container</w:t>
       </w:r>
       <w:r>
         <w:rPr>
-          <w:sz w:val="22"/>
-          <w:szCs w:val="22"/>
+          <w:szCs w:val="20"/>
         </w:rPr>
         <w:t>s</w:t>
       </w:r>
       <w:r>
         <w:rPr>
-          <w:sz w:val="22"/>
-          <w:szCs w:val="22"/>
+          <w:szCs w:val="20"/>
         </w:rPr>
         <w:t>.</w:t>
       </w:r>
@@ -1509,17 +1443,11 @@
         <w:spacing w:line="240" w:lineRule="auto"/>
         <w:ind w:left="0" w:right="0" w:firstLine="0"/>
         <w:jc w:val="both"/>
-        <w:rPr>
-          <w:sz w:val="22"/>
-          <w:szCs w:val="22"/>
-        </w:rPr>
       </w:pPr>
       <w:r>
         <w:rPr>
           <w:b/>
           <w:bCs/>
-          <w:sz w:val="22"/>
-          <w:szCs w:val="22"/>
         </w:rPr>
         <w:t>Software Developer</w:t>
       </w:r>
@@ -1528,16 +1456,10 @@
           <w:rFonts w:cstheme="minorBidi"/>
           <w:b/>
           <w:bCs/>
-          <w:sz w:val="22"/>
-          <w:szCs w:val="22"/>
         </w:rPr>
         <w:t xml:space="preserve"> Freelancer</w:t>
       </w:r>
       <w:r>
-        <w:rPr>
-          <w:sz w:val="22"/>
-          <w:szCs w:val="22"/>
-        </w:rPr>
         <w:t xml:space="preserve"> | </w:t>
       </w:r>
       <w:hyperlink r:id="rId24" w:history="1">
@@ -1545,8 +1467,6 @@
         <w:r>
           <w:rPr>
             <w:rStyle w:val="Hyperlink"/>
-            <w:sz w:val="22"/>
-            <w:szCs w:val="22"/>
             <w:u w:val="none"/>
           </w:rPr>
           <w:t>Hazirs</w:t>
@@ -1555,8 +1475,6 @@
         <w:r>
           <w:rPr>
             <w:rStyle w:val="Hyperlink"/>
-            <w:sz w:val="22"/>
-            <w:szCs w:val="22"/>
             <w:u w:val="none"/>
           </w:rPr>
           <w:t>, remote</w:t>
@@ -1565,24 +1483,14 @@
       <w:r>
         <w:rPr>
           <w:rStyle w:val="Hyperlink"/>
-          <w:sz w:val="22"/>
-          <w:szCs w:val="22"/>
           <w:u w:val="none"/>
         </w:rPr>
         <w:tab/>
       </w:r>
       <w:r>
-        <w:rPr>
-          <w:sz w:val="22"/>
-          <w:szCs w:val="22"/>
-        </w:rPr>
         <w:t>December 202</w:t>
       </w:r>
       <w:r>
-        <w:rPr>
-          <w:sz w:val="22"/>
-          <w:szCs w:val="22"/>
-        </w:rPr>
         <w:t>2</w:t>
       </w:r>
     </w:p>
@@ -1597,112 +1505,90 @@
         <w:ind w:right="0"/>
         <w:jc w:val="both"/>
         <w:rPr>
-          <w:sz w:val="22"/>
-          <w:szCs w:val="22"/>
-        </w:rPr>
-      </w:pPr>
-      <w:r>
-        <w:rPr>
-          <w:sz w:val="22"/>
-          <w:szCs w:val="22"/>
+          <w:szCs w:val="20"/>
+        </w:rPr>
+      </w:pPr>
+      <w:r>
+        <w:rPr>
+          <w:szCs w:val="20"/>
         </w:rPr>
         <w:t xml:space="preserve">Crafted </w:t>
       </w:r>
       <w:r>
         <w:rPr>
-          <w:sz w:val="22"/>
-          <w:szCs w:val="22"/>
+          <w:szCs w:val="20"/>
         </w:rPr>
         <w:t>a</w:t>
       </w:r>
       <w:r>
         <w:rPr>
-          <w:sz w:val="22"/>
-          <w:szCs w:val="22"/>
+          <w:szCs w:val="20"/>
         </w:rPr>
         <w:t xml:space="preserve">n Android application </w:t>
       </w:r>
       <w:r>
         <w:rPr>
-          <w:sz w:val="22"/>
-          <w:szCs w:val="22"/>
+          <w:szCs w:val="20"/>
         </w:rPr>
         <w:t xml:space="preserve">in </w:t>
       </w:r>
       <w:r>
         <w:rPr>
-          <w:sz w:val="22"/>
-          <w:szCs w:val="22"/>
+          <w:szCs w:val="20"/>
         </w:rPr>
         <w:t>Java</w:t>
       </w:r>
       <w:r>
         <w:rPr>
-          <w:sz w:val="22"/>
-          <w:szCs w:val="22"/>
+          <w:szCs w:val="20"/>
         </w:rPr>
         <w:t xml:space="preserve"> and XML</w:t>
       </w:r>
       <w:r>
         <w:rPr>
-          <w:sz w:val="22"/>
-          <w:szCs w:val="22"/>
+          <w:szCs w:val="20"/>
+        </w:rPr>
+        <w:t xml:space="preserve"> from scratch</w:t>
+      </w:r>
+      <w:r>
+        <w:rPr>
+          <w:szCs w:val="20"/>
         </w:rPr>
         <w:t xml:space="preserve"> </w:t>
       </w:r>
       <w:r>
         <w:rPr>
-          <w:sz w:val="22"/>
-          <w:szCs w:val="22"/>
-        </w:rPr>
-        <w:t>from scratch</w:t>
-      </w:r>
-      <w:r>
-        <w:rPr>
-          <w:sz w:val="22"/>
-          <w:szCs w:val="22"/>
-        </w:rPr>
-        <w:t xml:space="preserve"> </w:t>
-      </w:r>
-      <w:r>
-        <w:rPr>
-          <w:sz w:val="22"/>
-          <w:szCs w:val="22"/>
+          <w:szCs w:val="20"/>
         </w:rPr>
         <w:t xml:space="preserve">using </w:t>
       </w:r>
       <w:r>
         <w:rPr>
-          <w:sz w:val="22"/>
-          <w:szCs w:val="22"/>
+          <w:szCs w:val="20"/>
         </w:rPr>
         <w:t xml:space="preserve">the </w:t>
       </w:r>
       <w:r>
         <w:rPr>
-          <w:sz w:val="22"/>
-          <w:szCs w:val="22"/>
+          <w:szCs w:val="20"/>
         </w:rPr>
         <w:t>Google</w:t>
       </w:r>
       <w:r>
         <w:rPr>
-          <w:sz w:val="22"/>
-          <w:szCs w:val="22"/>
+          <w:szCs w:val="20"/>
         </w:rPr>
         <w:t xml:space="preserve"> Sign-In API</w:t>
       </w:r>
       <w:r>
         <w:rPr>
-          <w:sz w:val="22"/>
-          <w:szCs w:val="22"/>
+          <w:szCs w:val="20"/>
         </w:rPr>
         <w:t>.</w:t>
       </w:r>
       <w:r>
         <w:rPr>
-          <w:sz w:val="22"/>
-          <w:szCs w:val="22"/>
+          <w:szCs w:val="20"/>
         </w:rPr>
         <w:t xml:space="preserve"> </w:t>
       </w:r>
@@ -1718,112 +1604,97 @@
         <w:ind w:right="0"/>
         <w:jc w:val="both"/>
         <w:rPr>
-          <w:sz w:val="22"/>
-          <w:szCs w:val="22"/>
-        </w:rPr>
-      </w:pPr>
-      <w:r>
-        <w:rPr>
-          <w:sz w:val="22"/>
-          <w:szCs w:val="22"/>
+          <w:rFonts w:cstheme="minorBidi"/>
+          <w:szCs w:val="20"/>
+        </w:rPr>
+      </w:pPr>
+      <w:r>
+        <w:rPr>
+          <w:szCs w:val="20"/>
         </w:rPr>
         <w:t xml:space="preserve">Implemented </w:t>
       </w:r>
       <w:r>
         <w:rPr>
-          <w:sz w:val="22"/>
-          <w:szCs w:val="22"/>
+          <w:szCs w:val="20"/>
         </w:rPr>
         <w:t xml:space="preserve">email </w:t>
       </w:r>
       <w:r>
         <w:rPr>
-          <w:sz w:val="22"/>
-          <w:szCs w:val="22"/>
+          <w:szCs w:val="20"/>
         </w:rPr>
         <w:t>authentica</w:t>
       </w:r>
       <w:r>
         <w:rPr>
-          <w:sz w:val="22"/>
-          <w:szCs w:val="22"/>
+          <w:szCs w:val="20"/>
         </w:rPr>
         <w:t xml:space="preserve">tion and </w:t>
       </w:r>
       <w:r>
         <w:rPr>
-          <w:sz w:val="22"/>
-          <w:szCs w:val="22"/>
+          <w:szCs w:val="20"/>
         </w:rPr>
         <w:t>log</w:t>
       </w:r>
       <w:r>
         <w:rPr>
-          <w:sz w:val="22"/>
-          <w:szCs w:val="22"/>
+          <w:szCs w:val="20"/>
         </w:rPr>
         <w:t>-</w:t>
       </w:r>
       <w:r>
         <w:rPr>
-          <w:sz w:val="22"/>
-          <w:szCs w:val="22"/>
+          <w:szCs w:val="20"/>
         </w:rPr>
         <w:t xml:space="preserve">in </w:t>
       </w:r>
       <w:r>
         <w:rPr>
-          <w:sz w:val="22"/>
-          <w:szCs w:val="22"/>
+          <w:szCs w:val="20"/>
         </w:rPr>
         <w:t xml:space="preserve">with </w:t>
       </w:r>
       <w:r>
         <w:rPr>
-          <w:sz w:val="22"/>
-          <w:szCs w:val="22"/>
+          <w:szCs w:val="20"/>
         </w:rPr>
         <w:t xml:space="preserve">page navigation via </w:t>
       </w:r>
       <w:r>
         <w:rPr>
-          <w:sz w:val="22"/>
-          <w:szCs w:val="22"/>
+          <w:szCs w:val="20"/>
         </w:rPr>
         <w:t>A</w:t>
       </w:r>
       <w:r>
         <w:rPr>
-          <w:sz w:val="22"/>
-          <w:szCs w:val="22"/>
+          <w:szCs w:val="20"/>
         </w:rPr>
         <w:t>ndroid intent</w:t>
       </w:r>
       <w:r>
         <w:rPr>
-          <w:sz w:val="22"/>
-          <w:szCs w:val="22"/>
+          <w:szCs w:val="20"/>
         </w:rPr>
         <w:t>s</w:t>
       </w:r>
       <w:r>
         <w:rPr>
-          <w:sz w:val="22"/>
-          <w:szCs w:val="22"/>
+          <w:szCs w:val="20"/>
         </w:rPr>
         <w:t xml:space="preserve"> and activit</w:t>
       </w:r>
       <w:r>
         <w:rPr>
-          <w:sz w:val="22"/>
-          <w:szCs w:val="22"/>
+          <w:szCs w:val="20"/>
         </w:rPr>
         <w:t>ies</w:t>
       </w:r>
       <w:r>
         <w:rPr>
-          <w:sz w:val="22"/>
-          <w:szCs w:val="22"/>
+          <w:szCs w:val="20"/>
         </w:rPr>
         <w:t>.</w:t>
       </w:r>
@@ -1840,129 +1711,816 @@
         <w:jc w:val="both"/>
         <w:rPr>
           <w:rFonts w:cstheme="minorBidi"/>
+          <w:szCs w:val="20"/>
+        </w:rPr>
+      </w:pPr>
+      <w:r>
+        <w:rPr>
+          <w:rFonts w:cstheme="minorBidi"/>
+          <w:szCs w:val="20"/>
+        </w:rPr>
+        <w:t>R</w:t>
+      </w:r>
+      <w:r>
+        <w:rPr>
+          <w:rFonts w:cstheme="minorBidi"/>
+          <w:szCs w:val="20"/>
+        </w:rPr>
+        <w:t>educed</w:t>
+      </w:r>
+      <w:r>
+        <w:rPr>
+          <w:rFonts w:cstheme="minorBidi"/>
+          <w:szCs w:val="20"/>
+        </w:rPr>
+        <w:t xml:space="preserve"> the</w:t>
+      </w:r>
+      <w:r>
+        <w:rPr>
+          <w:rFonts w:cstheme="minorBidi"/>
+          <w:szCs w:val="20"/>
+        </w:rPr>
+        <w:t xml:space="preserve"> number of clicks required before reaching </w:t>
+      </w:r>
+      <w:r>
+        <w:rPr>
+          <w:rFonts w:cstheme="minorBidi"/>
+          <w:szCs w:val="20"/>
+        </w:rPr>
+        <w:t xml:space="preserve">the </w:t>
+      </w:r>
+      <w:r>
+        <w:rPr>
+          <w:rFonts w:cstheme="minorBidi"/>
+          <w:szCs w:val="20"/>
+        </w:rPr>
+        <w:t>home page by</w:t>
+      </w:r>
+      <w:r>
+        <w:rPr>
+          <w:rFonts w:cstheme="minorBidi"/>
+          <w:szCs w:val="20"/>
+        </w:rPr>
+        <w:t xml:space="preserve"> about 33%</w:t>
+      </w:r>
+      <w:r>
+        <w:rPr>
+          <w:rFonts w:cstheme="minorBidi"/>
+          <w:szCs w:val="20"/>
+        </w:rPr>
+        <w:t>.</w:t>
+      </w:r>
+      <w:r>
+        <w:rPr>
+          <w:b/>
+          <w:bCs/>
+          <w:szCs w:val="20"/>
+        </w:rPr>
+        <w:t xml:space="preserve"> </w:t>
+      </w:r>
+    </w:p>
+    <w:p>
+      <w:pPr>
+        <w:pBdr>
+          <w:bottom w:val="single" w:sz="6" w:space="1" w:color="auto"/>
+        </w:pBdr>
+        <w:spacing w:line="240" w:lineRule="auto"/>
+        <w:ind w:right="0"/>
+        <w:jc w:val="both"/>
+        <w:rPr>
+          <w:b/>
+          <w:bCs/>
           <w:sz w:val="22"/>
           <w:szCs w:val="22"/>
         </w:rPr>
       </w:pPr>
-      <w:r>
+    </w:p>
+    <w:p>
+      <w:pPr>
+        <w:spacing w:line="240" w:lineRule="auto"/>
+        <w:ind w:right="0"/>
+        <w:jc w:val="center"/>
         <w:rPr>
           <w:rFonts w:cstheme="minorBidi"/>
+          <w:b/>
+          <w:bCs/>
           <w:sz w:val="22"/>
           <w:szCs w:val="22"/>
         </w:rPr>
-        <w:t xml:space="preserve">Added </w:t>
-      </w:r>
+      </w:pPr>
       <w:r>
         <w:rPr>
           <w:rFonts w:cstheme="minorBidi"/>
+          <w:b/>
+          <w:bCs/>
           <w:sz w:val="22"/>
           <w:szCs w:val="22"/>
         </w:rPr>
-        <w:t>h</w:t>
-      </w:r>
-      <w:r>
-        <w:rPr>
-          <w:rFonts w:cstheme="minorBidi"/>
+        <w:t>Projects</w:t>
+      </w:r>
+    </w:p>
+    <w:p>
+      <w:pPr>
+        <w:pStyle w:val="ListParagraph"/>
+        <w:numPr>
+          <w:ilvl w:val="0"/>
+          <w:numId w:val="31"/>
+        </w:numPr>
+        <w:spacing w:line="240" w:lineRule="auto"/>
+        <w:ind w:right="0"/>
+        <w:jc w:val="both"/>
+        <w:rPr>
+          <w:szCs w:val="20"/>
+        </w:rPr>
+      </w:pPr>
+      <w:hyperlink r:id="rId25" w:history="1">
+        <w:r>
+          <w:rPr>
+            <w:rStyle w:val="Hyperlink"/>
+            <w:rFonts w:cs="Arial"/>
+            <w:sz w:val="22"/>
+            <w:szCs w:val="22"/>
+            <w:u w:val="none"/>
+          </w:rPr>
+          <w:t>A brand-new programming language</w:t>
+        </w:r>
+      </w:hyperlink>
+      <w:r>
+        <w:rPr>
+          <w:rStyle w:val="Hyperlink"/>
+          <w:rFonts w:cs="Arial"/>
+          <w:szCs w:val="20"/>
+          <w:u w:val="none"/>
+        </w:rPr>
+        <w:t xml:space="preserve"> </w:t>
+      </w:r>
+      <w:r>
+        <w:rPr>
+          <w:szCs w:val="20"/>
+        </w:rPr>
+        <w:t>(</w:t>
+      </w:r>
+      <w:r>
+        <w:rPr>
+          <w:b/>
+          <w:bCs/>
+          <w:szCs w:val="20"/>
+        </w:rPr>
+        <w:t>JavaScript, PHP</w:t>
+      </w:r>
+      <w:r>
+        <w:rPr>
+          <w:szCs w:val="20"/>
+        </w:rPr>
+        <w:t xml:space="preserve">): Hindi4All, </w:t>
+      </w:r>
+      <w:r>
+        <w:rPr>
+          <w:szCs w:val="20"/>
+        </w:rPr>
+        <w:t xml:space="preserve">which </w:t>
+      </w:r>
+      <w:r>
+        <w:rPr>
+          <w:szCs w:val="20"/>
+        </w:rPr>
+        <w:t>is</w:t>
+      </w:r>
+      <w:r>
+        <w:rPr>
+          <w:szCs w:val="20"/>
+        </w:rPr>
+        <w:t xml:space="preserve"> </w:t>
+      </w:r>
+      <w:r>
+        <w:rPr>
+          <w:szCs w:val="20"/>
+        </w:rPr>
+        <w:t xml:space="preserve">in Hindi and has the features of a traditional programming language, documentation, </w:t>
+      </w:r>
+      <w:r>
+        <w:rPr>
+          <w:szCs w:val="20"/>
+        </w:rPr>
+        <w:t>an editor</w:t>
+      </w:r>
+      <w:r>
+        <w:rPr>
+          <w:szCs w:val="20"/>
+        </w:rPr>
+        <w:t>,</w:t>
+      </w:r>
+      <w:r>
+        <w:rPr>
+          <w:szCs w:val="20"/>
+        </w:rPr>
+        <w:t xml:space="preserve"> </w:t>
+      </w:r>
+      <w:r>
+        <w:rPr>
+          <w:szCs w:val="20"/>
+        </w:rPr>
+        <w:t>a</w:t>
+      </w:r>
+      <w:r>
+        <w:rPr>
+          <w:szCs w:val="20"/>
+        </w:rPr>
+        <w:t>nd CLI support</w:t>
+      </w:r>
+      <w:r>
+        <w:rPr>
+          <w:szCs w:val="20"/>
+        </w:rPr>
+        <w:t>.</w:t>
+      </w:r>
+    </w:p>
+    <w:p>
+      <w:pPr>
+        <w:pStyle w:val="ListParagraph"/>
+        <w:numPr>
+          <w:ilvl w:val="0"/>
+          <w:numId w:val="31"/>
+        </w:numPr>
+        <w:spacing w:line="240" w:lineRule="auto"/>
+        <w:ind w:right="0"/>
+        <w:jc w:val="both"/>
+        <w:rPr>
+          <w:szCs w:val="20"/>
+        </w:rPr>
+      </w:pPr>
+      <w:hyperlink r:id="rId26" w:history="1">
+        <w:r>
+          <w:rPr>
+            <w:rStyle w:val="Hyperlink"/>
+            <w:rFonts w:cs="Arial"/>
+            <w:sz w:val="22"/>
+            <w:szCs w:val="22"/>
+            <w:u w:val="none"/>
+          </w:rPr>
+          <w:t>Algorithmic stock-trading</w:t>
+        </w:r>
+      </w:hyperlink>
+      <w:r>
+        <w:rPr>
+          <w:rFonts w:cs="Arial"/>
           <w:sz w:val="22"/>
           <w:szCs w:val="22"/>
         </w:rPr>
-        <w:t>ome, categories</w:t>
-      </w:r>
-      <w:r>
-        <w:rPr>
-          <w:rFonts w:cstheme="minorBidi"/>
+        <w:t xml:space="preserve"> </w:t>
+      </w:r>
+      <w:r>
+        <w:rPr>
+          <w:rFonts w:cs="Arial"/>
+          <w:szCs w:val="20"/>
+        </w:rPr>
+        <w:t>(</w:t>
+      </w:r>
+      <w:r>
+        <w:rPr>
+          <w:rFonts w:cs="Arial"/>
+          <w:b/>
+          <w:bCs/>
+          <w:szCs w:val="20"/>
+        </w:rPr>
+        <w:t>Python</w:t>
+      </w:r>
+      <w:r>
+        <w:rPr>
+          <w:rFonts w:cs="Arial"/>
+          <w:szCs w:val="20"/>
+        </w:rPr>
+        <w:t xml:space="preserve">): applications </w:t>
+      </w:r>
+      <w:r>
+        <w:rPr>
+          <w:szCs w:val="20"/>
+        </w:rPr>
+        <w:t>that operated APIs provided by</w:t>
+      </w:r>
+      <w:r>
+        <w:rPr>
+          <w:szCs w:val="20"/>
+        </w:rPr>
+        <w:t xml:space="preserve"> leading</w:t>
+      </w:r>
+      <w:r>
+        <w:rPr>
+          <w:szCs w:val="20"/>
+        </w:rPr>
+        <w:t xml:space="preserve"> Indian stock brokers, namely </w:t>
+      </w:r>
+      <w:r>
+        <w:rPr>
+          <w:szCs w:val="20"/>
+        </w:rPr>
+        <w:t>Kota Securities, Fyers</w:t>
+      </w:r>
+      <w:r>
+        <w:rPr>
+          <w:szCs w:val="20"/>
+        </w:rPr>
+        <w:t>,</w:t>
+      </w:r>
+      <w:r>
+        <w:rPr>
+          <w:szCs w:val="20"/>
+        </w:rPr>
+        <w:t xml:space="preserve"> </w:t>
+      </w:r>
+      <w:r>
+        <w:rPr>
+          <w:szCs w:val="20"/>
+        </w:rPr>
+        <w:t xml:space="preserve">and </w:t>
+      </w:r>
+      <w:proofErr w:type="spellStart"/>
+      <w:r>
+        <w:rPr>
+          <w:szCs w:val="20"/>
+        </w:rPr>
+        <w:t>Zerodha</w:t>
+      </w:r>
+      <w:proofErr w:type="spellEnd"/>
+      <w:r>
+        <w:rPr>
+          <w:szCs w:val="20"/>
+        </w:rPr>
+        <w:t>, and</w:t>
+      </w:r>
+      <w:r>
+        <w:rPr>
+          <w:szCs w:val="20"/>
+        </w:rPr>
+        <w:t xml:space="preserve"> </w:t>
+      </w:r>
+      <w:r>
+        <w:rPr>
+          <w:szCs w:val="20"/>
+        </w:rPr>
+        <w:t>t</w:t>
+      </w:r>
+      <w:r>
+        <w:rPr>
+          <w:szCs w:val="20"/>
+        </w:rPr>
+        <w:t>rade</w:t>
+      </w:r>
+      <w:r>
+        <w:rPr>
+          <w:szCs w:val="20"/>
+        </w:rPr>
+        <w:t>d</w:t>
+      </w:r>
+      <w:r>
+        <w:rPr>
+          <w:szCs w:val="20"/>
+        </w:rPr>
+        <w:t xml:space="preserve"> stocks worth 10</w:t>
+      </w:r>
+      <w:r>
+        <w:rPr>
+          <w:szCs w:val="20"/>
+        </w:rPr>
+        <w:t>,</w:t>
+      </w:r>
+      <w:r>
+        <w:rPr>
+          <w:szCs w:val="20"/>
+        </w:rPr>
+        <w:t>000 INR</w:t>
+      </w:r>
+      <w:r>
+        <w:rPr>
+          <w:szCs w:val="20"/>
+        </w:rPr>
+        <w:t>.</w:t>
+      </w:r>
+    </w:p>
+    <w:p>
+      <w:pPr>
+        <w:pStyle w:val="ListParagraph"/>
+        <w:numPr>
+          <w:ilvl w:val="0"/>
+          <w:numId w:val="31"/>
+        </w:numPr>
+        <w:spacing w:line="240" w:lineRule="auto"/>
+        <w:ind w:right="0"/>
+        <w:jc w:val="both"/>
+        <w:rPr>
+          <w:szCs w:val="20"/>
+        </w:rPr>
+      </w:pPr>
+      <w:hyperlink r:id="rId27" w:history="1">
+        <w:r>
+          <w:rPr>
+            <w:rStyle w:val="Hyperlink"/>
+            <w:sz w:val="22"/>
+            <w:szCs w:val="22"/>
+            <w:u w:val="none"/>
+          </w:rPr>
+          <w:t>Internet-controlled drone</w:t>
+        </w:r>
+      </w:hyperlink>
+      <w:r>
+        <w:rPr>
+          <w:rStyle w:val="Hyperlink"/>
           <w:sz w:val="22"/>
           <w:szCs w:val="22"/>
-        </w:rPr>
-        <w:t>,</w:t>
-      </w:r>
-      <w:r>
-        <w:rPr>
-          <w:rFonts w:cstheme="minorBidi"/>
+          <w:u w:val="none"/>
+        </w:rPr>
+        <w:t xml:space="preserve"> </w:t>
+      </w:r>
+      <w:r>
+        <w:rPr>
+          <w:szCs w:val="20"/>
+        </w:rPr>
+        <w:t>(</w:t>
+      </w:r>
+      <w:r>
+        <w:rPr>
+          <w:b/>
+          <w:bCs/>
+          <w:szCs w:val="20"/>
+        </w:rPr>
+        <w:t>C++, JavaScript</w:t>
+      </w:r>
+      <w:r>
+        <w:rPr>
+          <w:szCs w:val="20"/>
+        </w:rPr>
+        <w:t>):</w:t>
+      </w:r>
+      <w:r>
+        <w:rPr>
+          <w:szCs w:val="20"/>
+        </w:rPr>
+        <w:t xml:space="preserve"> </w:t>
+      </w:r>
+      <w:r>
+        <w:rPr>
+          <w:szCs w:val="20"/>
+        </w:rPr>
+        <w:t>attempt to assemble an internet-controlled drone.</w:t>
+      </w:r>
+    </w:p>
+    <w:p>
+      <w:pPr>
+        <w:pStyle w:val="ListParagraph"/>
+        <w:numPr>
+          <w:ilvl w:val="0"/>
+          <w:numId w:val="31"/>
+        </w:numPr>
+        <w:spacing w:line="240" w:lineRule="auto"/>
+        <w:ind w:right="0"/>
+        <w:jc w:val="both"/>
+        <w:rPr>
+          <w:szCs w:val="20"/>
+        </w:rPr>
+      </w:pPr>
+      <w:hyperlink r:id="rId28" w:history="1">
+        <w:r>
+          <w:rPr>
+            <w:rStyle w:val="Hyperlink"/>
+            <w:sz w:val="22"/>
+            <w:szCs w:val="22"/>
+            <w:u w:val="none"/>
+          </w:rPr>
+          <w:t>Portfolio Site</w:t>
+        </w:r>
+      </w:hyperlink>
+      <w:r>
+        <w:rPr>
+          <w:szCs w:val="20"/>
+        </w:rPr>
+        <w:t xml:space="preserve"> (</w:t>
+      </w:r>
+      <w:r>
+        <w:rPr>
+          <w:b/>
+          <w:bCs/>
+          <w:szCs w:val="20"/>
+        </w:rPr>
+        <w:t>JavaScript, React</w:t>
+      </w:r>
+      <w:r>
+        <w:rPr>
+          <w:szCs w:val="20"/>
+        </w:rPr>
+        <w:t>): React JS-based portfolio site with an overview of projects done.</w:t>
+      </w:r>
+    </w:p>
+    <w:p>
+      <w:pPr>
+        <w:pBdr>
+          <w:bottom w:val="single" w:sz="6" w:space="1" w:color="auto"/>
+        </w:pBdr>
+        <w:spacing w:line="240" w:lineRule="auto"/>
+        <w:ind w:left="0" w:right="0" w:firstLine="0"/>
+        <w:jc w:val="both"/>
+        <w:rPr>
+          <w:b/>
+          <w:bCs/>
           <w:sz w:val="22"/>
           <w:szCs w:val="22"/>
         </w:rPr>
-        <w:t xml:space="preserve"> and</w:t>
-      </w:r>
-      <w:r>
+      </w:pPr>
+    </w:p>
+    <w:p>
+      <w:pPr>
+        <w:spacing w:line="240" w:lineRule="auto"/>
+        <w:ind w:right="0"/>
+        <w:jc w:val="center"/>
         <w:rPr>
           <w:rFonts w:cstheme="minorBidi"/>
+          <w:b/>
+          <w:bCs/>
           <w:sz w:val="22"/>
           <w:szCs w:val="22"/>
         </w:rPr>
-        <w:t xml:space="preserve"> a</w:t>
-      </w:r>
+      </w:pPr>
       <w:r>
         <w:rPr>
           <w:rFonts w:cstheme="minorBidi"/>
+          <w:b/>
+          <w:bCs/>
           <w:sz w:val="22"/>
           <w:szCs w:val="22"/>
         </w:rPr>
-        <w:t xml:space="preserve"> login page with </w:t>
-      </w:r>
-      <w:r>
-        <w:rPr>
-          <w:rFonts w:cstheme="minorBidi"/>
+        <w:t>Expertise</w:t>
+      </w:r>
+    </w:p>
+    <w:p>
+      <w:pPr>
+        <w:pStyle w:val="Heading2"/>
+        <w:numPr>
+          <w:ilvl w:val="0"/>
+          <w:numId w:val="32"/>
+        </w:numPr>
+        <w:spacing w:line="240" w:lineRule="auto"/>
+        <w:jc w:val="both"/>
+        <w:rPr>
+          <w:sz w:val="20"/>
+        </w:rPr>
+      </w:pPr>
+      <w:r>
+        <w:rPr>
+          <w:sz w:val="20"/>
+        </w:rPr>
+        <w:t>Java:</w:t>
+      </w:r>
+    </w:p>
+    <w:p>
+      <w:pPr>
+        <w:spacing w:after="0" w:line="240" w:lineRule="auto"/>
+        <w:ind w:right="0"/>
+        <w:jc w:val="both"/>
+      </w:pPr>
+      <w:r>
+        <w:t xml:space="preserve">Developed </w:t>
+      </w:r>
+      <w:r>
+        <w:t xml:space="preserve">Java </w:t>
+      </w:r>
+      <w:r>
+        <w:t xml:space="preserve">applications, including Android projects that used areas like </w:t>
+      </w:r>
+      <w:r>
+        <w:t xml:space="preserve">Android </w:t>
+      </w:r>
+      <w:r>
+        <w:t>Foreground Services, which used REST APIs for networking while transferring data in non-main threads</w:t>
+      </w:r>
+      <w:r>
+        <w:t xml:space="preserve"> and automated mailing</w:t>
+      </w:r>
+      <w:r>
+        <w:t xml:space="preserve">. </w:t>
+      </w:r>
+      <w:r>
+        <w:t>Also familiar with Spring Boot concepts</w:t>
+      </w:r>
+      <w:bookmarkStart w:id="0" w:name="_Hlk157827288"/>
+      <w:r>
+        <w:t xml:space="preserve"> </w:t>
+      </w:r>
+      <w:r>
+        <w:t xml:space="preserve">and </w:t>
+      </w:r>
+      <w:r>
+        <w:t>hav</w:t>
+      </w:r>
+      <w:r>
+        <w:t xml:space="preserve">e </w:t>
+      </w:r>
+      <w:r>
+        <w:t>built microservices</w:t>
+      </w:r>
+      <w:r>
+        <w:t xml:space="preserve"> in Spring Boot</w:t>
+      </w:r>
+      <w:r>
+        <w:t>.</w:t>
+      </w:r>
+    </w:p>
+    <w:p>
+      <w:pPr>
+        <w:pStyle w:val="Heading2"/>
+        <w:numPr>
+          <w:ilvl w:val="0"/>
+          <w:numId w:val="32"/>
+        </w:numPr>
+        <w:spacing w:line="240" w:lineRule="auto"/>
+        <w:jc w:val="both"/>
+        <w:rPr>
+          <w:sz w:val="20"/>
+        </w:rPr>
+      </w:pPr>
+      <w:r>
+        <w:rPr>
+          <w:sz w:val="20"/>
+        </w:rPr>
+        <w:t>Python:</w:t>
+      </w:r>
+    </w:p>
+    <w:bookmarkEnd w:id="0"/>
+    <w:p>
+      <w:pPr>
+        <w:spacing w:line="240" w:lineRule="auto"/>
+        <w:ind w:left="0" w:right="0" w:firstLine="0"/>
+        <w:jc w:val="both"/>
+      </w:pPr>
+      <w:r>
+        <w:t>Built Python applications using libraries such as Selenium, CSV</w:t>
+      </w:r>
+      <w:r>
+        <w:t>,</w:t>
+      </w:r>
+      <w:r>
+        <w:t xml:space="preserve"> and Matplotlib. </w:t>
+      </w:r>
+      <w:r>
+        <w:t>E</w:t>
+      </w:r>
+      <w:r>
+        <w:t xml:space="preserve">nhanced </w:t>
+      </w:r>
+      <w:r>
+        <w:t xml:space="preserve">web and desktop </w:t>
+      </w:r>
+      <w:r>
+        <w:t>applications using requests and other libraries to perform tasks like HTTP</w:t>
+      </w:r>
+      <w:r>
+        <w:t>(s)</w:t>
+      </w:r>
+      <w:r>
+        <w:t xml:space="preserve"> requests to server</w:t>
+      </w:r>
+      <w:r>
+        <w:t>s</w:t>
+      </w:r>
+      <w:r>
+        <w:t>, consuming third-party REST APIs, and automating logins.</w:t>
+      </w:r>
+      <w:r>
+        <w:t xml:space="preserve"> </w:t>
+      </w:r>
+      <w:r>
+        <w:t>B</w:t>
+      </w:r>
+      <w:r>
+        <w:t xml:space="preserve">uilt AI and ML models </w:t>
+      </w:r>
+      <w:r>
+        <w:t xml:space="preserve">in </w:t>
+      </w:r>
+      <w:proofErr w:type="spellStart"/>
+      <w:r>
+        <w:t>P</w:t>
+      </w:r>
+      <w:r>
+        <w:t>rolog</w:t>
+      </w:r>
+      <w:proofErr w:type="spellEnd"/>
+      <w:r>
+        <w:t xml:space="preserve"> and </w:t>
+      </w:r>
+      <w:r>
+        <w:t>Python</w:t>
+      </w:r>
+      <w:r>
+        <w:t>.</w:t>
+      </w:r>
+      <w:r>
+        <w:t xml:space="preserve"> </w:t>
+      </w:r>
+    </w:p>
+    <w:p>
+      <w:pPr>
+        <w:pStyle w:val="Heading2"/>
+        <w:numPr>
+          <w:ilvl w:val="0"/>
+          <w:numId w:val="32"/>
+        </w:numPr>
+        <w:spacing w:after="0" w:line="240" w:lineRule="auto"/>
+        <w:jc w:val="both"/>
+        <w:rPr>
+          <w:sz w:val="20"/>
+        </w:rPr>
+      </w:pPr>
+      <w:r>
+        <w:rPr>
+          <w:sz w:val="20"/>
+        </w:rPr>
+        <w:t>REST-APIs:</w:t>
+      </w:r>
+    </w:p>
+    <w:p>
+      <w:pPr>
+        <w:pBdr>
+          <w:bottom w:val="single" w:sz="6" w:space="1" w:color="auto"/>
+        </w:pBdr>
+        <w:spacing w:line="240" w:lineRule="auto"/>
+        <w:ind w:left="0" w:right="0" w:firstLine="0"/>
+        <w:jc w:val="both"/>
+      </w:pPr>
+      <w:r>
+        <w:t xml:space="preserve">Proficient in creating and handling REST APIs </w:t>
+      </w:r>
+      <w:r>
+        <w:t xml:space="preserve">and </w:t>
+      </w:r>
+      <w:r>
+        <w:t>HTTP</w:t>
+      </w:r>
+      <w:r>
+        <w:t>(s)</w:t>
+      </w:r>
+      <w:r>
+        <w:t xml:space="preserve"> requests.</w:t>
+      </w:r>
+      <w:r>
+        <w:t xml:space="preserve"> Delivered</w:t>
+      </w:r>
+      <w:r>
+        <w:t xml:space="preserve"> optimized REST APIs in JavaScript and PHP and handled different types of data using database management systems like MYSQL</w:t>
+      </w:r>
+      <w:r>
+        <w:t xml:space="preserve"> </w:t>
+      </w:r>
+      <w:r>
+        <w:t>(SQL) and MongoDB</w:t>
+      </w:r>
+      <w:r>
+        <w:t xml:space="preserve"> </w:t>
+      </w:r>
+      <w:r>
+        <w:t xml:space="preserve">(NoSQL). </w:t>
+      </w:r>
+      <w:r>
+        <w:t>C</w:t>
+      </w:r>
+      <w:r>
+        <w:t xml:space="preserve">onsumed </w:t>
+      </w:r>
+      <w:r>
+        <w:t>3rd</w:t>
+      </w:r>
+      <w:r>
+        <w:t>-party APIs in Java, Python, JavaScript</w:t>
+      </w:r>
+      <w:r>
+        <w:t>,</w:t>
+      </w:r>
+      <w:r>
+        <w:t xml:space="preserve"> and PHP.</w:t>
+      </w:r>
+    </w:p>
+    <w:p>
+      <w:pPr>
+        <w:pBdr>
+          <w:bottom w:val="single" w:sz="6" w:space="1" w:color="auto"/>
+        </w:pBdr>
+        <w:spacing w:line="240" w:lineRule="auto"/>
+        <w:ind w:left="0" w:right="0" w:firstLine="0"/>
+        <w:jc w:val="both"/>
+      </w:pPr>
+    </w:p>
+    <w:p>
+      <w:pPr>
+        <w:spacing w:line="240" w:lineRule="auto"/>
+        <w:ind w:right="0"/>
+        <w:jc w:val="center"/>
+      </w:pPr>
+      <w:r>
+        <w:rPr>
+          <w:b/>
+          <w:bCs/>
           <w:sz w:val="22"/>
           <w:szCs w:val="22"/>
         </w:rPr>
-        <w:t>custom theme</w:t>
-      </w:r>
-      <w:r>
-        <w:rPr>
-          <w:rFonts w:cstheme="minorBidi"/>
-          <w:sz w:val="22"/>
-          <w:szCs w:val="22"/>
-        </w:rPr>
-        <w:t>s</w:t>
-      </w:r>
-      <w:r>
-        <w:rPr>
-          <w:rFonts w:cstheme="minorBidi"/>
-          <w:sz w:val="22"/>
-          <w:szCs w:val="22"/>
-        </w:rPr>
-        <w:t>, different</w:t>
-      </w:r>
-      <w:r>
-        <w:rPr>
-          <w:rFonts w:cstheme="minorBidi"/>
-          <w:sz w:val="22"/>
-          <w:szCs w:val="22"/>
-        </w:rPr>
-        <w:t xml:space="preserve"> style</w:t>
-      </w:r>
-      <w:r>
-        <w:rPr>
-          <w:rFonts w:cstheme="minorBidi"/>
-          <w:sz w:val="22"/>
-          <w:szCs w:val="22"/>
-        </w:rPr>
-        <w:t>s</w:t>
-      </w:r>
-      <w:r>
-        <w:rPr>
-          <w:rFonts w:cstheme="minorBidi"/>
-          <w:sz w:val="22"/>
-          <w:szCs w:val="22"/>
-        </w:rPr>
-        <w:t>,</w:t>
-      </w:r>
-      <w:r>
-        <w:rPr>
-          <w:rFonts w:cstheme="minorBidi"/>
-          <w:sz w:val="22"/>
-          <w:szCs w:val="22"/>
-        </w:rPr>
-        <w:t xml:space="preserve"> and images</w:t>
-      </w:r>
-      <w:r>
-        <w:rPr>
-          <w:rFonts w:cstheme="minorBidi"/>
-          <w:sz w:val="22"/>
-          <w:szCs w:val="22"/>
-        </w:rPr>
-        <w:t>.</w:t>
+        <w:t>Skills</w:t>
       </w:r>
     </w:p>
     <w:p>
@@ -1976,83 +2534,201 @@
         <w:ind w:right="0"/>
         <w:jc w:val="both"/>
         <w:rPr>
-          <w:rFonts w:cstheme="minorBidi"/>
-          <w:sz w:val="22"/>
-          <w:szCs w:val="22"/>
-        </w:rPr>
-      </w:pPr>
-      <w:r>
-        <w:rPr>
-          <w:rFonts w:cstheme="minorBidi"/>
-          <w:sz w:val="22"/>
-          <w:szCs w:val="22"/>
-        </w:rPr>
-        <w:t>R</w:t>
-      </w:r>
-      <w:r>
-        <w:rPr>
-          <w:rFonts w:cstheme="minorBidi"/>
-          <w:sz w:val="22"/>
-          <w:szCs w:val="22"/>
-        </w:rPr>
-        <w:t>educed</w:t>
-      </w:r>
-      <w:r>
-        <w:rPr>
-          <w:rFonts w:cstheme="minorBidi"/>
-          <w:sz w:val="22"/>
-          <w:szCs w:val="22"/>
-        </w:rPr>
-        <w:t xml:space="preserve"> the</w:t>
-      </w:r>
-      <w:r>
-        <w:rPr>
-          <w:rFonts w:cstheme="minorBidi"/>
-          <w:sz w:val="22"/>
-          <w:szCs w:val="22"/>
-        </w:rPr>
-        <w:t xml:space="preserve"> number of clicks required before reaching </w:t>
-      </w:r>
-      <w:r>
-        <w:rPr>
-          <w:rFonts w:cstheme="minorBidi"/>
-          <w:sz w:val="22"/>
-          <w:szCs w:val="22"/>
-        </w:rPr>
-        <w:t xml:space="preserve">the </w:t>
-      </w:r>
-      <w:r>
-        <w:rPr>
-          <w:rFonts w:cstheme="minorBidi"/>
-          <w:sz w:val="22"/>
-          <w:szCs w:val="22"/>
-        </w:rPr>
-        <w:t>home page by</w:t>
-      </w:r>
-      <w:r>
-        <w:rPr>
-          <w:rFonts w:cstheme="minorBidi"/>
-          <w:sz w:val="22"/>
-          <w:szCs w:val="22"/>
-        </w:rPr>
-        <w:t xml:space="preserve"> about 33%</w:t>
-      </w:r>
-      <w:r>
-        <w:rPr>
-          <w:rFonts w:cstheme="minorBidi"/>
-          <w:sz w:val="22"/>
-          <w:szCs w:val="22"/>
-        </w:rPr>
-        <w:t>.</w:t>
-      </w:r>
+          <w:szCs w:val="20"/>
+        </w:rPr>
+      </w:pPr>
       <w:r>
         <w:rPr>
           <w:b/>
           <w:bCs/>
-          <w:sz w:val="22"/>
-          <w:szCs w:val="22"/>
+          <w:szCs w:val="20"/>
+        </w:rPr>
+        <w:t>Languages</w:t>
+      </w:r>
+      <w:r>
+        <w:rPr>
+          <w:szCs w:val="20"/>
+        </w:rPr>
+        <w:t>: Java, JavaScript, Python, PHP, SQL,</w:t>
+      </w:r>
+      <w:r>
+        <w:rPr>
+          <w:szCs w:val="20"/>
+        </w:rPr>
+        <w:t xml:space="preserve"> C, C++, </w:t>
+      </w:r>
+      <w:r>
+        <w:rPr>
+          <w:szCs w:val="20"/>
+        </w:rPr>
+        <w:t xml:space="preserve">HTML, </w:t>
+      </w:r>
+      <w:r>
+        <w:rPr>
+          <w:szCs w:val="20"/>
+        </w:rPr>
+        <w:t xml:space="preserve">XML, </w:t>
+      </w:r>
+      <w:r>
+        <w:rPr>
+          <w:szCs w:val="20"/>
+        </w:rPr>
+        <w:t xml:space="preserve">CSS, </w:t>
+      </w:r>
+      <w:r>
+        <w:rPr>
+          <w:szCs w:val="20"/>
+        </w:rPr>
+        <w:t xml:space="preserve">and </w:t>
+      </w:r>
+      <w:r>
+        <w:rPr>
+          <w:szCs w:val="20"/>
+        </w:rPr>
+        <w:t>JSON.</w:t>
+      </w:r>
+      <w:r>
+        <w:rPr>
+          <w:szCs w:val="20"/>
         </w:rPr>
         <w:t xml:space="preserve"> </w:t>
+      </w:r>
+    </w:p>
+    <w:p>
+      <w:pPr>
+        <w:pStyle w:val="ListParagraph"/>
+        <w:numPr>
+          <w:ilvl w:val="0"/>
+          <w:numId w:val="32"/>
+        </w:numPr>
+        <w:spacing w:line="240" w:lineRule="auto"/>
+        <w:ind w:right="0"/>
+        <w:jc w:val="both"/>
+        <w:rPr>
+          <w:szCs w:val="20"/>
+        </w:rPr>
+      </w:pPr>
+      <w:r>
+        <w:rPr>
+          <w:b/>
+          <w:bCs/>
+          <w:szCs w:val="20"/>
+        </w:rPr>
+        <w:t>Technologies</w:t>
+      </w:r>
+      <w:r>
+        <w:rPr>
+          <w:szCs w:val="20"/>
+        </w:rPr>
+        <w:t>: REST APIs, microservices, multi</w:t>
+      </w:r>
+      <w:r>
+        <w:rPr>
+          <w:szCs w:val="20"/>
+        </w:rPr>
+        <w:t>-</w:t>
+      </w:r>
+      <w:r>
+        <w:rPr>
+          <w:szCs w:val="20"/>
+        </w:rPr>
+        <w:t xml:space="preserve">threading, MySQL, </w:t>
+      </w:r>
+      <w:r>
+        <w:rPr>
+          <w:szCs w:val="20"/>
+        </w:rPr>
+        <w:t>MongoDB</w:t>
+      </w:r>
+      <w:r>
+        <w:rPr>
+          <w:szCs w:val="20"/>
+        </w:rPr>
+        <w:t>, AWS</w:t>
+      </w:r>
+      <w:r>
+        <w:rPr>
+          <w:szCs w:val="20"/>
+        </w:rPr>
+        <w:t>, React</w:t>
+      </w:r>
+      <w:r>
+        <w:rPr>
+          <w:szCs w:val="20"/>
+        </w:rPr>
+        <w:t>.</w:t>
+      </w:r>
+    </w:p>
+    <w:p>
+      <w:pPr>
+        <w:pStyle w:val="ListParagraph"/>
+        <w:numPr>
+          <w:ilvl w:val="0"/>
+          <w:numId w:val="32"/>
+        </w:numPr>
+        <w:spacing w:line="240" w:lineRule="auto"/>
+        <w:ind w:right="0"/>
+        <w:jc w:val="both"/>
+        <w:rPr>
+          <w:bCs/>
+          <w:szCs w:val="20"/>
+        </w:rPr>
+      </w:pPr>
+      <w:r>
+        <w:rPr>
+          <w:b/>
+          <w:bCs/>
+          <w:szCs w:val="20"/>
+        </w:rPr>
+        <w:t xml:space="preserve">Tools: </w:t>
+      </w:r>
+      <w:r>
+        <w:rPr>
+          <w:szCs w:val="20"/>
+        </w:rPr>
+        <w:t xml:space="preserve">Git, GitHub, GitHub Actions, </w:t>
+      </w:r>
+      <w:r>
+        <w:rPr>
+          <w:szCs w:val="20"/>
+        </w:rPr>
+        <w:t xml:space="preserve">Docker, </w:t>
+      </w:r>
+      <w:r>
+        <w:rPr>
+          <w:szCs w:val="20"/>
+        </w:rPr>
+        <w:t xml:space="preserve">Postman, Selenium, </w:t>
+      </w:r>
+      <w:r>
+        <w:rPr>
+          <w:szCs w:val="20"/>
+        </w:rPr>
+        <w:t>VS Code</w:t>
+      </w:r>
+      <w:r>
+        <w:rPr>
+          <w:szCs w:val="20"/>
+        </w:rPr>
+        <w:t>,</w:t>
+      </w:r>
+      <w:r>
+        <w:rPr>
+          <w:szCs w:val="20"/>
+        </w:rPr>
+        <w:t xml:space="preserve"> and</w:t>
+      </w:r>
+      <w:r>
+        <w:rPr>
+          <w:szCs w:val="20"/>
+        </w:rPr>
+        <w:t xml:space="preserve"> Android Studio</w:t>
+      </w:r>
+      <w:r>
+        <w:rPr>
+          <w:szCs w:val="20"/>
+        </w:rPr>
+        <w:t>.</w:t>
       </w:r>
     </w:p>
     <w:p>
@@ -2066,411 +2742,31 @@
         <w:rPr>
           <w:b/>
           <w:bCs/>
-          <w:sz w:val="24"/>
-          <w:szCs w:val="24"/>
+          <w:sz w:val="22"/>
+          <w:szCs w:val="22"/>
         </w:rPr>
       </w:pPr>
     </w:p>
     <w:p>
       <w:pPr>
         <w:spacing w:line="240" w:lineRule="auto"/>
-        <w:ind w:right="0"/>
+        <w:ind w:left="0" w:right="0" w:firstLine="0"/>
         <w:jc w:val="center"/>
-        <w:rPr>
-          <w:rFonts w:cstheme="minorBidi"/>
-          <w:b/>
-          <w:bCs/>
-          <w:sz w:val="24"/>
-          <w:szCs w:val="24"/>
-        </w:rPr>
-      </w:pPr>
-      <w:r>
-        <w:rPr>
-          <w:rFonts w:cstheme="minorBidi"/>
-          <w:b/>
-          <w:bCs/>
-          <w:sz w:val="24"/>
-          <w:szCs w:val="24"/>
-        </w:rPr>
-        <w:t>Projects</w:t>
-      </w:r>
-    </w:p>
-    <w:p>
-      <w:pPr>
-        <w:pStyle w:val="ListParagraph"/>
-        <w:numPr>
-          <w:ilvl w:val="0"/>
-          <w:numId w:val="31"/>
-        </w:numPr>
-        <w:spacing w:line="240" w:lineRule="auto"/>
-        <w:ind w:right="48"/>
-        <w:jc w:val="both"/>
-        <w:rPr>
-          <w:sz w:val="22"/>
-          <w:szCs w:val="22"/>
-        </w:rPr>
-      </w:pPr>
-      <w:hyperlink r:id="rId25" w:history="1">
-        <w:r>
-          <w:rPr>
-            <w:rStyle w:val="Hyperlink"/>
-            <w:rFonts w:cs="Arial"/>
-            <w:sz w:val="24"/>
-            <w:szCs w:val="24"/>
-            <w:u w:val="none"/>
-          </w:rPr>
-          <w:t>A brand-new programming language</w:t>
-        </w:r>
-      </w:hyperlink>
-      <w:r>
-        <w:rPr>
-          <w:rStyle w:val="Hyperlink"/>
-          <w:rFonts w:cs="Arial"/>
-          <w:sz w:val="22"/>
-          <w:szCs w:val="22"/>
-          <w:u w:val="none"/>
-        </w:rPr>
-        <w:t xml:space="preserve"> </w:t>
-      </w:r>
-      <w:r>
-        <w:rPr>
-          <w:sz w:val="22"/>
-          <w:szCs w:val="22"/>
-        </w:rPr>
-        <w:t>(</w:t>
-      </w:r>
-      <w:r>
         <w:rPr>
           <w:b/>
           <w:bCs/>
           <w:sz w:val="22"/>
           <w:szCs w:val="22"/>
         </w:rPr>
-        <w:t>JavaScript, PHP</w:t>
-      </w:r>
-      <w:r>
-        <w:rPr>
-          <w:sz w:val="22"/>
-          <w:szCs w:val="22"/>
-        </w:rPr>
-        <w:t xml:space="preserve">): Hindi4All, </w:t>
-      </w:r>
-      <w:r>
-        <w:rPr>
-          <w:sz w:val="22"/>
-          <w:szCs w:val="22"/>
-        </w:rPr>
-        <w:t xml:space="preserve">which </w:t>
-      </w:r>
-      <w:r>
-        <w:rPr>
-          <w:sz w:val="22"/>
-          <w:szCs w:val="22"/>
-        </w:rPr>
-        <w:t>is</w:t>
-      </w:r>
-      <w:r>
-        <w:rPr>
-          <w:sz w:val="22"/>
-          <w:szCs w:val="22"/>
-        </w:rPr>
-        <w:t xml:space="preserve"> </w:t>
-      </w:r>
-      <w:r>
-        <w:rPr>
-          <w:sz w:val="22"/>
-          <w:szCs w:val="22"/>
-        </w:rPr>
-        <w:t>in Hindi</w:t>
-      </w:r>
-      <w:r>
-        <w:rPr>
-          <w:sz w:val="22"/>
-          <w:szCs w:val="22"/>
-        </w:rPr>
-        <w:t xml:space="preserve"> and has</w:t>
-      </w:r>
-      <w:r>
-        <w:rPr>
-          <w:sz w:val="22"/>
-          <w:szCs w:val="22"/>
-        </w:rPr>
-        <w:t xml:space="preserve"> the features of a traditional programming language, documentation, </w:t>
-      </w:r>
-      <w:r>
-        <w:rPr>
-          <w:sz w:val="22"/>
-          <w:szCs w:val="22"/>
-        </w:rPr>
-        <w:t xml:space="preserve">an </w:t>
-      </w:r>
-      <w:r>
-        <w:rPr>
-          <w:sz w:val="22"/>
-          <w:szCs w:val="22"/>
-        </w:rPr>
-        <w:t>editor</w:t>
-      </w:r>
-      <w:r>
-        <w:rPr>
-          <w:sz w:val="22"/>
-          <w:szCs w:val="22"/>
-        </w:rPr>
-        <w:t>,</w:t>
-      </w:r>
-      <w:r>
-        <w:rPr>
-          <w:sz w:val="22"/>
-          <w:szCs w:val="22"/>
-        </w:rPr>
-        <w:t xml:space="preserve"> </w:t>
-      </w:r>
-      <w:r>
-        <w:rPr>
-          <w:sz w:val="22"/>
-          <w:szCs w:val="22"/>
-        </w:rPr>
-        <w:t>a</w:t>
-      </w:r>
-      <w:r>
-        <w:rPr>
-          <w:sz w:val="22"/>
-          <w:szCs w:val="22"/>
-        </w:rPr>
-        <w:t>nd CLI support</w:t>
-      </w:r>
-      <w:r>
-        <w:rPr>
-          <w:sz w:val="22"/>
-          <w:szCs w:val="22"/>
-        </w:rPr>
-        <w:t>.</w:t>
-      </w:r>
-    </w:p>
-    <w:p>
-      <w:pPr>
-        <w:pStyle w:val="ListParagraph"/>
-        <w:numPr>
-          <w:ilvl w:val="0"/>
-          <w:numId w:val="31"/>
-        </w:numPr>
-        <w:spacing w:line="240" w:lineRule="auto"/>
-        <w:ind w:right="48"/>
-        <w:jc w:val="both"/>
-        <w:rPr>
-          <w:sz w:val="22"/>
-          <w:szCs w:val="22"/>
-        </w:rPr>
-      </w:pPr>
-      <w:hyperlink r:id="rId26" w:history="1">
-        <w:r>
-          <w:rPr>
-            <w:rStyle w:val="Hyperlink"/>
-            <w:rFonts w:cs="Arial"/>
-            <w:sz w:val="24"/>
-            <w:szCs w:val="24"/>
-            <w:u w:val="none"/>
-          </w:rPr>
-          <w:t>Algorithmic stock-trading</w:t>
-        </w:r>
-      </w:hyperlink>
-      <w:r>
-        <w:rPr>
-          <w:rFonts w:cs="Arial"/>
-          <w:sz w:val="24"/>
-          <w:szCs w:val="24"/>
-        </w:rPr>
-        <w:t xml:space="preserve"> </w:t>
-      </w:r>
-      <w:r>
-        <w:rPr>
-          <w:rFonts w:cs="Arial"/>
-          <w:sz w:val="22"/>
-          <w:szCs w:val="22"/>
-        </w:rPr>
-        <w:t>(</w:t>
-      </w:r>
-      <w:r>
-        <w:rPr>
-          <w:rFonts w:cs="Arial"/>
+      </w:pPr>
+      <w:r>
+        <w:rPr>
           <w:b/>
           <w:bCs/>
           <w:sz w:val="22"/>
           <w:szCs w:val="22"/>
         </w:rPr>
-        <w:t>Python</w:t>
-      </w:r>
-      <w:r>
-        <w:rPr>
-          <w:rFonts w:cs="Arial"/>
-          <w:sz w:val="22"/>
-          <w:szCs w:val="22"/>
-        </w:rPr>
-        <w:t xml:space="preserve">): applications </w:t>
-      </w:r>
-      <w:r>
-        <w:rPr>
-          <w:sz w:val="22"/>
-          <w:szCs w:val="22"/>
-        </w:rPr>
-        <w:t>that operated APIs provided by</w:t>
-      </w:r>
-      <w:r>
-        <w:rPr>
-          <w:sz w:val="22"/>
-          <w:szCs w:val="22"/>
-        </w:rPr>
-        <w:t xml:space="preserve"> leading</w:t>
-      </w:r>
-      <w:r>
-        <w:rPr>
-          <w:sz w:val="22"/>
-          <w:szCs w:val="22"/>
-        </w:rPr>
-        <w:t xml:space="preserve"> Indian stock brokers, namely </w:t>
-      </w:r>
-      <w:r>
-        <w:rPr>
-          <w:sz w:val="22"/>
-          <w:szCs w:val="22"/>
-        </w:rPr>
-        <w:t>Kota Securities, Fyers</w:t>
-      </w:r>
-      <w:r>
-        <w:rPr>
-          <w:sz w:val="22"/>
-          <w:szCs w:val="22"/>
-        </w:rPr>
-        <w:t>,</w:t>
-      </w:r>
-      <w:r>
-        <w:rPr>
-          <w:sz w:val="22"/>
-          <w:szCs w:val="22"/>
-        </w:rPr>
-        <w:t xml:space="preserve"> </w:t>
-      </w:r>
-      <w:r>
-        <w:rPr>
-          <w:sz w:val="22"/>
-          <w:szCs w:val="22"/>
-        </w:rPr>
-        <w:t xml:space="preserve">and </w:t>
-      </w:r>
-      <w:proofErr w:type="spellStart"/>
-      <w:r>
-        <w:rPr>
-          <w:sz w:val="22"/>
-          <w:szCs w:val="22"/>
-        </w:rPr>
-        <w:t>Zerodha</w:t>
-      </w:r>
-      <w:proofErr w:type="spellEnd"/>
-      <w:r>
-        <w:rPr>
-          <w:sz w:val="22"/>
-          <w:szCs w:val="22"/>
-        </w:rPr>
-        <w:t>, and</w:t>
-      </w:r>
-      <w:r>
-        <w:rPr>
-          <w:sz w:val="22"/>
-          <w:szCs w:val="22"/>
-        </w:rPr>
-        <w:t xml:space="preserve"> </w:t>
-      </w:r>
-      <w:r>
-        <w:rPr>
-          <w:sz w:val="22"/>
-          <w:szCs w:val="22"/>
-        </w:rPr>
-        <w:t>t</w:t>
-      </w:r>
-      <w:r>
-        <w:rPr>
-          <w:sz w:val="22"/>
-          <w:szCs w:val="22"/>
-        </w:rPr>
-        <w:t>rade</w:t>
-      </w:r>
-      <w:r>
-        <w:rPr>
-          <w:sz w:val="22"/>
-          <w:szCs w:val="22"/>
-        </w:rPr>
-        <w:t>d</w:t>
-      </w:r>
-      <w:r>
-        <w:rPr>
-          <w:sz w:val="22"/>
-          <w:szCs w:val="22"/>
-        </w:rPr>
-        <w:t xml:space="preserve"> stocks worth 10</w:t>
-      </w:r>
-      <w:r>
-        <w:rPr>
-          <w:sz w:val="22"/>
-          <w:szCs w:val="22"/>
-        </w:rPr>
-        <w:t>,</w:t>
-      </w:r>
-      <w:r>
-        <w:rPr>
-          <w:sz w:val="22"/>
-          <w:szCs w:val="22"/>
-        </w:rPr>
-        <w:t>000 INR</w:t>
-      </w:r>
-      <w:r>
-        <w:rPr>
-          <w:sz w:val="22"/>
-          <w:szCs w:val="22"/>
-        </w:rPr>
-        <w:t>.</w:t>
-      </w:r>
-    </w:p>
-    <w:p>
-      <w:pPr>
-        <w:pStyle w:val="ListParagraph"/>
-        <w:numPr>
-          <w:ilvl w:val="0"/>
-          <w:numId w:val="31"/>
-        </w:numPr>
-        <w:spacing w:line="240" w:lineRule="auto"/>
-        <w:ind w:right="48"/>
-        <w:jc w:val="both"/>
-        <w:rPr>
-          <w:sz w:val="22"/>
-          <w:szCs w:val="22"/>
-        </w:rPr>
-      </w:pPr>
-      <w:hyperlink r:id="rId27" w:history="1">
-        <w:r>
-          <w:rPr>
-            <w:rStyle w:val="Hyperlink"/>
-            <w:sz w:val="24"/>
-            <w:szCs w:val="24"/>
-            <w:u w:val="none"/>
-          </w:rPr>
-          <w:t>Internet-controlled drone</w:t>
-        </w:r>
-      </w:hyperlink>
-      <w:r>
-        <w:rPr>
-          <w:rStyle w:val="Hyperlink"/>
-          <w:sz w:val="24"/>
-          <w:szCs w:val="24"/>
-          <w:u w:val="none"/>
-        </w:rPr>
-        <w:t xml:space="preserve"> </w:t>
-      </w:r>
-      <w:r>
-        <w:rPr>
-          <w:sz w:val="22"/>
-          <w:szCs w:val="22"/>
-        </w:rPr>
-        <w:t>(</w:t>
+        <w:t xml:space="preserve">  </w:t>
       </w:r>
       <w:r>
         <w:rPr>
@@ -2479,1024 +2775,84 @@
           <w:sz w:val="22"/>
           <w:szCs w:val="22"/>
         </w:rPr>
-        <w:t>C++, JavaScript</w:t>
-      </w:r>
-      <w:r>
-        <w:rPr>
-          <w:sz w:val="22"/>
-          <w:szCs w:val="22"/>
-        </w:rPr>
-        <w:t>):</w:t>
-      </w:r>
-      <w:r>
-        <w:rPr>
-          <w:sz w:val="22"/>
-          <w:szCs w:val="22"/>
-        </w:rPr>
-        <w:t xml:space="preserve"> </w:t>
-      </w:r>
-      <w:r>
-        <w:rPr>
-          <w:sz w:val="22"/>
-          <w:szCs w:val="22"/>
-        </w:rPr>
-        <w:t>attempt to assemble an internet-controlled drone.</w:t>
+        <w:t>Certifications</w:t>
       </w:r>
     </w:p>
     <w:p>
       <w:pPr>
-        <w:pStyle w:val="ListParagraph"/>
-        <w:numPr>
-          <w:ilvl w:val="0"/>
-          <w:numId w:val="31"/>
-        </w:numPr>
-        <w:spacing w:line="240" w:lineRule="auto"/>
-        <w:ind w:right="48"/>
-        <w:jc w:val="both"/>
-        <w:rPr>
-          <w:sz w:val="22"/>
-          <w:szCs w:val="22"/>
-        </w:rPr>
-      </w:pPr>
-      <w:hyperlink r:id="rId28" w:history="1">
-        <w:r>
-          <w:rPr>
-            <w:rStyle w:val="Hyperlink"/>
-            <w:sz w:val="24"/>
-            <w:szCs w:val="24"/>
-            <w:u w:val="none"/>
-          </w:rPr>
-          <w:t>Portfolio Site</w:t>
-        </w:r>
-      </w:hyperlink>
-      <w:r>
-        <w:rPr>
-          <w:sz w:val="22"/>
-          <w:szCs w:val="22"/>
-        </w:rPr>
-        <w:t xml:space="preserve"> (</w:t>
-      </w:r>
-      <w:r>
-        <w:rPr>
-          <w:b/>
-          <w:bCs/>
-          <w:sz w:val="22"/>
-          <w:szCs w:val="22"/>
-        </w:rPr>
-        <w:t>JavaScript, React</w:t>
-      </w:r>
-      <w:r>
-        <w:rPr>
-          <w:sz w:val="22"/>
-          <w:szCs w:val="22"/>
-        </w:rPr>
-        <w:t>): React JS-based portfolio site with an overview of projects done.</w:t>
-      </w:r>
-    </w:p>
-    <w:p>
-      <w:pPr>
-        <w:pBdr>
-          <w:bottom w:val="single" w:sz="6" w:space="1" w:color="auto"/>
-        </w:pBdr>
         <w:spacing w:line="240" w:lineRule="auto"/>
         <w:ind w:right="0"/>
         <w:jc w:val="both"/>
         <w:rPr>
+          <w:bCs/>
+        </w:rPr>
+      </w:pPr>
+      <w:r>
+        <w:rPr>
           <w:b/>
           <w:bCs/>
-          <w:sz w:val="24"/>
-          <w:szCs w:val="24"/>
-        </w:rPr>
-      </w:pPr>
-    </w:p>
-    <w:p>
-      <w:pPr>
-        <w:spacing w:line="240" w:lineRule="auto"/>
-        <w:ind w:right="0"/>
-        <w:jc w:val="center"/>
-        <w:rPr>
-          <w:rFonts w:cstheme="minorBidi"/>
+        </w:rPr>
+        <w:t>AWS:</w:t>
+      </w:r>
+      <w:r>
+        <w:t xml:space="preserve"> </w:t>
+      </w:r>
+      <w:r>
+        <w:rPr>
+          <w:bCs/>
+        </w:rPr>
+        <w:t xml:space="preserve">Cloud Foundations; </w:t>
+      </w:r>
+      <w:r>
+        <w:rPr>
           <w:b/>
           <w:bCs/>
-          <w:sz w:val="24"/>
-          <w:szCs w:val="24"/>
-        </w:rPr>
-      </w:pPr>
-      <w:r>
-        <w:rPr>
-          <w:rFonts w:cstheme="minorBidi"/>
+        </w:rPr>
+        <w:t>Cisco</w:t>
+      </w:r>
+      <w:r>
+        <w:rPr>
           <w:b/>
           <w:bCs/>
-          <w:sz w:val="24"/>
-          <w:szCs w:val="24"/>
-        </w:rPr>
-        <w:t>Expertise</w:t>
-      </w:r>
-    </w:p>
-    <w:p>
-      <w:pPr>
-        <w:pStyle w:val="Heading2"/>
-        <w:numPr>
-          <w:ilvl w:val="0"/>
-          <w:numId w:val="32"/>
-        </w:numPr>
-        <w:spacing w:line="240" w:lineRule="auto"/>
-        <w:jc w:val="both"/>
-        <w:rPr>
-          <w:sz w:val="22"/>
-          <w:szCs w:val="22"/>
-        </w:rPr>
-      </w:pPr>
-      <w:r>
-        <w:rPr>
-          <w:sz w:val="22"/>
-          <w:szCs w:val="22"/>
-        </w:rPr>
-        <w:t>Java:</w:t>
-      </w:r>
-    </w:p>
-    <w:p>
-      <w:pPr>
-        <w:spacing w:after="0" w:line="240" w:lineRule="auto"/>
-        <w:ind w:right="281"/>
-        <w:jc w:val="both"/>
-        <w:rPr>
-          <w:sz w:val="22"/>
-          <w:szCs w:val="22"/>
-        </w:rPr>
-      </w:pPr>
-      <w:r>
-        <w:rPr>
-          <w:sz w:val="22"/>
-          <w:szCs w:val="22"/>
-        </w:rPr>
-        <w:t xml:space="preserve">Developed </w:t>
-      </w:r>
-      <w:r>
-        <w:rPr>
-          <w:sz w:val="22"/>
-          <w:szCs w:val="22"/>
-        </w:rPr>
-        <w:t xml:space="preserve">Java </w:t>
-      </w:r>
-      <w:r>
-        <w:rPr>
-          <w:sz w:val="22"/>
-          <w:szCs w:val="22"/>
-        </w:rPr>
-        <w:t xml:space="preserve">applications, including Android projects that used areas like </w:t>
-      </w:r>
-      <w:r>
-        <w:rPr>
-          <w:sz w:val="22"/>
-          <w:szCs w:val="22"/>
-        </w:rPr>
-        <w:t xml:space="preserve">Android </w:t>
-      </w:r>
-      <w:r>
-        <w:rPr>
-          <w:sz w:val="22"/>
-          <w:szCs w:val="22"/>
-        </w:rPr>
-        <w:t>Foreground Services, which used REST APIs for networking while transferring data in non-main threads</w:t>
-      </w:r>
-      <w:r>
-        <w:rPr>
-          <w:sz w:val="22"/>
-          <w:szCs w:val="22"/>
-        </w:rPr>
-        <w:t xml:space="preserve"> and automated mailing</w:t>
-      </w:r>
-      <w:r>
-        <w:rPr>
-          <w:sz w:val="22"/>
-          <w:szCs w:val="22"/>
-        </w:rPr>
-        <w:t xml:space="preserve">. </w:t>
-      </w:r>
-      <w:r>
-        <w:rPr>
-          <w:sz w:val="22"/>
-          <w:szCs w:val="22"/>
-        </w:rPr>
-        <w:t>Also familiar with Spring Boot concepts</w:t>
-      </w:r>
-      <w:bookmarkStart w:id="0" w:name="_Hlk157827288"/>
-      <w:r>
-        <w:rPr>
-          <w:sz w:val="22"/>
-          <w:szCs w:val="22"/>
+        </w:rPr>
+        <w:t>:</w:t>
+      </w:r>
+      <w:r>
+        <w:rPr>
+          <w:bCs/>
+        </w:rPr>
+        <w:t xml:space="preserve"> NDG Linux Unhatched</w:t>
+      </w:r>
+      <w:r>
+        <w:rPr>
+          <w:bCs/>
+        </w:rPr>
+        <w:t>;</w:t>
+      </w:r>
+      <w:r>
+        <w:rPr>
+          <w:bCs/>
         </w:rPr>
         <w:t xml:space="preserve"> </w:t>
       </w:r>
-      <w:r>
-        <w:rPr>
-          <w:sz w:val="22"/>
-          <w:szCs w:val="22"/>
-        </w:rPr>
-        <w:t xml:space="preserve">and </w:t>
-      </w:r>
-      <w:r>
-        <w:rPr>
-          <w:sz w:val="22"/>
-          <w:szCs w:val="22"/>
-        </w:rPr>
-        <w:t>hav</w:t>
-      </w:r>
-      <w:r>
-        <w:rPr>
-          <w:sz w:val="22"/>
-          <w:szCs w:val="22"/>
-        </w:rPr>
-        <w:t xml:space="preserve">e </w:t>
-      </w:r>
-      <w:r>
-        <w:rPr>
-          <w:sz w:val="22"/>
-          <w:szCs w:val="22"/>
-        </w:rPr>
-        <w:t>built microservices</w:t>
-      </w:r>
-      <w:r>
-        <w:rPr>
-          <w:sz w:val="22"/>
-          <w:szCs w:val="22"/>
-        </w:rPr>
-        <w:t xml:space="preserve"> in Spring Boot</w:t>
-      </w:r>
-      <w:r>
-        <w:rPr>
-          <w:sz w:val="22"/>
-          <w:szCs w:val="22"/>
-        </w:rPr>
-        <w:t>.</w:t>
-      </w:r>
-    </w:p>
-    <w:p>
-      <w:pPr>
-        <w:pStyle w:val="Heading2"/>
-        <w:numPr>
-          <w:ilvl w:val="0"/>
-          <w:numId w:val="32"/>
-        </w:numPr>
-        <w:spacing w:line="240" w:lineRule="auto"/>
-        <w:jc w:val="both"/>
-        <w:rPr>
-          <w:sz w:val="22"/>
-          <w:szCs w:val="22"/>
-        </w:rPr>
-      </w:pPr>
-      <w:r>
-        <w:rPr>
-          <w:sz w:val="22"/>
-          <w:szCs w:val="22"/>
-        </w:rPr>
-        <w:t>Python:</w:t>
-      </w:r>
-    </w:p>
-    <w:bookmarkEnd w:id="0"/>
-    <w:p>
-      <w:pPr>
-        <w:spacing w:line="240" w:lineRule="auto"/>
-        <w:ind w:left="0" w:right="281" w:firstLine="0"/>
-        <w:jc w:val="both"/>
-        <w:rPr>
-          <w:sz w:val="22"/>
-          <w:szCs w:val="22"/>
-        </w:rPr>
-      </w:pPr>
-      <w:r>
-        <w:rPr>
-          <w:sz w:val="22"/>
-          <w:szCs w:val="22"/>
-        </w:rPr>
-        <w:t>Built Python applications using libraries such as Selenium, CSV</w:t>
-      </w:r>
-      <w:r>
-        <w:rPr>
-          <w:sz w:val="22"/>
-          <w:szCs w:val="22"/>
-        </w:rPr>
-        <w:t>,</w:t>
-      </w:r>
-      <w:r>
-        <w:rPr>
-          <w:sz w:val="22"/>
-          <w:szCs w:val="22"/>
-        </w:rPr>
-        <w:t xml:space="preserve"> and Matplotlib. </w:t>
-      </w:r>
-      <w:r>
-        <w:rPr>
-          <w:sz w:val="22"/>
-          <w:szCs w:val="22"/>
-        </w:rPr>
-        <w:t>E</w:t>
-      </w:r>
-      <w:r>
-        <w:rPr>
-          <w:sz w:val="22"/>
-          <w:szCs w:val="22"/>
-        </w:rPr>
-        <w:t xml:space="preserve">nhanced </w:t>
-      </w:r>
-      <w:r>
-        <w:rPr>
-          <w:sz w:val="22"/>
-          <w:szCs w:val="22"/>
-        </w:rPr>
-        <w:t xml:space="preserve">web and desktop </w:t>
-      </w:r>
-      <w:r>
-        <w:rPr>
-          <w:sz w:val="22"/>
-          <w:szCs w:val="22"/>
-        </w:rPr>
-        <w:t>applications using requests and other libraries to perform tasks like HTTP</w:t>
-      </w:r>
-      <w:r>
-        <w:rPr>
-          <w:sz w:val="22"/>
-          <w:szCs w:val="22"/>
-        </w:rPr>
-        <w:t>(s)</w:t>
-      </w:r>
-      <w:r>
-        <w:rPr>
-          <w:sz w:val="22"/>
-          <w:szCs w:val="22"/>
-        </w:rPr>
-        <w:t xml:space="preserve"> requests to server</w:t>
-      </w:r>
-      <w:r>
-        <w:rPr>
-          <w:sz w:val="22"/>
-          <w:szCs w:val="22"/>
-        </w:rPr>
-        <w:t>s</w:t>
-      </w:r>
-      <w:r>
-        <w:rPr>
-          <w:sz w:val="22"/>
-          <w:szCs w:val="22"/>
-        </w:rPr>
-        <w:t>, consuming third-party REST APIs, and automating logins.</w:t>
-      </w:r>
-      <w:r>
-        <w:rPr>
-          <w:sz w:val="22"/>
-          <w:szCs w:val="22"/>
-        </w:rPr>
-        <w:t xml:space="preserve"> </w:t>
-      </w:r>
-      <w:r>
-        <w:rPr>
-          <w:sz w:val="22"/>
-          <w:szCs w:val="22"/>
-        </w:rPr>
-        <w:t>B</w:t>
-      </w:r>
-      <w:r>
-        <w:rPr>
-          <w:sz w:val="22"/>
-          <w:szCs w:val="22"/>
-        </w:rPr>
-        <w:t xml:space="preserve">uilt AI and ML models </w:t>
-      </w:r>
-      <w:r>
-        <w:rPr>
-          <w:sz w:val="22"/>
-          <w:szCs w:val="22"/>
-        </w:rPr>
-        <w:t xml:space="preserve">in </w:t>
-      </w:r>
-      <w:proofErr w:type="spellStart"/>
-      <w:r>
-        <w:rPr>
-          <w:sz w:val="22"/>
-          <w:szCs w:val="22"/>
-        </w:rPr>
-        <w:t>P</w:t>
-      </w:r>
-      <w:r>
-        <w:rPr>
-          <w:sz w:val="22"/>
-          <w:szCs w:val="22"/>
-        </w:rPr>
-        <w:t>rolog</w:t>
-      </w:r>
-      <w:proofErr w:type="spellEnd"/>
-      <w:r>
-        <w:rPr>
-          <w:sz w:val="22"/>
-          <w:szCs w:val="22"/>
-        </w:rPr>
-        <w:t xml:space="preserve"> and </w:t>
-      </w:r>
-      <w:r>
-        <w:rPr>
-          <w:sz w:val="22"/>
-          <w:szCs w:val="22"/>
-        </w:rPr>
-        <w:t>Python</w:t>
-      </w:r>
-      <w:r>
-        <w:rPr>
-          <w:sz w:val="22"/>
-          <w:szCs w:val="22"/>
-        </w:rPr>
-        <w:t>.</w:t>
-      </w:r>
-      <w:r>
-        <w:rPr>
-          <w:sz w:val="22"/>
-          <w:szCs w:val="22"/>
-        </w:rPr>
-        <w:t xml:space="preserve"> </w:t>
-      </w:r>
-    </w:p>
-    <w:p>
-      <w:pPr>
-        <w:pStyle w:val="Heading2"/>
-        <w:numPr>
-          <w:ilvl w:val="0"/>
-          <w:numId w:val="32"/>
-        </w:numPr>
-        <w:spacing w:after="0" w:line="240" w:lineRule="auto"/>
-        <w:jc w:val="both"/>
-        <w:rPr>
-          <w:sz w:val="22"/>
-          <w:szCs w:val="22"/>
-        </w:rPr>
-      </w:pPr>
-      <w:r>
-        <w:rPr>
-          <w:sz w:val="22"/>
-          <w:szCs w:val="22"/>
-        </w:rPr>
-        <w:t>REST-APIs:</w:t>
-      </w:r>
-    </w:p>
-    <w:p>
-      <w:pPr>
-        <w:pBdr>
-          <w:bottom w:val="single" w:sz="6" w:space="1" w:color="auto"/>
-        </w:pBdr>
-        <w:spacing w:line="240" w:lineRule="auto"/>
-        <w:ind w:left="0" w:right="281" w:firstLine="0"/>
-        <w:jc w:val="both"/>
-        <w:rPr>
-          <w:sz w:val="22"/>
-          <w:szCs w:val="22"/>
-        </w:rPr>
-      </w:pPr>
-      <w:r>
-        <w:rPr>
-          <w:sz w:val="22"/>
-          <w:szCs w:val="22"/>
-        </w:rPr>
-        <w:t xml:space="preserve">Proficient in creating and handling REST APIs </w:t>
-      </w:r>
-      <w:r>
-        <w:rPr>
-          <w:sz w:val="22"/>
-          <w:szCs w:val="22"/>
-        </w:rPr>
-        <w:t xml:space="preserve">and </w:t>
-      </w:r>
-      <w:r>
-        <w:rPr>
-          <w:sz w:val="22"/>
-          <w:szCs w:val="22"/>
-        </w:rPr>
-        <w:t>HTTP</w:t>
-      </w:r>
-      <w:r>
-        <w:rPr>
-          <w:sz w:val="22"/>
-          <w:szCs w:val="22"/>
-        </w:rPr>
-        <w:t>(s)</w:t>
-      </w:r>
-      <w:r>
-        <w:rPr>
-          <w:sz w:val="22"/>
-          <w:szCs w:val="22"/>
-        </w:rPr>
-        <w:t xml:space="preserve"> requests.</w:t>
-      </w:r>
-      <w:r>
-        <w:rPr>
-          <w:sz w:val="22"/>
-          <w:szCs w:val="22"/>
-        </w:rPr>
-        <w:t xml:space="preserve"> Delivered</w:t>
-      </w:r>
-      <w:r>
-        <w:rPr>
-          <w:sz w:val="22"/>
-          <w:szCs w:val="22"/>
-        </w:rPr>
-        <w:t xml:space="preserve"> optimized REST APIs in JavaScript and PHP and handled different types of data using database management systems like MYSQL</w:t>
-      </w:r>
-      <w:r>
-        <w:rPr>
-          <w:sz w:val="22"/>
-          <w:szCs w:val="22"/>
-        </w:rPr>
-        <w:t xml:space="preserve"> </w:t>
-      </w:r>
-      <w:r>
-        <w:rPr>
-          <w:sz w:val="22"/>
-          <w:szCs w:val="22"/>
-        </w:rPr>
-        <w:t>(SQL) and MongoDB</w:t>
-      </w:r>
-      <w:r>
-        <w:rPr>
-          <w:sz w:val="22"/>
-          <w:szCs w:val="22"/>
-        </w:rPr>
-        <w:t xml:space="preserve"> </w:t>
-      </w:r>
-      <w:r>
-        <w:rPr>
-          <w:sz w:val="22"/>
-          <w:szCs w:val="22"/>
-        </w:rPr>
-        <w:t xml:space="preserve">(NoSQL). </w:t>
-      </w:r>
-      <w:r>
-        <w:rPr>
-          <w:sz w:val="22"/>
-          <w:szCs w:val="22"/>
-        </w:rPr>
-        <w:t>C</w:t>
-      </w:r>
-      <w:r>
-        <w:rPr>
-          <w:sz w:val="22"/>
-          <w:szCs w:val="22"/>
-        </w:rPr>
-        <w:t xml:space="preserve">onsumed </w:t>
-      </w:r>
-      <w:r>
-        <w:rPr>
-          <w:sz w:val="22"/>
-          <w:szCs w:val="22"/>
-        </w:rPr>
-        <w:t>3rd</w:t>
-      </w:r>
-      <w:r>
-        <w:rPr>
-          <w:sz w:val="22"/>
-          <w:szCs w:val="22"/>
-        </w:rPr>
-        <w:t>-party APIs in Java, Python, JavaScript</w:t>
-      </w:r>
-      <w:r>
-        <w:rPr>
-          <w:sz w:val="22"/>
-          <w:szCs w:val="22"/>
-        </w:rPr>
-        <w:t>,</w:t>
-      </w:r>
-      <w:r>
-        <w:rPr>
-          <w:sz w:val="22"/>
-          <w:szCs w:val="22"/>
-        </w:rPr>
-        <w:t xml:space="preserve"> and PHP.</w:t>
-      </w:r>
-    </w:p>
-    <w:p>
-      <w:pPr>
-        <w:pBdr>
-          <w:bottom w:val="single" w:sz="6" w:space="1" w:color="auto"/>
-        </w:pBdr>
-        <w:spacing w:line="240" w:lineRule="auto"/>
-        <w:ind w:left="0" w:right="281" w:firstLine="0"/>
-        <w:jc w:val="both"/>
-        <w:rPr>
-          <w:sz w:val="22"/>
-          <w:szCs w:val="22"/>
-        </w:rPr>
-      </w:pPr>
-    </w:p>
-    <w:p>
-      <w:pPr>
-        <w:spacing w:line="240" w:lineRule="auto"/>
-        <w:ind w:right="0"/>
-        <w:jc w:val="center"/>
-        <w:rPr>
-          <w:sz w:val="22"/>
-          <w:szCs w:val="22"/>
-        </w:rPr>
-      </w:pPr>
       <w:r>
         <w:rPr>
           <w:b/>
           <w:bCs/>
-          <w:sz w:val="24"/>
-          <w:szCs w:val="24"/>
-        </w:rPr>
-        <w:t>Skills</w:t>
-      </w:r>
-    </w:p>
-    <w:p>
-      <w:pPr>
-        <w:pStyle w:val="ListParagraph"/>
-        <w:numPr>
-          <w:ilvl w:val="0"/>
-          <w:numId w:val="32"/>
-        </w:numPr>
-        <w:spacing w:line="240" w:lineRule="auto"/>
-        <w:ind w:right="281"/>
-        <w:jc w:val="both"/>
-        <w:rPr>
-          <w:sz w:val="22"/>
-          <w:szCs w:val="22"/>
-        </w:rPr>
-      </w:pPr>
-      <w:r>
-        <w:rPr>
-          <w:b/>
+        </w:rPr>
+        <w:t>Cisco:</w:t>
+      </w:r>
+      <w:r>
+        <w:rPr>
           <w:bCs/>
-          <w:sz w:val="22"/>
-          <w:szCs w:val="22"/>
-        </w:rPr>
-        <w:t>Languages</w:t>
-      </w:r>
-      <w:r>
-        <w:rPr>
-          <w:sz w:val="22"/>
-          <w:szCs w:val="22"/>
-        </w:rPr>
-        <w:t>: Java, JavaScript, Python, PHP, SQL,</w:t>
-      </w:r>
-      <w:r>
-        <w:rPr>
-          <w:sz w:val="22"/>
-          <w:szCs w:val="22"/>
-        </w:rPr>
-        <w:t xml:space="preserve"> C, C++, </w:t>
-      </w:r>
-      <w:r>
-        <w:rPr>
-          <w:sz w:val="22"/>
-          <w:szCs w:val="22"/>
-        </w:rPr>
-        <w:t xml:space="preserve">HTML, </w:t>
-      </w:r>
-      <w:r>
-        <w:rPr>
-          <w:sz w:val="22"/>
-          <w:szCs w:val="22"/>
-        </w:rPr>
-        <w:t xml:space="preserve">XML, </w:t>
-      </w:r>
-      <w:r>
-        <w:rPr>
-          <w:sz w:val="22"/>
-          <w:szCs w:val="22"/>
-        </w:rPr>
-        <w:t xml:space="preserve">CSS, </w:t>
-      </w:r>
-      <w:r>
-        <w:rPr>
-          <w:sz w:val="22"/>
-          <w:szCs w:val="22"/>
-        </w:rPr>
-        <w:t xml:space="preserve">and </w:t>
-      </w:r>
-      <w:r>
-        <w:rPr>
-          <w:sz w:val="22"/>
-          <w:szCs w:val="22"/>
-        </w:rPr>
-        <w:t>JSON.</w:t>
-      </w:r>
-      <w:r>
-        <w:rPr>
-          <w:sz w:val="22"/>
-          <w:szCs w:val="22"/>
+        </w:rPr>
+        <w:t xml:space="preserve"> Programming Essentials in Python;</w:t>
+      </w:r>
+      <w:r>
+        <w:rPr>
+          <w:bCs/>
         </w:rPr>
         <w:t xml:space="preserve"> </w:t>
-      </w:r>
-    </w:p>
-    <w:p>
-      <w:pPr>
-        <w:pStyle w:val="ListParagraph"/>
-        <w:numPr>
-          <w:ilvl w:val="0"/>
-          <w:numId w:val="32"/>
-        </w:numPr>
-        <w:spacing w:line="240" w:lineRule="auto"/>
-        <w:ind w:right="281"/>
-        <w:jc w:val="both"/>
-        <w:rPr>
-          <w:sz w:val="22"/>
-          <w:szCs w:val="22"/>
-        </w:rPr>
-      </w:pPr>
-      <w:r>
-        <w:rPr>
-          <w:b/>
-          <w:bCs/>
-          <w:sz w:val="22"/>
-          <w:szCs w:val="22"/>
-        </w:rPr>
-        <w:t>Technologies</w:t>
-      </w:r>
-      <w:r>
-        <w:rPr>
-          <w:sz w:val="22"/>
-          <w:szCs w:val="22"/>
-        </w:rPr>
-        <w:t>: REST APIs, microservices, multi</w:t>
-      </w:r>
-      <w:r>
-        <w:rPr>
-          <w:sz w:val="22"/>
-          <w:szCs w:val="22"/>
-        </w:rPr>
-        <w:t>-</w:t>
-      </w:r>
-      <w:r>
-        <w:rPr>
-          <w:sz w:val="22"/>
-          <w:szCs w:val="22"/>
-        </w:rPr>
-        <w:t xml:space="preserve">threading, MySQL, </w:t>
-      </w:r>
-      <w:r>
-        <w:rPr>
-          <w:sz w:val="22"/>
-          <w:szCs w:val="22"/>
-        </w:rPr>
-        <w:t>MongoDB</w:t>
-      </w:r>
-      <w:r>
-        <w:rPr>
-          <w:sz w:val="22"/>
-          <w:szCs w:val="22"/>
-        </w:rPr>
-        <w:t>, AWS</w:t>
-      </w:r>
-      <w:r>
-        <w:rPr>
-          <w:sz w:val="22"/>
-          <w:szCs w:val="22"/>
-        </w:rPr>
-        <w:t>, React</w:t>
-      </w:r>
-      <w:r>
-        <w:rPr>
-          <w:sz w:val="22"/>
-          <w:szCs w:val="22"/>
-        </w:rPr>
-        <w:t>.</w:t>
-      </w:r>
-    </w:p>
-    <w:p>
-      <w:pPr>
-        <w:pStyle w:val="ListParagraph"/>
-        <w:numPr>
-          <w:ilvl w:val="0"/>
-          <w:numId w:val="32"/>
-        </w:numPr>
-        <w:spacing w:line="240" w:lineRule="auto"/>
-        <w:ind w:right="281"/>
-        <w:jc w:val="both"/>
-        <w:rPr>
-          <w:bCs/>
-          <w:sz w:val="22"/>
-          <w:szCs w:val="22"/>
-        </w:rPr>
-      </w:pPr>
-      <w:r>
-        <w:rPr>
-          <w:b/>
-          <w:bCs/>
-          <w:sz w:val="22"/>
-          <w:szCs w:val="22"/>
-        </w:rPr>
-        <w:t xml:space="preserve">Tools: </w:t>
-      </w:r>
-      <w:r>
-        <w:rPr>
-          <w:sz w:val="22"/>
-          <w:szCs w:val="22"/>
-        </w:rPr>
-        <w:t xml:space="preserve">Git, GitHub, GitHub Actions, </w:t>
-      </w:r>
-      <w:r>
-        <w:rPr>
-          <w:sz w:val="22"/>
-          <w:szCs w:val="22"/>
-        </w:rPr>
-        <w:t xml:space="preserve">Docker, </w:t>
-      </w:r>
-      <w:r>
-        <w:rPr>
-          <w:sz w:val="22"/>
-          <w:szCs w:val="22"/>
-        </w:rPr>
-        <w:t xml:space="preserve">Postman, Selenium, </w:t>
-      </w:r>
-      <w:r>
-        <w:rPr>
-          <w:sz w:val="22"/>
-          <w:szCs w:val="22"/>
-        </w:rPr>
-        <w:t>VS Code</w:t>
-      </w:r>
-      <w:r>
-        <w:rPr>
-          <w:sz w:val="22"/>
-          <w:szCs w:val="22"/>
-        </w:rPr>
-        <w:t>,</w:t>
-      </w:r>
-      <w:r>
-        <w:rPr>
-          <w:sz w:val="22"/>
-          <w:szCs w:val="22"/>
-        </w:rPr>
-        <w:t xml:space="preserve"> and</w:t>
-      </w:r>
-      <w:r>
-        <w:rPr>
-          <w:sz w:val="22"/>
-          <w:szCs w:val="22"/>
-        </w:rPr>
-        <w:t xml:space="preserve"> Android Studio</w:t>
-      </w:r>
-      <w:r>
-        <w:rPr>
-          <w:sz w:val="22"/>
-          <w:szCs w:val="22"/>
-        </w:rPr>
-        <w:t>.</w:t>
-      </w:r>
-    </w:p>
-    <w:p>
-      <w:pPr>
-        <w:pBdr>
-          <w:bottom w:val="single" w:sz="6" w:space="1" w:color="auto"/>
-        </w:pBdr>
-        <w:spacing w:line="240" w:lineRule="auto"/>
-        <w:ind w:right="281"/>
-        <w:jc w:val="both"/>
-        <w:rPr>
-          <w:b/>
-          <w:bCs/>
-          <w:sz w:val="24"/>
-          <w:szCs w:val="24"/>
-        </w:rPr>
-      </w:pPr>
-    </w:p>
-    <w:p>
-      <w:pPr>
-        <w:spacing w:line="240" w:lineRule="auto"/>
-        <w:ind w:left="0" w:right="281" w:firstLine="0"/>
-        <w:jc w:val="center"/>
-        <w:rPr>
-          <w:b/>
-          <w:bCs/>
-          <w:sz w:val="24"/>
-          <w:szCs w:val="24"/>
-        </w:rPr>
-      </w:pPr>
-      <w:r>
-        <w:rPr>
-          <w:b/>
-          <w:bCs/>
-          <w:sz w:val="24"/>
-          <w:szCs w:val="24"/>
-        </w:rPr>
-        <w:t xml:space="preserve">  </w:t>
-      </w:r>
-      <w:r>
-        <w:rPr>
-          <w:b/>
-          <w:bCs/>
-          <w:sz w:val="24"/>
-          <w:szCs w:val="24"/>
-        </w:rPr>
-        <w:t>Certifications</w:t>
-      </w:r>
-    </w:p>
-    <w:p>
-      <w:pPr>
-        <w:spacing w:line="240" w:lineRule="auto"/>
-        <w:ind w:right="281"/>
-        <w:jc w:val="both"/>
-        <w:rPr>
-          <w:bCs/>
-          <w:sz w:val="22"/>
-          <w:szCs w:val="22"/>
-        </w:rPr>
-      </w:pPr>
-      <w:r>
-        <w:rPr>
-          <w:b/>
-          <w:bCs/>
-          <w:sz w:val="22"/>
-          <w:szCs w:val="22"/>
-        </w:rPr>
-        <w:t>AWS:</w:t>
-      </w:r>
-      <w:r>
-        <w:rPr>
-          <w:sz w:val="22"/>
-          <w:szCs w:val="22"/>
-        </w:rPr>
-        <w:t xml:space="preserve"> </w:t>
-      </w:r>
-      <w:r>
-        <w:rPr>
-          <w:bCs/>
-          <w:sz w:val="22"/>
-          <w:szCs w:val="22"/>
-        </w:rPr>
-        <w:t xml:space="preserve">Cloud Foundations; </w:t>
-      </w:r>
-      <w:r>
-        <w:rPr>
-          <w:b/>
-          <w:bCs/>
-          <w:sz w:val="22"/>
-          <w:szCs w:val="22"/>
-        </w:rPr>
-        <w:t>Cisco</w:t>
-      </w:r>
-      <w:r>
-        <w:rPr>
-          <w:b/>
-          <w:bCs/>
-          <w:sz w:val="22"/>
-          <w:szCs w:val="22"/>
-        </w:rPr>
-        <w:t>:</w:t>
-      </w:r>
-      <w:r>
-        <w:rPr>
-          <w:bCs/>
-          <w:sz w:val="22"/>
-          <w:szCs w:val="22"/>
-        </w:rPr>
-        <w:t xml:space="preserve"> NDG Linux Unhatched</w:t>
-      </w:r>
-      <w:r>
-        <w:rPr>
-          <w:bCs/>
-          <w:sz w:val="22"/>
-          <w:szCs w:val="22"/>
-        </w:rPr>
-        <w:t>;</w:t>
-      </w:r>
-      <w:r>
-        <w:rPr>
-          <w:bCs/>
-          <w:sz w:val="22"/>
-          <w:szCs w:val="22"/>
-        </w:rPr>
-        <w:t xml:space="preserve"> </w:t>
-      </w:r>
-      <w:r>
-        <w:rPr>
-          <w:b/>
-          <w:bCs/>
-          <w:sz w:val="22"/>
-          <w:szCs w:val="22"/>
-        </w:rPr>
-        <w:t>Cisco:</w:t>
-      </w:r>
-      <w:r>
-        <w:rPr>
-          <w:bCs/>
-          <w:sz w:val="22"/>
-          <w:szCs w:val="22"/>
-        </w:rPr>
-        <w:t xml:space="preserve"> Programming </w:t>
-      </w:r>
-      <w:r>
-        <w:rPr>
-          <w:bCs/>
-          <w:sz w:val="22"/>
-          <w:szCs w:val="22"/>
-        </w:rPr>
-        <w:t>E</w:t>
-      </w:r>
-      <w:r>
-        <w:rPr>
-          <w:bCs/>
-          <w:sz w:val="22"/>
-          <w:szCs w:val="22"/>
-        </w:rPr>
-        <w:t xml:space="preserve">ssentials in Python; </w:t>
       </w:r>
     </w:p>
     <w:p>
@@ -3505,197 +2861,53 @@
         <w:ind w:right="0"/>
         <w:jc w:val="both"/>
         <w:rPr>
+          <w:bCs/>
+        </w:rPr>
+      </w:pPr>
+      <w:r>
+        <w:rPr>
           <w:b/>
           <w:bCs/>
-          <w:sz w:val="22"/>
-          <w:szCs w:val="22"/>
-        </w:rPr>
-      </w:pPr>
+        </w:rPr>
+        <w:t>Cisco:</w:t>
+      </w:r>
+      <w:r>
+        <w:rPr>
+          <w:bCs/>
+        </w:rPr>
+        <w:t xml:space="preserve"> Networking Basics;</w:t>
+      </w:r>
+      <w:r>
+        <w:rPr>
+          <w:bCs/>
+        </w:rPr>
+        <w:t xml:space="preserve"> </w:t>
+      </w:r>
       <w:r>
         <w:rPr>
           <w:b/>
           <w:bCs/>
-          <w:sz w:val="22"/>
-          <w:szCs w:val="22"/>
-        </w:rPr>
-        <w:t>Cisco:</w:t>
+        </w:rPr>
+        <w:t>IIT KGP(NPTEL):</w:t>
       </w:r>
       <w:r>
         <w:rPr>
           <w:bCs/>
-          <w:sz w:val="22"/>
-          <w:szCs w:val="22"/>
-        </w:rPr>
-        <w:t xml:space="preserve"> Networking Basics;</w:t>
-      </w:r>
-      <w:r>
-        <w:rPr>
-          <w:bCs/>
-          <w:sz w:val="22"/>
-          <w:szCs w:val="22"/>
-        </w:rPr>
-        <w:t xml:space="preserve"> </w:t>
+        </w:rPr>
+        <w:t xml:space="preserve"> Programming in Java; </w:t>
       </w:r>
       <w:r>
         <w:rPr>
           <w:b/>
           <w:bCs/>
-          <w:sz w:val="22"/>
-          <w:szCs w:val="22"/>
-        </w:rPr>
-        <w:t>IIT</w:t>
-      </w:r>
-      <w:r>
-        <w:rPr>
-          <w:b/>
+        </w:rPr>
+        <w:t>IIT Bombay:</w:t>
+      </w:r>
+      <w:r>
+        <w:rPr>
           <w:bCs/>
-          <w:sz w:val="22"/>
-          <w:szCs w:val="22"/>
-        </w:rPr>
-        <w:t xml:space="preserve"> KGP</w:t>
-      </w:r>
-      <w:r>
-        <w:rPr>
-          <w:b/>
-          <w:bCs/>
-          <w:sz w:val="22"/>
-          <w:szCs w:val="22"/>
-        </w:rPr>
-        <w:t>(</w:t>
-      </w:r>
-      <w:r>
-        <w:rPr>
-          <w:b/>
-          <w:bCs/>
-          <w:sz w:val="22"/>
-          <w:szCs w:val="22"/>
-        </w:rPr>
-        <w:t>NPTE</w:t>
-      </w:r>
-      <w:r>
-        <w:rPr>
-          <w:b/>
-          <w:bCs/>
-          <w:sz w:val="22"/>
-          <w:szCs w:val="22"/>
-        </w:rPr>
-        <w:t>L</w:t>
-      </w:r>
-      <w:r>
-        <w:rPr>
-          <w:b/>
-          <w:bCs/>
-          <w:sz w:val="22"/>
-          <w:szCs w:val="22"/>
-        </w:rPr>
-        <w:t>):</w:t>
-      </w:r>
-      <w:r>
-        <w:rPr>
-          <w:bCs/>
-          <w:sz w:val="22"/>
-          <w:szCs w:val="22"/>
-        </w:rPr>
-        <w:t xml:space="preserve"> Programming in </w:t>
-      </w:r>
-      <w:r>
-        <w:rPr>
-          <w:bCs/>
-          <w:sz w:val="22"/>
-          <w:szCs w:val="22"/>
-        </w:rPr>
-        <w:t>Java</w:t>
-      </w:r>
-      <w:r>
-        <w:rPr>
-          <w:bCs/>
-          <w:sz w:val="22"/>
-          <w:szCs w:val="22"/>
-        </w:rPr>
-        <w:t>;</w:t>
-      </w:r>
-      <w:r>
-        <w:rPr>
-          <w:bCs/>
-          <w:sz w:val="22"/>
-          <w:szCs w:val="22"/>
-        </w:rPr>
-        <w:t xml:space="preserve"> </w:t>
-      </w:r>
-      <w:r>
-        <w:rPr>
-          <w:b/>
-          <w:bCs/>
-          <w:sz w:val="22"/>
-          <w:szCs w:val="22"/>
-        </w:rPr>
-        <w:t>IIT Bomba</w:t>
-      </w:r>
-      <w:r>
-        <w:rPr>
-          <w:b/>
-          <w:bCs/>
-          <w:sz w:val="22"/>
-          <w:szCs w:val="22"/>
-        </w:rPr>
-        <w:t>y</w:t>
-      </w:r>
-      <w:r>
-        <w:rPr>
-          <w:b/>
-          <w:bCs/>
-          <w:sz w:val="22"/>
-          <w:szCs w:val="22"/>
-        </w:rPr>
-        <w:t>:</w:t>
-      </w:r>
-      <w:r>
-        <w:rPr>
-          <w:bCs/>
-          <w:sz w:val="22"/>
-          <w:szCs w:val="22"/>
-        </w:rPr>
-        <w:t xml:space="preserve"> </w:t>
-      </w:r>
-      <w:r>
-        <w:rPr>
-          <w:bCs/>
-          <w:sz w:val="22"/>
-          <w:szCs w:val="22"/>
-        </w:rPr>
-        <w:t>W</w:t>
-      </w:r>
-      <w:r>
-        <w:rPr>
-          <w:bCs/>
-          <w:sz w:val="22"/>
-          <w:szCs w:val="22"/>
-        </w:rPr>
-        <w:t xml:space="preserve">eb </w:t>
-      </w:r>
-      <w:r>
-        <w:rPr>
-          <w:bCs/>
-          <w:sz w:val="22"/>
-          <w:szCs w:val="22"/>
-        </w:rPr>
-        <w:t>d</w:t>
-      </w:r>
-      <w:r>
-        <w:rPr>
-          <w:bCs/>
-          <w:sz w:val="22"/>
-          <w:szCs w:val="22"/>
-        </w:rPr>
-        <w:t>evelopment</w:t>
-      </w:r>
-      <w:r>
-        <w:rPr>
-          <w:bCs/>
-          <w:sz w:val="22"/>
-          <w:szCs w:val="22"/>
-        </w:rPr>
-        <w:t>;</w:t>
+        </w:rPr>
+        <w:t xml:space="preserve"> Web development;</w:t>
       </w:r>
     </w:p>
     <w:sectPr>
@@ -3781,42 +2993,42 @@
         <v:path o:extrusionok="f" gradientshapeok="t" o:connecttype="rect"/>
         <o:lock v:ext="edit" aspectratio="t"/>
       </v:shapetype>
-      <v:shape id="_x0000_i1513" type="#_x0000_t75" style="width:512pt;height:512pt;rotation:180;flip:x y;visibility:visible;mso-wrap-style:square" o:bullet="t">
+      <v:shape id="_x0000_i1422" type="#_x0000_t75" style="width:511.8pt;height:511.8pt;rotation:180;flip:x y;visibility:visible;mso-wrap-style:square" o:bullet="t">
         <v:imagedata r:id="rId1" o:title="107161_circle_github_icon"/>
       </v:shape>
     </w:pict>
   </w:numPicBullet>
   <w:numPicBullet w:numPicBulletId="1">
     <w:pict>
-      <v:shape id="_x0000_i1514" type="#_x0000_t75" style="width:169pt;height:169pt;visibility:visible;mso-wrap-style:square" o:bullet="t">
+      <v:shape id="_x0000_i1423" type="#_x0000_t75" style="width:169.2pt;height:169.2pt;visibility:visible;mso-wrap-style:square" o:bullet="t">
         <v:imagedata r:id="rId2" o:title="941C13C7"/>
       </v:shape>
     </w:pict>
   </w:numPicBullet>
   <w:numPicBullet w:numPicBulletId="2">
     <w:pict>
-      <v:shape id="_x0000_i1515" type="#_x0000_t75" style="width:29pt;height:16pt;visibility:visible;mso-wrap-style:square" o:bullet="t">
+      <v:shape id="_x0000_i1424" type="#_x0000_t75" style="width:28.8pt;height:16.2pt;visibility:visible;mso-wrap-style:square" o:bullet="t">
         <v:imagedata r:id="rId3" o:title="107161_circle_github_icon"/>
       </v:shape>
     </w:pict>
   </w:numPicBullet>
   <w:numPicBullet w:numPicBulletId="3">
     <w:pict>
-      <v:shape id="_x0000_i1516" type="#_x0000_t75" style="width:240pt;height:234pt;visibility:visible;mso-wrap-style:square" o:bullet="t">
+      <v:shape id="_x0000_i1425" type="#_x0000_t75" style="width:240pt;height:234pt;visibility:visible;mso-wrap-style:square" o:bullet="t">
         <v:imagedata r:id="rId4" o:title="Indian_Institute_of_Technology_Bombay_Logo"/>
       </v:shape>
     </w:pict>
   </w:numPicBullet>
   <w:numPicBullet w:numPicBulletId="4">
     <w:pict>
-      <v:shape id="_x0000_i1517" type="#_x0000_t75" style="width:22pt;height:16pt;visibility:visible;mso-wrap-style:square" o:bullet="t">
+      <v:shape id="_x0000_i1426" type="#_x0000_t75" style="width:22.2pt;height:16.2pt;visibility:visible;mso-wrap-style:square" o:bullet="t">
         <v:imagedata r:id="rId5" o:title="Indian_Institute_of_Technology_Bombay_Logo"/>
       </v:shape>
     </w:pict>
   </w:numPicBullet>
   <w:numPicBullet w:numPicBulletId="5">
     <w:pict>
-      <v:shape id="_x0000_i1518" type="#_x0000_t75" style="width:77pt;height:77pt;visibility:visible;mso-wrap-style:square" o:bullet="t">
+      <v:shape id="_x0000_i1427" type="#_x0000_t75" style="width:76.8pt;height:76.8pt;visibility:visible;mso-wrap-style:square" o:bullet="t">
         <v:imagedata r:id="rId6" o:title=""/>
       </v:shape>
     </w:pict>

</xml_diff>

<commit_message>
Address removed, single programming language, project names updated and medicine line added
</commit_message>
<xml_diff>
--- a/Resume_latest - Copy.docx
+++ b/Resume_latest - Copy.docx
@@ -7,15 +7,15 @@
         <w:pStyle w:val="Heading1"/>
         <w:spacing w:after="0" w:line="240" w:lineRule="auto"/>
         <w:ind w:left="0" w:firstLine="0"/>
-        <w:jc w:val="both"/>
-        <w:rPr>
-          <w:sz w:val="20"/>
-        </w:rPr>
-      </w:pPr>
-      <w:r>
+        <w:jc w:val="center"/>
         <w:rPr>
           <w:szCs w:val="28"/>
         </w:rPr>
+      </w:pPr>
+      <w:r>
+        <w:rPr>
+          <w:szCs w:val="28"/>
+        </w:rPr>
         <w:t>P</w:t>
       </w:r>
       <w:r>
@@ -41,37 +41,6 @@
           <w:szCs w:val="28"/>
         </w:rPr>
         <w:t>t</w:t>
-      </w:r>
-      <w:r>
-        <w:rPr>
-          <w:b w:val="0"/>
-          <w:bCs/>
-          <w:szCs w:val="28"/>
-        </w:rPr>
-        <w:t xml:space="preserve"> </w:t>
-      </w:r>
-      <w:r>
-        <w:rPr>
-          <w:b w:val="0"/>
-          <w:bCs/>
-          <w:szCs w:val="28"/>
-        </w:rPr>
-        <w:t>|</w:t>
-      </w:r>
-      <w:r>
-        <w:rPr>
-          <w:b w:val="0"/>
-          <w:bCs/>
-          <w:sz w:val="32"/>
-          <w:szCs w:val="32"/>
-        </w:rPr>
-        <w:t xml:space="preserve"> </w:t>
-      </w:r>
-      <w:r>
-        <w:rPr>
-          <w:sz w:val="20"/>
-        </w:rPr>
-        <w:t>Nagpur, Maharashtra, India [440027]</w:t>
       </w:r>
     </w:p>
     <w:p>
@@ -79,7 +48,6 @@
         <w:pStyle w:val="Heading1"/>
         <w:spacing w:after="0" w:line="240" w:lineRule="auto"/>
         <w:ind w:left="0" w:firstLine="0"/>
-        <w:jc w:val="both"/>
         <w:rPr>
           <w:b w:val="0"/>
           <w:sz w:val="20"/>
@@ -284,8 +252,21 @@
             <w:u w:val="none"/>
             <w:shd w:val="clear" w:color="auto" w:fill="FFFFFF"/>
           </w:rPr>
-          <w:t>inkedin.com/in/prathameshvivekbhagat</w:t>
+          <w:t>inkedin.com/in/</w:t>
         </w:r>
+        <w:proofErr w:type="spellStart"/>
+        <w:r>
+          <w:rPr>
+            <w:rStyle w:val="Hyperlink"/>
+            <w:b w:val="0"/>
+            <w:bCs/>
+            <w:sz w:val="20"/>
+            <w:u w:val="none"/>
+            <w:shd w:val="clear" w:color="auto" w:fill="FFFFFF"/>
+          </w:rPr>
+          <w:t>prathameshvivekbhagat</w:t>
+        </w:r>
+        <w:proofErr w:type="spellEnd"/>
       </w:hyperlink>
       <w:r>
         <w:rPr>
@@ -391,7 +372,6 @@
         </w:pBdr>
         <w:spacing w:line="240" w:lineRule="auto"/>
         <w:ind w:left="0" w:right="0" w:firstLine="10"/>
-        <w:jc w:val="both"/>
         <w:rPr>
           <w:bCs/>
         </w:rPr>
@@ -465,8 +445,17 @@
             <w:rStyle w:val="Hyperlink"/>
             <w:u w:val="none"/>
           </w:rPr>
-          <w:t>github.com/PrathameshBhagat</w:t>
+          <w:t>github.com/</w:t>
         </w:r>
+        <w:proofErr w:type="spellStart"/>
+        <w:r>
+          <w:rPr>
+            <w:rStyle w:val="Hyperlink"/>
+            <w:u w:val="none"/>
+          </w:rPr>
+          <w:t>PrathameshBhagat</w:t>
+        </w:r>
+        <w:proofErr w:type="spellEnd"/>
         <w:r>
           <w:rPr>
             <w:rStyle w:val="Hyperlink"/>
@@ -738,13 +727,21 @@
         <w:t>+</w:t>
       </w:r>
       <w:r>
-        <w:t xml:space="preserve"> Leet</w:t>
+        <w:t xml:space="preserve"> </w:t>
+      </w:r>
+      <w:proofErr w:type="spellStart"/>
+      <w:r>
+        <w:t>Leet</w:t>
       </w:r>
       <w:r>
         <w:t>C</w:t>
       </w:r>
       <w:r>
-        <w:t>ode problems</w:t>
+        <w:t>ode</w:t>
+      </w:r>
+      <w:proofErr w:type="spellEnd"/>
+      <w:r>
+        <w:t xml:space="preserve"> problems</w:t>
       </w:r>
       <w:r>
         <w:t>,</w:t>
@@ -897,6 +894,7 @@
         <w:r>
           <w:rPr>
             <w:rStyle w:val="Hyperlink"/>
+            <w:b/>
             <w:bCs/>
             <w:u w:val="none"/>
           </w:rPr>
@@ -967,8 +965,8 @@
         <w:r>
           <w:rPr>
             <w:rStyle w:val="Hyperlink"/>
-            <w:sz w:val="21"/>
-            <w:szCs w:val="21"/>
+            <w:b/>
+            <w:bCs/>
             <w:u w:val="none"/>
             <w:shd w:val="clear" w:color="auto" w:fill="FFFFFF"/>
           </w:rPr>
@@ -977,6 +975,7 @@
       </w:hyperlink>
       <w:r>
         <w:rPr>
+          <w:b/>
           <w:bCs/>
           <w:cs/>
         </w:rPr>
@@ -1132,6 +1131,8 @@
         <w:spacing w:after="0" w:line="240" w:lineRule="auto"/>
         <w:ind w:right="0"/>
         <w:rPr>
+          <w:b/>
+          <w:bCs/>
           <w:szCs w:val="20"/>
         </w:rPr>
       </w:pPr>
@@ -1139,8 +1140,9 @@
         <w:r>
           <w:rPr>
             <w:rStyle w:val="Hyperlink"/>
-            <w:sz w:val="22"/>
-            <w:szCs w:val="22"/>
+            <w:b/>
+            <w:bCs/>
+            <w:szCs w:val="20"/>
             <w:u w:val="none"/>
           </w:rPr>
           <w:t>OFY Wellness Android app</w:t>
@@ -1148,30 +1150,11 @@
       </w:hyperlink>
       <w:r>
         <w:rPr>
-          <w:sz w:val="22"/>
-          <w:szCs w:val="22"/>
-        </w:rPr>
-        <w:t xml:space="preserve"> </w:t>
-      </w:r>
-      <w:r>
-        <w:rPr>
-          <w:szCs w:val="20"/>
-        </w:rPr>
-        <w:t>(</w:t>
-      </w:r>
-      <w:r>
-        <w:rPr>
           <w:b/>
           <w:bCs/>
           <w:szCs w:val="20"/>
         </w:rPr>
-        <w:t>Java</w:t>
-      </w:r>
-      <w:r>
-        <w:rPr>
-          <w:szCs w:val="20"/>
-        </w:rPr>
-        <w:t>)</w:t>
+        <w:t xml:space="preserve"> (Java)</w:t>
       </w:r>
     </w:p>
     <w:p>
@@ -1264,7 +1247,7 @@
         <w:rPr>
           <w:szCs w:val="20"/>
         </w:rPr>
-        <w:t xml:space="preserve">. </w:t>
+        <w:t>.</w:t>
       </w:r>
     </w:p>
     <w:p>
@@ -1285,19 +1268,7 @@
         <w:rPr>
           <w:szCs w:val="20"/>
         </w:rPr>
-        <w:t>Added</w:t>
-      </w:r>
-      <w:r>
-        <w:rPr>
-          <w:szCs w:val="20"/>
-        </w:rPr>
-        <w:t xml:space="preserve"> </w:t>
-      </w:r>
-      <w:r>
-        <w:rPr>
-          <w:szCs w:val="20"/>
-        </w:rPr>
-        <w:t>broadcast messaging features for users to interact with each other.</w:t>
+        <w:t>Tuned the model and improved meal image and nutrient detection by over 50%.</w:t>
       </w:r>
     </w:p>
     <w:p>
@@ -1318,49 +1289,19 @@
         <w:rPr>
           <w:szCs w:val="20"/>
         </w:rPr>
-        <w:t>Tun</w:t>
-      </w:r>
-      <w:r>
-        <w:rPr>
-          <w:szCs w:val="20"/>
-        </w:rPr>
-        <w:t>ed</w:t>
-      </w:r>
-      <w:r>
-        <w:rPr>
-          <w:szCs w:val="20"/>
-        </w:rPr>
-        <w:t xml:space="preserve"> the model and i</w:t>
-      </w:r>
-      <w:r>
-        <w:rPr>
-          <w:szCs w:val="20"/>
-        </w:rPr>
-        <w:t>mproved meal image and nutrient detection by</w:t>
-      </w:r>
-      <w:r>
-        <w:rPr>
-          <w:szCs w:val="20"/>
-        </w:rPr>
-        <w:t xml:space="preserve"> ov</w:t>
-      </w:r>
-      <w:r>
-        <w:rPr>
-          <w:szCs w:val="20"/>
-        </w:rPr>
-        <w:t>e</w:t>
-      </w:r>
-      <w:r>
-        <w:rPr>
-          <w:szCs w:val="20"/>
-        </w:rPr>
-        <w:t xml:space="preserve">r </w:t>
-      </w:r>
-      <w:r>
-        <w:rPr>
-          <w:szCs w:val="20"/>
-        </w:rPr>
-        <w:t>50%.</w:t>
+        <w:t>Added</w:t>
+      </w:r>
+      <w:r>
+        <w:rPr>
+          <w:szCs w:val="20"/>
+        </w:rPr>
+        <w:t xml:space="preserve"> broadcast messaging features for users to interact with each other</w:t>
+      </w:r>
+      <w:r>
+        <w:rPr>
+          <w:szCs w:val="20"/>
+        </w:rPr>
+        <w:t>.</w:t>
       </w:r>
     </w:p>
     <w:p>
@@ -1381,6 +1322,47 @@
         <w:rPr>
           <w:szCs w:val="20"/>
         </w:rPr>
+        <w:t xml:space="preserve">Complemented meal logging with </w:t>
+      </w:r>
+      <w:r>
+        <w:rPr>
+          <w:szCs w:val="20"/>
+        </w:rPr>
+        <w:t>medicine intake logging and viewing</w:t>
+      </w:r>
+      <w:r>
+        <w:rPr>
+          <w:szCs w:val="20"/>
+        </w:rPr>
+        <w:t xml:space="preserve"> features</w:t>
+      </w:r>
+      <w:r>
+        <w:rPr>
+          <w:szCs w:val="20"/>
+        </w:rPr>
+        <w:t>.</w:t>
+      </w:r>
+    </w:p>
+    <w:p>
+      <w:pPr>
+        <w:pStyle w:val="ListParagraph"/>
+        <w:numPr>
+          <w:ilvl w:val="0"/>
+          <w:numId w:val="32"/>
+        </w:numPr>
+        <w:spacing w:line="240" w:lineRule="auto"/>
+        <w:ind w:right="0"/>
+        <w:jc w:val="both"/>
+        <w:rPr>
+          <w:b/>
+          <w:bCs/>
+          <w:szCs w:val="20"/>
+        </w:rPr>
+      </w:pPr>
+      <w:r>
+        <w:rPr>
+          <w:szCs w:val="20"/>
+        </w:rPr>
         <w:t xml:space="preserve">Close to </w:t>
       </w:r>
       <w:r>
@@ -1407,6 +1389,8 @@
         <w:ind w:right="0"/>
         <w:jc w:val="both"/>
         <w:rPr>
+          <w:b/>
+          <w:bCs/>
           <w:szCs w:val="20"/>
         </w:rPr>
       </w:pPr>
@@ -1415,8 +1399,9 @@
           <w:rPr>
             <w:rStyle w:val="Hyperlink"/>
             <w:rFonts w:cs="Arial"/>
-            <w:sz w:val="22"/>
-            <w:szCs w:val="22"/>
+            <w:b/>
+            <w:bCs/>
+            <w:szCs w:val="20"/>
             <w:u w:val="none"/>
           </w:rPr>
           <w:t>A Spring Boot</w:t>
@@ -1424,8 +1409,9 @@
         <w:r>
           <w:rPr>
             <w:rStyle w:val="Hyperlink"/>
-            <w:sz w:val="22"/>
-            <w:szCs w:val="22"/>
+            <w:b/>
+            <w:bCs/>
+            <w:szCs w:val="20"/>
             <w:u w:val="none"/>
           </w:rPr>
           <w:t xml:space="preserve"> revenue converter</w:t>
@@ -1433,30 +1419,11 @@
       </w:hyperlink>
       <w:r>
         <w:rPr>
-          <w:sz w:val="22"/>
-          <w:szCs w:val="22"/>
-        </w:rPr>
-        <w:t xml:space="preserve"> </w:t>
-      </w:r>
-      <w:r>
-        <w:rPr>
-          <w:szCs w:val="20"/>
-        </w:rPr>
-        <w:t>(</w:t>
-      </w:r>
-      <w:r>
-        <w:rPr>
           <w:b/>
           <w:bCs/>
           <w:szCs w:val="20"/>
         </w:rPr>
-        <w:t>Java</w:t>
-      </w:r>
-      <w:r>
-        <w:rPr>
-          <w:szCs w:val="20"/>
-        </w:rPr>
-        <w:t>)</w:t>
+        <w:t xml:space="preserve"> (Java)</w:t>
       </w:r>
     </w:p>
     <w:p>
@@ -1477,7 +1444,13 @@
         <w:rPr>
           <w:szCs w:val="20"/>
         </w:rPr>
-        <w:t>Developed a Spring Boot revenue converter to convert earnings into different time brackets to assist</w:t>
+        <w:t xml:space="preserve">Built </w:t>
+      </w:r>
+      <w:r>
+        <w:rPr>
+          <w:szCs w:val="20"/>
+        </w:rPr>
+        <w:t>a Spring Boot revenue converter and scaled</w:t>
       </w:r>
       <w:r>
         <w:rPr>
@@ -1489,13 +1462,13 @@
         <w:rPr>
           <w:szCs w:val="20"/>
         </w:rPr>
-        <w:t>costs</w:t>
-      </w:r>
-      <w:r>
-        <w:rPr>
-          <w:szCs w:val="20"/>
-        </w:rPr>
-        <w:t xml:space="preserve"> and revenue calculations</w:t>
+        <w:t>conversion feature</w:t>
+      </w:r>
+      <w:r>
+        <w:rPr>
+          <w:szCs w:val="20"/>
+        </w:rPr>
+        <w:t xml:space="preserve"> to 10+ currency pairs</w:t>
       </w:r>
       <w:r>
         <w:rPr>
@@ -1518,17 +1491,127 @@
           <w:szCs w:val="20"/>
         </w:rPr>
       </w:pPr>
-      <w:r>
-        <w:rPr>
-          <w:szCs w:val="20"/>
-        </w:rPr>
-        <w:t>Supplemented currency conversion feature and scaled currency pairs to 10+ currency pairs</w:t>
-      </w:r>
-      <w:r>
-        <w:rPr>
-          <w:szCs w:val="20"/>
-        </w:rPr>
-        <w:t xml:space="preserve">. </w:t>
+      <w:proofErr w:type="spellStart"/>
+      <w:r>
+        <w:rPr>
+          <w:szCs w:val="20"/>
+        </w:rPr>
+        <w:t>Dockerized</w:t>
+      </w:r>
+      <w:proofErr w:type="spellEnd"/>
+      <w:r>
+        <w:rPr>
+          <w:szCs w:val="20"/>
+        </w:rPr>
+        <w:t xml:space="preserve"> </w:t>
+      </w:r>
+      <w:r>
+        <w:rPr>
+          <w:szCs w:val="20"/>
+        </w:rPr>
+        <w:t>the Spring Boot application and increased its availability by more than 10% by deploying it</w:t>
+      </w:r>
+      <w:r>
+        <w:rPr>
+          <w:szCs w:val="20"/>
+        </w:rPr>
+        <w:t xml:space="preserve"> to</w:t>
+      </w:r>
+      <w:r>
+        <w:rPr>
+          <w:szCs w:val="20"/>
+        </w:rPr>
+        <w:t xml:space="preserve"> </w:t>
+      </w:r>
+      <w:r>
+        <w:rPr>
+          <w:szCs w:val="20"/>
+        </w:rPr>
+        <w:t>an AWS EC2 instance and</w:t>
+      </w:r>
+      <w:r>
+        <w:rPr>
+          <w:szCs w:val="20"/>
+        </w:rPr>
+        <w:t xml:space="preserve"> multiple Docker container</w:t>
+      </w:r>
+      <w:r>
+        <w:rPr>
+          <w:szCs w:val="20"/>
+        </w:rPr>
+        <w:t>s</w:t>
+      </w:r>
+      <w:r>
+        <w:rPr>
+          <w:szCs w:val="20"/>
+        </w:rPr>
+        <w:t>.</w:t>
+      </w:r>
+    </w:p>
+    <w:p>
+      <w:pPr>
+        <w:spacing w:line="240" w:lineRule="auto"/>
+        <w:ind w:right="0"/>
+        <w:jc w:val="both"/>
+      </w:pPr>
+    </w:p>
+    <w:p>
+      <w:pPr>
+        <w:tabs>
+          <w:tab w:val="right" w:pos="10490"/>
+        </w:tabs>
+        <w:spacing w:line="240" w:lineRule="auto"/>
+        <w:ind w:left="0" w:right="0" w:firstLine="0"/>
+        <w:jc w:val="both"/>
+      </w:pPr>
+      <w:r>
+        <w:rPr>
+          <w:b/>
+          <w:bCs/>
+        </w:rPr>
+        <w:t>Software Developer</w:t>
+      </w:r>
+      <w:r>
+        <w:rPr>
+          <w:rFonts w:cstheme="minorBidi"/>
+          <w:b/>
+          <w:bCs/>
+        </w:rPr>
+        <w:t xml:space="preserve"> Freelancer</w:t>
+      </w:r>
+      <w:r>
+        <w:t xml:space="preserve"> | </w:t>
+      </w:r>
+      <w:hyperlink r:id="rId27" w:history="1">
+        <w:proofErr w:type="spellStart"/>
+        <w:r>
+          <w:rPr>
+            <w:rStyle w:val="Hyperlink"/>
+            <w:u w:val="none"/>
+          </w:rPr>
+          <w:t>Hazirs</w:t>
+        </w:r>
+        <w:proofErr w:type="spellEnd"/>
+        <w:r>
+          <w:rPr>
+            <w:rStyle w:val="Hyperlink"/>
+            <w:u w:val="none"/>
+          </w:rPr>
+          <w:t>, remote</w:t>
+        </w:r>
+      </w:hyperlink>
+      <w:r>
+        <w:rPr>
+          <w:rStyle w:val="Hyperlink"/>
+          <w:u w:val="none"/>
+        </w:rPr>
+        <w:tab/>
+      </w:r>
+      <w:r>
+        <w:t>December 202</w:t>
+      </w:r>
+      <w:r>
+        <w:t>2</w:t>
       </w:r>
     </w:p>
     <w:p>
@@ -1549,19 +1632,43 @@
         <w:rPr>
           <w:szCs w:val="20"/>
         </w:rPr>
-        <w:t xml:space="preserve">Dockerized </w:t>
-      </w:r>
-      <w:r>
-        <w:rPr>
-          <w:szCs w:val="20"/>
-        </w:rPr>
-        <w:t>the Spring Boot application and increased its availability by more than 10% by deploying it</w:t>
-      </w:r>
-      <w:r>
-        <w:rPr>
-          <w:szCs w:val="20"/>
-        </w:rPr>
-        <w:t xml:space="preserve"> to</w:t>
+        <w:t xml:space="preserve">Crafted </w:t>
+      </w:r>
+      <w:r>
+        <w:rPr>
+          <w:szCs w:val="20"/>
+        </w:rPr>
+        <w:t>a</w:t>
+      </w:r>
+      <w:r>
+        <w:rPr>
+          <w:szCs w:val="20"/>
+        </w:rPr>
+        <w:t xml:space="preserve">n Android application </w:t>
+      </w:r>
+      <w:r>
+        <w:rPr>
+          <w:szCs w:val="20"/>
+        </w:rPr>
+        <w:t xml:space="preserve">in </w:t>
+      </w:r>
+      <w:r>
+        <w:rPr>
+          <w:szCs w:val="20"/>
+        </w:rPr>
+        <w:t>Java</w:t>
+      </w:r>
+      <w:r>
+        <w:rPr>
+          <w:szCs w:val="20"/>
+        </w:rPr>
+        <w:t xml:space="preserve"> and XML</w:t>
+      </w:r>
+      <w:r>
+        <w:rPr>
+          <w:szCs w:val="20"/>
+        </w:rPr>
+        <w:t xml:space="preserve"> from scratch</w:t>
       </w:r>
       <w:r>
         <w:rPr>
@@ -1573,19 +1680,25 @@
         <w:rPr>
           <w:szCs w:val="20"/>
         </w:rPr>
-        <w:t>an AWS EC2 instance and</w:t>
-      </w:r>
-      <w:r>
-        <w:rPr>
-          <w:szCs w:val="20"/>
-        </w:rPr>
-        <w:t xml:space="preserve"> multiple Docker container</w:t>
-      </w:r>
-      <w:r>
-        <w:rPr>
-          <w:szCs w:val="20"/>
-        </w:rPr>
-        <w:t>s</w:t>
+        <w:t xml:space="preserve">using </w:t>
+      </w:r>
+      <w:r>
+        <w:rPr>
+          <w:szCs w:val="20"/>
+        </w:rPr>
+        <w:t xml:space="preserve">the </w:t>
+      </w:r>
+      <w:r>
+        <w:rPr>
+          <w:szCs w:val="20"/>
+        </w:rPr>
+        <w:t>Google</w:t>
+      </w:r>
+      <w:r>
+        <w:rPr>
+          <w:szCs w:val="20"/>
+        </w:rPr>
+        <w:t xml:space="preserve"> Sign-In API</w:t>
       </w:r>
       <w:r>
         <w:rPr>
@@ -1593,69 +1706,11 @@
         </w:rPr>
         <w:t>.</w:t>
       </w:r>
-    </w:p>
-    <w:p>
-      <w:pPr>
-        <w:spacing w:line="240" w:lineRule="auto"/>
-        <w:ind w:right="0"/>
-        <w:jc w:val="both"/>
-      </w:pPr>
-    </w:p>
-    <w:p>
-      <w:pPr>
-        <w:tabs>
-          <w:tab w:val="right" w:pos="10490"/>
-        </w:tabs>
-        <w:spacing w:line="240" w:lineRule="auto"/>
-        <w:ind w:left="0" w:right="0" w:firstLine="0"/>
-        <w:jc w:val="both"/>
-      </w:pPr>
-      <w:r>
-        <w:rPr>
-          <w:b/>
-          <w:bCs/>
-        </w:rPr>
-        <w:t>Software Developer</w:t>
-      </w:r>
-      <w:r>
-        <w:rPr>
-          <w:rFonts w:cstheme="minorBidi"/>
-          <w:b/>
-          <w:bCs/>
-        </w:rPr>
-        <w:t xml:space="preserve"> Freelancer</w:t>
-      </w:r>
-      <w:r>
-        <w:t xml:space="preserve"> | </w:t>
-      </w:r>
-      <w:hyperlink r:id="rId27" w:history="1">
-        <w:r>
-          <w:rPr>
-            <w:rStyle w:val="Hyperlink"/>
-            <w:u w:val="none"/>
-          </w:rPr>
-          <w:t>Hazirs</w:t>
-        </w:r>
-        <w:r>
-          <w:rPr>
-            <w:rStyle w:val="Hyperlink"/>
-            <w:u w:val="none"/>
-          </w:rPr>
-          <w:t>, remote</w:t>
-        </w:r>
-      </w:hyperlink>
-      <w:r>
-        <w:rPr>
-          <w:rStyle w:val="Hyperlink"/>
-          <w:u w:val="none"/>
-        </w:rPr>
-        <w:tab/>
-      </w:r>
-      <w:r>
-        <w:t>December 202</w:t>
-      </w:r>
-      <w:r>
-        <w:t>2</w:t>
+      <w:r>
+        <w:rPr>
+          <w:szCs w:val="20"/>
+        </w:rPr>
+        <w:t xml:space="preserve"> </w:t>
       </w:r>
     </w:p>
     <w:p>
@@ -1669,14 +1724,258 @@
         <w:ind w:right="0"/>
         <w:jc w:val="both"/>
         <w:rPr>
-          <w:szCs w:val="20"/>
-        </w:rPr>
-      </w:pPr>
-      <w:r>
-        <w:rPr>
-          <w:szCs w:val="20"/>
-        </w:rPr>
-        <w:t xml:space="preserve">Crafted </w:t>
+          <w:rFonts w:cstheme="minorBidi"/>
+          <w:szCs w:val="20"/>
+        </w:rPr>
+      </w:pPr>
+      <w:r>
+        <w:rPr>
+          <w:szCs w:val="20"/>
+        </w:rPr>
+        <w:t xml:space="preserve">Implemented </w:t>
+      </w:r>
+      <w:r>
+        <w:rPr>
+          <w:szCs w:val="20"/>
+        </w:rPr>
+        <w:t xml:space="preserve">email </w:t>
+      </w:r>
+      <w:r>
+        <w:rPr>
+          <w:szCs w:val="20"/>
+        </w:rPr>
+        <w:t>authentica</w:t>
+      </w:r>
+      <w:r>
+        <w:rPr>
+          <w:szCs w:val="20"/>
+        </w:rPr>
+        <w:t xml:space="preserve">tion and </w:t>
+      </w:r>
+      <w:r>
+        <w:rPr>
+          <w:szCs w:val="20"/>
+        </w:rPr>
+        <w:t>log</w:t>
+      </w:r>
+      <w:r>
+        <w:rPr>
+          <w:szCs w:val="20"/>
+        </w:rPr>
+        <w:t>-</w:t>
+      </w:r>
+      <w:r>
+        <w:rPr>
+          <w:szCs w:val="20"/>
+        </w:rPr>
+        <w:t xml:space="preserve">in </w:t>
+      </w:r>
+      <w:r>
+        <w:rPr>
+          <w:szCs w:val="20"/>
+        </w:rPr>
+        <w:t>and r</w:t>
+      </w:r>
+      <w:r>
+        <w:rPr>
+          <w:rFonts w:cstheme="minorBidi"/>
+          <w:szCs w:val="20"/>
+        </w:rPr>
+        <w:t>educed</w:t>
+      </w:r>
+      <w:r>
+        <w:rPr>
+          <w:rFonts w:cstheme="minorBidi"/>
+          <w:szCs w:val="20"/>
+        </w:rPr>
+        <w:t xml:space="preserve"> </w:t>
+      </w:r>
+      <w:r>
+        <w:rPr>
+          <w:rFonts w:cstheme="minorBidi"/>
+          <w:szCs w:val="20"/>
+        </w:rPr>
+        <w:t xml:space="preserve">the </w:t>
+      </w:r>
+      <w:r>
+        <w:rPr>
+          <w:rFonts w:cstheme="minorBidi"/>
+          <w:szCs w:val="20"/>
+        </w:rPr>
+        <w:t xml:space="preserve">number of clicks required before reaching </w:t>
+      </w:r>
+      <w:r>
+        <w:rPr>
+          <w:rFonts w:cstheme="minorBidi"/>
+          <w:szCs w:val="20"/>
+        </w:rPr>
+        <w:t xml:space="preserve">the </w:t>
+      </w:r>
+      <w:r>
+        <w:rPr>
+          <w:rFonts w:cstheme="minorBidi"/>
+          <w:szCs w:val="20"/>
+        </w:rPr>
+        <w:t>home page by</w:t>
+      </w:r>
+      <w:r>
+        <w:rPr>
+          <w:rFonts w:cstheme="minorBidi"/>
+          <w:szCs w:val="20"/>
+        </w:rPr>
+        <w:t xml:space="preserve"> about 33%</w:t>
+      </w:r>
+      <w:r>
+        <w:rPr>
+          <w:rFonts w:cstheme="minorBidi"/>
+          <w:szCs w:val="20"/>
+        </w:rPr>
+        <w:t>.</w:t>
+      </w:r>
+      <w:r>
+        <w:rPr>
+          <w:b/>
+          <w:bCs/>
+          <w:szCs w:val="20"/>
+        </w:rPr>
+        <w:t xml:space="preserve"> </w:t>
+      </w:r>
+    </w:p>
+    <w:p>
+      <w:pPr>
+        <w:pBdr>
+          <w:bottom w:val="single" w:sz="6" w:space="1" w:color="auto"/>
+        </w:pBdr>
+        <w:spacing w:line="240" w:lineRule="auto"/>
+        <w:ind w:right="0"/>
+        <w:jc w:val="both"/>
+        <w:rPr>
+          <w:b/>
+          <w:bCs/>
+          <w:sz w:val="22"/>
+          <w:szCs w:val="22"/>
+        </w:rPr>
+      </w:pPr>
+    </w:p>
+    <w:p>
+      <w:pPr>
+        <w:spacing w:line="240" w:lineRule="auto"/>
+        <w:ind w:right="0"/>
+        <w:jc w:val="center"/>
+        <w:rPr>
+          <w:rFonts w:cstheme="minorBidi"/>
+          <w:b/>
+          <w:bCs/>
+          <w:sz w:val="22"/>
+          <w:szCs w:val="22"/>
+        </w:rPr>
+      </w:pPr>
+      <w:r>
+        <w:rPr>
+          <w:rFonts w:cstheme="minorBidi"/>
+          <w:b/>
+          <w:bCs/>
+          <w:sz w:val="22"/>
+          <w:szCs w:val="22"/>
+        </w:rPr>
+        <w:t>Projects</w:t>
+      </w:r>
+    </w:p>
+    <w:p>
+      <w:pPr>
+        <w:pStyle w:val="ListParagraph"/>
+        <w:numPr>
+          <w:ilvl w:val="0"/>
+          <w:numId w:val="31"/>
+        </w:numPr>
+        <w:spacing w:line="240" w:lineRule="auto"/>
+        <w:ind w:right="0"/>
+        <w:jc w:val="both"/>
+        <w:rPr>
+          <w:szCs w:val="20"/>
+        </w:rPr>
+      </w:pPr>
+      <w:hyperlink r:id="rId28" w:history="1">
+        <w:r>
+          <w:rPr>
+            <w:rStyle w:val="Hyperlink"/>
+            <w:rFonts w:cs="Arial"/>
+            <w:b/>
+            <w:bCs/>
+            <w:szCs w:val="20"/>
+            <w:u w:val="none"/>
+          </w:rPr>
+          <w:t>Hindi4All: A brand-new programming language</w:t>
+        </w:r>
+      </w:hyperlink>
+      <w:r>
+        <w:rPr>
+          <w:rFonts w:cs="Arial"/>
+          <w:szCs w:val="20"/>
+        </w:rPr>
+        <w:t xml:space="preserve"> </w:t>
+      </w:r>
+      <w:r>
+        <w:rPr>
+          <w:szCs w:val="20"/>
+        </w:rPr>
+        <w:t>(</w:t>
+      </w:r>
+      <w:r>
+        <w:rPr>
+          <w:b/>
+          <w:bCs/>
+          <w:szCs w:val="20"/>
+        </w:rPr>
+        <w:t>JavaScript, PHP</w:t>
+      </w:r>
+      <w:r>
+        <w:rPr>
+          <w:szCs w:val="20"/>
+        </w:rPr>
+        <w:t xml:space="preserve">): </w:t>
+      </w:r>
+      <w:r>
+        <w:rPr>
+          <w:szCs w:val="20"/>
+        </w:rPr>
+        <w:t xml:space="preserve">which </w:t>
+      </w:r>
+      <w:r>
+        <w:rPr>
+          <w:szCs w:val="20"/>
+        </w:rPr>
+        <w:t>is</w:t>
+      </w:r>
+      <w:r>
+        <w:rPr>
+          <w:szCs w:val="20"/>
+        </w:rPr>
+        <w:t xml:space="preserve"> </w:t>
+      </w:r>
+      <w:r>
+        <w:rPr>
+          <w:szCs w:val="20"/>
+        </w:rPr>
+        <w:t xml:space="preserve">in Hindi and has the features of a traditional programming language, documentation, </w:t>
+      </w:r>
+      <w:r>
+        <w:rPr>
+          <w:szCs w:val="20"/>
+        </w:rPr>
+        <w:t>an editor</w:t>
+      </w:r>
+      <w:r>
+        <w:rPr>
+          <w:szCs w:val="20"/>
+        </w:rPr>
+        <w:t>,</w:t>
+      </w:r>
+      <w:r>
+        <w:rPr>
+          <w:szCs w:val="20"/>
+        </w:rPr>
+        <w:t xml:space="preserve"> </w:t>
       </w:r>
       <w:r>
         <w:rPr>
@@ -1688,31 +1987,128 @@
         <w:rPr>
           <w:szCs w:val="20"/>
         </w:rPr>
-        <w:t xml:space="preserve">n Android application </w:t>
-      </w:r>
-      <w:r>
-        <w:rPr>
-          <w:szCs w:val="20"/>
-        </w:rPr>
-        <w:t xml:space="preserve">in </w:t>
-      </w:r>
-      <w:r>
-        <w:rPr>
+        <w:t>nd CLI support</w:t>
+      </w:r>
+      <w:r>
+        <w:rPr>
+          <w:szCs w:val="20"/>
+        </w:rPr>
+        <w:t>.</w:t>
+      </w:r>
+    </w:p>
+    <w:p>
+      <w:pPr>
+        <w:pStyle w:val="ListParagraph"/>
+        <w:numPr>
+          <w:ilvl w:val="0"/>
+          <w:numId w:val="31"/>
+        </w:numPr>
+        <w:spacing w:line="240" w:lineRule="auto"/>
+        <w:ind w:right="0"/>
+        <w:jc w:val="both"/>
+        <w:rPr>
+          <w:szCs w:val="20"/>
+        </w:rPr>
+      </w:pPr>
+      <w:hyperlink r:id="rId29" w:history="1">
+        <w:r>
+          <w:rPr>
+            <w:rStyle w:val="Hyperlink"/>
+            <w:rFonts w:cs="Arial"/>
+            <w:b/>
+            <w:bCs/>
+            <w:szCs w:val="20"/>
+            <w:u w:val="none"/>
+          </w:rPr>
+          <w:t>Stock trading</w:t>
+        </w:r>
+      </w:hyperlink>
+      <w:r>
+        <w:rPr>
+          <w:rFonts w:cs="Arial"/>
+          <w:szCs w:val="20"/>
+        </w:rPr>
+        <w:t xml:space="preserve"> </w:t>
+      </w:r>
+      <w:r>
+        <w:rPr>
+          <w:rFonts w:cs="Arial"/>
+          <w:szCs w:val="20"/>
+        </w:rPr>
+        <w:t>(</w:t>
+      </w:r>
+      <w:r>
+        <w:rPr>
+          <w:rFonts w:cs="Arial"/>
+          <w:b/>
+          <w:bCs/>
+          <w:szCs w:val="20"/>
+        </w:rPr>
+        <w:t>Python</w:t>
+      </w:r>
+      <w:r>
+        <w:rPr>
+          <w:rFonts w:cs="Arial"/>
+          <w:b/>
+          <w:bCs/>
+          <w:szCs w:val="20"/>
+        </w:rPr>
+        <w:t>,</w:t>
+      </w:r>
+      <w:r>
+        <w:rPr>
+          <w:rFonts w:cs="Arial"/>
+          <w:b/>
+          <w:bCs/>
+          <w:szCs w:val="20"/>
+        </w:rPr>
+        <w:t xml:space="preserve"> </w:t>
+      </w:r>
+      <w:r>
+        <w:rPr>
+          <w:rFonts w:cs="Arial"/>
+          <w:b/>
+          <w:bCs/>
           <w:szCs w:val="20"/>
         </w:rPr>
         <w:t>Java</w:t>
       </w:r>
       <w:r>
         <w:rPr>
-          <w:szCs w:val="20"/>
-        </w:rPr>
-        <w:t xml:space="preserve"> and XML</w:t>
-      </w:r>
-      <w:r>
-        <w:rPr>
-          <w:szCs w:val="20"/>
-        </w:rPr>
-        <w:t xml:space="preserve"> from scratch</w:t>
+          <w:rFonts w:cs="Arial"/>
+          <w:szCs w:val="20"/>
+        </w:rPr>
+        <w:t xml:space="preserve">): applications </w:t>
+      </w:r>
+      <w:r>
+        <w:rPr>
+          <w:szCs w:val="20"/>
+        </w:rPr>
+        <w:t>that operated APIs provided by</w:t>
+      </w:r>
+      <w:r>
+        <w:rPr>
+          <w:szCs w:val="20"/>
+        </w:rPr>
+        <w:t xml:space="preserve"> leading</w:t>
+      </w:r>
+      <w:r>
+        <w:rPr>
+          <w:szCs w:val="20"/>
+        </w:rPr>
+        <w:t xml:space="preserve"> stock brokers, namely </w:t>
+      </w:r>
+      <w:r>
+        <w:rPr>
+          <w:szCs w:val="20"/>
+        </w:rPr>
+        <w:t>Kota Securities, Fyers</w:t>
+      </w:r>
+      <w:r>
+        <w:rPr>
+          <w:szCs w:val="20"/>
+        </w:rPr>
+        <w:t>,</w:t>
       </w:r>
       <w:r>
         <w:rPr>
@@ -1724,25 +2120,105 @@
         <w:rPr>
           <w:szCs w:val="20"/>
         </w:rPr>
-        <w:t xml:space="preserve">using </w:t>
-      </w:r>
-      <w:r>
-        <w:rPr>
-          <w:szCs w:val="20"/>
-        </w:rPr>
-        <w:t xml:space="preserve">the </w:t>
-      </w:r>
-      <w:r>
-        <w:rPr>
-          <w:szCs w:val="20"/>
-        </w:rPr>
-        <w:t>Google</w:t>
-      </w:r>
-      <w:r>
-        <w:rPr>
-          <w:szCs w:val="20"/>
-        </w:rPr>
-        <w:t xml:space="preserve"> Sign-In API</w:t>
+        <w:t xml:space="preserve">and </w:t>
+      </w:r>
+      <w:proofErr w:type="spellStart"/>
+      <w:r>
+        <w:rPr>
+          <w:szCs w:val="20"/>
+        </w:rPr>
+        <w:t>Zerodha</w:t>
+      </w:r>
+      <w:proofErr w:type="spellEnd"/>
+      <w:r>
+        <w:rPr>
+          <w:szCs w:val="20"/>
+        </w:rPr>
+        <w:t xml:space="preserve">, </w:t>
+      </w:r>
+      <w:r>
+        <w:rPr>
+          <w:szCs w:val="20"/>
+        </w:rPr>
+        <w:t xml:space="preserve">that algorithmically </w:t>
+      </w:r>
+      <w:r>
+        <w:rPr>
+          <w:szCs w:val="20"/>
+        </w:rPr>
+        <w:t>t</w:t>
+      </w:r>
+      <w:r>
+        <w:rPr>
+          <w:szCs w:val="20"/>
+        </w:rPr>
+        <w:t>rade</w:t>
+      </w:r>
+      <w:r>
+        <w:rPr>
+          <w:szCs w:val="20"/>
+        </w:rPr>
+        <w:t>d</w:t>
+      </w:r>
+      <w:r>
+        <w:rPr>
+          <w:szCs w:val="20"/>
+        </w:rPr>
+        <w:t xml:space="preserve"> stocks</w:t>
+      </w:r>
+      <w:r>
+        <w:rPr>
+          <w:szCs w:val="20"/>
+        </w:rPr>
+        <w:t xml:space="preserve"> &amp; </w:t>
+      </w:r>
+      <w:r>
+        <w:rPr>
+          <w:szCs w:val="20"/>
+        </w:rPr>
+        <w:t xml:space="preserve">futures contracts </w:t>
+      </w:r>
+      <w:r>
+        <w:rPr>
+          <w:szCs w:val="20"/>
+        </w:rPr>
+        <w:t>worth</w:t>
+      </w:r>
+      <w:r>
+        <w:rPr>
+          <w:szCs w:val="20"/>
+        </w:rPr>
+        <w:t xml:space="preserve"> </w:t>
+      </w:r>
+      <w:r>
+        <w:rPr>
+          <w:szCs w:val="20"/>
+        </w:rPr>
+        <w:t>~</w:t>
+      </w:r>
+      <w:r>
+        <w:rPr>
+          <w:szCs w:val="20"/>
+        </w:rPr>
+        <w:t>₹</w:t>
+      </w:r>
+      <w:r>
+        <w:rPr>
+          <w:szCs w:val="20"/>
+        </w:rPr>
+        <w:t>10</w:t>
+      </w:r>
+      <w:r>
+        <w:rPr>
+          <w:szCs w:val="20"/>
+        </w:rPr>
+        <w:t>,</w:t>
+      </w:r>
+      <w:r>
+        <w:rPr>
+          <w:szCs w:val="20"/>
+        </w:rPr>
+        <w:t>000</w:t>
       </w:r>
       <w:r>
         <w:rPr>
@@ -1750,11 +2226,210 @@
         </w:rPr>
         <w:t>.</w:t>
       </w:r>
-      <w:r>
-        <w:rPr>
-          <w:szCs w:val="20"/>
+    </w:p>
+    <w:p>
+      <w:pPr>
+        <w:pStyle w:val="ListParagraph"/>
+        <w:numPr>
+          <w:ilvl w:val="0"/>
+          <w:numId w:val="31"/>
+        </w:numPr>
+        <w:spacing w:line="240" w:lineRule="auto"/>
+        <w:ind w:right="0"/>
+        <w:jc w:val="both"/>
+        <w:rPr>
+          <w:b/>
+          <w:bCs/>
+          <w:i/>
+          <w:iCs/>
+          <w:szCs w:val="20"/>
+        </w:rPr>
+      </w:pPr>
+      <w:hyperlink r:id="rId30" w:history="1">
+        <w:r>
+          <w:rPr>
+            <w:rStyle w:val="Hyperlink"/>
+            <w:b/>
+            <w:bCs/>
+            <w:szCs w:val="20"/>
+            <w:u w:val="none"/>
+          </w:rPr>
+          <w:t>Autonomous drone</w:t>
+        </w:r>
+      </w:hyperlink>
+      <w:r>
+        <w:rPr>
+          <w:rStyle w:val="Hyperlink"/>
+          <w:szCs w:val="20"/>
+          <w:u w:val="none"/>
         </w:rPr>
         <w:t xml:space="preserve"> </w:t>
+      </w:r>
+      <w:r>
+        <w:rPr>
+          <w:szCs w:val="20"/>
+        </w:rPr>
+        <w:t>(</w:t>
+      </w:r>
+      <w:r>
+        <w:rPr>
+          <w:b/>
+          <w:bCs/>
+          <w:szCs w:val="20"/>
+        </w:rPr>
+        <w:t>C++, JavaScript</w:t>
+      </w:r>
+      <w:r>
+        <w:rPr>
+          <w:szCs w:val="20"/>
+        </w:rPr>
+        <w:t>):</w:t>
+      </w:r>
+      <w:r>
+        <w:rPr>
+          <w:szCs w:val="20"/>
+        </w:rPr>
+        <w:t xml:space="preserve"> </w:t>
+      </w:r>
+      <w:r>
+        <w:rPr>
+          <w:szCs w:val="20"/>
+        </w:rPr>
+        <w:t xml:space="preserve">attempt to assemble an internet-controlled </w:t>
+      </w:r>
+      <w:r>
+        <w:rPr>
+          <w:szCs w:val="20"/>
+        </w:rPr>
+        <w:t xml:space="preserve">autonomous </w:t>
+      </w:r>
+      <w:r>
+        <w:rPr>
+          <w:szCs w:val="20"/>
+        </w:rPr>
+        <w:t>drone.</w:t>
+      </w:r>
+    </w:p>
+    <w:p>
+      <w:pPr>
+        <w:pStyle w:val="ListParagraph"/>
+        <w:numPr>
+          <w:ilvl w:val="0"/>
+          <w:numId w:val="31"/>
+        </w:numPr>
+        <w:spacing w:line="240" w:lineRule="auto"/>
+        <w:ind w:right="0"/>
+        <w:jc w:val="both"/>
+        <w:rPr>
+          <w:szCs w:val="20"/>
+        </w:rPr>
+      </w:pPr>
+      <w:hyperlink r:id="rId31" w:history="1">
+        <w:r>
+          <w:rPr>
+            <w:rStyle w:val="Hyperlink"/>
+            <w:b/>
+            <w:bCs/>
+            <w:szCs w:val="20"/>
+            <w:u w:val="none"/>
+          </w:rPr>
+          <w:t>Portfolio Site</w:t>
+        </w:r>
+      </w:hyperlink>
+      <w:r>
+        <w:rPr>
+          <w:szCs w:val="20"/>
+        </w:rPr>
+        <w:t xml:space="preserve"> (</w:t>
+      </w:r>
+      <w:r>
+        <w:rPr>
+          <w:b/>
+          <w:bCs/>
+          <w:szCs w:val="20"/>
+        </w:rPr>
+        <w:t>JavaScript, React</w:t>
+      </w:r>
+      <w:r>
+        <w:rPr>
+          <w:szCs w:val="20"/>
+        </w:rPr>
+        <w:t>): React J</w:t>
+      </w:r>
+      <w:r>
+        <w:rPr>
+          <w:szCs w:val="20"/>
+        </w:rPr>
+        <w:t>.</w:t>
+      </w:r>
+      <w:r>
+        <w:rPr>
+          <w:szCs w:val="20"/>
+        </w:rPr>
+        <w:t>S</w:t>
+      </w:r>
+      <w:r>
+        <w:rPr>
+          <w:szCs w:val="20"/>
+        </w:rPr>
+        <w:t>.</w:t>
+      </w:r>
+      <w:r>
+        <w:rPr>
+          <w:szCs w:val="20"/>
+        </w:rPr>
+        <w:t>-based portfolio site with an overview of projects done.</w:t>
+      </w:r>
+    </w:p>
+    <w:p>
+      <w:pPr>
+        <w:pBdr>
+          <w:bottom w:val="single" w:sz="6" w:space="1" w:color="auto"/>
+        </w:pBdr>
+        <w:spacing w:line="240" w:lineRule="auto"/>
+        <w:ind w:left="0" w:right="0" w:firstLine="0"/>
+        <w:jc w:val="both"/>
+      </w:pPr>
+    </w:p>
+    <w:p>
+      <w:pPr>
+        <w:spacing w:line="240" w:lineRule="auto"/>
+        <w:ind w:right="0"/>
+        <w:jc w:val="center"/>
+      </w:pPr>
+      <w:r>
+        <w:rPr>
+          <w:b/>
+          <w:bCs/>
+          <w:sz w:val="22"/>
+          <w:szCs w:val="22"/>
+        </w:rPr>
+        <w:t>Skills</w:t>
+      </w:r>
+    </w:p>
+    <w:p>
+      <w:pPr>
+        <w:spacing w:line="240" w:lineRule="auto"/>
+        <w:ind w:right="0"/>
+        <w:jc w:val="both"/>
+        <w:rPr>
+          <w:b/>
+          <w:bCs/>
+        </w:rPr>
+      </w:pPr>
+      <w:r>
+        <w:rPr>
+          <w:b/>
+          <w:bCs/>
+        </w:rPr>
+        <w:t>Proficiencies</w:t>
+      </w:r>
+      <w:r>
+        <w:rPr>
+          <w:b/>
+          <w:bCs/>
+        </w:rPr>
+        <w:t>:</w:t>
       </w:r>
     </w:p>
     <w:p>
@@ -1768,726 +2443,22 @@
         <w:ind w:right="0"/>
         <w:jc w:val="both"/>
         <w:rPr>
-          <w:rFonts w:cstheme="minorBidi"/>
-          <w:szCs w:val="20"/>
-        </w:rPr>
-      </w:pPr>
-      <w:r>
-        <w:rPr>
-          <w:szCs w:val="20"/>
-        </w:rPr>
-        <w:t xml:space="preserve">Implemented </w:t>
-      </w:r>
-      <w:r>
-        <w:rPr>
-          <w:szCs w:val="20"/>
-        </w:rPr>
-        <w:t xml:space="preserve">email </w:t>
-      </w:r>
-      <w:r>
-        <w:rPr>
-          <w:szCs w:val="20"/>
-        </w:rPr>
-        <w:t>authentica</w:t>
-      </w:r>
-      <w:r>
-        <w:rPr>
-          <w:szCs w:val="20"/>
-        </w:rPr>
-        <w:t xml:space="preserve">tion and </w:t>
-      </w:r>
-      <w:r>
-        <w:rPr>
-          <w:szCs w:val="20"/>
-        </w:rPr>
-        <w:t>log</w:t>
-      </w:r>
-      <w:r>
-        <w:rPr>
-          <w:szCs w:val="20"/>
-        </w:rPr>
-        <w:t>-</w:t>
-      </w:r>
-      <w:r>
-        <w:rPr>
-          <w:szCs w:val="20"/>
-        </w:rPr>
-        <w:t xml:space="preserve">in </w:t>
-      </w:r>
-      <w:r>
-        <w:rPr>
-          <w:szCs w:val="20"/>
-        </w:rPr>
-        <w:t>and r</w:t>
-      </w:r>
-      <w:r>
-        <w:rPr>
-          <w:rFonts w:cstheme="minorBidi"/>
-          <w:szCs w:val="20"/>
-        </w:rPr>
-        <w:t>educed</w:t>
-      </w:r>
-      <w:r>
-        <w:rPr>
-          <w:rFonts w:cstheme="minorBidi"/>
-          <w:szCs w:val="20"/>
-        </w:rPr>
-        <w:t xml:space="preserve"> </w:t>
-      </w:r>
-      <w:r>
-        <w:rPr>
-          <w:rFonts w:cstheme="minorBidi"/>
-          <w:szCs w:val="20"/>
-        </w:rPr>
-        <w:t xml:space="preserve">the </w:t>
-      </w:r>
-      <w:r>
-        <w:rPr>
-          <w:rFonts w:cstheme="minorBidi"/>
-          <w:szCs w:val="20"/>
-        </w:rPr>
-        <w:t xml:space="preserve">number of clicks required before reaching </w:t>
-      </w:r>
-      <w:r>
-        <w:rPr>
-          <w:rFonts w:cstheme="minorBidi"/>
-          <w:szCs w:val="20"/>
-        </w:rPr>
-        <w:t xml:space="preserve">the </w:t>
-      </w:r>
-      <w:r>
-        <w:rPr>
-          <w:rFonts w:cstheme="minorBidi"/>
-          <w:szCs w:val="20"/>
-        </w:rPr>
-        <w:t>home page by</w:t>
-      </w:r>
-      <w:r>
-        <w:rPr>
-          <w:rFonts w:cstheme="minorBidi"/>
-          <w:szCs w:val="20"/>
-        </w:rPr>
-        <w:t xml:space="preserve"> about 33%</w:t>
-      </w:r>
-      <w:r>
-        <w:rPr>
-          <w:rFonts w:cstheme="minorBidi"/>
-          <w:szCs w:val="20"/>
-        </w:rPr>
-        <w:t>.</w:t>
-      </w:r>
-      <w:r>
-        <w:rPr>
-          <w:b/>
-          <w:bCs/>
-          <w:szCs w:val="20"/>
-        </w:rPr>
-        <w:t xml:space="preserve"> </w:t>
-      </w:r>
-    </w:p>
-    <w:p>
-      <w:pPr>
-        <w:pBdr>
-          <w:bottom w:val="single" w:sz="6" w:space="1" w:color="auto"/>
-        </w:pBdr>
-        <w:spacing w:line="240" w:lineRule="auto"/>
-        <w:ind w:right="0"/>
-        <w:jc w:val="both"/>
-        <w:rPr>
-          <w:b/>
-          <w:bCs/>
-          <w:sz w:val="22"/>
-          <w:szCs w:val="22"/>
-        </w:rPr>
-      </w:pPr>
-    </w:p>
-    <w:p>
-      <w:pPr>
-        <w:spacing w:line="240" w:lineRule="auto"/>
-        <w:ind w:right="0"/>
-        <w:jc w:val="center"/>
-        <w:rPr>
-          <w:rFonts w:cstheme="minorBidi"/>
-          <w:b/>
-          <w:bCs/>
-          <w:sz w:val="22"/>
-          <w:szCs w:val="22"/>
-        </w:rPr>
-      </w:pPr>
-      <w:r>
-        <w:rPr>
-          <w:rFonts w:cstheme="minorBidi"/>
-          <w:b/>
-          <w:bCs/>
-          <w:sz w:val="22"/>
-          <w:szCs w:val="22"/>
-        </w:rPr>
-        <w:t>Projects</w:t>
-      </w:r>
-    </w:p>
-    <w:p>
-      <w:pPr>
-        <w:pStyle w:val="ListParagraph"/>
-        <w:numPr>
-          <w:ilvl w:val="0"/>
-          <w:numId w:val="31"/>
-        </w:numPr>
-        <w:spacing w:line="240" w:lineRule="auto"/>
-        <w:ind w:right="0"/>
-        <w:jc w:val="both"/>
-        <w:rPr>
-          <w:szCs w:val="20"/>
-        </w:rPr>
-      </w:pPr>
-      <w:hyperlink r:id="rId28" w:history="1">
-        <w:r>
-          <w:rPr>
-            <w:rStyle w:val="Hyperlink"/>
-            <w:rFonts w:cs="Arial"/>
-            <w:sz w:val="22"/>
-            <w:szCs w:val="22"/>
-            <w:u w:val="none"/>
-          </w:rPr>
-          <w:t>A brand-new programming language</w:t>
-        </w:r>
-      </w:hyperlink>
-      <w:r>
-        <w:rPr>
-          <w:rStyle w:val="Hyperlink"/>
-          <w:rFonts w:cs="Arial"/>
-          <w:szCs w:val="20"/>
-          <w:u w:val="none"/>
-        </w:rPr>
-        <w:t xml:space="preserve"> </w:t>
-      </w:r>
-      <w:r>
-        <w:rPr>
-          <w:szCs w:val="20"/>
-        </w:rPr>
-        <w:t>(</w:t>
-      </w:r>
-      <w:r>
-        <w:rPr>
-          <w:b/>
-          <w:bCs/>
-          <w:szCs w:val="20"/>
-        </w:rPr>
-        <w:t>JavaScript, PHP</w:t>
-      </w:r>
-      <w:r>
-        <w:rPr>
-          <w:szCs w:val="20"/>
-        </w:rPr>
-        <w:t xml:space="preserve">): Hindi4All, </w:t>
-      </w:r>
-      <w:r>
-        <w:rPr>
-          <w:szCs w:val="20"/>
-        </w:rPr>
-        <w:t xml:space="preserve">which </w:t>
-      </w:r>
-      <w:r>
-        <w:rPr>
-          <w:szCs w:val="20"/>
-        </w:rPr>
-        <w:t>is</w:t>
-      </w:r>
-      <w:r>
-        <w:rPr>
-          <w:szCs w:val="20"/>
-        </w:rPr>
-        <w:t xml:space="preserve"> </w:t>
-      </w:r>
-      <w:r>
-        <w:rPr>
-          <w:szCs w:val="20"/>
-        </w:rPr>
-        <w:t xml:space="preserve">in Hindi and has the features of a traditional programming language, documentation, </w:t>
-      </w:r>
-      <w:r>
-        <w:rPr>
-          <w:szCs w:val="20"/>
-        </w:rPr>
-        <w:t>an editor</w:t>
-      </w:r>
-      <w:r>
-        <w:rPr>
-          <w:szCs w:val="20"/>
-        </w:rPr>
-        <w:t>,</w:t>
-      </w:r>
-      <w:r>
-        <w:rPr>
-          <w:szCs w:val="20"/>
-        </w:rPr>
-        <w:t xml:space="preserve"> </w:t>
-      </w:r>
-      <w:r>
-        <w:rPr>
-          <w:szCs w:val="20"/>
-        </w:rPr>
-        <w:t>a</w:t>
-      </w:r>
-      <w:r>
-        <w:rPr>
-          <w:szCs w:val="20"/>
-        </w:rPr>
-        <w:t>nd CLI support</w:t>
-      </w:r>
-      <w:r>
-        <w:rPr>
-          <w:szCs w:val="20"/>
-        </w:rPr>
-        <w:t>.</w:t>
-      </w:r>
-    </w:p>
-    <w:p>
-      <w:pPr>
-        <w:pStyle w:val="ListParagraph"/>
-        <w:numPr>
-          <w:ilvl w:val="0"/>
-          <w:numId w:val="31"/>
-        </w:numPr>
-        <w:spacing w:line="240" w:lineRule="auto"/>
-        <w:ind w:right="0"/>
-        <w:jc w:val="both"/>
-        <w:rPr>
-          <w:szCs w:val="20"/>
-        </w:rPr>
-      </w:pPr>
-      <w:hyperlink r:id="rId29" w:history="1">
-        <w:r>
-          <w:rPr>
-            <w:rStyle w:val="Hyperlink"/>
-            <w:rFonts w:cs="Arial"/>
-            <w:sz w:val="22"/>
-            <w:szCs w:val="22"/>
-            <w:u w:val="none"/>
-          </w:rPr>
-          <w:t>Algorithmic stock</w:t>
-        </w:r>
-        <w:r>
-          <w:rPr>
-            <w:rStyle w:val="Hyperlink"/>
-            <w:rFonts w:cs="Arial"/>
-            <w:sz w:val="22"/>
-            <w:szCs w:val="22"/>
-            <w:u w:val="none"/>
-          </w:rPr>
-          <w:t xml:space="preserve"> </w:t>
-        </w:r>
-        <w:r>
-          <w:rPr>
-            <w:rStyle w:val="Hyperlink"/>
-            <w:rFonts w:cs="Arial"/>
-            <w:sz w:val="22"/>
-            <w:szCs w:val="22"/>
-            <w:u w:val="none"/>
-          </w:rPr>
-          <w:t>trading</w:t>
-        </w:r>
-      </w:hyperlink>
-      <w:r>
-        <w:rPr>
-          <w:rFonts w:cs="Arial"/>
-          <w:sz w:val="22"/>
-          <w:szCs w:val="22"/>
-        </w:rPr>
-        <w:t xml:space="preserve"> </w:t>
-      </w:r>
-      <w:r>
-        <w:rPr>
-          <w:rFonts w:cs="Arial"/>
-          <w:szCs w:val="20"/>
-        </w:rPr>
-        <w:t>(</w:t>
-      </w:r>
-      <w:r>
-        <w:rPr>
-          <w:rFonts w:cs="Arial"/>
-          <w:b/>
-          <w:bCs/>
-          <w:szCs w:val="20"/>
-        </w:rPr>
-        <w:t>Python</w:t>
-      </w:r>
-      <w:r>
-        <w:rPr>
-          <w:rFonts w:cs="Arial"/>
-          <w:b/>
-          <w:bCs/>
-          <w:szCs w:val="20"/>
-        </w:rPr>
-        <w:t>,</w:t>
-      </w:r>
-      <w:r>
-        <w:rPr>
-          <w:rFonts w:cs="Arial"/>
-          <w:b/>
-          <w:bCs/>
-          <w:szCs w:val="20"/>
-        </w:rPr>
-        <w:t xml:space="preserve"> </w:t>
-      </w:r>
-      <w:r>
-        <w:rPr>
-          <w:rFonts w:cs="Arial"/>
-          <w:b/>
-          <w:bCs/>
-          <w:szCs w:val="20"/>
-        </w:rPr>
-        <w:t>Java</w:t>
-      </w:r>
-      <w:r>
-        <w:rPr>
-          <w:rFonts w:cs="Arial"/>
-          <w:szCs w:val="20"/>
-        </w:rPr>
-        <w:t xml:space="preserve">): applications </w:t>
-      </w:r>
-      <w:r>
-        <w:rPr>
-          <w:szCs w:val="20"/>
-        </w:rPr>
-        <w:t>that operated APIs provided by</w:t>
-      </w:r>
-      <w:r>
-        <w:rPr>
-          <w:szCs w:val="20"/>
-        </w:rPr>
-        <w:t xml:space="preserve"> leading</w:t>
-      </w:r>
-      <w:r>
-        <w:rPr>
-          <w:szCs w:val="20"/>
-        </w:rPr>
-        <w:t xml:space="preserve"> Indian stock brokers, namely </w:t>
-      </w:r>
-      <w:r>
-        <w:rPr>
-          <w:szCs w:val="20"/>
-        </w:rPr>
-        <w:t>Kota Securities, Fyers</w:t>
-      </w:r>
-      <w:r>
-        <w:rPr>
-          <w:szCs w:val="20"/>
-        </w:rPr>
-        <w:t>,</w:t>
-      </w:r>
-      <w:r>
-        <w:rPr>
-          <w:szCs w:val="20"/>
-        </w:rPr>
-        <w:t xml:space="preserve"> </w:t>
-      </w:r>
-      <w:r>
-        <w:rPr>
-          <w:szCs w:val="20"/>
-        </w:rPr>
-        <w:t xml:space="preserve">and </w:t>
-      </w:r>
-      <w:r>
-        <w:rPr>
-          <w:szCs w:val="20"/>
-        </w:rPr>
-        <w:t>Zerodha</w:t>
-      </w:r>
-      <w:r>
-        <w:rPr>
-          <w:szCs w:val="20"/>
-        </w:rPr>
-        <w:t>, and</w:t>
-      </w:r>
-      <w:r>
-        <w:rPr>
-          <w:szCs w:val="20"/>
-        </w:rPr>
-        <w:t xml:space="preserve"> </w:t>
-      </w:r>
-      <w:r>
-        <w:rPr>
-          <w:szCs w:val="20"/>
-        </w:rPr>
-        <w:t>t</w:t>
-      </w:r>
-      <w:r>
-        <w:rPr>
-          <w:szCs w:val="20"/>
-        </w:rPr>
-        <w:t>rade</w:t>
-      </w:r>
-      <w:r>
-        <w:rPr>
-          <w:szCs w:val="20"/>
-        </w:rPr>
-        <w:t>d</w:t>
-      </w:r>
-      <w:r>
-        <w:rPr>
-          <w:szCs w:val="20"/>
-        </w:rPr>
-        <w:t xml:space="preserve"> stocks</w:t>
-      </w:r>
-      <w:r>
-        <w:rPr>
-          <w:szCs w:val="20"/>
-        </w:rPr>
-        <w:t xml:space="preserve"> and </w:t>
-      </w:r>
-      <w:r>
-        <w:rPr>
-          <w:szCs w:val="20"/>
-        </w:rPr>
-        <w:t xml:space="preserve">futures contracts </w:t>
-      </w:r>
-      <w:r>
-        <w:rPr>
-          <w:szCs w:val="20"/>
-        </w:rPr>
-        <w:t>worth</w:t>
-      </w:r>
-      <w:r>
-        <w:rPr>
-          <w:szCs w:val="20"/>
-        </w:rPr>
-        <w:t xml:space="preserve"> </w:t>
-      </w:r>
-      <w:r>
-        <w:rPr>
-          <w:szCs w:val="20"/>
-        </w:rPr>
-        <w:t>~</w:t>
-      </w:r>
-      <w:r>
-        <w:rPr>
-          <w:szCs w:val="20"/>
-        </w:rPr>
-        <w:t>₹</w:t>
-      </w:r>
-      <w:r>
-        <w:rPr>
-          <w:szCs w:val="20"/>
-        </w:rPr>
-        <w:t>10</w:t>
-      </w:r>
-      <w:r>
-        <w:rPr>
-          <w:szCs w:val="20"/>
-        </w:rPr>
-        <w:t>,</w:t>
-      </w:r>
-      <w:r>
-        <w:rPr>
-          <w:szCs w:val="20"/>
-        </w:rPr>
-        <w:t>000</w:t>
-      </w:r>
-      <w:r>
-        <w:rPr>
-          <w:szCs w:val="20"/>
-        </w:rPr>
-        <w:t>.</w:t>
-      </w:r>
-    </w:p>
-    <w:p>
-      <w:pPr>
-        <w:pStyle w:val="ListParagraph"/>
-        <w:numPr>
-          <w:ilvl w:val="0"/>
-          <w:numId w:val="31"/>
-        </w:numPr>
-        <w:spacing w:line="240" w:lineRule="auto"/>
-        <w:ind w:right="0"/>
-        <w:jc w:val="both"/>
-        <w:rPr>
-          <w:szCs w:val="20"/>
-        </w:rPr>
-      </w:pPr>
-      <w:hyperlink r:id="rId30" w:history="1">
-        <w:r>
-          <w:rPr>
-            <w:rStyle w:val="Hyperlink"/>
-            <w:sz w:val="22"/>
-            <w:szCs w:val="22"/>
-            <w:u w:val="none"/>
-          </w:rPr>
-          <w:t>Autonomous drone</w:t>
-        </w:r>
-      </w:hyperlink>
-      <w:r>
-        <w:rPr>
-          <w:rStyle w:val="Hyperlink"/>
-          <w:sz w:val="22"/>
-          <w:szCs w:val="22"/>
-          <w:u w:val="none"/>
-        </w:rPr>
-        <w:t xml:space="preserve"> </w:t>
-      </w:r>
-      <w:r>
-        <w:rPr>
-          <w:szCs w:val="20"/>
-        </w:rPr>
-        <w:t>(</w:t>
-      </w:r>
-      <w:r>
-        <w:rPr>
-          <w:b/>
-          <w:bCs/>
-          <w:szCs w:val="20"/>
-        </w:rPr>
-        <w:t>C++, JavaScript</w:t>
-      </w:r>
-      <w:r>
-        <w:rPr>
-          <w:szCs w:val="20"/>
-        </w:rPr>
-        <w:t>):</w:t>
-      </w:r>
-      <w:r>
-        <w:rPr>
-          <w:szCs w:val="20"/>
-        </w:rPr>
-        <w:t xml:space="preserve"> </w:t>
-      </w:r>
-      <w:r>
-        <w:rPr>
-          <w:szCs w:val="20"/>
-        </w:rPr>
-        <w:t xml:space="preserve">attempt to assemble an internet-controlled </w:t>
-      </w:r>
-      <w:r>
-        <w:rPr>
-          <w:szCs w:val="20"/>
-        </w:rPr>
-        <w:t xml:space="preserve">autonomous </w:t>
-      </w:r>
-      <w:r>
-        <w:rPr>
-          <w:szCs w:val="20"/>
-        </w:rPr>
-        <w:t>drone.</w:t>
-      </w:r>
-    </w:p>
-    <w:p>
-      <w:pPr>
-        <w:pStyle w:val="ListParagraph"/>
-        <w:numPr>
-          <w:ilvl w:val="0"/>
-          <w:numId w:val="31"/>
-        </w:numPr>
-        <w:spacing w:line="240" w:lineRule="auto"/>
-        <w:ind w:right="0"/>
-        <w:jc w:val="both"/>
-        <w:rPr>
-          <w:szCs w:val="20"/>
-        </w:rPr>
-      </w:pPr>
-      <w:hyperlink r:id="rId31" w:history="1">
-        <w:r>
-          <w:rPr>
-            <w:rStyle w:val="Hyperlink"/>
-            <w:sz w:val="22"/>
-            <w:szCs w:val="22"/>
-            <w:u w:val="none"/>
-          </w:rPr>
-          <w:t>Portfolio Site</w:t>
-        </w:r>
-      </w:hyperlink>
-      <w:r>
-        <w:rPr>
-          <w:szCs w:val="20"/>
-        </w:rPr>
-        <w:t xml:space="preserve"> (</w:t>
-      </w:r>
-      <w:r>
-        <w:rPr>
-          <w:b/>
-          <w:bCs/>
-          <w:szCs w:val="20"/>
-        </w:rPr>
-        <w:t>JavaScript, React</w:t>
-      </w:r>
-      <w:r>
-        <w:rPr>
-          <w:szCs w:val="20"/>
-        </w:rPr>
-        <w:t>): React J</w:t>
-      </w:r>
-      <w:r>
-        <w:rPr>
-          <w:szCs w:val="20"/>
-        </w:rPr>
-        <w:t>.</w:t>
-      </w:r>
-      <w:r>
-        <w:rPr>
-          <w:szCs w:val="20"/>
-        </w:rPr>
-        <w:t>S</w:t>
-      </w:r>
-      <w:r>
-        <w:rPr>
-          <w:szCs w:val="20"/>
-        </w:rPr>
-        <w:t>.</w:t>
-      </w:r>
-      <w:r>
-        <w:rPr>
-          <w:szCs w:val="20"/>
-        </w:rPr>
-        <w:t>-based portfolio site with an overview of projects done.</w:t>
-      </w:r>
-    </w:p>
-    <w:p>
-      <w:pPr>
-        <w:pBdr>
-          <w:bottom w:val="single" w:sz="6" w:space="1" w:color="auto"/>
-        </w:pBdr>
-        <w:spacing w:line="240" w:lineRule="auto"/>
-        <w:ind w:left="0" w:right="0" w:firstLine="0"/>
-        <w:jc w:val="both"/>
-      </w:pPr>
-    </w:p>
-    <w:p>
-      <w:pPr>
-        <w:spacing w:line="240" w:lineRule="auto"/>
-        <w:ind w:right="0"/>
-        <w:jc w:val="center"/>
-      </w:pPr>
-      <w:r>
-        <w:rPr>
-          <w:b/>
-          <w:bCs/>
-          <w:sz w:val="22"/>
-          <w:szCs w:val="22"/>
-        </w:rPr>
-        <w:t>Skills</w:t>
-      </w:r>
-    </w:p>
-    <w:p>
-      <w:pPr>
-        <w:spacing w:line="240" w:lineRule="auto"/>
-        <w:ind w:right="0"/>
-        <w:jc w:val="both"/>
-        <w:rPr>
-          <w:b/>
-          <w:bCs/>
-        </w:rPr>
-      </w:pPr>
-      <w:r>
-        <w:rPr>
-          <w:b/>
-          <w:bCs/>
-        </w:rPr>
-        <w:t>Proficiencies</w:t>
-      </w:r>
-      <w:r>
-        <w:rPr>
-          <w:b/>
-          <w:bCs/>
-        </w:rPr>
-        <w:t>:</w:t>
+          <w:szCs w:val="20"/>
+        </w:rPr>
+      </w:pPr>
+      <w:r>
+        <w:rPr>
+          <w:i/>
+          <w:iCs/>
+          <w:szCs w:val="20"/>
+        </w:rPr>
+        <w:t>Languages</w:t>
+      </w:r>
+      <w:r>
+        <w:rPr>
+          <w:szCs w:val="20"/>
+        </w:rPr>
+        <w:t xml:space="preserve">: Java </w:t>
       </w:r>
     </w:p>
     <w:p>
@@ -2510,37 +2481,19 @@
           <w:iCs/>
           <w:szCs w:val="20"/>
         </w:rPr>
-        <w:t>Languages</w:t>
-      </w:r>
-      <w:r>
-        <w:rPr>
-          <w:szCs w:val="20"/>
-        </w:rPr>
-        <w:t xml:space="preserve">: Java, JavaScript, PHP, </w:t>
-      </w:r>
-      <w:r>
-        <w:rPr>
-          <w:szCs w:val="20"/>
-        </w:rPr>
-        <w:t xml:space="preserve">and </w:t>
-      </w:r>
-      <w:r>
-        <w:rPr>
-          <w:szCs w:val="20"/>
-        </w:rPr>
-        <w:t>SQL</w:t>
+        <w:t>Technologies</w:t>
+      </w:r>
+      <w:r>
+        <w:rPr>
+          <w:szCs w:val="20"/>
+        </w:rPr>
+        <w:t>: REST APIs</w:t>
       </w:r>
       <w:r>
         <w:rPr>
           <w:szCs w:val="20"/>
         </w:rPr>
         <w:t>.</w:t>
-      </w:r>
-      <w:r>
-        <w:rPr>
-          <w:szCs w:val="20"/>
-        </w:rPr>
-        <w:t xml:space="preserve"> </w:t>
       </w:r>
     </w:p>
     <w:p>
@@ -2563,37 +2516,31 @@
           <w:iCs/>
           <w:szCs w:val="20"/>
         </w:rPr>
-        <w:t>Databases</w:t>
-      </w:r>
-      <w:r>
-        <w:rPr>
-          <w:szCs w:val="20"/>
-        </w:rPr>
-        <w:t xml:space="preserve">: </w:t>
-      </w:r>
-      <w:r>
-        <w:rPr>
-          <w:szCs w:val="20"/>
-        </w:rPr>
-        <w:t xml:space="preserve">Firebase, </w:t>
-      </w:r>
-      <w:r>
-        <w:rPr>
-          <w:szCs w:val="20"/>
-        </w:rPr>
-        <w:t xml:space="preserve">MySQL, </w:t>
-      </w:r>
-      <w:r>
-        <w:rPr>
-          <w:szCs w:val="20"/>
-        </w:rPr>
-        <w:t xml:space="preserve">and </w:t>
-      </w:r>
-      <w:r>
-        <w:rPr>
-          <w:szCs w:val="20"/>
-        </w:rPr>
-        <w:t>MySQL Workbench.</w:t>
+        <w:t>Domains</w:t>
+      </w:r>
+      <w:r>
+        <w:rPr>
+          <w:szCs w:val="20"/>
+        </w:rPr>
+        <w:t>:</w:t>
+      </w:r>
+      <w:r>
+        <w:rPr>
+          <w:szCs w:val="20"/>
+        </w:rPr>
+        <w:t xml:space="preserve"> </w:t>
+      </w:r>
+      <w:r>
+        <w:rPr>
+          <w:szCs w:val="20"/>
+        </w:rPr>
+        <w:t>Android application development and web back-end development</w:t>
+      </w:r>
+      <w:r>
+        <w:rPr>
+          <w:szCs w:val="20"/>
+        </w:rPr>
+        <w:t>.</w:t>
       </w:r>
     </w:p>
     <w:p>
@@ -2607,6 +2554,7 @@
         <w:ind w:right="0"/>
         <w:jc w:val="both"/>
         <w:rPr>
+          <w:bCs/>
           <w:szCs w:val="20"/>
         </w:rPr>
       </w:pPr>
@@ -2616,19 +2564,92 @@
           <w:iCs/>
           <w:szCs w:val="20"/>
         </w:rPr>
-        <w:t>Technologies</w:t>
-      </w:r>
-      <w:r>
-        <w:rPr>
-          <w:szCs w:val="20"/>
-        </w:rPr>
-        <w:t>: REST APIs, multi-threading</w:t>
+        <w:t>Others</w:t>
+      </w:r>
+      <w:r>
+        <w:rPr>
+          <w:i/>
+          <w:iCs/>
+          <w:szCs w:val="20"/>
+        </w:rPr>
+        <w:t>:</w:t>
+      </w:r>
+      <w:r>
+        <w:rPr>
+          <w:b/>
+          <w:bCs/>
+          <w:szCs w:val="20"/>
+        </w:rPr>
+        <w:t xml:space="preserve"> </w:t>
+      </w:r>
+      <w:r>
+        <w:rPr>
+          <w:szCs w:val="20"/>
+        </w:rPr>
+        <w:t>Git, GitHub, VS Code</w:t>
+      </w:r>
+      <w:r>
+        <w:rPr>
+          <w:szCs w:val="20"/>
+        </w:rPr>
+        <w:t>,</w:t>
+      </w:r>
+      <w:r>
+        <w:rPr>
+          <w:szCs w:val="20"/>
+        </w:rPr>
+        <w:t xml:space="preserve"> and</w:t>
+      </w:r>
+      <w:r>
+        <w:rPr>
+          <w:szCs w:val="20"/>
+        </w:rPr>
+        <w:t xml:space="preserve"> Android Studio</w:t>
       </w:r>
       <w:r>
         <w:rPr>
           <w:szCs w:val="20"/>
         </w:rPr>
         <w:t>.</w:t>
+      </w:r>
+    </w:p>
+    <w:p>
+      <w:pPr>
+        <w:spacing w:line="240" w:lineRule="auto"/>
+        <w:ind w:right="0"/>
+        <w:jc w:val="both"/>
+        <w:rPr>
+          <w:bCs/>
+          <w:sz w:val="18"/>
+          <w:szCs w:val="18"/>
+        </w:rPr>
+      </w:pPr>
+    </w:p>
+    <w:p>
+      <w:pPr>
+        <w:spacing w:line="240" w:lineRule="auto"/>
+        <w:ind w:right="0"/>
+        <w:rPr>
+          <w:rFonts w:cstheme="minorBidi"/>
+          <w:b/>
+          <w:bCs/>
+        </w:rPr>
+      </w:pPr>
+      <w:r>
+        <w:rPr>
+          <w:rFonts w:cstheme="minorBidi"/>
+          <w:b/>
+          <w:bCs/>
+        </w:rPr>
+        <w:t>Familiarities</w:t>
+      </w:r>
+      <w:r>
+        <w:rPr>
+          <w:rFonts w:cstheme="minorBidi"/>
+          <w:b/>
+          <w:bCs/>
+        </w:rPr>
+        <w:t>:</w:t>
       </w:r>
     </w:p>
     <w:p>
@@ -2651,7 +2672,7 @@
           <w:iCs/>
           <w:szCs w:val="20"/>
         </w:rPr>
-        <w:t>Domains</w:t>
+        <w:t>Languages</w:t>
       </w:r>
       <w:r>
         <w:rPr>
@@ -2663,13 +2684,31 @@
         <w:rPr>
           <w:szCs w:val="20"/>
         </w:rPr>
-        <w:t xml:space="preserve"> </w:t>
-      </w:r>
-      <w:r>
-        <w:rPr>
-          <w:szCs w:val="20"/>
-        </w:rPr>
-        <w:t>Android application development and web back-end development</w:t>
+        <w:t xml:space="preserve"> JavaScript, PHP, Python</w:t>
+      </w:r>
+      <w:r>
+        <w:rPr>
+          <w:szCs w:val="20"/>
+        </w:rPr>
+        <w:t xml:space="preserve">, </w:t>
+      </w:r>
+      <w:r>
+        <w:rPr>
+          <w:szCs w:val="20"/>
+        </w:rPr>
+        <w:t>SQL</w:t>
+      </w:r>
+      <w:r>
+        <w:rPr>
+          <w:szCs w:val="20"/>
+        </w:rPr>
+        <w:t xml:space="preserve">, </w:t>
+      </w:r>
+      <w:r>
+        <w:rPr>
+          <w:szCs w:val="20"/>
+        </w:rPr>
+        <w:t>C++</w:t>
       </w:r>
       <w:r>
         <w:rPr>
@@ -2689,7 +2728,6 @@
         <w:ind w:right="0"/>
         <w:jc w:val="both"/>
         <w:rPr>
-          <w:bCs/>
           <w:szCs w:val="20"/>
         </w:rPr>
       </w:pPr>
@@ -2699,92 +2737,13 @@
           <w:iCs/>
           <w:szCs w:val="20"/>
         </w:rPr>
-        <w:t>Others</w:t>
-      </w:r>
-      <w:r>
-        <w:rPr>
-          <w:i/>
-          <w:iCs/>
-          <w:szCs w:val="20"/>
-        </w:rPr>
-        <w:t>:</w:t>
-      </w:r>
-      <w:r>
-        <w:rPr>
-          <w:b/>
-          <w:bCs/>
-          <w:szCs w:val="20"/>
-        </w:rPr>
-        <w:t xml:space="preserve"> </w:t>
-      </w:r>
-      <w:r>
-        <w:rPr>
-          <w:szCs w:val="20"/>
-        </w:rPr>
-        <w:t>Git, GitHub, VS Code</w:t>
-      </w:r>
-      <w:r>
-        <w:rPr>
-          <w:szCs w:val="20"/>
-        </w:rPr>
-        <w:t>,</w:t>
-      </w:r>
-      <w:r>
-        <w:rPr>
-          <w:szCs w:val="20"/>
-        </w:rPr>
-        <w:t xml:space="preserve"> and</w:t>
-      </w:r>
-      <w:r>
-        <w:rPr>
-          <w:szCs w:val="20"/>
-        </w:rPr>
-        <w:t xml:space="preserve"> Android Studio</w:t>
-      </w:r>
-      <w:r>
-        <w:rPr>
-          <w:szCs w:val="20"/>
-        </w:rPr>
-        <w:t>.</w:t>
-      </w:r>
-    </w:p>
-    <w:p>
-      <w:pPr>
-        <w:spacing w:line="240" w:lineRule="auto"/>
-        <w:ind w:right="0"/>
-        <w:jc w:val="both"/>
-        <w:rPr>
-          <w:bCs/>
-          <w:sz w:val="18"/>
-          <w:szCs w:val="18"/>
-        </w:rPr>
-      </w:pPr>
-    </w:p>
-    <w:p>
-      <w:pPr>
-        <w:spacing w:line="240" w:lineRule="auto"/>
-        <w:ind w:right="0"/>
-        <w:rPr>
-          <w:rFonts w:cstheme="minorBidi"/>
-          <w:b/>
-          <w:bCs/>
-        </w:rPr>
-      </w:pPr>
-      <w:r>
-        <w:rPr>
-          <w:rFonts w:cstheme="minorBidi"/>
-          <w:b/>
-          <w:bCs/>
-        </w:rPr>
-        <w:t>Familiarities</w:t>
-      </w:r>
-      <w:r>
-        <w:rPr>
-          <w:rFonts w:cstheme="minorBidi"/>
-          <w:b/>
-          <w:bCs/>
-        </w:rPr>
-        <w:t>:</w:t>
+        <w:t>Databases</w:t>
+      </w:r>
+      <w:r>
+        <w:rPr>
+          <w:szCs w:val="20"/>
+        </w:rPr>
+        <w:t>: Firebase, MySQL, and MySQL Workbench, MongoDB.</w:t>
       </w:r>
     </w:p>
     <w:p>
@@ -2807,7 +2766,7 @@
           <w:iCs/>
           <w:szCs w:val="20"/>
         </w:rPr>
-        <w:t>Languages</w:t>
+        <w:t>Technologies</w:t>
       </w:r>
       <w:r>
         <w:rPr>
@@ -2819,19 +2778,37 @@
         <w:rPr>
           <w:szCs w:val="20"/>
         </w:rPr>
-        <w:t>Python,</w:t>
-      </w:r>
-      <w:r>
-        <w:rPr>
-          <w:szCs w:val="20"/>
-        </w:rPr>
-        <w:t xml:space="preserve"> </w:t>
-      </w:r>
-      <w:r>
-        <w:rPr>
-          <w:szCs w:val="20"/>
-        </w:rPr>
-        <w:t>C, C++, HTML, XML, CSS, and JSON.</w:t>
+        <w:t>M</w:t>
+      </w:r>
+      <w:r>
+        <w:rPr>
+          <w:szCs w:val="20"/>
+        </w:rPr>
+        <w:t>ulti-threading</w:t>
+      </w:r>
+      <w:r>
+        <w:rPr>
+          <w:szCs w:val="20"/>
+        </w:rPr>
+        <w:t xml:space="preserve">, </w:t>
+      </w:r>
+      <w:r>
+        <w:rPr>
+          <w:szCs w:val="20"/>
+        </w:rPr>
+        <w:t>Microservices</w:t>
+      </w:r>
+      <w:r>
+        <w:rPr>
+          <w:szCs w:val="20"/>
+        </w:rPr>
+        <w:t>, ReactJS, Bootstrap, Spring Boot</w:t>
+      </w:r>
+      <w:r>
+        <w:rPr>
+          <w:szCs w:val="20"/>
+        </w:rPr>
+        <w:t>.</w:t>
       </w:r>
     </w:p>
     <w:p>
@@ -2854,13 +2831,37 @@
           <w:iCs/>
           <w:szCs w:val="20"/>
         </w:rPr>
-        <w:t xml:space="preserve">Databases: </w:t>
-      </w:r>
-      <w:r>
-        <w:rPr>
-          <w:szCs w:val="20"/>
-        </w:rPr>
-        <w:t>MongoDB.</w:t>
+        <w:t>Domains</w:t>
+      </w:r>
+      <w:r>
+        <w:rPr>
+          <w:szCs w:val="20"/>
+        </w:rPr>
+        <w:t>:</w:t>
+      </w:r>
+      <w:r>
+        <w:rPr>
+          <w:szCs w:val="20"/>
+        </w:rPr>
+        <w:t xml:space="preserve"> F</w:t>
+      </w:r>
+      <w:r>
+        <w:rPr>
+          <w:szCs w:val="20"/>
+        </w:rPr>
+        <w:t>ull-stack web development</w:t>
+      </w:r>
+      <w:r>
+        <w:rPr>
+          <w:szCs w:val="20"/>
+        </w:rPr>
+        <w:t>, AI/ML model development and integration</w:t>
+      </w:r>
+      <w:r>
+        <w:rPr>
+          <w:szCs w:val="20"/>
+        </w:rPr>
+        <w:t>.</w:t>
       </w:r>
     </w:p>
     <w:p>
@@ -2874,6 +2875,7 @@
         <w:ind w:right="0"/>
         <w:jc w:val="both"/>
         <w:rPr>
+          <w:bCs/>
           <w:szCs w:val="20"/>
         </w:rPr>
       </w:pPr>
@@ -2883,125 +2885,18 @@
           <w:iCs/>
           <w:szCs w:val="20"/>
         </w:rPr>
-        <w:t>Technologies</w:t>
-      </w:r>
-      <w:r>
-        <w:rPr>
-          <w:szCs w:val="20"/>
-        </w:rPr>
-        <w:t xml:space="preserve">: </w:t>
-      </w:r>
-      <w:r>
-        <w:rPr>
-          <w:szCs w:val="20"/>
-        </w:rPr>
-        <w:t>M</w:t>
-      </w:r>
-      <w:r>
-        <w:rPr>
-          <w:szCs w:val="20"/>
-        </w:rPr>
-        <w:t>icroservices</w:t>
-      </w:r>
-      <w:r>
-        <w:rPr>
-          <w:szCs w:val="20"/>
-        </w:rPr>
-        <w:t>, ReactJS, Bootstrap, Spring Boot</w:t>
-      </w:r>
-      <w:r>
-        <w:rPr>
-          <w:szCs w:val="20"/>
-        </w:rPr>
-        <w:t>.</w:t>
-      </w:r>
-    </w:p>
-    <w:p>
-      <w:pPr>
-        <w:pStyle w:val="ListParagraph"/>
-        <w:numPr>
-          <w:ilvl w:val="0"/>
-          <w:numId w:val="32"/>
-        </w:numPr>
-        <w:spacing w:line="240" w:lineRule="auto"/>
-        <w:ind w:right="0"/>
-        <w:jc w:val="both"/>
-        <w:rPr>
-          <w:szCs w:val="20"/>
-        </w:rPr>
-      </w:pPr>
+        <w:t>Others</w:t>
+      </w:r>
       <w:r>
         <w:rPr>
           <w:i/>
           <w:iCs/>
           <w:szCs w:val="20"/>
         </w:rPr>
-        <w:t>Domains</w:t>
-      </w:r>
-      <w:r>
-        <w:rPr>
-          <w:szCs w:val="20"/>
-        </w:rPr>
         <w:t>:</w:t>
       </w:r>
       <w:r>
         <w:rPr>
-          <w:szCs w:val="20"/>
-        </w:rPr>
-        <w:t xml:space="preserve"> F</w:t>
-      </w:r>
-      <w:r>
-        <w:rPr>
-          <w:szCs w:val="20"/>
-        </w:rPr>
-        <w:t>ull-stack web development</w:t>
-      </w:r>
-      <w:r>
-        <w:rPr>
-          <w:szCs w:val="20"/>
-        </w:rPr>
-        <w:t>, AI/ML model development and integration</w:t>
-      </w:r>
-      <w:r>
-        <w:rPr>
-          <w:szCs w:val="20"/>
-        </w:rPr>
-        <w:t>.</w:t>
-      </w:r>
-    </w:p>
-    <w:p>
-      <w:pPr>
-        <w:pStyle w:val="ListParagraph"/>
-        <w:numPr>
-          <w:ilvl w:val="0"/>
-          <w:numId w:val="32"/>
-        </w:numPr>
-        <w:spacing w:line="240" w:lineRule="auto"/>
-        <w:ind w:right="0"/>
-        <w:jc w:val="both"/>
-        <w:rPr>
-          <w:bCs/>
-          <w:szCs w:val="20"/>
-        </w:rPr>
-      </w:pPr>
-      <w:r>
-        <w:rPr>
-          <w:i/>
-          <w:iCs/>
-          <w:szCs w:val="20"/>
-        </w:rPr>
-        <w:t>Others</w:t>
-      </w:r>
-      <w:r>
-        <w:rPr>
-          <w:i/>
-          <w:iCs/>
-          <w:szCs w:val="20"/>
-        </w:rPr>
-        <w:t>:</w:t>
-      </w:r>
-      <w:r>
-        <w:rPr>
           <w:b/>
           <w:bCs/>
           <w:szCs w:val="20"/>
@@ -3062,8 +2957,16 @@
         <w:rPr>
           <w:szCs w:val="20"/>
         </w:rPr>
-        <w:t xml:space="preserve"> PHPMyAdmin</w:t>
-      </w:r>
+        <w:t xml:space="preserve"> </w:t>
+      </w:r>
+      <w:proofErr w:type="spellStart"/>
+      <w:r>
+        <w:rPr>
+          <w:szCs w:val="20"/>
+        </w:rPr>
+        <w:t>PHPMyAdmin</w:t>
+      </w:r>
+      <w:proofErr w:type="spellEnd"/>
       <w:r>
         <w:rPr>
           <w:szCs w:val="20"/>
@@ -3089,7 +2992,7 @@
     </w:p>
     <w:p>
       <w:pPr>
-        <w:spacing w:line="240" w:lineRule="auto"/>
+        <w:spacing w:line="360" w:lineRule="auto"/>
         <w:ind w:left="0" w:right="0" w:firstLine="0"/>
         <w:jc w:val="center"/>
         <w:rPr>
@@ -3120,7 +3023,7 @@
     </w:p>
     <w:p>
       <w:pPr>
-        <w:spacing w:line="240" w:lineRule="auto"/>
+        <w:spacing w:line="360" w:lineRule="auto"/>
         <w:ind w:right="0"/>
         <w:jc w:val="both"/>
         <w:rPr>
@@ -3197,7 +3100,7 @@
     </w:p>
     <w:p>
       <w:pPr>
-        <w:spacing w:line="240" w:lineRule="auto"/>
+        <w:spacing w:line="360" w:lineRule="auto"/>
         <w:ind w:right="0"/>
         <w:jc w:val="both"/>
         <w:rPr>
@@ -3398,42 +3301,42 @@
         <v:path o:extrusionok="f" gradientshapeok="t" o:connecttype="rect"/>
         <o:lock v:ext="edit" aspectratio="t"/>
       </v:shapetype>
-      <v:shape id="_x0000_i2040" type="#_x0000_t75" style="width:512.25pt;height:512.25pt;rotation:180;flip:x y;visibility:visible;mso-wrap-style:square" o:bullet="t">
+      <v:shape id="_x0000_i1848" type="#_x0000_t75" style="width:512.25pt;height:512.25pt;rotation:180;flip:x y;visibility:visible;mso-wrap-style:square" o:bullet="t">
         <v:imagedata r:id="rId1" o:title="107161_circle_github_icon"/>
       </v:shape>
     </w:pict>
   </w:numPicBullet>
   <w:numPicBullet w:numPicBulletId="1">
     <w:pict>
-      <v:shape id="_x0000_i2041" type="#_x0000_t75" style="width:169.5pt;height:169.5pt;visibility:visible;mso-wrap-style:square" o:bullet="t">
+      <v:shape id="_x0000_i1849" type="#_x0000_t75" style="width:169.5pt;height:169.5pt;visibility:visible;mso-wrap-style:square" o:bullet="t">
         <v:imagedata r:id="rId2" o:title="941C13C7"/>
       </v:shape>
     </w:pict>
   </w:numPicBullet>
   <w:numPicBullet w:numPicBulletId="2">
     <w:pict>
-      <v:shape id="_x0000_i2042" type="#_x0000_t75" style="width:28.5pt;height:16.5pt;visibility:visible;mso-wrap-style:square" o:bullet="t">
+      <v:shape id="_x0000_i1850" type="#_x0000_t75" style="width:28.5pt;height:16.5pt;visibility:visible;mso-wrap-style:square" o:bullet="t">
         <v:imagedata r:id="rId3" o:title="107161_circle_github_icon"/>
       </v:shape>
     </w:pict>
   </w:numPicBullet>
   <w:numPicBullet w:numPicBulletId="3">
     <w:pict>
-      <v:shape id="_x0000_i2043" type="#_x0000_t75" style="width:240pt;height:234pt;visibility:visible;mso-wrap-style:square" o:bullet="t">
+      <v:shape id="_x0000_i1851" type="#_x0000_t75" style="width:240pt;height:234pt;visibility:visible;mso-wrap-style:square" o:bullet="t">
         <v:imagedata r:id="rId4" o:title="Indian_Institute_of_Technology_Bombay_Logo"/>
       </v:shape>
     </w:pict>
   </w:numPicBullet>
   <w:numPicBullet w:numPicBulletId="4">
     <w:pict>
-      <v:shape id="_x0000_i2044" type="#_x0000_t75" style="width:22.5pt;height:16.5pt;visibility:visible;mso-wrap-style:square" o:bullet="t">
+      <v:shape id="_x0000_i1852" type="#_x0000_t75" style="width:22.5pt;height:16.5pt;visibility:visible;mso-wrap-style:square" o:bullet="t">
         <v:imagedata r:id="rId5" o:title="Indian_Institute_of_Technology_Bombay_Logo"/>
       </v:shape>
     </w:pict>
   </w:numPicBullet>
   <w:numPicBullet w:numPicBulletId="5">
     <w:pict>
-      <v:shape id="_x0000_i2045" type="#_x0000_t75" style="width:76.5pt;height:76.5pt;visibility:visible;mso-wrap-style:square" o:bullet="t">
+      <v:shape id="_x0000_i1853" type="#_x0000_t75" style="width:76.5pt;height:76.5pt;visibility:visible;mso-wrap-style:square" o:bullet="t">
         <v:imagedata r:id="rId6" o:title=""/>
       </v:shape>
     </w:pict>

</xml_diff>

<commit_message>
Education links updated, <<link>> word added in links
</commit_message>
<xml_diff>
--- a/Resume_latest - Copy.docx
+++ b/Resume_latest - Copy.docx
@@ -241,7 +241,7 @@
             <w:u w:val="none"/>
             <w:shd w:val="clear" w:color="auto" w:fill="FFFFFF"/>
           </w:rPr>
-          <w:t>l</w:t>
+          <w:t>link</w:t>
         </w:r>
         <w:r>
           <w:rPr>
@@ -252,7 +252,7 @@
             <w:u w:val="none"/>
             <w:shd w:val="clear" w:color="auto" w:fill="FFFFFF"/>
           </w:rPr>
-          <w:t>inkedin.com/in/</w:t>
+          <w:t>edin.com/in/</w:t>
         </w:r>
         <w:proofErr w:type="spellStart"/>
         <w:r>
@@ -898,7 +898,25 @@
             <w:bCs/>
             <w:u w:val="none"/>
           </w:rPr>
-          <w:t>Bajaj Institute of Technology, Wardha</w:t>
+          <w:t>Bajaj Institute of Technology, Ward</w:t>
+        </w:r>
+        <w:r>
+          <w:rPr>
+            <w:rStyle w:val="Hyperlink"/>
+            <w:b/>
+            <w:bCs/>
+            <w:u w:val="none"/>
+          </w:rPr>
+          <w:t>h</w:t>
+        </w:r>
+        <w:r>
+          <w:rPr>
+            <w:rStyle w:val="Hyperlink"/>
+            <w:b/>
+            <w:bCs/>
+            <w:u w:val="none"/>
+          </w:rPr>
+          <w:t>a</w:t>
         </w:r>
       </w:hyperlink>
       <w:r>
@@ -1133,6 +1151,7 @@
         <w:rPr>
           <w:b/>
           <w:bCs/>
+          <w:color w:val="auto"/>
           <w:szCs w:val="20"/>
         </w:rPr>
       </w:pPr>
@@ -1142,20 +1161,47 @@
             <w:rStyle w:val="Hyperlink"/>
             <w:b/>
             <w:bCs/>
+            <w:color w:val="0070C0"/>
             <w:szCs w:val="20"/>
             <w:u w:val="none"/>
           </w:rPr>
-          <w:t>OFY Wellness Android app</w:t>
+          <w:t xml:space="preserve">OFY Wellness Android app (Java) </w:t>
+        </w:r>
+        <w:r>
+          <w:rPr>
+            <w:rStyle w:val="Hyperlink"/>
+            <w:b/>
+            <w:bCs/>
+            <w:color w:val="000000" w:themeColor="text1"/>
+            <w:szCs w:val="20"/>
+            <w:u w:val="none"/>
+          </w:rPr>
+          <w:t>[</w:t>
+        </w:r>
+        <w:r>
+          <w:rPr>
+            <w:rStyle w:val="Hyperlink"/>
+            <w:b/>
+            <w:bCs/>
+            <w:i/>
+            <w:iCs/>
+            <w:color w:val="000000" w:themeColor="text1"/>
+            <w:szCs w:val="20"/>
+          </w:rPr>
+          <w:t>link</w:t>
+        </w:r>
+        <w:r>
+          <w:rPr>
+            <w:rStyle w:val="Hyperlink"/>
+            <w:b/>
+            <w:bCs/>
+            <w:color w:val="000000" w:themeColor="text1"/>
+            <w:szCs w:val="20"/>
+            <w:u w:val="none"/>
+          </w:rPr>
+          <w:t>]</w:t>
         </w:r>
       </w:hyperlink>
-      <w:r>
-        <w:rPr>
-          <w:b/>
-          <w:bCs/>
-          <w:szCs w:val="20"/>
-        </w:rPr>
-        <w:t xml:space="preserve"> (Java)</w:t>
-      </w:r>
     </w:p>
     <w:p>
       <w:pPr>
@@ -1268,7 +1314,21 @@
         <w:rPr>
           <w:szCs w:val="20"/>
         </w:rPr>
-        <w:t>Tuned the model and improved meal image and nutrient detection by over 50%.</w:t>
+        <w:t xml:space="preserve">Tuned the model and improved meal image and nutrient detection by over </w:t>
+      </w:r>
+      <w:r>
+        <w:rPr>
+          <w:b/>
+          <w:bCs/>
+          <w:szCs w:val="20"/>
+        </w:rPr>
+        <w:t>50%</w:t>
+      </w:r>
+      <w:r>
+        <w:rPr>
+          <w:szCs w:val="20"/>
+        </w:rPr>
+        <w:t>.</w:t>
       </w:r>
     </w:p>
     <w:p>
@@ -1391,6 +1451,7 @@
         <w:rPr>
           <w:b/>
           <w:bCs/>
+          <w:color w:val="auto"/>
           <w:szCs w:val="20"/>
         </w:rPr>
       </w:pPr>
@@ -1398,33 +1459,93 @@
         <w:r>
           <w:rPr>
             <w:rStyle w:val="Hyperlink"/>
-            <w:rFonts w:cs="Arial"/>
             <w:b/>
             <w:bCs/>
+            <w:color w:val="0070C0"/>
             <w:szCs w:val="20"/>
             <w:u w:val="none"/>
           </w:rPr>
-          <w:t>A Spring Boot</w:t>
+          <w:t xml:space="preserve">A Spring Boot </w:t>
         </w:r>
         <w:r>
           <w:rPr>
             <w:rStyle w:val="Hyperlink"/>
             <w:b/>
             <w:bCs/>
+            <w:color w:val="0070C0"/>
             <w:szCs w:val="20"/>
             <w:u w:val="none"/>
           </w:rPr>
-          <w:t xml:space="preserve"> revenue converter</w:t>
+          <w:t>R</w:t>
+        </w:r>
+        <w:r>
+          <w:rPr>
+            <w:rStyle w:val="Hyperlink"/>
+            <w:b/>
+            <w:bCs/>
+            <w:color w:val="0070C0"/>
+            <w:szCs w:val="20"/>
+            <w:u w:val="none"/>
+          </w:rPr>
+          <w:t xml:space="preserve">evenue </w:t>
+        </w:r>
+        <w:r>
+          <w:rPr>
+            <w:rStyle w:val="Hyperlink"/>
+            <w:b/>
+            <w:bCs/>
+            <w:color w:val="0070C0"/>
+            <w:szCs w:val="20"/>
+            <w:u w:val="none"/>
+          </w:rPr>
+          <w:t>C</w:t>
+        </w:r>
+        <w:r>
+          <w:rPr>
+            <w:rStyle w:val="Hyperlink"/>
+            <w:b/>
+            <w:bCs/>
+            <w:color w:val="0070C0"/>
+            <w:szCs w:val="20"/>
+            <w:u w:val="none"/>
+          </w:rPr>
+          <w:t xml:space="preserve">onverter (Java) </w:t>
+        </w:r>
+        <w:r>
+          <w:rPr>
+            <w:rStyle w:val="Hyperlink"/>
+            <w:b/>
+            <w:bCs/>
+            <w:color w:val="000000" w:themeColor="text1"/>
+            <w:szCs w:val="20"/>
+            <w:u w:val="none"/>
+          </w:rPr>
+          <w:t>[</w:t>
+        </w:r>
+        <w:r>
+          <w:rPr>
+            <w:rStyle w:val="Hyperlink"/>
+            <w:b/>
+            <w:bCs/>
+            <w:i/>
+            <w:iCs/>
+            <w:color w:val="000000" w:themeColor="text1"/>
+            <w:szCs w:val="20"/>
+          </w:rPr>
+          <w:t>link</w:t>
+        </w:r>
+        <w:r>
+          <w:rPr>
+            <w:rStyle w:val="Hyperlink"/>
+            <w:b/>
+            <w:bCs/>
+            <w:color w:val="000000" w:themeColor="text1"/>
+            <w:szCs w:val="20"/>
+            <w:u w:val="none"/>
+          </w:rPr>
+          <w:t>]</w:t>
         </w:r>
       </w:hyperlink>
-      <w:r>
-        <w:rPr>
-          <w:b/>
-          <w:bCs/>
-          <w:szCs w:val="20"/>
-        </w:rPr>
-        <w:t xml:space="preserve"> (Java)</w:t>
-      </w:r>
     </w:p>
     <w:p>
       <w:pPr>
@@ -1456,19 +1577,27 @@
         <w:rPr>
           <w:szCs w:val="20"/>
         </w:rPr>
-        <w:t xml:space="preserve"> </w:t>
-      </w:r>
-      <w:r>
-        <w:rPr>
-          <w:szCs w:val="20"/>
-        </w:rPr>
-        <w:t>conversion feature</w:t>
-      </w:r>
-      <w:r>
-        <w:rPr>
-          <w:szCs w:val="20"/>
-        </w:rPr>
-        <w:t xml:space="preserve"> to 10+ currency pairs</w:t>
+        <w:t xml:space="preserve"> conversion feature</w:t>
+      </w:r>
+      <w:r>
+        <w:rPr>
+          <w:szCs w:val="20"/>
+        </w:rPr>
+        <w:t xml:space="preserve"> to </w:t>
+      </w:r>
+      <w:r>
+        <w:rPr>
+          <w:b/>
+          <w:bCs/>
+          <w:szCs w:val="20"/>
+        </w:rPr>
+        <w:t>10+</w:t>
+      </w:r>
+      <w:r>
+        <w:rPr>
+          <w:szCs w:val="20"/>
+        </w:rPr>
+        <w:t xml:space="preserve"> currency pairs</w:t>
       </w:r>
       <w:r>
         <w:rPr>
@@ -1509,7 +1638,21 @@
         <w:rPr>
           <w:szCs w:val="20"/>
         </w:rPr>
-        <w:t>the Spring Boot application and increased its availability by more than 10% by deploying it</w:t>
+        <w:t xml:space="preserve">the Spring Boot application and increased its availability by more than </w:t>
+      </w:r>
+      <w:r>
+        <w:rPr>
+          <w:b/>
+          <w:bCs/>
+          <w:szCs w:val="20"/>
+        </w:rPr>
+        <w:t>10%</w:t>
+      </w:r>
+      <w:r>
+        <w:rPr>
+          <w:szCs w:val="20"/>
+        </w:rPr>
+        <w:t xml:space="preserve"> by deploying it</w:t>
       </w:r>
       <w:r>
         <w:rPr>
@@ -1823,7 +1966,16 @@
           <w:rFonts w:cstheme="minorBidi"/>
           <w:szCs w:val="20"/>
         </w:rPr>
-        <w:t xml:space="preserve"> about 33%</w:t>
+        <w:t xml:space="preserve"> about </w:t>
+      </w:r>
+      <w:r>
+        <w:rPr>
+          <w:rFonts w:cstheme="minorBidi"/>
+          <w:b/>
+          <w:bCs/>
+          <w:szCs w:val="20"/>
+        </w:rPr>
+        <w:t>33%</w:t>
       </w:r>
       <w:r>
         <w:rPr>
@@ -1905,35 +2057,57 @@
             <w:szCs w:val="20"/>
             <w:u w:val="none"/>
           </w:rPr>
-          <w:t>Hindi4All: A brand-new programming language</w:t>
+          <w:t xml:space="preserve">Hindi4All: A brand-new programming language </w:t>
+        </w:r>
+        <w:r>
+          <w:rPr>
+            <w:rStyle w:val="Hyperlink"/>
+            <w:rFonts w:cs="Arial"/>
+            <w:b/>
+            <w:bCs/>
+            <w:color w:val="auto"/>
+            <w:szCs w:val="20"/>
+            <w:u w:val="none"/>
+          </w:rPr>
+          <w:t>(JavaScript, PHP) [</w:t>
+        </w:r>
+        <w:r>
+          <w:rPr>
+            <w:rStyle w:val="Hyperlink"/>
+            <w:rFonts w:cs="Arial"/>
+            <w:b/>
+            <w:bCs/>
+            <w:i/>
+            <w:iCs/>
+            <w:color w:val="auto"/>
+            <w:szCs w:val="20"/>
+          </w:rPr>
+          <w:t>link</w:t>
+        </w:r>
+        <w:r>
+          <w:rPr>
+            <w:rStyle w:val="Hyperlink"/>
+            <w:rFonts w:cs="Arial"/>
+            <w:b/>
+            <w:bCs/>
+            <w:color w:val="auto"/>
+            <w:szCs w:val="20"/>
+            <w:u w:val="none"/>
+          </w:rPr>
+          <w:t>]</w:t>
         </w:r>
       </w:hyperlink>
       <w:r>
         <w:rPr>
-          <w:rFonts w:cs="Arial"/>
+          <w:szCs w:val="20"/>
+        </w:rPr>
+        <w:t>:</w:t>
+      </w:r>
+      <w:r>
+        <w:rPr>
           <w:szCs w:val="20"/>
         </w:rPr>
         <w:t xml:space="preserve"> </w:t>
-      </w:r>
-      <w:r>
-        <w:rPr>
-          <w:szCs w:val="20"/>
-        </w:rPr>
-        <w:t>(</w:t>
-      </w:r>
-      <w:r>
-        <w:rPr>
-          <w:b/>
-          <w:bCs/>
-          <w:szCs w:val="20"/>
-        </w:rPr>
-        <w:t>JavaScript, PHP</w:t>
-      </w:r>
-      <w:r>
-        <w:rPr>
-          <w:szCs w:val="20"/>
-        </w:rPr>
-        <w:t xml:space="preserve">): </w:t>
       </w:r>
       <w:r>
         <w:rPr>
@@ -2007,6 +2181,8 @@
         <w:ind w:right="0"/>
         <w:jc w:val="both"/>
         <w:rPr>
+          <w:b/>
+          <w:bCs/>
           <w:szCs w:val="20"/>
         </w:rPr>
       </w:pPr>
@@ -2020,7 +2196,44 @@
             <w:szCs w:val="20"/>
             <w:u w:val="none"/>
           </w:rPr>
-          <w:t>Stock trading</w:t>
+          <w:t xml:space="preserve">Stock trading </w:t>
+        </w:r>
+        <w:r>
+          <w:rPr>
+            <w:rStyle w:val="Hyperlink"/>
+            <w:rFonts w:cs="Arial"/>
+            <w:b/>
+            <w:bCs/>
+            <w:color w:val="auto"/>
+            <w:szCs w:val="20"/>
+            <w:u w:val="none"/>
+          </w:rPr>
+          <w:t>(Python, Java) [</w:t>
+        </w:r>
+        <w:r>
+          <w:rPr>
+            <w:rStyle w:val="Hyperlink"/>
+            <w:rFonts w:cs="Arial"/>
+            <w:b/>
+            <w:bCs/>
+            <w:i/>
+            <w:iCs/>
+            <w:color w:val="auto"/>
+            <w:szCs w:val="20"/>
+          </w:rPr>
+          <w:t>link</w:t>
+        </w:r>
+        <w:r>
+          <w:rPr>
+            <w:rStyle w:val="Hyperlink"/>
+            <w:rFonts w:cs="Arial"/>
+            <w:b/>
+            <w:bCs/>
+            <w:color w:val="auto"/>
+            <w:szCs w:val="20"/>
+            <w:u w:val="none"/>
+          </w:rPr>
+          <w:t>]</w:t>
         </w:r>
       </w:hyperlink>
       <w:r>
@@ -2028,200 +2241,169 @@
           <w:rFonts w:cs="Arial"/>
           <w:szCs w:val="20"/>
         </w:rPr>
+        <w:t>:</w:t>
+      </w:r>
+      <w:r>
+        <w:rPr>
+          <w:rFonts w:cs="Arial"/>
+          <w:szCs w:val="20"/>
+        </w:rPr>
+        <w:t xml:space="preserve"> applications </w:t>
+      </w:r>
+      <w:r>
+        <w:rPr>
+          <w:szCs w:val="20"/>
+        </w:rPr>
+        <w:t>that operated APIs provided by</w:t>
+      </w:r>
+      <w:r>
+        <w:rPr>
+          <w:szCs w:val="20"/>
+        </w:rPr>
+        <w:t xml:space="preserve"> leading</w:t>
+      </w:r>
+      <w:r>
+        <w:rPr>
+          <w:szCs w:val="20"/>
+        </w:rPr>
+        <w:t xml:space="preserve"> stock brokers, namely </w:t>
+      </w:r>
+      <w:r>
+        <w:rPr>
+          <w:szCs w:val="20"/>
+        </w:rPr>
+        <w:t>Kota Securities, Fyers</w:t>
+      </w:r>
+      <w:r>
+        <w:rPr>
+          <w:szCs w:val="20"/>
+        </w:rPr>
+        <w:t>,</w:t>
+      </w:r>
+      <w:r>
+        <w:rPr>
+          <w:szCs w:val="20"/>
+        </w:rPr>
         <w:t xml:space="preserve"> </w:t>
       </w:r>
       <w:r>
         <w:rPr>
-          <w:rFonts w:cs="Arial"/>
-          <w:szCs w:val="20"/>
-        </w:rPr>
-        <w:t>(</w:t>
-      </w:r>
-      <w:r>
-        <w:rPr>
-          <w:rFonts w:cs="Arial"/>
+          <w:szCs w:val="20"/>
+        </w:rPr>
+        <w:t xml:space="preserve">and </w:t>
+      </w:r>
+      <w:proofErr w:type="spellStart"/>
+      <w:r>
+        <w:rPr>
+          <w:szCs w:val="20"/>
+        </w:rPr>
+        <w:t>Zerodha</w:t>
+      </w:r>
+      <w:proofErr w:type="spellEnd"/>
+      <w:r>
+        <w:rPr>
+          <w:szCs w:val="20"/>
+        </w:rPr>
+        <w:t xml:space="preserve">, </w:t>
+      </w:r>
+      <w:r>
+        <w:rPr>
+          <w:szCs w:val="20"/>
+        </w:rPr>
+        <w:t xml:space="preserve">that algorithmically </w:t>
+      </w:r>
+      <w:r>
+        <w:rPr>
+          <w:szCs w:val="20"/>
+        </w:rPr>
+        <w:t>t</w:t>
+      </w:r>
+      <w:r>
+        <w:rPr>
+          <w:szCs w:val="20"/>
+        </w:rPr>
+        <w:t>rade</w:t>
+      </w:r>
+      <w:r>
+        <w:rPr>
+          <w:szCs w:val="20"/>
+        </w:rPr>
+        <w:t>d</w:t>
+      </w:r>
+      <w:r>
+        <w:rPr>
+          <w:szCs w:val="20"/>
+        </w:rPr>
+        <w:t xml:space="preserve"> stocks</w:t>
+      </w:r>
+      <w:r>
+        <w:rPr>
+          <w:szCs w:val="20"/>
+        </w:rPr>
+        <w:t xml:space="preserve"> &amp; </w:t>
+      </w:r>
+      <w:r>
+        <w:rPr>
+          <w:szCs w:val="20"/>
+        </w:rPr>
+        <w:t xml:space="preserve">futures contracts </w:t>
+      </w:r>
+      <w:r>
+        <w:rPr>
+          <w:szCs w:val="20"/>
+        </w:rPr>
+        <w:t>worth</w:t>
+      </w:r>
+      <w:r>
+        <w:rPr>
+          <w:szCs w:val="20"/>
+        </w:rPr>
+        <w:t xml:space="preserve"> </w:t>
+      </w:r>
+      <w:r>
+        <w:rPr>
           <w:b/>
           <w:bCs/>
           <w:szCs w:val="20"/>
         </w:rPr>
-        <w:t>Python</w:t>
-      </w:r>
-      <w:r>
-        <w:rPr>
-          <w:rFonts w:cs="Arial"/>
+        <w:t>~</w:t>
+      </w:r>
+      <w:r>
+        <w:rPr>
           <w:b/>
           <w:bCs/>
           <w:szCs w:val="20"/>
         </w:rPr>
+        <w:t>₹</w:t>
+      </w:r>
+      <w:r>
+        <w:rPr>
+          <w:b/>
+          <w:bCs/>
+          <w:szCs w:val="20"/>
+        </w:rPr>
+        <w:t>10</w:t>
+      </w:r>
+      <w:r>
+        <w:rPr>
+          <w:b/>
+          <w:bCs/>
+          <w:szCs w:val="20"/>
+        </w:rPr>
         <w:t>,</w:t>
       </w:r>
       <w:r>
         <w:rPr>
-          <w:rFonts w:cs="Arial"/>
           <w:b/>
           <w:bCs/>
           <w:szCs w:val="20"/>
         </w:rPr>
-        <w:t xml:space="preserve"> </w:t>
-      </w:r>
-      <w:r>
-        <w:rPr>
-          <w:rFonts w:cs="Arial"/>
+        <w:t>000</w:t>
+      </w:r>
+      <w:r>
+        <w:rPr>
           <w:b/>
           <w:bCs/>
-          <w:szCs w:val="20"/>
-        </w:rPr>
-        <w:t>Java</w:t>
-      </w:r>
-      <w:r>
-        <w:rPr>
-          <w:rFonts w:cs="Arial"/>
-          <w:szCs w:val="20"/>
-        </w:rPr>
-        <w:t xml:space="preserve">): applications </w:t>
-      </w:r>
-      <w:r>
-        <w:rPr>
-          <w:szCs w:val="20"/>
-        </w:rPr>
-        <w:t>that operated APIs provided by</w:t>
-      </w:r>
-      <w:r>
-        <w:rPr>
-          <w:szCs w:val="20"/>
-        </w:rPr>
-        <w:t xml:space="preserve"> leading</w:t>
-      </w:r>
-      <w:r>
-        <w:rPr>
-          <w:szCs w:val="20"/>
-        </w:rPr>
-        <w:t xml:space="preserve"> stock brokers, namely </w:t>
-      </w:r>
-      <w:r>
-        <w:rPr>
-          <w:szCs w:val="20"/>
-        </w:rPr>
-        <w:t>Kota Securities, Fyers</w:t>
-      </w:r>
-      <w:r>
-        <w:rPr>
-          <w:szCs w:val="20"/>
-        </w:rPr>
-        <w:t>,</w:t>
-      </w:r>
-      <w:r>
-        <w:rPr>
-          <w:szCs w:val="20"/>
-        </w:rPr>
-        <w:t xml:space="preserve"> </w:t>
-      </w:r>
-      <w:r>
-        <w:rPr>
-          <w:szCs w:val="20"/>
-        </w:rPr>
-        <w:t xml:space="preserve">and </w:t>
-      </w:r>
-      <w:proofErr w:type="spellStart"/>
-      <w:r>
-        <w:rPr>
-          <w:szCs w:val="20"/>
-        </w:rPr>
-        <w:t>Zerodha</w:t>
-      </w:r>
-      <w:proofErr w:type="spellEnd"/>
-      <w:r>
-        <w:rPr>
-          <w:szCs w:val="20"/>
-        </w:rPr>
-        <w:t xml:space="preserve">, </w:t>
-      </w:r>
-      <w:r>
-        <w:rPr>
-          <w:szCs w:val="20"/>
-        </w:rPr>
-        <w:t xml:space="preserve">that algorithmically </w:t>
-      </w:r>
-      <w:r>
-        <w:rPr>
-          <w:szCs w:val="20"/>
-        </w:rPr>
-        <w:t>t</w:t>
-      </w:r>
-      <w:r>
-        <w:rPr>
-          <w:szCs w:val="20"/>
-        </w:rPr>
-        <w:t>rade</w:t>
-      </w:r>
-      <w:r>
-        <w:rPr>
-          <w:szCs w:val="20"/>
-        </w:rPr>
-        <w:t>d</w:t>
-      </w:r>
-      <w:r>
-        <w:rPr>
-          <w:szCs w:val="20"/>
-        </w:rPr>
-        <w:t xml:space="preserve"> stocks</w:t>
-      </w:r>
-      <w:r>
-        <w:rPr>
-          <w:szCs w:val="20"/>
-        </w:rPr>
-        <w:t xml:space="preserve"> &amp; </w:t>
-      </w:r>
-      <w:r>
-        <w:rPr>
-          <w:szCs w:val="20"/>
-        </w:rPr>
-        <w:t xml:space="preserve">futures contracts </w:t>
-      </w:r>
-      <w:r>
-        <w:rPr>
-          <w:szCs w:val="20"/>
-        </w:rPr>
-        <w:t>worth</w:t>
-      </w:r>
-      <w:r>
-        <w:rPr>
-          <w:szCs w:val="20"/>
-        </w:rPr>
-        <w:t xml:space="preserve"> </w:t>
-      </w:r>
-      <w:r>
-        <w:rPr>
-          <w:szCs w:val="20"/>
-        </w:rPr>
-        <w:t>~</w:t>
-      </w:r>
-      <w:r>
-        <w:rPr>
-          <w:szCs w:val="20"/>
-        </w:rPr>
-        <w:t>₹</w:t>
-      </w:r>
-      <w:r>
-        <w:rPr>
-          <w:szCs w:val="20"/>
-        </w:rPr>
-        <w:t>10</w:t>
-      </w:r>
-      <w:r>
-        <w:rPr>
-          <w:szCs w:val="20"/>
-        </w:rPr>
-        <w:t>,</w:t>
-      </w:r>
-      <w:r>
-        <w:rPr>
-          <w:szCs w:val="20"/>
-        </w:rPr>
-        <w:t>000</w:t>
-      </w:r>
-      <w:r>
-        <w:rPr>
           <w:szCs w:val="20"/>
         </w:rPr>
         <w:t>.</w:t>
@@ -2254,39 +2436,47 @@
             <w:szCs w:val="20"/>
             <w:u w:val="none"/>
           </w:rPr>
-          <w:t>Autonomous drone</w:t>
+          <w:t xml:space="preserve">Autonomous drone </w:t>
+        </w:r>
+        <w:r>
+          <w:rPr>
+            <w:rStyle w:val="Hyperlink"/>
+            <w:b/>
+            <w:bCs/>
+            <w:color w:val="auto"/>
+            <w:szCs w:val="20"/>
+            <w:u w:val="none"/>
+          </w:rPr>
+          <w:t>(C++, JavaScript) [</w:t>
+        </w:r>
+        <w:r>
+          <w:rPr>
+            <w:rStyle w:val="Hyperlink"/>
+            <w:b/>
+            <w:bCs/>
+            <w:i/>
+            <w:iCs/>
+            <w:color w:val="auto"/>
+            <w:szCs w:val="20"/>
+          </w:rPr>
+          <w:t>link</w:t>
+        </w:r>
+        <w:r>
+          <w:rPr>
+            <w:rStyle w:val="Hyperlink"/>
+            <w:b/>
+            <w:bCs/>
+            <w:color w:val="auto"/>
+            <w:szCs w:val="20"/>
+            <w:u w:val="none"/>
+          </w:rPr>
+          <w:t>]:</w:t>
         </w:r>
       </w:hyperlink>
       <w:r>
         <w:rPr>
-          <w:rStyle w:val="Hyperlink"/>
-          <w:szCs w:val="20"/>
-          <w:u w:val="none"/>
-        </w:rPr>
-        <w:t xml:space="preserve"> </w:t>
-      </w:r>
-      <w:r>
-        <w:rPr>
-          <w:szCs w:val="20"/>
-        </w:rPr>
-        <w:t>(</w:t>
-      </w:r>
-      <w:r>
-        <w:rPr>
           <w:b/>
           <w:bCs/>
-          <w:szCs w:val="20"/>
-        </w:rPr>
-        <w:t>C++, JavaScript</w:t>
-      </w:r>
-      <w:r>
-        <w:rPr>
-          <w:szCs w:val="20"/>
-        </w:rPr>
-        <w:t>):</w:t>
-      </w:r>
-      <w:r>
-        <w:rPr>
           <w:szCs w:val="20"/>
         </w:rPr>
         <w:t xml:space="preserve"> </w:t>
@@ -2333,28 +2523,54 @@
             <w:szCs w:val="20"/>
             <w:u w:val="none"/>
           </w:rPr>
-          <w:t>Portfolio Site</w:t>
+          <w:t xml:space="preserve">Portfolio Site </w:t>
+        </w:r>
+        <w:r>
+          <w:rPr>
+            <w:rStyle w:val="Hyperlink"/>
+            <w:b/>
+            <w:bCs/>
+            <w:color w:val="auto"/>
+            <w:szCs w:val="20"/>
+            <w:u w:val="none"/>
+          </w:rPr>
+          <w:t>(JavaScript, React) [</w:t>
+        </w:r>
+        <w:r>
+          <w:rPr>
+            <w:rStyle w:val="Hyperlink"/>
+            <w:b/>
+            <w:bCs/>
+            <w:i/>
+            <w:iCs/>
+            <w:color w:val="auto"/>
+            <w:szCs w:val="20"/>
+          </w:rPr>
+          <w:t>link</w:t>
+        </w:r>
+        <w:r>
+          <w:rPr>
+            <w:rStyle w:val="Hyperlink"/>
+            <w:b/>
+            <w:bCs/>
+            <w:color w:val="auto"/>
+            <w:szCs w:val="20"/>
+            <w:u w:val="none"/>
+          </w:rPr>
+          <w:t>]</w:t>
         </w:r>
       </w:hyperlink>
       <w:r>
         <w:rPr>
           <w:szCs w:val="20"/>
         </w:rPr>
-        <w:t xml:space="preserve"> (</w:t>
-      </w:r>
-      <w:r>
-        <w:rPr>
-          <w:b/>
-          <w:bCs/>
-          <w:szCs w:val="20"/>
-        </w:rPr>
-        <w:t>JavaScript, React</w:t>
-      </w:r>
-      <w:r>
-        <w:rPr>
-          <w:szCs w:val="20"/>
-        </w:rPr>
-        <w:t>): React J</w:t>
+        <w:t>:</w:t>
+      </w:r>
+      <w:r>
+        <w:rPr>
+          <w:szCs w:val="20"/>
+        </w:rPr>
+        <w:t xml:space="preserve"> React J</w:t>
       </w:r>
       <w:r>
         <w:rPr>
@@ -3301,42 +3517,42 @@
         <v:path o:extrusionok="f" gradientshapeok="t" o:connecttype="rect"/>
         <o:lock v:ext="edit" aspectratio="t"/>
       </v:shapetype>
-      <v:shape id="_x0000_i1848" type="#_x0000_t75" style="width:512.25pt;height:512.25pt;rotation:180;flip:x y;visibility:visible;mso-wrap-style:square" o:bullet="t">
+      <v:shape id="_x0000_i1344" type="#_x0000_t75" style="width:512.25pt;height:512.25pt;rotation:180;flip:x y;visibility:visible;mso-wrap-style:square" o:bullet="t">
         <v:imagedata r:id="rId1" o:title="107161_circle_github_icon"/>
       </v:shape>
     </w:pict>
   </w:numPicBullet>
   <w:numPicBullet w:numPicBulletId="1">
     <w:pict>
-      <v:shape id="_x0000_i1849" type="#_x0000_t75" style="width:169.5pt;height:169.5pt;visibility:visible;mso-wrap-style:square" o:bullet="t">
+      <v:shape id="_x0000_i1345" type="#_x0000_t75" style="width:169.5pt;height:169.5pt;visibility:visible;mso-wrap-style:square" o:bullet="t">
         <v:imagedata r:id="rId2" o:title="941C13C7"/>
       </v:shape>
     </w:pict>
   </w:numPicBullet>
   <w:numPicBullet w:numPicBulletId="2">
     <w:pict>
-      <v:shape id="_x0000_i1850" type="#_x0000_t75" style="width:28.5pt;height:16.5pt;visibility:visible;mso-wrap-style:square" o:bullet="t">
+      <v:shape id="_x0000_i1346" type="#_x0000_t75" style="width:28.5pt;height:16.5pt;visibility:visible;mso-wrap-style:square" o:bullet="t">
         <v:imagedata r:id="rId3" o:title="107161_circle_github_icon"/>
       </v:shape>
     </w:pict>
   </w:numPicBullet>
   <w:numPicBullet w:numPicBulletId="3">
     <w:pict>
-      <v:shape id="_x0000_i1851" type="#_x0000_t75" style="width:240pt;height:234pt;visibility:visible;mso-wrap-style:square" o:bullet="t">
+      <v:shape id="_x0000_i1347" type="#_x0000_t75" style="width:240pt;height:234pt;visibility:visible;mso-wrap-style:square" o:bullet="t">
         <v:imagedata r:id="rId4" o:title="Indian_Institute_of_Technology_Bombay_Logo"/>
       </v:shape>
     </w:pict>
   </w:numPicBullet>
   <w:numPicBullet w:numPicBulletId="4">
     <w:pict>
-      <v:shape id="_x0000_i1852" type="#_x0000_t75" style="width:22.5pt;height:16.5pt;visibility:visible;mso-wrap-style:square" o:bullet="t">
+      <v:shape id="_x0000_i1348" type="#_x0000_t75" style="width:22.5pt;height:16.5pt;visibility:visible;mso-wrap-style:square" o:bullet="t">
         <v:imagedata r:id="rId5" o:title="Indian_Institute_of_Technology_Bombay_Logo"/>
       </v:shape>
     </w:pict>
   </w:numPicBullet>
   <w:numPicBullet w:numPicBulletId="5">
     <w:pict>
-      <v:shape id="_x0000_i1853" type="#_x0000_t75" style="width:76.5pt;height:76.5pt;visibility:visible;mso-wrap-style:square" o:bullet="t">
+      <v:shape id="_x0000_i1349" type="#_x0000_t75" style="width:76.5pt;height:76.5pt;visibility:visible;mso-wrap-style:square" o:bullet="t">
         <v:imagedata r:id="rId6" o:title=""/>
       </v:shape>
     </w:pict>

</xml_diff>

<commit_message>
very minor changes like comma rearranging course word, CISCO course names, etc
</commit_message>
<xml_diff>
--- a/Resume_latest - Copy.docx
+++ b/Resume_latest - Copy.docx
@@ -195,25 +195,7 @@
             <w:color w:val="000000" w:themeColor="text1"/>
             <w:u w:val="none"/>
           </w:rPr>
-          <w:t>ub.com/</w:t>
-        </w:r>
-        <w:proofErr w:type="spellStart"/>
-        <w:r>
-          <w:rPr>
-            <w:rStyle w:val="Hyperlink"/>
-            <w:color w:val="000000" w:themeColor="text1"/>
-            <w:u w:val="none"/>
-          </w:rPr>
-          <w:t>PrathameshBhagat</w:t>
-        </w:r>
-        <w:proofErr w:type="spellEnd"/>
-        <w:r>
-          <w:rPr>
-            <w:rStyle w:val="Hyperlink"/>
-            <w:color w:val="000000" w:themeColor="text1"/>
-            <w:u w:val="none"/>
-          </w:rPr>
-          <w:t xml:space="preserve"> </w:t>
+          <w:t xml:space="preserve">ub.com/PrathameshBhagat </w:t>
         </w:r>
       </w:hyperlink>
     </w:p>
@@ -632,20 +614,8 @@
             <w:u w:val="none"/>
             <w:shd w:val="clear" w:color="auto" w:fill="FFFFFF"/>
           </w:rPr>
-          <w:t>inkedin.com/in/</w:t>
+          <w:t>inkedin.com/in/prathameshvivekbhagat</w:t>
         </w:r>
-        <w:proofErr w:type="spellStart"/>
-        <w:r>
-          <w:rPr>
-            <w:rStyle w:val="Hyperlink"/>
-            <w:bCs/>
-            <w:color w:val="000000" w:themeColor="text1"/>
-            <w:u w:val="none"/>
-            <w:shd w:val="clear" w:color="auto" w:fill="FFFFFF"/>
-          </w:rPr>
-          <w:t>prathameshvivekbhagat</w:t>
-        </w:r>
-        <w:proofErr w:type="spellEnd"/>
       </w:hyperlink>
       <w:r>
         <w:rPr>
@@ -1061,19 +1031,8 @@
             <w:color w:val="000000" w:themeColor="text1"/>
             <w:u w:val="none"/>
           </w:rPr>
-          <w:t xml:space="preserve">Lal Bahadur Shastri Jr. College, </w:t>
+          <w:t>Lal Bahadur Shastri Jr. College, Bhandara</w:t>
         </w:r>
-        <w:proofErr w:type="spellStart"/>
-        <w:r>
-          <w:rPr>
-            <w:rStyle w:val="Hyperlink"/>
-            <w:bCs/>
-            <w:color w:val="000000" w:themeColor="text1"/>
-            <w:u w:val="none"/>
-          </w:rPr>
-          <w:t>Bhandara</w:t>
-        </w:r>
-        <w:proofErr w:type="spellEnd"/>
       </w:hyperlink>
       <w:r>
         <w:rPr>
@@ -1473,7 +1432,7 @@
           <w:bCs/>
           <w:szCs w:val="20"/>
         </w:rPr>
-        <w:t xml:space="preserve">, </w:t>
+        <w:t xml:space="preserve"> </w:t>
       </w:r>
       <w:r>
         <w:rPr>
@@ -1661,7 +1620,19 @@
         <w:rPr>
           <w:szCs w:val="20"/>
         </w:rPr>
-        <w:t xml:space="preserve">mage and nutrient detection via </w:t>
+        <w:t>mage and nutrient detection via</w:t>
+      </w:r>
+      <w:r>
+        <w:rPr>
+          <w:szCs w:val="20"/>
+        </w:rPr>
+        <w:t xml:space="preserve"> the</w:t>
+      </w:r>
+      <w:r>
+        <w:rPr>
+          <w:szCs w:val="20"/>
+        </w:rPr>
+        <w:t xml:space="preserve"> </w:t>
       </w:r>
       <w:r>
         <w:rPr>
@@ -1991,13 +1962,21 @@
         <w:rPr>
           <w:szCs w:val="20"/>
         </w:rPr>
-        <w:t>water intake</w:t>
-      </w:r>
-      <w:r>
-        <w:rPr>
-          <w:szCs w:val="20"/>
-        </w:rPr>
-        <w:t>,</w:t>
+        <w:t xml:space="preserve">water intake </w:t>
+      </w:r>
+      <w:r>
+        <w:rPr>
+          <w:szCs w:val="20"/>
+        </w:rPr>
+        <w:t xml:space="preserve">and </w:t>
+      </w:r>
+      <w:r>
+        <w:rPr>
+          <w:b/>
+          <w:bCs/>
+          <w:szCs w:val="20"/>
+        </w:rPr>
+        <w:t>weight tracking</w:t>
       </w:r>
       <w:r>
         <w:rPr>
@@ -2009,33 +1988,13 @@
         <w:rPr>
           <w:szCs w:val="20"/>
         </w:rPr>
-        <w:t xml:space="preserve">and </w:t>
-      </w:r>
-      <w:r>
-        <w:rPr>
-          <w:b/>
-          <w:bCs/>
-          <w:szCs w:val="20"/>
-        </w:rPr>
-        <w:t>weight tracking</w:t>
-      </w:r>
-      <w:r>
-        <w:rPr>
-          <w:szCs w:val="20"/>
-        </w:rPr>
-        <w:t xml:space="preserve"> </w:t>
-      </w:r>
-      <w:r>
-        <w:rPr>
-          <w:szCs w:val="20"/>
-        </w:rPr>
         <w:t>features</w:t>
       </w:r>
       <w:r>
         <w:rPr>
           <w:szCs w:val="20"/>
         </w:rPr>
-        <w:t xml:space="preserve">, and added </w:t>
+        <w:t xml:space="preserve"> and added </w:t>
       </w:r>
       <w:r>
         <w:rPr>
@@ -2096,7 +2055,19 @@
         <w:rPr>
           <w:szCs w:val="20"/>
         </w:rPr>
-        <w:t xml:space="preserve"> and water intake tracking feature with </w:t>
+        <w:t xml:space="preserve"> and water intake tracking feature</w:t>
+      </w:r>
+      <w:r>
+        <w:rPr>
+          <w:szCs w:val="20"/>
+        </w:rPr>
+        <w:t>s</w:t>
+      </w:r>
+      <w:r>
+        <w:rPr>
+          <w:szCs w:val="20"/>
+        </w:rPr>
+        <w:t xml:space="preserve"> with </w:t>
       </w:r>
       <w:r>
         <w:rPr>
@@ -2335,7 +2306,19 @@
         <w:rPr>
           <w:szCs w:val="20"/>
         </w:rPr>
-        <w:t xml:space="preserve"> conversion feature</w:t>
+        <w:t xml:space="preserve"> </w:t>
+      </w:r>
+      <w:r>
+        <w:rPr>
+          <w:szCs w:val="20"/>
+        </w:rPr>
+        <w:t xml:space="preserve">the </w:t>
+      </w:r>
+      <w:r>
+        <w:rPr>
+          <w:szCs w:val="20"/>
+        </w:rPr>
+        <w:t>conversion feature</w:t>
       </w:r>
       <w:r>
         <w:rPr>
@@ -2378,19 +2361,11 @@
           <w:szCs w:val="20"/>
         </w:rPr>
       </w:pPr>
-      <w:proofErr w:type="spellStart"/>
-      <w:r>
-        <w:rPr>
-          <w:szCs w:val="20"/>
-        </w:rPr>
-        <w:t>Dockerized</w:t>
-      </w:r>
-      <w:proofErr w:type="spellEnd"/>
-      <w:r>
-        <w:rPr>
-          <w:szCs w:val="20"/>
-        </w:rPr>
-        <w:t xml:space="preserve"> </w:t>
+      <w:r>
+        <w:rPr>
+          <w:szCs w:val="20"/>
+        </w:rPr>
+        <w:t xml:space="preserve">Dockerized </w:t>
       </w:r>
       <w:r>
         <w:rPr>
@@ -2520,7 +2495,6 @@
         <w:t xml:space="preserve"> | </w:t>
       </w:r>
       <w:hyperlink r:id="rId29" w:history="1">
-        <w:proofErr w:type="spellStart"/>
         <w:r>
           <w:rPr>
             <w:rStyle w:val="Hyperlink"/>
@@ -2529,7 +2503,6 @@
           </w:rPr>
           <w:t>Hazirs</w:t>
         </w:r>
-        <w:proofErr w:type="spellEnd"/>
         <w:r>
           <w:rPr>
             <w:rStyle w:val="Hyperlink"/>
@@ -2629,14 +2602,18 @@
         </w:rPr>
         <w:t xml:space="preserve"> </w:t>
       </w:r>
-      <w:proofErr w:type="spellStart"/>
       <w:r>
         <w:rPr>
           <w:szCs w:val="20"/>
         </w:rPr>
         <w:t>Hazirs</w:t>
       </w:r>
-      <w:proofErr w:type="spellEnd"/>
+      <w:r>
+        <w:rPr>
+          <w:szCs w:val="20"/>
+        </w:rPr>
+        <w:t>,</w:t>
+      </w:r>
       <w:r>
         <w:rPr>
           <w:szCs w:val="20"/>
@@ -2743,13 +2720,25 @@
         <w:rPr>
           <w:szCs w:val="20"/>
         </w:rPr>
-        <w:t xml:space="preserve">Cleaning and </w:t>
-      </w:r>
-      <w:r>
-        <w:rPr>
-          <w:szCs w:val="20"/>
-        </w:rPr>
-        <w:t>House help industry</w:t>
+        <w:t>c</w:t>
+      </w:r>
+      <w:r>
+        <w:rPr>
+          <w:szCs w:val="20"/>
+        </w:rPr>
+        <w:t xml:space="preserve">leaning and </w:t>
+      </w:r>
+      <w:r>
+        <w:rPr>
+          <w:szCs w:val="20"/>
+        </w:rPr>
+        <w:t>h</w:t>
+      </w:r>
+      <w:r>
+        <w:rPr>
+          <w:szCs w:val="20"/>
+        </w:rPr>
+        <w:t>ouse help industry</w:t>
       </w:r>
       <w:r>
         <w:rPr>
@@ -2826,6 +2815,12 @@
           <w:szCs w:val="20"/>
         </w:rPr>
         <w:t xml:space="preserve"> feature</w:t>
+      </w:r>
+      <w:r>
+        <w:rPr>
+          <w:szCs w:val="20"/>
+        </w:rPr>
+        <w:t>s</w:t>
       </w:r>
       <w:r>
         <w:rPr>
@@ -3504,23 +3499,23 @@
       </w:r>
       <w:r>
         <w:rPr>
-          <w:szCs w:val="20"/>
-        </w:rPr>
-        <w:t xml:space="preserve"> </w:t>
-      </w:r>
-      <w:r>
-        <w:rPr>
-          <w:szCs w:val="20"/>
-        </w:rPr>
-        <w:t xml:space="preserve">to </w:t>
-      </w:r>
-      <w:r>
-        <w:rPr>
           <w:i/>
           <w:iCs/>
           <w:szCs w:val="20"/>
         </w:rPr>
-        <w:t>t</w:t>
+        <w:t>,</w:t>
+      </w:r>
+      <w:r>
+        <w:rPr>
+          <w:szCs w:val="20"/>
+        </w:rPr>
+        <w:t xml:space="preserve"> </w:t>
+      </w:r>
+      <w:r>
+        <w:rPr>
+          <w:szCs w:val="20"/>
+        </w:rPr>
+        <w:t xml:space="preserve">to </w:t>
       </w:r>
       <w:r>
         <w:rPr>
@@ -3528,7 +3523,7 @@
           <w:iCs/>
           <w:szCs w:val="20"/>
         </w:rPr>
-        <w:t>rade</w:t>
+        <w:t>t</w:t>
       </w:r>
       <w:r>
         <w:rPr>
@@ -3536,7 +3531,7 @@
           <w:iCs/>
           <w:szCs w:val="20"/>
         </w:rPr>
-        <w:t xml:space="preserve"> stocks</w:t>
+        <w:t>rade</w:t>
       </w:r>
       <w:r>
         <w:rPr>
@@ -3544,7 +3539,7 @@
           <w:iCs/>
           <w:szCs w:val="20"/>
         </w:rPr>
-        <w:t xml:space="preserve"> </w:t>
+        <w:t xml:space="preserve"> stocks</w:t>
       </w:r>
       <w:r>
         <w:rPr>
@@ -3552,7 +3547,7 @@
           <w:iCs/>
           <w:szCs w:val="20"/>
         </w:rPr>
-        <w:t>and</w:t>
+        <w:t xml:space="preserve"> </w:t>
       </w:r>
       <w:r>
         <w:rPr>
@@ -3560,7 +3555,7 @@
           <w:iCs/>
           <w:szCs w:val="20"/>
         </w:rPr>
-        <w:t xml:space="preserve"> </w:t>
+        <w:t>and</w:t>
       </w:r>
       <w:r>
         <w:rPr>
@@ -3568,57 +3563,7 @@
           <w:iCs/>
           <w:szCs w:val="20"/>
         </w:rPr>
-        <w:t>futures contracts</w:t>
-      </w:r>
-      <w:r>
-        <w:rPr>
-          <w:szCs w:val="20"/>
-        </w:rPr>
         <w:t xml:space="preserve"> </w:t>
-      </w:r>
-      <w:r>
-        <w:rPr>
-          <w:szCs w:val="20"/>
-        </w:rPr>
-        <w:t>worth</w:t>
-      </w:r>
-      <w:r>
-        <w:rPr>
-          <w:szCs w:val="20"/>
-        </w:rPr>
-        <w:t xml:space="preserve"> </w:t>
-      </w:r>
-      <w:r>
-        <w:rPr>
-          <w:szCs w:val="20"/>
-        </w:rPr>
-        <w:t>more than</w:t>
-      </w:r>
-      <w:r>
-        <w:rPr>
-          <w:szCs w:val="20"/>
-        </w:rPr>
-        <w:t xml:space="preserve"> </w:t>
-      </w:r>
-      <w:r>
-        <w:rPr>
-          <w:szCs w:val="20"/>
-        </w:rPr>
-        <w:t xml:space="preserve">around </w:t>
-      </w:r>
-      <w:r>
-        <w:rPr>
-          <w:b/>
-          <w:bCs/>
-          <w:szCs w:val="20"/>
-        </w:rPr>
-        <w:t xml:space="preserve">$100 </w:t>
-      </w:r>
-      <w:r>
-        <w:rPr>
-          <w:szCs w:val="20"/>
-        </w:rPr>
-        <w:t>(</w:t>
       </w:r>
       <w:r>
         <w:rPr>
@@ -3626,7 +3571,57 @@
           <w:iCs/>
           <w:szCs w:val="20"/>
         </w:rPr>
-        <w:t>~</w:t>
+        <w:t>futures contracts</w:t>
+      </w:r>
+      <w:r>
+        <w:rPr>
+          <w:szCs w:val="20"/>
+        </w:rPr>
+        <w:t xml:space="preserve"> </w:t>
+      </w:r>
+      <w:r>
+        <w:rPr>
+          <w:szCs w:val="20"/>
+        </w:rPr>
+        <w:t>worth</w:t>
+      </w:r>
+      <w:r>
+        <w:rPr>
+          <w:szCs w:val="20"/>
+        </w:rPr>
+        <w:t xml:space="preserve"> </w:t>
+      </w:r>
+      <w:r>
+        <w:rPr>
+          <w:szCs w:val="20"/>
+        </w:rPr>
+        <w:t>more than</w:t>
+      </w:r>
+      <w:r>
+        <w:rPr>
+          <w:szCs w:val="20"/>
+        </w:rPr>
+        <w:t xml:space="preserve"> </w:t>
+      </w:r>
+      <w:r>
+        <w:rPr>
+          <w:szCs w:val="20"/>
+        </w:rPr>
+        <w:t xml:space="preserve">around </w:t>
+      </w:r>
+      <w:r>
+        <w:rPr>
+          <w:b/>
+          <w:bCs/>
+          <w:szCs w:val="20"/>
+        </w:rPr>
+        <w:t xml:space="preserve">$100 </w:t>
+      </w:r>
+      <w:r>
+        <w:rPr>
+          <w:szCs w:val="20"/>
+        </w:rPr>
+        <w:t>(</w:t>
       </w:r>
       <w:r>
         <w:rPr>
@@ -3634,17 +3629,15 @@
           <w:iCs/>
           <w:szCs w:val="20"/>
         </w:rPr>
-        <w:t>₹</w:t>
-      </w:r>
-      <w:r>
-        <w:rPr>
-          <w:b/>
-          <w:bCs/>
+        <w:t>~</w:t>
+      </w:r>
+      <w:r>
+        <w:rPr>
           <w:i/>
           <w:iCs/>
           <w:szCs w:val="20"/>
         </w:rPr>
-        <w:t>10</w:t>
+        <w:t>₹</w:t>
       </w:r>
       <w:r>
         <w:rPr>
@@ -3654,7 +3647,7 @@
           <w:iCs/>
           <w:szCs w:val="20"/>
         </w:rPr>
-        <w:t>,</w:t>
+        <w:t>10</w:t>
       </w:r>
       <w:r>
         <w:rPr>
@@ -3664,47 +3657,49 @@
           <w:iCs/>
           <w:szCs w:val="20"/>
         </w:rPr>
-        <w:t>000</w:t>
-      </w:r>
-      <w:r>
-        <w:rPr>
-          <w:szCs w:val="20"/>
-        </w:rPr>
-        <w:t>)</w:t>
-      </w:r>
-      <w:r>
-        <w:rPr>
-          <w:b/>
-          <w:bCs/>
-          <w:szCs w:val="20"/>
-        </w:rPr>
-        <w:t xml:space="preserve"> </w:t>
-      </w:r>
-      <w:r>
-        <w:rPr>
-          <w:szCs w:val="20"/>
-        </w:rPr>
-        <w:t>algorithmically</w:t>
-      </w:r>
-      <w:r>
-        <w:rPr>
-          <w:szCs w:val="20"/>
-        </w:rPr>
-        <w:t>.</w:t>
-      </w:r>
-      <w:r>
-        <w:rPr>
-          <w:szCs w:val="20"/>
-        </w:rPr>
-        <w:t xml:space="preserve"> Also </w:t>
-      </w:r>
-      <w:r>
-        <w:rPr>
+        <w:t>,</w:t>
+      </w:r>
+      <w:r>
+        <w:rPr>
+          <w:b/>
+          <w:bCs/>
           <w:i/>
           <w:iCs/>
           <w:szCs w:val="20"/>
         </w:rPr>
-        <w:t>trade</w:t>
+        <w:t>000</w:t>
+      </w:r>
+      <w:r>
+        <w:rPr>
+          <w:szCs w:val="20"/>
+        </w:rPr>
+        <w:t>)</w:t>
+      </w:r>
+      <w:r>
+        <w:rPr>
+          <w:b/>
+          <w:bCs/>
+          <w:szCs w:val="20"/>
+        </w:rPr>
+        <w:t xml:space="preserve"> </w:t>
+      </w:r>
+      <w:r>
+        <w:rPr>
+          <w:szCs w:val="20"/>
+        </w:rPr>
+        <w:t>algorithmically</w:t>
+      </w:r>
+      <w:r>
+        <w:rPr>
+          <w:szCs w:val="20"/>
+        </w:rPr>
+        <w:t>.</w:t>
+      </w:r>
+      <w:r>
+        <w:rPr>
+          <w:szCs w:val="20"/>
+        </w:rPr>
+        <w:t xml:space="preserve"> Also </w:t>
       </w:r>
       <w:r>
         <w:rPr>
@@ -3712,15 +3707,7 @@
           <w:iCs/>
           <w:szCs w:val="20"/>
         </w:rPr>
-        <w:t>d</w:t>
-      </w:r>
-      <w:r>
-        <w:rPr>
-          <w:i/>
-          <w:iCs/>
-          <w:szCs w:val="20"/>
-        </w:rPr>
-        <w:t xml:space="preserve"> stocks autonomously</w:t>
+        <w:t>traded stocks autonomously</w:t>
       </w:r>
       <w:r>
         <w:rPr>
@@ -3738,7 +3725,7 @@
         <w:rPr>
           <w:szCs w:val="20"/>
         </w:rPr>
-        <w:t>-</w:t>
+        <w:t xml:space="preserve"> </w:t>
       </w:r>
       <w:r>
         <w:rPr>
@@ -3758,7 +3745,6 @@
         </w:rPr>
         <w:t xml:space="preserve"> </w:t>
       </w:r>
-      <w:proofErr w:type="spellStart"/>
       <w:r>
         <w:rPr>
           <w:b/>
@@ -3767,7 +3753,6 @@
         </w:rPr>
         <w:t>Zerodha’s</w:t>
       </w:r>
-      <w:proofErr w:type="spellEnd"/>
       <w:r>
         <w:rPr>
           <w:szCs w:val="20"/>
@@ -3820,12 +3805,6 @@
         <w:rPr>
           <w:szCs w:val="20"/>
         </w:rPr>
-        <w:t>,</w:t>
-      </w:r>
-      <w:r>
-        <w:rPr>
-          <w:szCs w:val="20"/>
-        </w:rPr>
         <w:t xml:space="preserve"> </w:t>
       </w:r>
       <w:r>
@@ -3862,7 +3841,19 @@
         <w:rPr>
           <w:szCs w:val="20"/>
         </w:rPr>
-        <w:t xml:space="preserve">and order booking </w:t>
+        <w:t>and order booking</w:t>
+      </w:r>
+      <w:r>
+        <w:rPr>
+          <w:szCs w:val="20"/>
+        </w:rPr>
+        <w:t>s</w:t>
+      </w:r>
+      <w:r>
+        <w:rPr>
+          <w:szCs w:val="20"/>
+        </w:rPr>
+        <w:t xml:space="preserve"> </w:t>
       </w:r>
       <w:r>
         <w:rPr>
@@ -4060,7 +4051,19 @@
         <w:rPr>
           <w:szCs w:val="20"/>
         </w:rPr>
-        <w:t xml:space="preserve"> Self-programmed the </w:t>
+        <w:t xml:space="preserve"> Self-</w:t>
+      </w:r>
+      <w:r>
+        <w:rPr>
+          <w:szCs w:val="20"/>
+        </w:rPr>
+        <w:t>p</w:t>
+      </w:r>
+      <w:r>
+        <w:rPr>
+          <w:szCs w:val="20"/>
+        </w:rPr>
+        <w:t xml:space="preserve">rogrammed the </w:t>
       </w:r>
       <w:r>
         <w:rPr>
@@ -4128,13 +4131,59 @@
         <w:rPr>
           <w:szCs w:val="20"/>
         </w:rPr>
-        <w:t xml:space="preserve">built </w:t>
-      </w:r>
-      <w:r>
-        <w:rPr>
-          <w:szCs w:val="20"/>
-        </w:rPr>
-        <w:t>cost from</w:t>
+        <w:t>buil</w:t>
+      </w:r>
+      <w:r>
+        <w:rPr>
+          <w:szCs w:val="20"/>
+        </w:rPr>
+        <w:t>d</w:t>
+      </w:r>
+      <w:r>
+        <w:rPr>
+          <w:szCs w:val="20"/>
+        </w:rPr>
+        <w:t xml:space="preserve"> </w:t>
+      </w:r>
+      <w:r>
+        <w:rPr>
+          <w:szCs w:val="20"/>
+        </w:rPr>
+        <w:t xml:space="preserve">cost </w:t>
+      </w:r>
+      <w:r>
+        <w:rPr>
+          <w:szCs w:val="20"/>
+        </w:rPr>
+        <w:t xml:space="preserve">by &gt; </w:t>
+      </w:r>
+      <w:r>
+        <w:rPr>
+          <w:b/>
+          <w:bCs/>
+          <w:szCs w:val="20"/>
+        </w:rPr>
+        <w:t>7</w:t>
+      </w:r>
+      <w:r>
+        <w:rPr>
+          <w:b/>
+          <w:bCs/>
+          <w:szCs w:val="20"/>
+        </w:rPr>
+        <w:t>0%</w:t>
+      </w:r>
+      <w:r>
+        <w:rPr>
+          <w:szCs w:val="20"/>
+        </w:rPr>
+        <w:t xml:space="preserve"> </w:t>
+      </w:r>
+      <w:r>
+        <w:rPr>
+          <w:szCs w:val="20"/>
+        </w:rPr>
+        <w:t>from</w:t>
       </w:r>
       <w:r>
         <w:rPr>
@@ -4643,7 +4692,19 @@
         <w:rPr>
           <w:szCs w:val="20"/>
         </w:rPr>
-        <w:t xml:space="preserve"> Microservices</w:t>
+        <w:t xml:space="preserve"> </w:t>
+      </w:r>
+      <w:r>
+        <w:rPr>
+          <w:szCs w:val="20"/>
+        </w:rPr>
+        <w:t>m</w:t>
+      </w:r>
+      <w:r>
+        <w:rPr>
+          <w:szCs w:val="20"/>
+        </w:rPr>
+        <w:t>icroservices</w:t>
       </w:r>
       <w:r>
         <w:rPr>
@@ -5090,18 +5151,6 @@
       </w:r>
       <w:r>
         <w:rPr>
-          <w:szCs w:val="20"/>
-        </w:rPr>
-        <w:t>course</w:t>
-      </w:r>
-      <w:r>
-        <w:rPr>
-          <w:szCs w:val="20"/>
-        </w:rPr>
-        <w:t xml:space="preserve"> </w:t>
-      </w:r>
-      <w:r>
-        <w:rPr>
           <w:i/>
           <w:iCs/>
           <w:szCs w:val="20"/>
@@ -5112,7 +5161,25 @@
         <w:rPr>
           <w:szCs w:val="20"/>
         </w:rPr>
-        <w:t xml:space="preserve"> by </w:t>
+        <w:t xml:space="preserve"> </w:t>
+      </w:r>
+      <w:r>
+        <w:rPr>
+          <w:szCs w:val="20"/>
+        </w:rPr>
+        <w:t>course</w:t>
+      </w:r>
+      <w:r>
+        <w:rPr>
+          <w:szCs w:val="20"/>
+        </w:rPr>
+        <w:t xml:space="preserve"> </w:t>
+      </w:r>
+      <w:r>
+        <w:rPr>
+          <w:szCs w:val="20"/>
+        </w:rPr>
+        <w:t xml:space="preserve">by </w:t>
       </w:r>
       <w:r>
         <w:rPr>
@@ -5337,7 +5404,14 @@
           <w:b/>
           <w:szCs w:val="20"/>
         </w:rPr>
-        <w:t>Web development</w:t>
+        <w:t>w</w:t>
+      </w:r>
+      <w:r>
+        <w:rPr>
+          <w:b/>
+          <w:szCs w:val="20"/>
+        </w:rPr>
+        <w:t>eb development</w:t>
       </w:r>
       <w:r>
         <w:rPr>
@@ -5365,7 +5439,7 @@
           <w:bCs/>
           <w:szCs w:val="20"/>
         </w:rPr>
-        <w:t>, and</w:t>
+        <w:t xml:space="preserve"> and</w:t>
       </w:r>
       <w:r>
         <w:rPr>
@@ -5437,7 +5511,21 @@
           <w:b/>
           <w:szCs w:val="20"/>
         </w:rPr>
-        <w:t>AWS Cloud foundations</w:t>
+        <w:t xml:space="preserve">AWS Cloud </w:t>
+      </w:r>
+      <w:r>
+        <w:rPr>
+          <w:b/>
+          <w:szCs w:val="20"/>
+        </w:rPr>
+        <w:t>F</w:t>
+      </w:r>
+      <w:r>
+        <w:rPr>
+          <w:b/>
+          <w:szCs w:val="20"/>
+        </w:rPr>
+        <w:t>oundations</w:t>
       </w:r>
       <w:r>
         <w:rPr>
@@ -5458,7 +5546,7 @@
           <w:b/>
           <w:szCs w:val="20"/>
         </w:rPr>
-        <w:t>s</w:t>
+        <w:t>,</w:t>
       </w:r>
       <w:r>
         <w:rPr>
@@ -5490,14 +5578,7 @@
           <w:iCs/>
           <w:szCs w:val="20"/>
         </w:rPr>
-        <w:t>Programming essentials in Python</w:t>
-      </w:r>
-      <w:r>
-        <w:rPr>
-          <w:bCs/>
-          <w:szCs w:val="20"/>
-        </w:rPr>
-        <w:t xml:space="preserve">, and </w:t>
+        <w:t xml:space="preserve">Programming </w:t>
       </w:r>
       <w:r>
         <w:rPr>
@@ -5506,7 +5587,39 @@
           <w:iCs/>
           <w:szCs w:val="20"/>
         </w:rPr>
-        <w:t>Networking Basics</w:t>
+        <w:t>E</w:t>
+      </w:r>
+      <w:r>
+        <w:rPr>
+          <w:bCs/>
+          <w:i/>
+          <w:iCs/>
+          <w:szCs w:val="20"/>
+        </w:rPr>
+        <w:t>ssentials in Python</w:t>
+      </w:r>
+      <w:r>
+        <w:rPr>
+          <w:bCs/>
+          <w:szCs w:val="20"/>
+        </w:rPr>
+        <w:t>, and</w:t>
+      </w:r>
+      <w:r>
+        <w:rPr>
+          <w:bCs/>
+          <w:szCs w:val="20"/>
+        </w:rPr>
+        <w:t xml:space="preserve"> </w:t>
+      </w:r>
+      <w:r>
+        <w:rPr>
+          <w:bCs/>
+          <w:i/>
+          <w:iCs/>
+          <w:szCs w:val="20"/>
+        </w:rPr>
+        <w:t>IoT Fundamentals: Connecting Things</w:t>
       </w:r>
       <w:r>
         <w:rPr>
@@ -5599,42 +5712,42 @@
         <v:path o:extrusionok="f" gradientshapeok="t" o:connecttype="rect"/>
         <o:lock v:ext="edit" aspectratio="t"/>
       </v:shapetype>
-      <v:shape id="_x0000_i2286" type="#_x0000_t75" style="width:512.85pt;height:512.85pt;rotation:180;flip:x y;visibility:visible;mso-wrap-style:square" o:bullet="t">
+      <v:shape id="_x0000_i2016" type="#_x0000_t75" style="width:513pt;height:513pt;rotation:180;flip:x y;visibility:visible;mso-wrap-style:square" o:bullet="t">
         <v:imagedata r:id="rId1" o:title="107161_circle_github_icon"/>
       </v:shape>
     </w:pict>
   </w:numPicBullet>
   <w:numPicBullet w:numPicBulletId="1">
     <w:pict>
-      <v:shape id="_x0000_i2287" type="#_x0000_t75" style="width:169.15pt;height:169.15pt;visibility:visible;mso-wrap-style:square" o:bullet="t">
+      <v:shape id="_x0000_i2017" type="#_x0000_t75" style="width:169pt;height:169pt;visibility:visible;mso-wrap-style:square" o:bullet="t">
         <v:imagedata r:id="rId2" o:title="941C13C7"/>
       </v:shape>
     </w:pict>
   </w:numPicBullet>
   <w:numPicBullet w:numPicBulletId="2">
     <w:pict>
-      <v:shape id="_x0000_i2288" type="#_x0000_t75" style="width:29.2pt;height:16.3pt;visibility:visible;mso-wrap-style:square" o:bullet="t">
+      <v:shape id="_x0000_i2018" type="#_x0000_t75" style="width:29pt;height:16.5pt;visibility:visible;mso-wrap-style:square" o:bullet="t">
         <v:imagedata r:id="rId3" o:title="107161_circle_github_icon"/>
       </v:shape>
     </w:pict>
   </w:numPicBullet>
   <w:numPicBullet w:numPicBulletId="3">
     <w:pict>
-      <v:shape id="_x0000_i2289" type="#_x0000_t75" style="width:239.75pt;height:234.35pt;visibility:visible;mso-wrap-style:square" o:bullet="t">
+      <v:shape id="_x0000_i2019" type="#_x0000_t75" style="width:240pt;height:234pt;visibility:visible;mso-wrap-style:square" o:bullet="t">
         <v:imagedata r:id="rId4" o:title="Indian_Institute_of_Technology_Bombay_Logo"/>
       </v:shape>
     </w:pict>
   </w:numPicBullet>
   <w:numPicBullet w:numPicBulletId="4">
     <w:pict>
-      <v:shape id="_x0000_i2290" type="#_x0000_t75" style="width:22.4pt;height:16.3pt;visibility:visible;mso-wrap-style:square" o:bullet="t">
+      <v:shape id="_x0000_i2020" type="#_x0000_t75" style="width:22.5pt;height:16.5pt;visibility:visible;mso-wrap-style:square" o:bullet="t">
         <v:imagedata r:id="rId5" o:title="Indian_Institute_of_Technology_Bombay_Logo"/>
       </v:shape>
     </w:pict>
   </w:numPicBullet>
   <w:numPicBullet w:numPicBulletId="5">
     <w:pict>
-      <v:shape id="_x0000_i2291" type="#_x0000_t75" style="width:76.75pt;height:76.75pt;visibility:visible;mso-wrap-style:square" o:bullet="t">
+      <v:shape id="_x0000_i2021" type="#_x0000_t75" style="width:76.5pt;height:76.5pt;visibility:visible;mso-wrap-style:square" o:bullet="t">
         <v:imagedata r:id="rId6" o:title=""/>
       </v:shape>
     </w:pict>
@@ -10669,6 +10782,7 @@
   <w:style w:type="character" w:default="1" w:styleId="DefaultParagraphFont">
     <w:name w:val="Default Paragraph Font"/>
     <w:uiPriority w:val="1"/>
+    <w:semiHidden/>
     <w:unhideWhenUsed/>
   </w:style>
   <w:style w:type="table" w:default="1" w:styleId="TableNormal">

</xml_diff>

<commit_message>
Project, Experience section updated
Added new line & em-dashes and updated lines in projects section and updated lines in
OFY Wellness app in experience section
</commit_message>
<xml_diff>
--- a/Resume_latest - Copy.docx
+++ b/Resume_latest - Copy.docx
@@ -77,15 +77,31 @@
           <w:u w:val="none"/>
           <w:shd w:val="clear" w:color="auto" w:fill="FFFFFF"/>
         </w:rPr>
-        <w:t xml:space="preserve"> J</w:t>
+        <w:t xml:space="preserve"> </w:t>
       </w:r>
       <w:r>
         <w:rPr>
           <w:rStyle w:val="Hyperlink"/>
-          <w:bCs/>
+          <w:b/>
           <w:i/>
           <w:iCs/>
           <w:color w:val="000000" w:themeColor="text1"/>
+          <w:sz w:val="24"/>
+          <w:szCs w:val="24"/>
+          <w:u w:val="none"/>
+          <w:shd w:val="clear" w:color="auto" w:fill="FFFFFF"/>
+        </w:rPr>
+        <w:t>J</w:t>
+      </w:r>
+      <w:r>
+        <w:rPr>
+          <w:rStyle w:val="Hyperlink"/>
+          <w:b/>
+          <w:i/>
+          <w:iCs/>
+          <w:color w:val="000000" w:themeColor="text1"/>
+          <w:sz w:val="24"/>
+          <w:szCs w:val="24"/>
           <w:u w:val="none"/>
         </w:rPr>
         <w:t>ava</w:t>
@@ -804,10 +820,6 @@
         </w:tabs>
         <w:spacing w:line="240" w:lineRule="auto"/>
         <w:ind w:right="0"/>
-        <w:rPr>
-          <w:bCs/>
-          <w:color w:val="000000" w:themeColor="text1"/>
-        </w:rPr>
       </w:pPr>
       <w:hyperlink r:id="rId20" w:history="1">
         <w:r>
@@ -935,162 +947,13 @@
           <w:tab w:val="right" w:pos="10490"/>
         </w:tabs>
         <w:spacing w:line="240" w:lineRule="auto"/>
-        <w:ind w:left="0" w:right="0" w:firstLine="0"/>
+        <w:ind w:right="0"/>
         <w:rPr>
           <w:bCs/>
           <w:color w:val="000000" w:themeColor="text1"/>
         </w:rPr>
       </w:pPr>
       <w:hyperlink r:id="rId22" w:history="1">
-        <w:r>
-          <w:rPr>
-            <w:rStyle w:val="Hyperlink"/>
-            <w:color w:val="000000" w:themeColor="text1"/>
-            <w:u w:val="none"/>
-            <w:shd w:val="clear" w:color="auto" w:fill="FFFFFF"/>
-          </w:rPr>
-          <w:t>Indian Institute of Techno</w:t>
-        </w:r>
-        <w:bookmarkStart w:id="0" w:name="_Hlk187671783"/>
-        <w:r>
-          <w:rPr>
-            <w:rStyle w:val="Hyperlink"/>
-            <w:color w:val="000000" w:themeColor="text1"/>
-            <w:u w:val="none"/>
-            <w:shd w:val="clear" w:color="auto" w:fill="FFFFFF"/>
-          </w:rPr>
-          <w:t>l</w:t>
-        </w:r>
-        <w:bookmarkEnd w:id="0"/>
-        <w:r>
-          <w:rPr>
-            <w:rStyle w:val="Hyperlink"/>
-            <w:color w:val="000000" w:themeColor="text1"/>
-            <w:u w:val="none"/>
-            <w:shd w:val="clear" w:color="auto" w:fill="FFFFFF"/>
-          </w:rPr>
-          <w:t>ogy, Kharagpur</w:t>
-        </w:r>
-      </w:hyperlink>
-      <w:r>
-        <w:rPr>
-          <w:rStyle w:val="Hyperlink"/>
-          <w:color w:val="000000" w:themeColor="text1"/>
-          <w:u w:val="none"/>
-          <w:shd w:val="clear" w:color="auto" w:fill="FFFFFF"/>
-        </w:rPr>
-        <w:t xml:space="preserve"> </w:t>
-      </w:r>
-      <w:r>
-        <w:rPr>
-          <w:bCs/>
-          <w:color w:val="000000" w:themeColor="text1"/>
-        </w:rPr>
-        <w:t>–</w:t>
-      </w:r>
-      <w:r>
-        <w:rPr>
-          <w:bCs/>
-          <w:color w:val="000000" w:themeColor="text1"/>
-        </w:rPr>
-        <w:t xml:space="preserve"> </w:t>
-      </w:r>
-      <w:r>
-        <w:rPr>
-          <w:b/>
-          <w:bCs/>
-          <w:i/>
-          <w:iCs/>
-          <w:color w:val="000000" w:themeColor="text1"/>
-        </w:rPr>
-        <w:t>Programming in Java</w:t>
-      </w:r>
-      <w:r>
-        <w:rPr>
-          <w:color w:val="000000" w:themeColor="text1"/>
-        </w:rPr>
-        <w:t xml:space="preserve"> (</w:t>
-      </w:r>
-      <w:r>
-        <w:rPr>
-          <w:i/>
-          <w:iCs/>
-          <w:color w:val="000000" w:themeColor="text1"/>
-        </w:rPr>
-        <w:t>A non-degree course</w:t>
-      </w:r>
-      <w:r>
-        <w:rPr>
-          <w:color w:val="000000" w:themeColor="text1"/>
-        </w:rPr>
-        <w:t>) [</w:t>
-      </w:r>
-      <w:hyperlink r:id="rId23" w:history="1">
-        <w:r>
-          <w:rPr>
-            <w:rStyle w:val="Hyperlink"/>
-            <w:color w:val="auto"/>
-          </w:rPr>
-          <w:t>NPTEL</w:t>
-        </w:r>
-      </w:hyperlink>
-      <w:r>
-        <w:rPr>
-          <w:rStyle w:val="Hyperlink"/>
-          <w:color w:val="000000" w:themeColor="text1"/>
-          <w:u w:val="none"/>
-        </w:rPr>
-        <w:t>]</w:t>
-      </w:r>
-      <w:r>
-        <w:rPr>
-          <w:bCs/>
-          <w:color w:val="000000" w:themeColor="text1"/>
-        </w:rPr>
-        <w:tab/>
-      </w:r>
-      <w:r>
-        <w:rPr>
-          <w:color w:val="000000" w:themeColor="text1"/>
-        </w:rPr>
-        <w:t xml:space="preserve">Jul </w:t>
-      </w:r>
-      <w:r>
-        <w:rPr>
-          <w:bCs/>
-          <w:color w:val="000000" w:themeColor="text1"/>
-        </w:rPr>
-        <w:t>–</w:t>
-      </w:r>
-      <w:r>
-        <w:rPr>
-          <w:color w:val="000000" w:themeColor="text1"/>
-        </w:rPr>
-        <w:t xml:space="preserve"> Oct 202</w:t>
-      </w:r>
-      <w:r>
-        <w:rPr>
-          <w:color w:val="000000" w:themeColor="text1"/>
-        </w:rPr>
-        <w:t>1</w:t>
-      </w:r>
-    </w:p>
-    <w:p>
-      <w:pPr>
-        <w:pBdr>
-          <w:bottom w:val="single" w:sz="6" w:space="1" w:color="auto"/>
-        </w:pBdr>
-        <w:tabs>
-          <w:tab w:val="right" w:pos="10490"/>
-        </w:tabs>
-        <w:spacing w:line="240" w:lineRule="auto"/>
-        <w:ind w:right="0"/>
-        <w:rPr>
-          <w:bCs/>
-          <w:color w:val="000000" w:themeColor="text1"/>
-        </w:rPr>
-      </w:pPr>
-      <w:hyperlink r:id="rId24" w:history="1">
         <w:r>
           <w:rPr>
             <w:rStyle w:val="Hyperlink"/>
@@ -1196,7 +1059,7 @@
         </w:rPr>
         <w:t>[</w:t>
       </w:r>
-      <w:hyperlink r:id="rId25" w:history="1">
+      <w:hyperlink r:id="rId23" w:history="1">
         <w:r>
           <w:rPr>
             <w:rStyle w:val="Hyperlink"/>
@@ -1296,7 +1159,7 @@
       <w:r>
         <w:t xml:space="preserve"> </w:t>
       </w:r>
-      <w:hyperlink r:id="rId26" w:history="1">
+      <w:hyperlink r:id="rId24" w:history="1">
         <w:r>
           <w:rPr>
             <w:rStyle w:val="Hyperlink"/>
@@ -1373,26 +1236,19 @@
     </w:p>
     <w:p>
       <w:pPr>
-        <w:pStyle w:val="ListParagraph"/>
-        <w:numPr>
-          <w:ilvl w:val="0"/>
-          <w:numId w:val="39"/>
-        </w:numPr>
         <w:spacing w:after="0" w:line="240" w:lineRule="auto"/>
-        <w:ind w:right="0"/>
+        <w:ind w:right="0" w:firstLine="350"/>
         <w:rPr>
           <w:color w:val="auto"/>
-          <w:szCs w:val="20"/>
-        </w:rPr>
-      </w:pPr>
-      <w:hyperlink r:id="rId27" w:history="1">
+        </w:rPr>
+      </w:pPr>
+      <w:hyperlink r:id="rId25" w:history="1">
         <w:r>
           <w:rPr>
             <w:rStyle w:val="Hyperlink"/>
             <w:b/>
             <w:bCs/>
             <w:color w:val="0070C0"/>
-            <w:szCs w:val="20"/>
             <w:u w:val="none"/>
           </w:rPr>
           <w:t xml:space="preserve">OFY Wellness Android app </w:t>
@@ -1403,7 +1259,6 @@
             <w:b/>
             <w:bCs/>
             <w:color w:val="000000" w:themeColor="text1"/>
-            <w:szCs w:val="20"/>
             <w:u w:val="none"/>
           </w:rPr>
           <w:t>(Java)</w:t>
@@ -1412,7 +1267,6 @@
           <w:rPr>
             <w:rStyle w:val="Hyperlink"/>
             <w:color w:val="0070C0"/>
-            <w:szCs w:val="20"/>
             <w:u w:val="none"/>
           </w:rPr>
           <w:t xml:space="preserve"> </w:t>
@@ -1421,7 +1275,6 @@
           <w:rPr>
             <w:rStyle w:val="Hyperlink"/>
             <w:color w:val="000000" w:themeColor="text1"/>
-            <w:szCs w:val="20"/>
             <w:u w:val="none"/>
           </w:rPr>
           <w:t>[</w:t>
@@ -1432,7 +1285,6 @@
             <w:i/>
             <w:iCs/>
             <w:color w:val="000000" w:themeColor="text1"/>
-            <w:szCs w:val="20"/>
           </w:rPr>
           <w:t>link</w:t>
         </w:r>
@@ -1440,7 +1292,6 @@
           <w:rPr>
             <w:rStyle w:val="Hyperlink"/>
             <w:color w:val="000000" w:themeColor="text1"/>
-            <w:szCs w:val="20"/>
             <w:u w:val="none"/>
           </w:rPr>
           <w:t>]</w:t>
@@ -1616,33 +1467,137 @@
         <w:rPr>
           <w:szCs w:val="20"/>
         </w:rPr>
-        <w:t xml:space="preserve">Added daily diet logging and viewing features using </w:t>
-      </w:r>
-      <w:r>
-        <w:rPr>
-          <w:b/>
-          <w:bCs/>
-          <w:szCs w:val="20"/>
-        </w:rPr>
-        <w:t xml:space="preserve">Firebase </w:t>
-      </w:r>
-      <w:r>
-        <w:rPr>
-          <w:szCs w:val="20"/>
-        </w:rPr>
-        <w:t>real-time database</w:t>
-      </w:r>
-      <w:r>
-        <w:rPr>
-          <w:szCs w:val="20"/>
-        </w:rPr>
-        <w:t xml:space="preserve"> and cloud storage</w:t>
-      </w:r>
-      <w:r>
-        <w:rPr>
-          <w:szCs w:val="20"/>
-        </w:rPr>
-        <w:t xml:space="preserve"> for Firebase</w:t>
+        <w:t>Added daily diet</w:t>
+      </w:r>
+      <w:r>
+        <w:rPr>
+          <w:szCs w:val="20"/>
+        </w:rPr>
+        <w:t>,</w:t>
+      </w:r>
+      <w:r>
+        <w:rPr>
+          <w:szCs w:val="20"/>
+        </w:rPr>
+        <w:t xml:space="preserve"> </w:t>
+      </w:r>
+      <w:r>
+        <w:rPr>
+          <w:szCs w:val="20"/>
+        </w:rPr>
+        <w:t>water,</w:t>
+      </w:r>
+      <w:r>
+        <w:rPr>
+          <w:szCs w:val="20"/>
+        </w:rPr>
+        <w:t xml:space="preserve"> </w:t>
+      </w:r>
+      <w:r>
+        <w:rPr>
+          <w:szCs w:val="20"/>
+        </w:rPr>
+        <w:t>medicine intake,</w:t>
+      </w:r>
+      <w:r>
+        <w:rPr>
+          <w:szCs w:val="20"/>
+        </w:rPr>
+        <w:t xml:space="preserve"> and</w:t>
+      </w:r>
+      <w:r>
+        <w:rPr>
+          <w:szCs w:val="20"/>
+        </w:rPr>
+        <w:t xml:space="preserve"> </w:t>
+      </w:r>
+      <w:r>
+        <w:rPr>
+          <w:szCs w:val="20"/>
+        </w:rPr>
+        <w:t>weight tracking</w:t>
+      </w:r>
+      <w:r>
+        <w:rPr>
+          <w:szCs w:val="20"/>
+        </w:rPr>
+        <w:t xml:space="preserve"> </w:t>
+      </w:r>
+      <w:r>
+        <w:rPr>
+          <w:szCs w:val="20"/>
+        </w:rPr>
+        <w:t xml:space="preserve">features using </w:t>
+      </w:r>
+      <w:r>
+        <w:rPr>
+          <w:b/>
+          <w:bCs/>
+          <w:szCs w:val="20"/>
+        </w:rPr>
+        <w:t>Firebase</w:t>
+      </w:r>
+      <w:r>
+        <w:rPr>
+          <w:b/>
+          <w:bCs/>
+          <w:szCs w:val="20"/>
+        </w:rPr>
+        <w:t xml:space="preserve">, </w:t>
+      </w:r>
+      <w:r>
+        <w:rPr>
+          <w:szCs w:val="20"/>
+        </w:rPr>
+        <w:t xml:space="preserve">integrated </w:t>
+      </w:r>
+      <w:r>
+        <w:rPr>
+          <w:b/>
+          <w:bCs/>
+          <w:szCs w:val="20"/>
+        </w:rPr>
+        <w:t>interactive graphs</w:t>
+      </w:r>
+      <w:r>
+        <w:rPr>
+          <w:szCs w:val="20"/>
+        </w:rPr>
+        <w:t xml:space="preserve"> for better analysis and UX, and</w:t>
+      </w:r>
+      <w:r>
+        <w:rPr>
+          <w:szCs w:val="20"/>
+        </w:rPr>
+        <w:t xml:space="preserve"> </w:t>
+      </w:r>
+      <w:r>
+        <w:rPr>
+          <w:b/>
+          <w:bCs/>
+          <w:szCs w:val="20"/>
+        </w:rPr>
+        <w:t xml:space="preserve">scaled </w:t>
+      </w:r>
+      <w:r>
+        <w:rPr>
+          <w:szCs w:val="20"/>
+        </w:rPr>
+        <w:t>medicine tracking feature</w:t>
+      </w:r>
+      <w:r>
+        <w:rPr>
+          <w:szCs w:val="20"/>
+        </w:rPr>
+        <w:t xml:space="preserve"> to track up to</w:t>
+      </w:r>
+      <w:r>
+        <w:rPr>
+          <w:b/>
+          <w:bCs/>
+          <w:szCs w:val="20"/>
+        </w:rPr>
+        <w:t xml:space="preserve"> 5 medicines</w:t>
       </w:r>
       <w:r>
         <w:rPr>
@@ -1668,14 +1623,74 @@
         <w:ind w:right="0"/>
         <w:jc w:val="both"/>
         <w:rPr>
-          <w:szCs w:val="20"/>
-        </w:rPr>
-      </w:pPr>
-      <w:r>
-        <w:rPr>
-          <w:szCs w:val="20"/>
-        </w:rPr>
-        <w:t xml:space="preserve">Implemented meal </w:t>
+          <w:b/>
+          <w:bCs/>
+          <w:szCs w:val="20"/>
+        </w:rPr>
+      </w:pPr>
+      <w:r>
+        <w:rPr>
+          <w:szCs w:val="20"/>
+        </w:rPr>
+        <w:t>Implemented meal image and nutrient detection via</w:t>
+      </w:r>
+      <w:r>
+        <w:rPr>
+          <w:szCs w:val="20"/>
+        </w:rPr>
+        <w:t xml:space="preserve"> the</w:t>
+      </w:r>
+      <w:r>
+        <w:rPr>
+          <w:szCs w:val="20"/>
+        </w:rPr>
+        <w:t xml:space="preserve"> </w:t>
+      </w:r>
+      <w:r>
+        <w:rPr>
+          <w:b/>
+          <w:bCs/>
+          <w:szCs w:val="20"/>
+        </w:rPr>
+        <w:t xml:space="preserve">Gemini Pro Vision </w:t>
+      </w:r>
+      <w:r>
+        <w:rPr>
+          <w:b/>
+          <w:bCs/>
+          <w:szCs w:val="20"/>
+        </w:rPr>
+        <w:t>(</w:t>
+      </w:r>
+      <w:r>
+        <w:rPr>
+          <w:b/>
+          <w:bCs/>
+          <w:szCs w:val="20"/>
+        </w:rPr>
+        <w:t>AI</w:t>
+      </w:r>
+      <w:r>
+        <w:rPr>
+          <w:b/>
+          <w:bCs/>
+          <w:szCs w:val="20"/>
+        </w:rPr>
+        <w:t>)</w:t>
+      </w:r>
+      <w:r>
+        <w:rPr>
+          <w:b/>
+          <w:bCs/>
+          <w:szCs w:val="20"/>
+        </w:rPr>
+        <w:t xml:space="preserve"> </w:t>
+      </w:r>
+      <w:r>
+        <w:rPr>
+          <w:szCs w:val="20"/>
+        </w:rPr>
+        <w:t xml:space="preserve">model and </w:t>
       </w:r>
       <w:r>
         <w:rPr>
@@ -1684,553 +1699,51 @@
         <w:t>i</w:t>
       </w:r>
       <w:r>
-        <w:rPr>
-          <w:szCs w:val="20"/>
-        </w:rPr>
-        <w:t>mage and nutrient detection via</w:t>
-      </w:r>
-      <w:r>
-        <w:rPr>
-          <w:szCs w:val="20"/>
-        </w:rPr>
-        <w:t xml:space="preserve"> the</w:t>
-      </w:r>
-      <w:r>
-        <w:rPr>
-          <w:szCs w:val="20"/>
+        <w:t xml:space="preserve">mproved detection by </w:t>
+      </w:r>
+      <w:r>
+        <w:rPr>
+          <w:b/>
+          <w:bCs/>
+        </w:rPr>
+        <w:t>over 50%</w:t>
+      </w:r>
+      <w:r>
+        <w:rPr>
+          <w:b/>
+          <w:bCs/>
         </w:rPr>
         <w:t xml:space="preserve"> </w:t>
       </w:r>
       <w:r>
-        <w:rPr>
-          <w:b/>
-          <w:bCs/>
-          <w:szCs w:val="20"/>
-        </w:rPr>
-        <w:t xml:space="preserve">Gemini Pro Vision </w:t>
-      </w:r>
-      <w:r>
-        <w:rPr>
-          <w:b/>
-          <w:bCs/>
-          <w:szCs w:val="20"/>
-        </w:rPr>
-        <w:t>(</w:t>
-      </w:r>
-      <w:r>
-        <w:rPr>
-          <w:b/>
-          <w:bCs/>
-          <w:szCs w:val="20"/>
-        </w:rPr>
-        <w:t>AI</w:t>
-      </w:r>
-      <w:r>
-        <w:rPr>
-          <w:b/>
-          <w:bCs/>
-          <w:szCs w:val="20"/>
-        </w:rPr>
-        <w:t>)</w:t>
-      </w:r>
-      <w:r>
-        <w:rPr>
-          <w:b/>
-          <w:bCs/>
-          <w:szCs w:val="20"/>
-        </w:rPr>
-        <w:t xml:space="preserve"> </w:t>
-      </w:r>
-      <w:r>
-        <w:rPr>
-          <w:szCs w:val="20"/>
-        </w:rPr>
-        <w:t xml:space="preserve">model and </w:t>
-      </w:r>
-      <w:r>
-        <w:rPr>
-          <w:szCs w:val="20"/>
-        </w:rPr>
-        <w:t>SDKs/</w:t>
-      </w:r>
-      <w:r>
-        <w:rPr>
-          <w:szCs w:val="20"/>
-        </w:rPr>
-        <w:t>APIs</w:t>
-      </w:r>
-      <w:r>
-        <w:rPr>
-          <w:szCs w:val="20"/>
-        </w:rPr>
+        <w:t xml:space="preserve">by </w:t>
+      </w:r>
+      <w:r>
+        <w:t xml:space="preserve">updating the prompts to </w:t>
+      </w:r>
+      <w:r>
+        <w:t>the model</w:t>
+      </w:r>
+      <w:r>
         <w:t>.</w:t>
       </w:r>
     </w:p>
     <w:p>
       <w:pPr>
-        <w:pStyle w:val="ListParagraph"/>
-        <w:numPr>
-          <w:ilvl w:val="0"/>
-          <w:numId w:val="32"/>
-        </w:numPr>
         <w:spacing w:line="240" w:lineRule="auto"/>
-        <w:ind w:right="0"/>
+        <w:ind w:right="0" w:firstLine="350"/>
         <w:jc w:val="both"/>
         <w:rPr>
-          <w:szCs w:val="20"/>
-        </w:rPr>
-      </w:pPr>
-      <w:r>
-        <w:rPr>
-          <w:szCs w:val="20"/>
-        </w:rPr>
-        <w:t>I</w:t>
-      </w:r>
-      <w:r>
-        <w:rPr>
-          <w:szCs w:val="20"/>
-        </w:rPr>
-        <w:t xml:space="preserve">mproved meal image and nutrient detection by </w:t>
-      </w:r>
-      <w:r>
-        <w:rPr>
-          <w:b/>
-          <w:bCs/>
-          <w:szCs w:val="20"/>
-        </w:rPr>
-        <w:t>over 50%</w:t>
-      </w:r>
-      <w:r>
-        <w:rPr>
-          <w:b/>
-          <w:bCs/>
-          <w:szCs w:val="20"/>
-        </w:rPr>
-        <w:t xml:space="preserve"> </w:t>
-      </w:r>
-      <w:r>
-        <w:rPr>
-          <w:szCs w:val="20"/>
-        </w:rPr>
-        <w:t xml:space="preserve">by </w:t>
-      </w:r>
-      <w:r>
-        <w:rPr>
-          <w:szCs w:val="20"/>
-        </w:rPr>
-        <w:t xml:space="preserve">updating the prompts to </w:t>
-      </w:r>
-      <w:r>
-        <w:rPr>
-          <w:szCs w:val="20"/>
-        </w:rPr>
-        <w:t>the model</w:t>
-      </w:r>
-      <w:r>
-        <w:rPr>
-          <w:szCs w:val="20"/>
-        </w:rPr>
-        <w:t>.</w:t>
-      </w:r>
-    </w:p>
-    <w:p>
-      <w:pPr>
-        <w:pStyle w:val="ListParagraph"/>
-        <w:numPr>
-          <w:ilvl w:val="0"/>
-          <w:numId w:val="32"/>
-        </w:numPr>
-        <w:spacing w:line="240" w:lineRule="auto"/>
-        <w:ind w:right="0"/>
-        <w:jc w:val="both"/>
-        <w:rPr>
-          <w:szCs w:val="20"/>
-        </w:rPr>
-      </w:pPr>
-      <w:r>
-        <w:rPr>
-          <w:szCs w:val="20"/>
-        </w:rPr>
-        <w:t xml:space="preserve">Designed and </w:t>
-      </w:r>
-      <w:r>
-        <w:rPr>
-          <w:szCs w:val="20"/>
-        </w:rPr>
-        <w:t>implement</w:t>
-      </w:r>
-      <w:r>
-        <w:rPr>
-          <w:szCs w:val="20"/>
-        </w:rPr>
-        <w:t xml:space="preserve">ed </w:t>
-      </w:r>
-      <w:r>
-        <w:rPr>
-          <w:szCs w:val="20"/>
-        </w:rPr>
-        <w:t xml:space="preserve">a </w:t>
-      </w:r>
-      <w:r>
-        <w:rPr>
-          <w:b/>
-          <w:bCs/>
-          <w:szCs w:val="20"/>
-        </w:rPr>
-        <w:t xml:space="preserve">broadcast </w:t>
-      </w:r>
-      <w:r>
-        <w:rPr>
-          <w:b/>
-          <w:bCs/>
-          <w:szCs w:val="20"/>
-        </w:rPr>
-        <w:t xml:space="preserve">messaging </w:t>
-      </w:r>
-      <w:r>
-        <w:rPr>
-          <w:szCs w:val="20"/>
-        </w:rPr>
-        <w:t>feature</w:t>
-      </w:r>
-      <w:r>
-        <w:rPr>
-          <w:szCs w:val="20"/>
-        </w:rPr>
-        <w:t xml:space="preserve"> </w:t>
-      </w:r>
-      <w:r>
-        <w:rPr>
-          <w:szCs w:val="20"/>
-        </w:rPr>
-        <w:t xml:space="preserve">enabling </w:t>
-      </w:r>
-      <w:r>
-        <w:rPr>
-          <w:szCs w:val="20"/>
-        </w:rPr>
-        <w:t>users to interact with</w:t>
-      </w:r>
-      <w:r>
-        <w:rPr>
-          <w:szCs w:val="20"/>
-        </w:rPr>
-        <w:t xml:space="preserve"> each other</w:t>
-      </w:r>
-      <w:r>
-        <w:rPr>
-          <w:szCs w:val="20"/>
-        </w:rPr>
-        <w:t>.</w:t>
-      </w:r>
-    </w:p>
-    <w:p>
-      <w:pPr>
-        <w:pStyle w:val="ListParagraph"/>
-        <w:numPr>
-          <w:ilvl w:val="0"/>
-          <w:numId w:val="32"/>
-        </w:numPr>
-        <w:spacing w:line="240" w:lineRule="auto"/>
-        <w:ind w:right="0"/>
-        <w:jc w:val="both"/>
-        <w:rPr>
-          <w:szCs w:val="20"/>
-        </w:rPr>
-      </w:pPr>
-      <w:r>
-        <w:rPr>
-          <w:szCs w:val="20"/>
-        </w:rPr>
-        <w:t xml:space="preserve">Integrated </w:t>
-      </w:r>
-      <w:r>
-        <w:rPr>
-          <w:szCs w:val="20"/>
-        </w:rPr>
-        <w:t xml:space="preserve">daily </w:t>
-      </w:r>
-      <w:r>
-        <w:rPr>
-          <w:szCs w:val="20"/>
-        </w:rPr>
-        <w:t>medicine intake logging and viewing</w:t>
-      </w:r>
-      <w:r>
-        <w:rPr>
-          <w:szCs w:val="20"/>
-        </w:rPr>
-        <w:t xml:space="preserve"> features</w:t>
-      </w:r>
-      <w:r>
-        <w:rPr>
-          <w:szCs w:val="20"/>
-        </w:rPr>
-        <w:t xml:space="preserve"> </w:t>
-      </w:r>
-      <w:r>
-        <w:rPr>
-          <w:szCs w:val="20"/>
-        </w:rPr>
-        <w:t xml:space="preserve">and </w:t>
-      </w:r>
-      <w:r>
-        <w:rPr>
-          <w:b/>
-          <w:bCs/>
-          <w:szCs w:val="20"/>
-        </w:rPr>
-        <w:t xml:space="preserve">scaled </w:t>
-      </w:r>
-      <w:r>
-        <w:rPr>
-          <w:szCs w:val="20"/>
-        </w:rPr>
-        <w:t>it to track up to</w:t>
-      </w:r>
-      <w:r>
-        <w:rPr>
-          <w:b/>
-          <w:bCs/>
-          <w:szCs w:val="20"/>
-        </w:rPr>
-        <w:t xml:space="preserve"> 5 medicines</w:t>
-      </w:r>
-      <w:r>
-        <w:rPr>
-          <w:b/>
-          <w:bCs/>
-          <w:szCs w:val="20"/>
-        </w:rPr>
-        <w:t>.</w:t>
-      </w:r>
-    </w:p>
-    <w:p>
-      <w:pPr>
-        <w:pStyle w:val="ListParagraph"/>
-        <w:numPr>
-          <w:ilvl w:val="0"/>
-          <w:numId w:val="32"/>
-        </w:numPr>
-        <w:spacing w:line="240" w:lineRule="auto"/>
-        <w:ind w:right="0"/>
-        <w:jc w:val="both"/>
-        <w:rPr>
-          <w:szCs w:val="20"/>
-        </w:rPr>
-      </w:pPr>
-      <w:r>
-        <w:rPr>
-          <w:szCs w:val="20"/>
-        </w:rPr>
-        <w:t xml:space="preserve">Delivered </w:t>
-      </w:r>
-      <w:r>
-        <w:rPr>
-          <w:szCs w:val="20"/>
-        </w:rPr>
-        <w:t xml:space="preserve">water intake </w:t>
-      </w:r>
-      <w:r>
-        <w:rPr>
-          <w:szCs w:val="20"/>
-        </w:rPr>
-        <w:t xml:space="preserve">and </w:t>
-      </w:r>
-      <w:r>
-        <w:rPr>
-          <w:b/>
-          <w:bCs/>
-          <w:szCs w:val="20"/>
-        </w:rPr>
-        <w:t>weight tracking</w:t>
-      </w:r>
-      <w:r>
-        <w:rPr>
-          <w:szCs w:val="20"/>
-        </w:rPr>
-        <w:t xml:space="preserve"> </w:t>
-      </w:r>
-      <w:r>
-        <w:rPr>
-          <w:szCs w:val="20"/>
-        </w:rPr>
-        <w:t>features</w:t>
-      </w:r>
-      <w:r>
-        <w:rPr>
-          <w:szCs w:val="20"/>
-        </w:rPr>
-        <w:t xml:space="preserve"> and added </w:t>
-      </w:r>
-      <w:r>
-        <w:rPr>
-          <w:i/>
-          <w:iCs/>
-          <w:szCs w:val="20"/>
-        </w:rPr>
-        <w:t xml:space="preserve">splash screen </w:t>
-      </w:r>
-      <w:r>
-        <w:rPr>
-          <w:i/>
-          <w:iCs/>
-          <w:szCs w:val="20"/>
-        </w:rPr>
-        <w:t>animation</w:t>
-      </w:r>
-      <w:r>
-        <w:rPr>
-          <w:szCs w:val="20"/>
-        </w:rPr>
-        <w:t xml:space="preserve"> for better UX</w:t>
-      </w:r>
-      <w:r>
-        <w:rPr>
-          <w:szCs w:val="20"/>
-        </w:rPr>
-        <w:t>.</w:t>
-      </w:r>
-    </w:p>
-    <w:p>
-      <w:pPr>
-        <w:pStyle w:val="ListParagraph"/>
-        <w:numPr>
-          <w:ilvl w:val="0"/>
-          <w:numId w:val="32"/>
-        </w:numPr>
-        <w:spacing w:line="240" w:lineRule="auto"/>
-        <w:ind w:right="0"/>
-        <w:jc w:val="both"/>
-        <w:rPr>
-          <w:szCs w:val="20"/>
-        </w:rPr>
-      </w:pPr>
-      <w:r>
-        <w:rPr>
-          <w:szCs w:val="20"/>
-        </w:rPr>
-        <w:t>Complemented nutrient, weight</w:t>
-      </w:r>
-      <w:r>
-        <w:rPr>
-          <w:szCs w:val="20"/>
-        </w:rPr>
-        <w:t>,</w:t>
-      </w:r>
-      <w:r>
-        <w:rPr>
-          <w:szCs w:val="20"/>
-        </w:rPr>
-        <w:t xml:space="preserve"> and water intake tracking feature</w:t>
-      </w:r>
-      <w:r>
-        <w:rPr>
-          <w:szCs w:val="20"/>
-        </w:rPr>
-        <w:t>s</w:t>
-      </w:r>
-      <w:r>
-        <w:rPr>
-          <w:szCs w:val="20"/>
-        </w:rPr>
-        <w:t xml:space="preserve"> with </w:t>
-      </w:r>
-      <w:r>
-        <w:rPr>
-          <w:b/>
-          <w:bCs/>
-          <w:szCs w:val="20"/>
-        </w:rPr>
-        <w:t>interactive graphs</w:t>
-      </w:r>
-      <w:r>
-        <w:rPr>
-          <w:szCs w:val="20"/>
-        </w:rPr>
-        <w:t xml:space="preserve"> for better UX.</w:t>
-      </w:r>
-    </w:p>
-    <w:p>
-      <w:pPr>
-        <w:pStyle w:val="ListParagraph"/>
-        <w:numPr>
-          <w:ilvl w:val="0"/>
-          <w:numId w:val="32"/>
-        </w:numPr>
-        <w:spacing w:line="240" w:lineRule="auto"/>
-        <w:ind w:right="0"/>
-        <w:jc w:val="both"/>
-        <w:rPr>
-          <w:b/>
-          <w:bCs/>
-          <w:szCs w:val="20"/>
-        </w:rPr>
-      </w:pPr>
-      <w:r>
-        <w:rPr>
-          <w:szCs w:val="20"/>
-        </w:rPr>
-        <w:t xml:space="preserve">Close to </w:t>
-      </w:r>
-      <w:r>
-        <w:rPr>
-          <w:szCs w:val="20"/>
-        </w:rPr>
-        <w:t>publishing</w:t>
-      </w:r>
-      <w:r>
-        <w:rPr>
-          <w:szCs w:val="20"/>
-        </w:rPr>
-        <w:t xml:space="preserve"> the app to </w:t>
-      </w:r>
-      <w:r>
-        <w:rPr>
-          <w:szCs w:val="20"/>
-        </w:rPr>
-        <w:t>the</w:t>
-      </w:r>
-      <w:r>
-        <w:rPr>
-          <w:b/>
-          <w:bCs/>
-          <w:szCs w:val="20"/>
-        </w:rPr>
-        <w:t xml:space="preserve"> </w:t>
-      </w:r>
-      <w:r>
-        <w:rPr>
-          <w:b/>
-          <w:bCs/>
-          <w:szCs w:val="20"/>
-        </w:rPr>
-        <w:t>Google Play Store.</w:t>
-      </w:r>
-    </w:p>
-    <w:p>
-      <w:pPr>
-        <w:pStyle w:val="ListParagraph"/>
-        <w:numPr>
-          <w:ilvl w:val="0"/>
-          <w:numId w:val="39"/>
-        </w:numPr>
-        <w:spacing w:line="240" w:lineRule="auto"/>
-        <w:ind w:right="0"/>
-        <w:jc w:val="both"/>
-        <w:rPr>
           <w:color w:val="auto"/>
-          <w:szCs w:val="20"/>
-        </w:rPr>
-      </w:pPr>
-      <w:hyperlink r:id="rId28" w:history="1">
+        </w:rPr>
+      </w:pPr>
+      <w:hyperlink r:id="rId26" w:history="1">
         <w:r>
           <w:rPr>
             <w:rStyle w:val="Hyperlink"/>
             <w:b/>
             <w:bCs/>
             <w:color w:val="0070C0"/>
-            <w:szCs w:val="20"/>
             <w:u w:val="none"/>
           </w:rPr>
           <w:t xml:space="preserve">A Spring Boot </w:t>
@@ -2241,7 +1754,16 @@
             <w:b/>
             <w:bCs/>
             <w:color w:val="0070C0"/>
-            <w:szCs w:val="20"/>
+            <w:u w:val="none"/>
+          </w:rPr>
+          <w:t>Currency/</w:t>
+        </w:r>
+        <w:r>
+          <w:rPr>
+            <w:rStyle w:val="Hyperlink"/>
+            <w:b/>
+            <w:bCs/>
+            <w:color w:val="0070C0"/>
             <w:u w:val="none"/>
           </w:rPr>
           <w:t>R</w:t>
@@ -2252,7 +1774,6 @@
             <w:b/>
             <w:bCs/>
             <w:color w:val="0070C0"/>
-            <w:szCs w:val="20"/>
             <w:u w:val="none"/>
           </w:rPr>
           <w:t xml:space="preserve">evenue </w:t>
@@ -2263,7 +1784,6 @@
             <w:b/>
             <w:bCs/>
             <w:color w:val="0070C0"/>
-            <w:szCs w:val="20"/>
             <w:u w:val="none"/>
           </w:rPr>
           <w:t>C</w:t>
@@ -2274,7 +1794,6 @@
             <w:b/>
             <w:bCs/>
             <w:color w:val="0070C0"/>
-            <w:szCs w:val="20"/>
             <w:u w:val="none"/>
           </w:rPr>
           <w:t xml:space="preserve">onverter </w:t>
@@ -2285,7 +1804,6 @@
             <w:b/>
             <w:bCs/>
             <w:color w:val="000000" w:themeColor="text1"/>
-            <w:szCs w:val="20"/>
             <w:u w:val="none"/>
           </w:rPr>
           <w:t>(Java)</w:t>
@@ -2294,7 +1812,6 @@
           <w:rPr>
             <w:rStyle w:val="Hyperlink"/>
             <w:color w:val="0070C0"/>
-            <w:szCs w:val="20"/>
             <w:u w:val="none"/>
           </w:rPr>
           <w:t xml:space="preserve"> </w:t>
@@ -2303,7 +1820,6 @@
           <w:rPr>
             <w:rStyle w:val="Hyperlink"/>
             <w:color w:val="000000" w:themeColor="text1"/>
-            <w:szCs w:val="20"/>
             <w:u w:val="none"/>
           </w:rPr>
           <w:t>[</w:t>
@@ -2314,7 +1830,6 @@
             <w:i/>
             <w:iCs/>
             <w:color w:val="000000" w:themeColor="text1"/>
-            <w:szCs w:val="20"/>
           </w:rPr>
           <w:t>link</w:t>
         </w:r>
@@ -2322,7 +1837,6 @@
           <w:rPr>
             <w:rStyle w:val="Hyperlink"/>
             <w:color w:val="000000" w:themeColor="text1"/>
-            <w:szCs w:val="20"/>
             <w:u w:val="none"/>
           </w:rPr>
           <w:t>]</w:t>
@@ -2367,19 +1881,37 @@
         <w:rPr>
           <w:szCs w:val="20"/>
         </w:rPr>
-        <w:t xml:space="preserve"> revenue converter and scaled</w:t>
-      </w:r>
-      <w:r>
-        <w:rPr>
-          <w:szCs w:val="20"/>
-        </w:rPr>
         <w:t xml:space="preserve"> </w:t>
       </w:r>
       <w:r>
         <w:rPr>
           <w:szCs w:val="20"/>
         </w:rPr>
+        <w:t xml:space="preserve">currency </w:t>
+      </w:r>
+      <w:r>
+        <w:rPr>
+          <w:szCs w:val="20"/>
+        </w:rPr>
+        <w:t>converter and scaled</w:t>
+      </w:r>
+      <w:r>
+        <w:rPr>
+          <w:szCs w:val="20"/>
+        </w:rPr>
+        <w:t xml:space="preserve"> </w:t>
+      </w:r>
+      <w:r>
+        <w:rPr>
+          <w:szCs w:val="20"/>
+        </w:rPr>
         <w:t xml:space="preserve">the </w:t>
+      </w:r>
+      <w:r>
+        <w:rPr>
+          <w:szCs w:val="20"/>
+        </w:rPr>
+        <w:t xml:space="preserve">currency </w:t>
       </w:r>
       <w:r>
         <w:rPr>
@@ -2561,7 +2093,7 @@
       <w:r>
         <w:t xml:space="preserve"> | </w:t>
       </w:r>
-      <w:hyperlink r:id="rId29" w:history="1">
+      <w:hyperlink r:id="rId27" w:history="1">
         <w:r>
           <w:rPr>
             <w:rStyle w:val="Hyperlink"/>
@@ -3055,952 +2587,24 @@
     </w:p>
     <w:p>
       <w:pPr>
-        <w:pStyle w:val="ListParagraph"/>
-        <w:numPr>
-          <w:ilvl w:val="0"/>
-          <w:numId w:val="31"/>
-        </w:numPr>
         <w:spacing w:line="240" w:lineRule="auto"/>
-        <w:ind w:right="0"/>
+        <w:ind w:left="0" w:right="0" w:firstLine="0"/>
         <w:jc w:val="both"/>
-        <w:rPr>
-          <w:szCs w:val="20"/>
-        </w:rPr>
-      </w:pPr>
-      <w:hyperlink r:id="rId30" w:history="1">
-        <w:r>
-          <w:rPr>
-            <w:rStyle w:val="Hyperlink"/>
-            <w:rFonts w:cs="Arial"/>
-            <w:b/>
-            <w:bCs/>
-            <w:szCs w:val="20"/>
-            <w:u w:val="none"/>
-          </w:rPr>
-          <w:t xml:space="preserve">Hindi4All: A brand-new programming language </w:t>
-        </w:r>
-        <w:r>
-          <w:rPr>
-            <w:rStyle w:val="Hyperlink"/>
-            <w:rFonts w:cs="Arial"/>
-            <w:color w:val="auto"/>
-            <w:szCs w:val="20"/>
-            <w:u w:val="none"/>
-          </w:rPr>
-          <w:t>(</w:t>
-        </w:r>
-        <w:r>
-          <w:rPr>
-            <w:rStyle w:val="Hyperlink"/>
-            <w:rFonts w:cs="Arial"/>
-            <w:b/>
-            <w:bCs/>
-            <w:color w:val="auto"/>
-            <w:szCs w:val="20"/>
-            <w:u w:val="none"/>
-          </w:rPr>
-          <w:t>JavaScript, PHP</w:t>
-        </w:r>
-        <w:r>
-          <w:rPr>
-            <w:rStyle w:val="Hyperlink"/>
-            <w:rFonts w:cs="Arial"/>
-            <w:color w:val="auto"/>
-            <w:szCs w:val="20"/>
-            <w:u w:val="none"/>
-          </w:rPr>
-          <w:t>) [</w:t>
-        </w:r>
-        <w:r>
-          <w:rPr>
-            <w:rStyle w:val="Hyperlink"/>
-            <w:rFonts w:cs="Arial"/>
-            <w:i/>
-            <w:iCs/>
-            <w:color w:val="auto"/>
-            <w:szCs w:val="20"/>
-          </w:rPr>
-          <w:t>link</w:t>
-        </w:r>
-        <w:r>
-          <w:rPr>
-            <w:rStyle w:val="Hyperlink"/>
-            <w:rFonts w:cs="Arial"/>
-            <w:color w:val="auto"/>
-            <w:szCs w:val="20"/>
-            <w:u w:val="none"/>
-          </w:rPr>
-          <w:t>]</w:t>
-        </w:r>
-      </w:hyperlink>
-      <w:r>
-        <w:rPr>
-          <w:szCs w:val="20"/>
-        </w:rPr>
-        <w:t>:</w:t>
-      </w:r>
-      <w:r>
-        <w:rPr>
-          <w:szCs w:val="20"/>
-        </w:rPr>
-        <w:t xml:space="preserve"> </w:t>
-      </w:r>
-      <w:r>
-        <w:rPr>
-          <w:szCs w:val="20"/>
-        </w:rPr>
-        <w:t xml:space="preserve">which </w:t>
-      </w:r>
-      <w:r>
-        <w:rPr>
-          <w:szCs w:val="20"/>
-        </w:rPr>
-        <w:t>is</w:t>
-      </w:r>
-      <w:r>
-        <w:rPr>
-          <w:szCs w:val="20"/>
-        </w:rPr>
-        <w:t xml:space="preserve"> </w:t>
-      </w:r>
-      <w:r>
-        <w:rPr>
-          <w:szCs w:val="20"/>
-        </w:rPr>
-        <w:t xml:space="preserve">in Hindi and has the features of a traditional programming language, documentation, </w:t>
-      </w:r>
-      <w:r>
-        <w:rPr>
-          <w:szCs w:val="20"/>
-        </w:rPr>
-        <w:t>an editor</w:t>
-      </w:r>
-      <w:r>
-        <w:rPr>
-          <w:szCs w:val="20"/>
-        </w:rPr>
-        <w:t>,</w:t>
-      </w:r>
-      <w:r>
-        <w:rPr>
-          <w:szCs w:val="20"/>
-        </w:rPr>
-        <w:t xml:space="preserve"> </w:t>
-      </w:r>
-      <w:r>
-        <w:rPr>
-          <w:szCs w:val="20"/>
-        </w:rPr>
-        <w:t>a</w:t>
-      </w:r>
-      <w:r>
-        <w:rPr>
-          <w:szCs w:val="20"/>
-        </w:rPr>
-        <w:t>nd CLI support</w:t>
-      </w:r>
-      <w:r>
-        <w:rPr>
-          <w:szCs w:val="20"/>
-        </w:rPr>
-        <w:t>.</w:t>
-      </w:r>
-      <w:r>
-        <w:rPr>
-          <w:szCs w:val="20"/>
-        </w:rPr>
-        <w:t xml:space="preserve"> </w:t>
-      </w:r>
-      <w:r>
-        <w:rPr>
-          <w:szCs w:val="20"/>
-        </w:rPr>
-        <w:t xml:space="preserve">With the potential to increase </w:t>
-      </w:r>
-      <w:r>
-        <w:rPr>
-          <w:szCs w:val="20"/>
-        </w:rPr>
-        <w:t xml:space="preserve">the </w:t>
-      </w:r>
-      <w:r>
-        <w:rPr>
-          <w:szCs w:val="20"/>
-        </w:rPr>
-        <w:t>salar</w:t>
-      </w:r>
-      <w:r>
-        <w:rPr>
-          <w:szCs w:val="20"/>
-        </w:rPr>
-        <w:t>ies</w:t>
-      </w:r>
-      <w:r>
-        <w:rPr>
-          <w:szCs w:val="20"/>
-        </w:rPr>
-        <w:t xml:space="preserve"> of </w:t>
-      </w:r>
-      <w:r>
-        <w:rPr>
-          <w:b/>
-          <w:bCs/>
-          <w:iCs/>
-          <w:szCs w:val="20"/>
-        </w:rPr>
-        <w:t xml:space="preserve">thousands </w:t>
-      </w:r>
-      <w:r>
-        <w:rPr>
-          <w:iCs/>
-          <w:szCs w:val="20"/>
-        </w:rPr>
-        <w:t>of</w:t>
-      </w:r>
-      <w:r>
-        <w:rPr>
-          <w:b/>
-          <w:bCs/>
-          <w:iCs/>
-          <w:szCs w:val="20"/>
-        </w:rPr>
-        <w:t xml:space="preserve"> </w:t>
-      </w:r>
-      <w:r>
-        <w:rPr>
-          <w:iCs/>
-          <w:szCs w:val="20"/>
-        </w:rPr>
-        <w:t>users</w:t>
-      </w:r>
-      <w:r>
-        <w:rPr>
-          <w:szCs w:val="20"/>
-        </w:rPr>
-        <w:t xml:space="preserve"> </w:t>
-      </w:r>
-      <w:r>
-        <w:rPr>
-          <w:szCs w:val="20"/>
-        </w:rPr>
-        <w:t xml:space="preserve">by </w:t>
-      </w:r>
-      <w:r>
-        <w:rPr>
-          <w:szCs w:val="20"/>
-        </w:rPr>
-        <w:t xml:space="preserve">more than </w:t>
-      </w:r>
-      <w:r>
-        <w:rPr>
-          <w:b/>
-          <w:bCs/>
-          <w:szCs w:val="20"/>
-        </w:rPr>
-        <w:t>30</w:t>
-      </w:r>
-      <w:r>
-        <w:rPr>
-          <w:b/>
-          <w:bCs/>
-          <w:szCs w:val="20"/>
-        </w:rPr>
-        <w:t>%</w:t>
-      </w:r>
-      <w:r>
-        <w:rPr>
-          <w:b/>
-          <w:bCs/>
-          <w:szCs w:val="20"/>
-        </w:rPr>
-        <w:t xml:space="preserve"> </w:t>
-      </w:r>
-      <w:r>
-        <w:rPr>
-          <w:szCs w:val="20"/>
-        </w:rPr>
-        <w:t>on average</w:t>
-      </w:r>
-      <w:r>
-        <w:rPr>
-          <w:szCs w:val="20"/>
-        </w:rPr>
-        <w:t>.</w:t>
-      </w:r>
-    </w:p>
-    <w:p>
-      <w:pPr>
-        <w:pStyle w:val="ListParagraph"/>
-        <w:numPr>
-          <w:ilvl w:val="0"/>
-          <w:numId w:val="31"/>
-        </w:numPr>
-        <w:spacing w:line="240" w:lineRule="auto"/>
-        <w:ind w:right="0"/>
-        <w:jc w:val="both"/>
-        <w:rPr>
-          <w:b/>
-          <w:bCs/>
-          <w:szCs w:val="20"/>
-        </w:rPr>
-      </w:pPr>
-      <w:hyperlink r:id="rId31" w:history="1">
-        <w:r>
-          <w:rPr>
-            <w:rStyle w:val="Hyperlink"/>
-            <w:rFonts w:cs="Arial"/>
-            <w:b/>
-            <w:bCs/>
-            <w:szCs w:val="20"/>
-            <w:u w:val="none"/>
-          </w:rPr>
-          <w:t xml:space="preserve">Stock trading </w:t>
-        </w:r>
-        <w:r>
-          <w:rPr>
-            <w:rStyle w:val="Hyperlink"/>
-            <w:rFonts w:cs="Arial"/>
-            <w:color w:val="auto"/>
-            <w:szCs w:val="20"/>
-            <w:u w:val="none"/>
-          </w:rPr>
-          <w:t>(</w:t>
-        </w:r>
-        <w:r>
-          <w:rPr>
-            <w:rStyle w:val="Hyperlink"/>
-            <w:rFonts w:cs="Arial"/>
-            <w:b/>
-            <w:bCs/>
-            <w:color w:val="auto"/>
-            <w:szCs w:val="20"/>
-            <w:u w:val="none"/>
-          </w:rPr>
-          <w:t>Java</w:t>
-        </w:r>
-        <w:r>
-          <w:rPr>
-            <w:rStyle w:val="Hyperlink"/>
-            <w:rFonts w:cs="Arial"/>
-            <w:color w:val="auto"/>
-            <w:szCs w:val="20"/>
-            <w:u w:val="none"/>
-          </w:rPr>
-          <w:t xml:space="preserve">, </w:t>
-        </w:r>
-        <w:r>
-          <w:rPr>
-            <w:rStyle w:val="Hyperlink"/>
-            <w:rFonts w:cs="Arial"/>
-            <w:b/>
-            <w:bCs/>
-            <w:color w:val="auto"/>
-            <w:szCs w:val="20"/>
-            <w:u w:val="none"/>
-          </w:rPr>
-          <w:t>Python</w:t>
-        </w:r>
-        <w:r>
-          <w:rPr>
-            <w:rStyle w:val="Hyperlink"/>
-            <w:rFonts w:cs="Arial"/>
-            <w:color w:val="auto"/>
-            <w:szCs w:val="20"/>
-            <w:u w:val="none"/>
-          </w:rPr>
-          <w:t>)</w:t>
-        </w:r>
-        <w:r>
-          <w:rPr>
-            <w:rStyle w:val="Hyperlink"/>
-            <w:rFonts w:cs="Arial"/>
-            <w:b/>
-            <w:bCs/>
-            <w:color w:val="auto"/>
-            <w:szCs w:val="20"/>
-            <w:u w:val="none"/>
-          </w:rPr>
-          <w:t xml:space="preserve"> </w:t>
-        </w:r>
-        <w:r>
-          <w:rPr>
-            <w:rStyle w:val="Hyperlink"/>
-            <w:rFonts w:cs="Arial"/>
-            <w:color w:val="auto"/>
-            <w:szCs w:val="20"/>
-            <w:u w:val="none"/>
-          </w:rPr>
-          <w:t>[</w:t>
-        </w:r>
-        <w:r>
-          <w:rPr>
-            <w:rStyle w:val="Hyperlink"/>
-            <w:rFonts w:cs="Arial"/>
-            <w:i/>
-            <w:iCs/>
-            <w:color w:val="auto"/>
-            <w:szCs w:val="20"/>
-          </w:rPr>
-          <w:t>link</w:t>
-        </w:r>
-        <w:r>
-          <w:rPr>
-            <w:rStyle w:val="Hyperlink"/>
-            <w:rFonts w:cs="Arial"/>
-            <w:color w:val="auto"/>
-            <w:szCs w:val="20"/>
-            <w:u w:val="none"/>
-          </w:rPr>
-          <w:t>]</w:t>
-        </w:r>
-      </w:hyperlink>
-      <w:r>
-        <w:rPr>
-          <w:rFonts w:cs="Arial"/>
-          <w:szCs w:val="20"/>
-        </w:rPr>
-        <w:t>:</w:t>
-      </w:r>
-      <w:r>
-        <w:rPr>
-          <w:rFonts w:cs="Arial"/>
-          <w:szCs w:val="20"/>
-        </w:rPr>
-        <w:t xml:space="preserve"> </w:t>
-      </w:r>
-      <w:r>
-        <w:rPr>
-          <w:rFonts w:cs="Arial"/>
-          <w:szCs w:val="20"/>
-        </w:rPr>
-        <w:t>A</w:t>
-      </w:r>
-      <w:r>
-        <w:rPr>
-          <w:rFonts w:cs="Arial"/>
-          <w:szCs w:val="20"/>
-        </w:rPr>
-        <w:t>ndroid</w:t>
-      </w:r>
-      <w:r>
-        <w:rPr>
-          <w:rFonts w:cs="Arial"/>
-          <w:szCs w:val="20"/>
-        </w:rPr>
-        <w:t xml:space="preserve"> and desktop </w:t>
-      </w:r>
-      <w:r>
-        <w:rPr>
-          <w:rFonts w:cs="Arial"/>
-          <w:szCs w:val="20"/>
-        </w:rPr>
-        <w:t>applications</w:t>
-      </w:r>
-      <w:r>
-        <w:rPr>
-          <w:rFonts w:cs="Arial"/>
-          <w:szCs w:val="20"/>
-        </w:rPr>
-        <w:t xml:space="preserve"> that</w:t>
-      </w:r>
-      <w:r>
-        <w:rPr>
-          <w:rFonts w:cs="Arial"/>
-          <w:szCs w:val="20"/>
-        </w:rPr>
-        <w:t xml:space="preserve"> </w:t>
-      </w:r>
-      <w:r>
-        <w:rPr>
-          <w:szCs w:val="20"/>
-        </w:rPr>
-        <w:t>operated APIs provided by</w:t>
-      </w:r>
-      <w:r>
-        <w:rPr>
-          <w:szCs w:val="20"/>
-        </w:rPr>
-        <w:t xml:space="preserve"> leading</w:t>
-      </w:r>
-      <w:r>
-        <w:rPr>
-          <w:szCs w:val="20"/>
-        </w:rPr>
-        <w:t xml:space="preserve"> Indian</w:t>
-      </w:r>
-      <w:r>
-        <w:rPr>
-          <w:szCs w:val="20"/>
-        </w:rPr>
-        <w:t xml:space="preserve"> stock brokers, namely </w:t>
-      </w:r>
-      <w:r>
-        <w:rPr>
-          <w:b/>
-          <w:bCs/>
-          <w:szCs w:val="20"/>
-        </w:rPr>
-        <w:t>Kota Securities</w:t>
-      </w:r>
-      <w:r>
-        <w:rPr>
-          <w:i/>
-          <w:iCs/>
-          <w:szCs w:val="20"/>
-        </w:rPr>
-        <w:t xml:space="preserve"> </w:t>
-      </w:r>
-      <w:r>
-        <w:rPr>
-          <w:szCs w:val="20"/>
-        </w:rPr>
-        <w:t>and</w:t>
-      </w:r>
-      <w:r>
-        <w:rPr>
-          <w:i/>
-          <w:iCs/>
-          <w:szCs w:val="20"/>
-        </w:rPr>
-        <w:t xml:space="preserve"> Fyers</w:t>
-      </w:r>
-      <w:r>
-        <w:rPr>
-          <w:i/>
-          <w:iCs/>
-          <w:szCs w:val="20"/>
-        </w:rPr>
-        <w:t>,</w:t>
-      </w:r>
-      <w:r>
-        <w:rPr>
-          <w:szCs w:val="20"/>
-        </w:rPr>
-        <w:t xml:space="preserve"> </w:t>
-      </w:r>
-      <w:r>
-        <w:rPr>
-          <w:szCs w:val="20"/>
-        </w:rPr>
-        <w:t xml:space="preserve">to </w:t>
-      </w:r>
-      <w:r>
-        <w:rPr>
-          <w:i/>
-          <w:iCs/>
-          <w:szCs w:val="20"/>
-        </w:rPr>
-        <w:t>t</w:t>
-      </w:r>
-      <w:r>
-        <w:rPr>
-          <w:i/>
-          <w:iCs/>
-          <w:szCs w:val="20"/>
-        </w:rPr>
-        <w:t>rade</w:t>
-      </w:r>
-      <w:r>
-        <w:rPr>
-          <w:i/>
-          <w:iCs/>
-          <w:szCs w:val="20"/>
-        </w:rPr>
-        <w:t xml:space="preserve"> stocks</w:t>
-      </w:r>
-      <w:r>
-        <w:rPr>
-          <w:i/>
-          <w:iCs/>
-          <w:szCs w:val="20"/>
-        </w:rPr>
-        <w:t xml:space="preserve"> </w:t>
-      </w:r>
-      <w:r>
-        <w:rPr>
-          <w:i/>
-          <w:iCs/>
-          <w:szCs w:val="20"/>
-        </w:rPr>
-        <w:t>and</w:t>
-      </w:r>
-      <w:r>
-        <w:rPr>
-          <w:i/>
-          <w:iCs/>
-          <w:szCs w:val="20"/>
-        </w:rPr>
-        <w:t xml:space="preserve"> </w:t>
-      </w:r>
-      <w:r>
-        <w:rPr>
-          <w:i/>
-          <w:iCs/>
-          <w:szCs w:val="20"/>
-        </w:rPr>
-        <w:t>futures contracts</w:t>
-      </w:r>
-      <w:r>
-        <w:rPr>
-          <w:szCs w:val="20"/>
-        </w:rPr>
-        <w:t xml:space="preserve"> </w:t>
-      </w:r>
-      <w:r>
-        <w:rPr>
-          <w:szCs w:val="20"/>
-        </w:rPr>
-        <w:t>worth</w:t>
-      </w:r>
-      <w:r>
-        <w:rPr>
-          <w:szCs w:val="20"/>
-        </w:rPr>
-        <w:t xml:space="preserve"> </w:t>
-      </w:r>
-      <w:r>
-        <w:rPr>
-          <w:szCs w:val="20"/>
-        </w:rPr>
-        <w:t>more than</w:t>
-      </w:r>
-      <w:r>
-        <w:rPr>
-          <w:szCs w:val="20"/>
-        </w:rPr>
-        <w:t xml:space="preserve"> </w:t>
-      </w:r>
-      <w:r>
-        <w:rPr>
-          <w:szCs w:val="20"/>
-        </w:rPr>
-        <w:t xml:space="preserve">around </w:t>
-      </w:r>
-      <w:r>
-        <w:rPr>
-          <w:b/>
-          <w:bCs/>
-          <w:szCs w:val="20"/>
-        </w:rPr>
-        <w:t xml:space="preserve">$100 </w:t>
-      </w:r>
-      <w:r>
-        <w:rPr>
-          <w:szCs w:val="20"/>
-        </w:rPr>
-        <w:t>(</w:t>
-      </w:r>
-      <w:r>
-        <w:rPr>
-          <w:i/>
-          <w:iCs/>
-          <w:szCs w:val="20"/>
-        </w:rPr>
-        <w:t>~</w:t>
-      </w:r>
-      <w:r>
-        <w:rPr>
-          <w:i/>
-          <w:iCs/>
-          <w:szCs w:val="20"/>
-        </w:rPr>
-        <w:t>₹</w:t>
-      </w:r>
-      <w:r>
-        <w:rPr>
-          <w:b/>
-          <w:bCs/>
-          <w:i/>
-          <w:iCs/>
-          <w:szCs w:val="20"/>
-        </w:rPr>
-        <w:t>10</w:t>
-      </w:r>
-      <w:r>
-        <w:rPr>
-          <w:b/>
-          <w:bCs/>
-          <w:i/>
-          <w:iCs/>
-          <w:szCs w:val="20"/>
-        </w:rPr>
-        <w:t>,</w:t>
-      </w:r>
-      <w:r>
-        <w:rPr>
-          <w:b/>
-          <w:bCs/>
-          <w:i/>
-          <w:iCs/>
-          <w:szCs w:val="20"/>
-        </w:rPr>
-        <w:t>000</w:t>
-      </w:r>
-      <w:r>
-        <w:rPr>
-          <w:szCs w:val="20"/>
-        </w:rPr>
-        <w:t>)</w:t>
-      </w:r>
-      <w:r>
-        <w:rPr>
-          <w:b/>
-          <w:bCs/>
-          <w:szCs w:val="20"/>
-        </w:rPr>
-        <w:t xml:space="preserve"> </w:t>
-      </w:r>
-      <w:r>
-        <w:rPr>
-          <w:szCs w:val="20"/>
-        </w:rPr>
-        <w:t>algorithmically</w:t>
-      </w:r>
-      <w:r>
-        <w:rPr>
-          <w:szCs w:val="20"/>
-        </w:rPr>
-        <w:t>.</w:t>
-      </w:r>
-      <w:r>
-        <w:rPr>
-          <w:szCs w:val="20"/>
-        </w:rPr>
-        <w:t xml:space="preserve"> Also </w:t>
-      </w:r>
-      <w:r>
-        <w:rPr>
-          <w:i/>
-          <w:iCs/>
-          <w:szCs w:val="20"/>
-        </w:rPr>
-        <w:t>traded stocks autonomously</w:t>
-      </w:r>
-      <w:r>
-        <w:rPr>
-          <w:szCs w:val="20"/>
-        </w:rPr>
-        <w:t xml:space="preserve"> by w</w:t>
-      </w:r>
-      <w:r>
-        <w:rPr>
-          <w:szCs w:val="20"/>
-        </w:rPr>
-        <w:t>eb</w:t>
-      </w:r>
-      <w:r>
-        <w:rPr>
-          <w:szCs w:val="20"/>
-        </w:rPr>
-        <w:t xml:space="preserve"> </w:t>
-      </w:r>
-      <w:r>
-        <w:rPr>
-          <w:szCs w:val="20"/>
-        </w:rPr>
-        <w:t>scrap</w:t>
-      </w:r>
-      <w:r>
-        <w:rPr>
-          <w:szCs w:val="20"/>
-        </w:rPr>
-        <w:t>ing</w:t>
-      </w:r>
-      <w:r>
-        <w:rPr>
-          <w:szCs w:val="20"/>
-        </w:rPr>
-        <w:t xml:space="preserve"> </w:t>
-      </w:r>
-      <w:r>
-        <w:rPr>
-          <w:b/>
-          <w:bCs/>
-          <w:szCs w:val="20"/>
-        </w:rPr>
-        <w:t>Zerodha’s</w:t>
-      </w:r>
-      <w:r>
-        <w:rPr>
-          <w:szCs w:val="20"/>
-        </w:rPr>
-        <w:t xml:space="preserve"> </w:t>
-      </w:r>
-      <w:r>
-        <w:rPr>
-          <w:szCs w:val="20"/>
-        </w:rPr>
-        <w:t xml:space="preserve">website </w:t>
-      </w:r>
-      <w:r>
-        <w:rPr>
-          <w:szCs w:val="20"/>
-        </w:rPr>
-        <w:t>(</w:t>
-      </w:r>
-      <w:r>
-        <w:rPr>
-          <w:szCs w:val="20"/>
-        </w:rPr>
-        <w:t>a</w:t>
-      </w:r>
-      <w:r>
-        <w:rPr>
-          <w:szCs w:val="20"/>
-        </w:rPr>
-        <w:t>lso a</w:t>
-      </w:r>
-      <w:r>
-        <w:rPr>
-          <w:szCs w:val="20"/>
-        </w:rPr>
-        <w:t xml:space="preserve"> </w:t>
-      </w:r>
-      <w:r>
-        <w:rPr>
-          <w:szCs w:val="20"/>
-        </w:rPr>
-        <w:t>leading I</w:t>
-      </w:r>
-      <w:r>
-        <w:rPr>
-          <w:szCs w:val="20"/>
-        </w:rPr>
-        <w:t>ndian stockbroker)</w:t>
-      </w:r>
-      <w:r>
-        <w:rPr>
-          <w:szCs w:val="20"/>
-        </w:rPr>
-        <w:t xml:space="preserve"> </w:t>
-      </w:r>
-      <w:r>
-        <w:rPr>
-          <w:szCs w:val="20"/>
-        </w:rPr>
-        <w:t xml:space="preserve">and </w:t>
-      </w:r>
-      <w:r>
-        <w:rPr>
-          <w:szCs w:val="20"/>
-        </w:rPr>
-        <w:t>ma</w:t>
-      </w:r>
-      <w:r>
-        <w:rPr>
-          <w:szCs w:val="20"/>
-        </w:rPr>
-        <w:t xml:space="preserve">king </w:t>
-      </w:r>
-      <w:r>
-        <w:rPr>
-          <w:szCs w:val="20"/>
-        </w:rPr>
-        <w:t>automated logins</w:t>
-      </w:r>
-      <w:r>
-        <w:rPr>
-          <w:szCs w:val="20"/>
-        </w:rPr>
-        <w:t xml:space="preserve"> </w:t>
-      </w:r>
-      <w:r>
-        <w:rPr>
-          <w:szCs w:val="20"/>
-        </w:rPr>
-        <w:t>and order booking</w:t>
-      </w:r>
-      <w:r>
-        <w:rPr>
-          <w:szCs w:val="20"/>
-        </w:rPr>
-        <w:t>s</w:t>
-      </w:r>
-      <w:r>
-        <w:rPr>
-          <w:szCs w:val="20"/>
-        </w:rPr>
-        <w:t xml:space="preserve"> </w:t>
-      </w:r>
-      <w:r>
-        <w:rPr>
-          <w:szCs w:val="20"/>
-        </w:rPr>
-        <w:t xml:space="preserve">via </w:t>
-      </w:r>
-      <w:r>
-        <w:rPr>
-          <w:i/>
-          <w:iCs/>
-          <w:szCs w:val="20"/>
-        </w:rPr>
-        <w:t>Selenium</w:t>
-      </w:r>
-      <w:r>
-        <w:rPr>
-          <w:i/>
-          <w:iCs/>
-          <w:szCs w:val="20"/>
-        </w:rPr>
-        <w:t xml:space="preserve"> </w:t>
-      </w:r>
-      <w:r>
-        <w:rPr>
-          <w:i/>
-          <w:iCs/>
-          <w:szCs w:val="20"/>
-        </w:rPr>
-        <w:t xml:space="preserve">&amp; </w:t>
-      </w:r>
-      <w:r>
-        <w:rPr>
-          <w:i/>
-          <w:iCs/>
-          <w:szCs w:val="20"/>
-        </w:rPr>
-        <w:t>Chromium</w:t>
-      </w:r>
-      <w:r>
-        <w:rPr>
-          <w:szCs w:val="20"/>
-        </w:rPr>
-        <w:t>.</w:t>
-      </w:r>
-    </w:p>
-    <w:p>
-      <w:pPr>
-        <w:pStyle w:val="ListParagraph"/>
-        <w:numPr>
-          <w:ilvl w:val="0"/>
-          <w:numId w:val="31"/>
-        </w:numPr>
-        <w:spacing w:line="240" w:lineRule="auto"/>
-        <w:ind w:right="0"/>
-        <w:jc w:val="both"/>
-        <w:rPr>
-          <w:b/>
-          <w:bCs/>
-          <w:i/>
-          <w:iCs/>
-          <w:szCs w:val="20"/>
-        </w:rPr>
-      </w:pPr>
-      <w:hyperlink r:id="rId32" w:history="1">
+      </w:pPr>
+      <w:hyperlink r:id="rId28" w:history="1">
         <w:r>
           <w:rPr>
             <w:rStyle w:val="Hyperlink"/>
             <w:b/>
             <w:bCs/>
-            <w:szCs w:val="20"/>
             <w:u w:val="none"/>
           </w:rPr>
-          <w:t xml:space="preserve">Autonomous drone </w:t>
+          <w:t xml:space="preserve">Hindi4All: </w:t>
         </w:r>
         <w:r>
           <w:rPr>
             <w:rStyle w:val="Hyperlink"/>
             <w:color w:val="auto"/>
-            <w:szCs w:val="20"/>
             <w:u w:val="none"/>
           </w:rPr>
           <w:t>(</w:t>
@@ -4011,16 +2615,265 @@
             <w:b/>
             <w:bCs/>
             <w:color w:val="auto"/>
-            <w:szCs w:val="20"/>
             <w:u w:val="none"/>
           </w:rPr>
-          <w:t>C++, JavaScript</w:t>
+          <w:t>JavaScript, PHP</w:t>
         </w:r>
         <w:r>
           <w:rPr>
             <w:rStyle w:val="Hyperlink"/>
             <w:color w:val="auto"/>
-            <w:szCs w:val="20"/>
+            <w:u w:val="none"/>
+          </w:rPr>
+          <w:t>) [</w:t>
+        </w:r>
+        <w:r>
+          <w:rPr>
+            <w:rStyle w:val="Hyperlink"/>
+            <w:i/>
+            <w:iCs/>
+            <w:color w:val="auto"/>
+          </w:rPr>
+          <w:t>link</w:t>
+        </w:r>
+        <w:r>
+          <w:rPr>
+            <w:rStyle w:val="Hyperlink"/>
+            <w:color w:val="auto"/>
+            <w:u w:val="none"/>
+          </w:rPr>
+          <w:t>]</w:t>
+        </w:r>
+      </w:hyperlink>
+      <w:r>
+        <w:t>:</w:t>
+      </w:r>
+      <w:r>
+        <w:t xml:space="preserve"> </w:t>
+      </w:r>
+    </w:p>
+    <w:p>
+      <w:pPr>
+        <w:pStyle w:val="ListParagraph"/>
+        <w:numPr>
+          <w:ilvl w:val="0"/>
+          <w:numId w:val="39"/>
+        </w:numPr>
+        <w:spacing w:line="240" w:lineRule="auto"/>
+        <w:ind w:right="0"/>
+        <w:jc w:val="both"/>
+      </w:pPr>
+      <w:r>
+        <w:t>Attempted to b</w:t>
+      </w:r>
+      <w:r>
+        <w:t>uil</w:t>
+      </w:r>
+      <w:r>
+        <w:t>d</w:t>
+      </w:r>
+      <w:r>
+        <w:t xml:space="preserve"> a</w:t>
+      </w:r>
+      <w:r>
+        <w:t xml:space="preserve"> brand-new programming language </w:t>
+      </w:r>
+      <w:r>
+        <w:t>in Hindi</w:t>
+      </w:r>
+      <w:r>
+        <w:t>,</w:t>
+      </w:r>
+      <w:r>
+        <w:t xml:space="preserve"> </w:t>
+      </w:r>
+      <w:r>
+        <w:t>to</w:t>
+      </w:r>
+      <w:r>
+        <w:t xml:space="preserve"> help </w:t>
+      </w:r>
+      <w:r>
+        <w:t xml:space="preserve">increase salaries by </w:t>
+      </w:r>
+      <w:r>
+        <w:t xml:space="preserve">&gt; </w:t>
+      </w:r>
+      <w:r>
+        <w:rPr>
+          <w:b/>
+          <w:bCs/>
+        </w:rPr>
+        <w:t>2</w:t>
+      </w:r>
+      <w:r>
+        <w:rPr>
+          <w:b/>
+          <w:bCs/>
+        </w:rPr>
+        <w:t>0%</w:t>
+      </w:r>
+      <w:r>
+        <w:rPr>
+          <w:b/>
+          <w:bCs/>
+        </w:rPr>
+        <w:t>.</w:t>
+      </w:r>
+    </w:p>
+    <w:p>
+      <w:pPr>
+        <w:pStyle w:val="ListParagraph"/>
+        <w:numPr>
+          <w:ilvl w:val="0"/>
+          <w:numId w:val="31"/>
+        </w:numPr>
+        <w:spacing w:line="240" w:lineRule="auto"/>
+        <w:ind w:right="0"/>
+        <w:jc w:val="both"/>
+      </w:pPr>
+      <w:r>
+        <w:t xml:space="preserve">Integrated </w:t>
+      </w:r>
+      <w:r>
+        <w:t>features of a traditional programming language</w:t>
+      </w:r>
+      <w:r>
+        <w:t xml:space="preserve"> like </w:t>
+      </w:r>
+      <w:r>
+        <w:rPr>
+          <w:b/>
+          <w:bCs/>
+        </w:rPr>
+        <w:t>if-else, switch statements</w:t>
+      </w:r>
+      <w:r>
+        <w:t xml:space="preserve">, </w:t>
+      </w:r>
+      <w:r>
+        <w:t xml:space="preserve">and </w:t>
+      </w:r>
+      <w:r>
+        <w:t>for, while loops.</w:t>
+      </w:r>
+    </w:p>
+    <w:p>
+      <w:pPr>
+        <w:pStyle w:val="ListParagraph"/>
+        <w:numPr>
+          <w:ilvl w:val="0"/>
+          <w:numId w:val="31"/>
+        </w:numPr>
+        <w:spacing w:line="240" w:lineRule="auto"/>
+        <w:ind w:right="0"/>
+        <w:jc w:val="both"/>
+      </w:pPr>
+      <w:r>
+        <w:t>D</w:t>
+      </w:r>
+      <w:r>
+        <w:t xml:space="preserve">eveloped </w:t>
+      </w:r>
+      <w:r>
+        <w:t>documentation</w:t>
+      </w:r>
+      <w:r>
+        <w:t xml:space="preserve">, </w:t>
+      </w:r>
+      <w:r>
+        <w:t>an</w:t>
+      </w:r>
+      <w:r>
+        <w:t xml:space="preserve"> online code</w:t>
+      </w:r>
+      <w:r>
+        <w:t xml:space="preserve"> editor</w:t>
+      </w:r>
+      <w:r>
+        <w:t>,</w:t>
+      </w:r>
+      <w:r>
+        <w:t xml:space="preserve"> </w:t>
+      </w:r>
+      <w:r>
+        <w:t xml:space="preserve">and </w:t>
+      </w:r>
+      <w:r>
+        <w:t>CLI support</w:t>
+      </w:r>
+      <w:r>
+        <w:t xml:space="preserve"> </w:t>
+      </w:r>
+      <w:r>
+        <w:t xml:space="preserve">for </w:t>
+      </w:r>
+      <w:r>
+        <w:t>the language</w:t>
+      </w:r>
+      <w:r>
+        <w:t xml:space="preserve"> to assist the developers</w:t>
+      </w:r>
+      <w:r>
+        <w:t>.</w:t>
+      </w:r>
+    </w:p>
+    <w:p>
+      <w:pPr>
+        <w:spacing w:line="240" w:lineRule="auto"/>
+        <w:ind w:right="0"/>
+        <w:jc w:val="both"/>
+      </w:pPr>
+      <w:hyperlink r:id="rId29" w:history="1">
+        <w:r>
+          <w:rPr>
+            <w:rStyle w:val="Hyperlink"/>
+            <w:b/>
+            <w:bCs/>
+            <w:u w:val="none"/>
+          </w:rPr>
+          <w:t xml:space="preserve">Stock trading </w:t>
+        </w:r>
+        <w:r>
+          <w:rPr>
+            <w:rStyle w:val="Hyperlink"/>
+            <w:color w:val="auto"/>
+            <w:u w:val="none"/>
+          </w:rPr>
+          <w:t>(</w:t>
+        </w:r>
+        <w:r>
+          <w:rPr>
+            <w:rStyle w:val="Hyperlink"/>
+            <w:b/>
+            <w:bCs/>
+            <w:color w:val="auto"/>
+            <w:u w:val="none"/>
+          </w:rPr>
+          <w:t>Java</w:t>
+        </w:r>
+        <w:r>
+          <w:rPr>
+            <w:rStyle w:val="Hyperlink"/>
+            <w:color w:val="auto"/>
+            <w:u w:val="none"/>
+          </w:rPr>
+          <w:t xml:space="preserve">, </w:t>
+        </w:r>
+        <w:r>
+          <w:rPr>
+            <w:rStyle w:val="Hyperlink"/>
+            <w:b/>
+            <w:bCs/>
+            <w:color w:val="auto"/>
+            <w:u w:val="none"/>
+          </w:rPr>
+          <w:t>Python</w:t>
+        </w:r>
+        <w:r>
+          <w:rPr>
+            <w:rStyle w:val="Hyperlink"/>
+            <w:color w:val="auto"/>
             <w:u w:val="none"/>
           </w:rPr>
           <w:t>)</w:t>
@@ -4031,7 +2884,6 @@
             <w:b/>
             <w:bCs/>
             <w:color w:val="auto"/>
-            <w:szCs w:val="20"/>
             <w:u w:val="none"/>
           </w:rPr>
           <w:t xml:space="preserve"> </w:t>
@@ -4040,7 +2892,6 @@
           <w:rPr>
             <w:rStyle w:val="Hyperlink"/>
             <w:color w:val="auto"/>
-            <w:szCs w:val="20"/>
             <w:u w:val="none"/>
           </w:rPr>
           <w:t>[</w:t>
@@ -4051,7 +2902,6 @@
             <w:i/>
             <w:iCs/>
             <w:color w:val="auto"/>
-            <w:szCs w:val="20"/>
           </w:rPr>
           <w:t>link</w:t>
         </w:r>
@@ -4059,7 +2909,461 @@
           <w:rPr>
             <w:rStyle w:val="Hyperlink"/>
             <w:color w:val="auto"/>
-            <w:szCs w:val="20"/>
+            <w:u w:val="none"/>
+          </w:rPr>
+          <w:t>]</w:t>
+        </w:r>
+      </w:hyperlink>
+      <w:r>
+        <w:t>:</w:t>
+      </w:r>
+    </w:p>
+    <w:p>
+      <w:pPr>
+        <w:pStyle w:val="ListParagraph"/>
+        <w:numPr>
+          <w:ilvl w:val="0"/>
+          <w:numId w:val="39"/>
+        </w:numPr>
+        <w:spacing w:line="240" w:lineRule="auto"/>
+        <w:ind w:right="0"/>
+        <w:jc w:val="both"/>
+        <w:rPr>
+          <w:b/>
+          <w:bCs/>
+        </w:rPr>
+      </w:pPr>
+      <w:r>
+        <w:t xml:space="preserve">Built </w:t>
+      </w:r>
+      <w:r>
+        <w:t xml:space="preserve">Android and desktop </w:t>
+      </w:r>
+      <w:r>
+        <w:t xml:space="preserve">apps </w:t>
+      </w:r>
+      <w:r>
+        <w:t>that</w:t>
+      </w:r>
+      <w:r>
+        <w:t xml:space="preserve"> operated APIs provided by</w:t>
+      </w:r>
+      <w:r>
+        <w:t xml:space="preserve"> leading</w:t>
+      </w:r>
+      <w:r>
+        <w:t xml:space="preserve"> </w:t>
+      </w:r>
+      <w:r>
+        <w:t xml:space="preserve">stock brokers, namely </w:t>
+      </w:r>
+      <w:r>
+        <w:rPr>
+          <w:b/>
+          <w:bCs/>
+        </w:rPr>
+        <w:t>Kota Securities</w:t>
+      </w:r>
+      <w:r>
+        <w:rPr>
+          <w:i/>
+          <w:iCs/>
+        </w:rPr>
+        <w:t xml:space="preserve"> </w:t>
+      </w:r>
+      <w:r>
+        <w:t>and</w:t>
+      </w:r>
+      <w:r>
+        <w:rPr>
+          <w:i/>
+          <w:iCs/>
+        </w:rPr>
+        <w:t xml:space="preserve"> </w:t>
+      </w:r>
+      <w:r>
+        <w:rPr>
+          <w:b/>
+          <w:bCs/>
+        </w:rPr>
+        <w:t>Fyers</w:t>
+      </w:r>
+      <w:r>
+        <w:rPr>
+          <w:i/>
+          <w:iCs/>
+        </w:rPr>
+        <w:t>,</w:t>
+      </w:r>
+      <w:r>
+        <w:t xml:space="preserve"> </w:t>
+      </w:r>
+      <w:r>
+        <w:t xml:space="preserve">to </w:t>
+      </w:r>
+      <w:r>
+        <w:rPr>
+          <w:i/>
+          <w:iCs/>
+        </w:rPr>
+        <w:t>t</w:t>
+      </w:r>
+      <w:r>
+        <w:rPr>
+          <w:i/>
+          <w:iCs/>
+        </w:rPr>
+        <w:t>rade</w:t>
+      </w:r>
+      <w:r>
+        <w:rPr>
+          <w:i/>
+          <w:iCs/>
+        </w:rPr>
+        <w:t xml:space="preserve"> stocks</w:t>
+      </w:r>
+      <w:r>
+        <w:rPr>
+          <w:i/>
+          <w:iCs/>
+        </w:rPr>
+        <w:t xml:space="preserve"> </w:t>
+      </w:r>
+      <w:r>
+        <w:rPr>
+          <w:i/>
+          <w:iCs/>
+        </w:rPr>
+        <w:t>and</w:t>
+      </w:r>
+      <w:r>
+        <w:rPr>
+          <w:i/>
+          <w:iCs/>
+        </w:rPr>
+        <w:t xml:space="preserve"> </w:t>
+      </w:r>
+      <w:r>
+        <w:rPr>
+          <w:i/>
+          <w:iCs/>
+        </w:rPr>
+        <w:t>futures contracts</w:t>
+      </w:r>
+      <w:r>
+        <w:t xml:space="preserve"> </w:t>
+      </w:r>
+      <w:r>
+        <w:t>worth</w:t>
+      </w:r>
+      <w:r>
+        <w:t xml:space="preserve"> </w:t>
+      </w:r>
+      <w:r>
+        <w:t>more than</w:t>
+      </w:r>
+      <w:r>
+        <w:t xml:space="preserve"> ~</w:t>
+      </w:r>
+      <w:r>
+        <w:rPr>
+          <w:b/>
+          <w:bCs/>
+        </w:rPr>
+        <w:t xml:space="preserve">$100 </w:t>
+      </w:r>
+      <w:r>
+        <w:t>(</w:t>
+      </w:r>
+      <w:r>
+        <w:rPr>
+          <w:i/>
+          <w:iCs/>
+        </w:rPr>
+        <w:t>~</w:t>
+      </w:r>
+      <w:r>
+        <w:rPr>
+          <w:i/>
+          <w:iCs/>
+        </w:rPr>
+        <w:t>₹</w:t>
+      </w:r>
+      <w:r>
+        <w:rPr>
+          <w:b/>
+          <w:bCs/>
+          <w:i/>
+          <w:iCs/>
+        </w:rPr>
+        <w:t>10</w:t>
+      </w:r>
+      <w:r>
+        <w:rPr>
+          <w:b/>
+          <w:bCs/>
+          <w:i/>
+          <w:iCs/>
+        </w:rPr>
+        <w:t>,</w:t>
+      </w:r>
+      <w:r>
+        <w:rPr>
+          <w:b/>
+          <w:bCs/>
+          <w:i/>
+          <w:iCs/>
+        </w:rPr>
+        <w:t>000</w:t>
+      </w:r>
+      <w:r>
+        <w:t>)</w:t>
+      </w:r>
+      <w:r>
+        <w:rPr>
+          <w:b/>
+          <w:bCs/>
+        </w:rPr>
+        <w:t xml:space="preserve"> </w:t>
+      </w:r>
+      <w:r>
+        <w:t>algorithmically</w:t>
+      </w:r>
+      <w:r>
+        <w:t>.</w:t>
+      </w:r>
+      <w:r>
+        <w:t xml:space="preserve"> </w:t>
+      </w:r>
+    </w:p>
+    <w:p>
+      <w:pPr>
+        <w:pStyle w:val="ListParagraph"/>
+        <w:numPr>
+          <w:ilvl w:val="0"/>
+          <w:numId w:val="39"/>
+        </w:numPr>
+        <w:spacing w:line="240" w:lineRule="auto"/>
+        <w:ind w:right="0"/>
+        <w:jc w:val="both"/>
+        <w:rPr>
+          <w:b/>
+          <w:bCs/>
+        </w:rPr>
+      </w:pPr>
+      <w:r>
+        <w:rPr>
+          <w:i/>
+          <w:iCs/>
+        </w:rPr>
+        <w:t>T</w:t>
+      </w:r>
+      <w:r>
+        <w:rPr>
+          <w:i/>
+          <w:iCs/>
+        </w:rPr>
+        <w:t>raded stocks autonomously</w:t>
+      </w:r>
+      <w:r>
+        <w:t xml:space="preserve"> by w</w:t>
+      </w:r>
+      <w:r>
+        <w:t>eb</w:t>
+      </w:r>
+      <w:r>
+        <w:t xml:space="preserve"> </w:t>
+      </w:r>
+      <w:r>
+        <w:t>scrap</w:t>
+      </w:r>
+      <w:r>
+        <w:t>ing</w:t>
+      </w:r>
+      <w:r>
+        <w:t xml:space="preserve"> </w:t>
+      </w:r>
+      <w:r>
+        <w:rPr>
+          <w:b/>
+          <w:bCs/>
+        </w:rPr>
+        <w:t>Zerodha’s</w:t>
+      </w:r>
+      <w:r>
+        <w:t xml:space="preserve"> </w:t>
+      </w:r>
+      <w:r>
+        <w:t xml:space="preserve">website </w:t>
+      </w:r>
+      <w:r>
+        <w:t>(</w:t>
+      </w:r>
+      <w:r>
+        <w:t>a</w:t>
+      </w:r>
+      <w:r>
+        <w:t>lso a</w:t>
+      </w:r>
+      <w:r>
+        <w:t xml:space="preserve"> </w:t>
+      </w:r>
+      <w:r>
+        <w:t>leading I</w:t>
+      </w:r>
+      <w:r>
+        <w:t>ndian stockbroker)</w:t>
+      </w:r>
+      <w:r>
+        <w:t xml:space="preserve"> </w:t>
+      </w:r>
+      <w:r>
+        <w:t xml:space="preserve">and </w:t>
+      </w:r>
+      <w:r>
+        <w:t>ma</w:t>
+      </w:r>
+      <w:r>
+        <w:t xml:space="preserve">king </w:t>
+      </w:r>
+      <w:r>
+        <w:t>automated logins</w:t>
+      </w:r>
+      <w:r>
+        <w:t xml:space="preserve"> </w:t>
+      </w:r>
+      <w:r>
+        <w:t>and booking</w:t>
+      </w:r>
+      <w:r>
+        <w:t>s</w:t>
+      </w:r>
+      <w:r>
+        <w:t xml:space="preserve"> </w:t>
+      </w:r>
+      <w:r>
+        <w:t xml:space="preserve">via </w:t>
+      </w:r>
+      <w:r>
+        <w:rPr>
+          <w:i/>
+          <w:iCs/>
+        </w:rPr>
+        <w:t>Selenium</w:t>
+      </w:r>
+      <w:r>
+        <w:rPr>
+          <w:i/>
+          <w:iCs/>
+        </w:rPr>
+        <w:t xml:space="preserve"> </w:t>
+      </w:r>
+      <w:r>
+        <w:rPr>
+          <w:i/>
+          <w:iCs/>
+        </w:rPr>
+        <w:t xml:space="preserve">&amp; </w:t>
+      </w:r>
+      <w:r>
+        <w:rPr>
+          <w:i/>
+          <w:iCs/>
+        </w:rPr>
+        <w:t>Chromium</w:t>
+      </w:r>
+      <w:r>
+        <w:t>.</w:t>
+      </w:r>
+    </w:p>
+    <w:p>
+      <w:pPr>
+        <w:spacing w:line="240" w:lineRule="auto"/>
+        <w:ind w:right="0"/>
+        <w:jc w:val="both"/>
+        <w:rPr>
+          <w:b/>
+          <w:bCs/>
+          <w:i/>
+          <w:iCs/>
+        </w:rPr>
+      </w:pPr>
+      <w:hyperlink r:id="rId30" w:history="1">
+        <w:r>
+          <w:rPr>
+            <w:rStyle w:val="Hyperlink"/>
+            <w:b/>
+            <w:bCs/>
+            <w:u w:val="none"/>
+          </w:rPr>
+          <w:t>Quadcopter D</w:t>
+        </w:r>
+        <w:r>
+          <w:rPr>
+            <w:rStyle w:val="Hyperlink"/>
+            <w:b/>
+            <w:bCs/>
+            <w:u w:val="none"/>
+          </w:rPr>
+          <w:t xml:space="preserve">rone </w:t>
+        </w:r>
+        <w:r>
+          <w:rPr>
+            <w:rStyle w:val="Hyperlink"/>
+            <w:color w:val="auto"/>
+            <w:u w:val="none"/>
+          </w:rPr>
+          <w:t>(</w:t>
+        </w:r>
+        <w:r>
+          <w:rPr>
+            <w:rStyle w:val="Hyperlink"/>
+            <w:b/>
+            <w:bCs/>
+            <w:color w:val="auto"/>
+            <w:u w:val="none"/>
+          </w:rPr>
+          <w:t>C++, JavaScript</w:t>
+        </w:r>
+        <w:r>
+          <w:rPr>
+            <w:rStyle w:val="Hyperlink"/>
+            <w:color w:val="auto"/>
+            <w:u w:val="none"/>
+          </w:rPr>
+          <w:t>)</w:t>
+        </w:r>
+        <w:r>
+          <w:rPr>
+            <w:rStyle w:val="Hyperlink"/>
+            <w:b/>
+            <w:bCs/>
+            <w:color w:val="auto"/>
+            <w:u w:val="none"/>
+          </w:rPr>
+          <w:t xml:space="preserve"> </w:t>
+        </w:r>
+        <w:r>
+          <w:rPr>
+            <w:rStyle w:val="Hyperlink"/>
+            <w:color w:val="auto"/>
+            <w:u w:val="none"/>
+          </w:rPr>
+          <w:t>[</w:t>
+        </w:r>
+        <w:r>
+          <w:rPr>
+            <w:rStyle w:val="Hyperlink"/>
+            <w:i/>
+            <w:iCs/>
+            <w:color w:val="auto"/>
+          </w:rPr>
+          <w:t>link</w:t>
+        </w:r>
+        <w:r>
+          <w:rPr>
+            <w:rStyle w:val="Hyperlink"/>
+            <w:color w:val="auto"/>
             <w:u w:val="none"/>
           </w:rPr>
           <w:t>]</w:t>
@@ -4070,7 +3374,6 @@
             <w:b/>
             <w:bCs/>
             <w:color w:val="auto"/>
-            <w:szCs w:val="20"/>
             <w:u w:val="none"/>
           </w:rPr>
           <w:t>:</w:t>
@@ -4080,319 +3383,8 @@
         <w:rPr>
           <w:b/>
           <w:bCs/>
-          <w:szCs w:val="20"/>
         </w:rPr>
         <w:t xml:space="preserve"> </w:t>
-      </w:r>
-      <w:r>
-        <w:rPr>
-          <w:szCs w:val="20"/>
-        </w:rPr>
-        <w:t xml:space="preserve">attempt to </w:t>
-      </w:r>
-      <w:r>
-        <w:rPr>
-          <w:szCs w:val="20"/>
-        </w:rPr>
-        <w:t xml:space="preserve">build </w:t>
-      </w:r>
-      <w:r>
-        <w:rPr>
-          <w:szCs w:val="20"/>
-        </w:rPr>
-        <w:t xml:space="preserve">an internet-controlled </w:t>
-      </w:r>
-      <w:r>
-        <w:rPr>
-          <w:szCs w:val="20"/>
-        </w:rPr>
-        <w:t xml:space="preserve">autonomous </w:t>
-      </w:r>
-      <w:r>
-        <w:rPr>
-          <w:szCs w:val="20"/>
-        </w:rPr>
-        <w:t>drone.</w:t>
-      </w:r>
-      <w:r>
-        <w:rPr>
-          <w:szCs w:val="20"/>
-        </w:rPr>
-        <w:t xml:space="preserve"> Self-</w:t>
-      </w:r>
-      <w:r>
-        <w:rPr>
-          <w:szCs w:val="20"/>
-        </w:rPr>
-        <w:t>p</w:t>
-      </w:r>
-      <w:r>
-        <w:rPr>
-          <w:szCs w:val="20"/>
-        </w:rPr>
-        <w:t xml:space="preserve">rogrammed the </w:t>
-      </w:r>
-      <w:r>
-        <w:rPr>
-          <w:szCs w:val="20"/>
-        </w:rPr>
-        <w:t xml:space="preserve">receiver </w:t>
-      </w:r>
-      <w:r>
-        <w:rPr>
-          <w:szCs w:val="20"/>
-        </w:rPr>
-        <w:t xml:space="preserve">and transmitter </w:t>
-      </w:r>
-      <w:r>
-        <w:rPr>
-          <w:szCs w:val="20"/>
-        </w:rPr>
-        <w:t xml:space="preserve">and used open-source code on cost-effective </w:t>
-      </w:r>
-      <w:r>
-        <w:rPr>
-          <w:i/>
-          <w:iCs/>
-          <w:szCs w:val="20"/>
-        </w:rPr>
-        <w:t>Arduino UNO R3</w:t>
-      </w:r>
-      <w:r>
-        <w:rPr>
-          <w:szCs w:val="20"/>
-        </w:rPr>
-        <w:t xml:space="preserve"> for the</w:t>
-      </w:r>
-      <w:r>
-        <w:rPr>
-          <w:szCs w:val="20"/>
-        </w:rPr>
-        <w:t xml:space="preserve"> flight controller,</w:t>
-      </w:r>
-      <w:r>
-        <w:rPr>
-          <w:szCs w:val="20"/>
-        </w:rPr>
-        <w:t xml:space="preserve"> </w:t>
-      </w:r>
-      <w:r>
-        <w:rPr>
-          <w:szCs w:val="20"/>
-        </w:rPr>
-        <w:t>reduc</w:t>
-      </w:r>
-      <w:r>
-        <w:rPr>
-          <w:szCs w:val="20"/>
-        </w:rPr>
-        <w:t>ing</w:t>
-      </w:r>
-      <w:r>
-        <w:rPr>
-          <w:szCs w:val="20"/>
-        </w:rPr>
-        <w:t xml:space="preserve"> the overall </w:t>
-      </w:r>
-      <w:r>
-        <w:rPr>
-          <w:szCs w:val="20"/>
-        </w:rPr>
-        <w:t>buil</w:t>
-      </w:r>
-      <w:r>
-        <w:rPr>
-          <w:szCs w:val="20"/>
-        </w:rPr>
-        <w:t>d</w:t>
-      </w:r>
-      <w:r>
-        <w:rPr>
-          <w:szCs w:val="20"/>
-        </w:rPr>
-        <w:t xml:space="preserve"> </w:t>
-      </w:r>
-      <w:r>
-        <w:rPr>
-          <w:szCs w:val="20"/>
-        </w:rPr>
-        <w:t xml:space="preserve">cost </w:t>
-      </w:r>
-      <w:r>
-        <w:rPr>
-          <w:szCs w:val="20"/>
-        </w:rPr>
-        <w:t xml:space="preserve">by &gt; </w:t>
-      </w:r>
-      <w:r>
-        <w:rPr>
-          <w:b/>
-          <w:bCs/>
-          <w:szCs w:val="20"/>
-        </w:rPr>
-        <w:t>7</w:t>
-      </w:r>
-      <w:r>
-        <w:rPr>
-          <w:b/>
-          <w:bCs/>
-          <w:szCs w:val="20"/>
-        </w:rPr>
-        <w:t>0%</w:t>
-      </w:r>
-      <w:r>
-        <w:rPr>
-          <w:szCs w:val="20"/>
-        </w:rPr>
-        <w:t xml:space="preserve"> </w:t>
-      </w:r>
-      <w:r>
-        <w:rPr>
-          <w:szCs w:val="20"/>
-        </w:rPr>
-        <w:t>from</w:t>
-      </w:r>
-      <w:r>
-        <w:rPr>
-          <w:szCs w:val="20"/>
-        </w:rPr>
-        <w:t xml:space="preserve"> </w:t>
-      </w:r>
-      <w:r>
-        <w:rPr>
-          <w:szCs w:val="20"/>
-        </w:rPr>
-        <w:t xml:space="preserve">approx. </w:t>
-      </w:r>
-      <w:r>
-        <w:rPr>
-          <w:b/>
-          <w:bCs/>
-          <w:szCs w:val="20"/>
-        </w:rPr>
-        <w:t>$</w:t>
-      </w:r>
-      <w:r>
-        <w:rPr>
-          <w:b/>
-          <w:bCs/>
-          <w:szCs w:val="20"/>
-        </w:rPr>
-        <w:t>400</w:t>
-      </w:r>
-      <w:r>
-        <w:rPr>
-          <w:b/>
-          <w:bCs/>
-          <w:szCs w:val="20"/>
-        </w:rPr>
-        <w:t xml:space="preserve"> </w:t>
-      </w:r>
-      <w:r>
-        <w:rPr>
-          <w:szCs w:val="20"/>
-        </w:rPr>
-        <w:t>to</w:t>
-      </w:r>
-      <w:r>
-        <w:rPr>
-          <w:szCs w:val="20"/>
-        </w:rPr>
-        <w:t xml:space="preserve"> </w:t>
-      </w:r>
-      <w:r>
-        <w:rPr>
-          <w:b/>
-          <w:bCs/>
-          <w:szCs w:val="20"/>
-        </w:rPr>
-        <w:t>$80</w:t>
-      </w:r>
-      <w:r>
-        <w:rPr>
-          <w:b/>
-          <w:bCs/>
-          <w:szCs w:val="20"/>
-        </w:rPr>
-        <w:t xml:space="preserve"> </w:t>
-      </w:r>
-      <w:r>
-        <w:rPr>
-          <w:szCs w:val="20"/>
-        </w:rPr>
-        <w:t>(</w:t>
-      </w:r>
-      <w:r>
-        <w:rPr>
-          <w:i/>
-          <w:iCs/>
-          <w:szCs w:val="20"/>
-        </w:rPr>
-        <w:t>~</w:t>
-      </w:r>
-      <w:r>
-        <w:rPr>
-          <w:i/>
-          <w:iCs/>
-          <w:szCs w:val="20"/>
-        </w:rPr>
-        <w:t>₹</w:t>
-      </w:r>
-      <w:r>
-        <w:rPr>
-          <w:b/>
-          <w:bCs/>
-          <w:i/>
-          <w:iCs/>
-          <w:szCs w:val="20"/>
-        </w:rPr>
-        <w:t>35,000</w:t>
-      </w:r>
-      <w:r>
-        <w:rPr>
-          <w:i/>
-          <w:iCs/>
-          <w:szCs w:val="20"/>
-        </w:rPr>
-        <w:t xml:space="preserve"> to </w:t>
-      </w:r>
-      <w:r>
-        <w:rPr>
-          <w:i/>
-          <w:iCs/>
-          <w:szCs w:val="20"/>
-        </w:rPr>
-        <w:t>~</w:t>
-      </w:r>
-      <w:r>
-        <w:rPr>
-          <w:i/>
-          <w:iCs/>
-          <w:szCs w:val="20"/>
-        </w:rPr>
-        <w:t>₹</w:t>
-      </w:r>
-      <w:r>
-        <w:rPr>
-          <w:b/>
-          <w:bCs/>
-          <w:i/>
-          <w:iCs/>
-          <w:szCs w:val="20"/>
-        </w:rPr>
-        <w:t>7,000</w:t>
-      </w:r>
-      <w:r>
-        <w:rPr>
-          <w:szCs w:val="20"/>
-        </w:rPr>
-        <w:t>)</w:t>
-      </w:r>
-      <w:r>
-        <w:rPr>
-          <w:szCs w:val="20"/>
-        </w:rPr>
-        <w:t>.</w:t>
       </w:r>
     </w:p>
     <w:p>
@@ -4405,116 +3397,282 @@
         <w:spacing w:line="240" w:lineRule="auto"/>
         <w:ind w:right="0"/>
         <w:jc w:val="both"/>
-        <w:rPr>
-          <w:szCs w:val="20"/>
-        </w:rPr>
-      </w:pPr>
-      <w:hyperlink r:id="rId33" w:history="1">
-        <w:r>
-          <w:rPr>
-            <w:rStyle w:val="Hyperlink"/>
-            <w:b/>
-            <w:bCs/>
-            <w:szCs w:val="20"/>
-            <w:u w:val="none"/>
-          </w:rPr>
-          <w:t xml:space="preserve">Portfolio Site </w:t>
-        </w:r>
-        <w:r>
-          <w:rPr>
-            <w:rStyle w:val="Hyperlink"/>
-            <w:color w:val="auto"/>
-            <w:szCs w:val="20"/>
-            <w:u w:val="none"/>
-          </w:rPr>
-          <w:t>(</w:t>
-        </w:r>
-        <w:r>
-          <w:rPr>
-            <w:rStyle w:val="Hyperlink"/>
-            <w:b/>
-            <w:bCs/>
-            <w:color w:val="auto"/>
-            <w:szCs w:val="20"/>
-            <w:u w:val="none"/>
-          </w:rPr>
-          <w:t>JavaScript, React</w:t>
-        </w:r>
-        <w:r>
-          <w:rPr>
-            <w:rStyle w:val="Hyperlink"/>
-            <w:color w:val="auto"/>
-            <w:szCs w:val="20"/>
-            <w:u w:val="none"/>
-          </w:rPr>
-          <w:t>) [</w:t>
-        </w:r>
-        <w:r>
-          <w:rPr>
-            <w:rStyle w:val="Hyperlink"/>
-            <w:i/>
-            <w:iCs/>
-            <w:color w:val="auto"/>
-            <w:szCs w:val="20"/>
-          </w:rPr>
-          <w:t>link</w:t>
-        </w:r>
-        <w:r>
-          <w:rPr>
-            <w:rStyle w:val="Hyperlink"/>
-            <w:color w:val="auto"/>
-            <w:szCs w:val="20"/>
-            <w:u w:val="none"/>
-          </w:rPr>
-          <w:t>]</w:t>
-        </w:r>
-      </w:hyperlink>
-      <w:r>
-        <w:rPr>
-          <w:szCs w:val="20"/>
-        </w:rPr>
-        <w:t>:</w:t>
-      </w:r>
-      <w:r>
-        <w:rPr>
-          <w:szCs w:val="20"/>
+      </w:pPr>
+      <w:r>
+        <w:t>A</w:t>
+      </w:r>
+      <w:r>
+        <w:t>ttempt</w:t>
+      </w:r>
+      <w:r>
+        <w:t>ed</w:t>
+      </w:r>
+      <w:r>
+        <w:t xml:space="preserve"> to build an internet-controlled autonomous drone</w:t>
+      </w:r>
+      <w:r>
+        <w:t xml:space="preserve"> and </w:t>
+      </w:r>
+      <w:r>
+        <w:rPr>
+          <w:b/>
+          <w:bCs/>
+        </w:rPr>
+        <w:t>s</w:t>
+      </w:r>
+      <w:r>
+        <w:rPr>
+          <w:b/>
+          <w:bCs/>
+          <w:i/>
+          <w:iCs/>
+        </w:rPr>
+        <w:t>elf-</w:t>
+      </w:r>
+      <w:r>
+        <w:rPr>
+          <w:b/>
+          <w:bCs/>
+          <w:i/>
+          <w:iCs/>
+        </w:rPr>
+        <w:t>p</w:t>
+      </w:r>
+      <w:r>
+        <w:rPr>
+          <w:b/>
+          <w:bCs/>
+          <w:i/>
+          <w:iCs/>
+        </w:rPr>
+        <w:t>rogrammed</w:t>
+      </w:r>
+      <w:r>
+        <w:rPr>
+          <w:i/>
+          <w:iCs/>
         </w:rPr>
         <w:t xml:space="preserve"> </w:t>
       </w:r>
       <w:r>
-        <w:rPr>
-          <w:szCs w:val="20"/>
-        </w:rPr>
-        <w:t xml:space="preserve">a </w:t>
-      </w:r>
-      <w:r>
-        <w:rPr>
-          <w:szCs w:val="20"/>
-        </w:rPr>
-        <w:t xml:space="preserve">basic website </w:t>
-      </w:r>
-      <w:r>
-        <w:rPr>
-          <w:szCs w:val="20"/>
-        </w:rPr>
-        <w:t>that provides</w:t>
-      </w:r>
-      <w:r>
-        <w:rPr>
-          <w:szCs w:val="20"/>
-        </w:rPr>
-        <w:t xml:space="preserve"> an overview of projects</w:t>
-      </w:r>
-      <w:r>
-        <w:rPr>
-          <w:szCs w:val="20"/>
-        </w:rPr>
-        <w:t xml:space="preserve"> worked on</w:t>
-      </w:r>
-      <w:r>
-        <w:rPr>
-          <w:szCs w:val="20"/>
-        </w:rPr>
+        <w:t xml:space="preserve">the </w:t>
+      </w:r>
+      <w:r>
+        <w:rPr>
+          <w:i/>
+          <w:iCs/>
+        </w:rPr>
+        <w:t xml:space="preserve">receiver </w:t>
+      </w:r>
+      <w:r>
+        <w:rPr>
+          <w:i/>
+          <w:iCs/>
+        </w:rPr>
+        <w:t>and transmitter</w:t>
+      </w:r>
+      <w:r>
+        <w:rPr>
+          <w:i/>
+          <w:iCs/>
+        </w:rPr>
+        <w:t>.</w:t>
+      </w:r>
+    </w:p>
+    <w:p>
+      <w:pPr>
+        <w:pStyle w:val="ListParagraph"/>
+        <w:numPr>
+          <w:ilvl w:val="0"/>
+          <w:numId w:val="31"/>
+        </w:numPr>
+        <w:spacing w:line="240" w:lineRule="auto"/>
+        <w:ind w:right="0"/>
+        <w:jc w:val="both"/>
+      </w:pPr>
+      <w:r>
+        <w:t>U</w:t>
+      </w:r>
+      <w:r>
+        <w:t xml:space="preserve">sed open-source code on </w:t>
+      </w:r>
+      <w:r>
+        <w:rPr>
+          <w:i/>
+          <w:iCs/>
+        </w:rPr>
+        <w:t>Arduino UNO R3</w:t>
+      </w:r>
+      <w:r>
+        <w:t xml:space="preserve"> for the</w:t>
+      </w:r>
+      <w:r>
+        <w:t xml:space="preserve"> flight controller</w:t>
+      </w:r>
+      <w:r>
+        <w:t xml:space="preserve"> to help reduce the </w:t>
+      </w:r>
+      <w:r>
+        <w:t xml:space="preserve">built </w:t>
+      </w:r>
+      <w:r>
+        <w:t>cost</w:t>
+      </w:r>
+      <w:r>
+        <w:t xml:space="preserve">. </w:t>
+      </w:r>
+    </w:p>
+    <w:p>
+      <w:pPr>
+        <w:pStyle w:val="ListParagraph"/>
+        <w:numPr>
+          <w:ilvl w:val="0"/>
+          <w:numId w:val="31"/>
+        </w:numPr>
+        <w:spacing w:line="240" w:lineRule="auto"/>
+        <w:ind w:right="0"/>
+        <w:jc w:val="both"/>
+      </w:pPr>
+      <w:r>
+        <w:t>R</w:t>
+      </w:r>
+      <w:r>
+        <w:t>edu</w:t>
+      </w:r>
+      <w:r>
+        <w:t>ced</w:t>
+      </w:r>
+      <w:r>
+        <w:t xml:space="preserve"> the overall </w:t>
+      </w:r>
+      <w:r>
+        <w:t>buil</w:t>
+      </w:r>
+      <w:r>
+        <w:t>d</w:t>
+      </w:r>
+      <w:r>
+        <w:t xml:space="preserve"> </w:t>
+      </w:r>
+      <w:r>
+        <w:t xml:space="preserve">cost </w:t>
+      </w:r>
+      <w:r>
+        <w:t xml:space="preserve">by &gt; </w:t>
+      </w:r>
+      <w:r>
+        <w:rPr>
+          <w:b/>
+          <w:bCs/>
+        </w:rPr>
+        <w:t>70%</w:t>
+      </w:r>
+      <w:r>
+        <w:t xml:space="preserve"> </w:t>
+      </w:r>
+      <w:r>
+        <w:t>from</w:t>
+      </w:r>
+      <w:r>
+        <w:t xml:space="preserve"> </w:t>
+      </w:r>
+      <w:r>
+        <w:t xml:space="preserve">approx. </w:t>
+      </w:r>
+      <w:r>
+        <w:rPr>
+          <w:b/>
+          <w:bCs/>
+        </w:rPr>
+        <w:t>$</w:t>
+      </w:r>
+      <w:r>
+        <w:rPr>
+          <w:b/>
+          <w:bCs/>
+        </w:rPr>
+        <w:t>400</w:t>
+      </w:r>
+      <w:r>
+        <w:rPr>
+          <w:b/>
+          <w:bCs/>
+        </w:rPr>
+        <w:t xml:space="preserve"> </w:t>
+      </w:r>
+      <w:r>
+        <w:t>to</w:t>
+      </w:r>
+      <w:r>
+        <w:t xml:space="preserve"> </w:t>
+      </w:r>
+      <w:r>
+        <w:rPr>
+          <w:b/>
+          <w:bCs/>
+        </w:rPr>
+        <w:t xml:space="preserve">$80 </w:t>
+      </w:r>
+      <w:r>
+        <w:t>(</w:t>
+      </w:r>
+      <w:r>
+        <w:rPr>
+          <w:i/>
+          <w:iCs/>
+        </w:rPr>
+        <w:t>~</w:t>
+      </w:r>
+      <w:r>
+        <w:rPr>
+          <w:i/>
+          <w:iCs/>
+        </w:rPr>
+        <w:t>₹</w:t>
+      </w:r>
+      <w:r>
+        <w:rPr>
+          <w:b/>
+          <w:bCs/>
+          <w:i/>
+          <w:iCs/>
+        </w:rPr>
+        <w:t>35,000</w:t>
+      </w:r>
+      <w:r>
+        <w:rPr>
+          <w:i/>
+          <w:iCs/>
+        </w:rPr>
+        <w:t xml:space="preserve"> to </w:t>
+      </w:r>
+      <w:r>
+        <w:rPr>
+          <w:i/>
+          <w:iCs/>
+        </w:rPr>
+        <w:t>~</w:t>
+      </w:r>
+      <w:r>
+        <w:rPr>
+          <w:i/>
+          <w:iCs/>
+        </w:rPr>
+        <w:t>₹</w:t>
+      </w:r>
+      <w:r>
+        <w:rPr>
+          <w:b/>
+          <w:bCs/>
+          <w:i/>
+          <w:iCs/>
+        </w:rPr>
+        <w:t>7,000</w:t>
+      </w:r>
+      <w:r>
+        <w:t>)</w:t>
+      </w:r>
+      <w:r>
         <w:t>.</w:t>
       </w:r>
     </w:p>
@@ -4903,7 +4061,19 @@
         <w:t>with</w:t>
       </w:r>
       <w:r>
-        <w:t>: Firebase, MySQL, and MySQL Workbench.</w:t>
+        <w:t>: Firebase</w:t>
+      </w:r>
+      <w:r>
+        <w:t xml:space="preserve"> real</w:t>
+      </w:r>
+      <w:r>
+        <w:t>-</w:t>
+      </w:r>
+      <w:r>
+        <w:t>time database</w:t>
+      </w:r>
+      <w:r>
+        <w:t>, MySQL, and MySQL Workbench.</w:t>
       </w:r>
     </w:p>
     <w:p>
@@ -5068,7 +4238,23 @@
           <w:bCs/>
           <w:szCs w:val="20"/>
         </w:rPr>
-        <w:t xml:space="preserve">Top 10% </w:t>
+        <w:t xml:space="preserve">Top </w:t>
+      </w:r>
+      <w:r>
+        <w:rPr>
+          <w:b/>
+          <w:bCs/>
+          <w:szCs w:val="20"/>
+        </w:rPr>
+        <w:t>5</w:t>
+      </w:r>
+      <w:r>
+        <w:rPr>
+          <w:b/>
+          <w:bCs/>
+          <w:szCs w:val="20"/>
+        </w:rPr>
+        <w:t xml:space="preserve">% </w:t>
       </w:r>
       <w:r>
         <w:rPr>
@@ -5717,6 +4903,66 @@
         </w:rPr>
         <w:t>.</w:t>
       </w:r>
+    </w:p>
+    <w:p>
+      <w:pPr>
+        <w:spacing w:line="240" w:lineRule="auto"/>
+        <w:ind w:right="0"/>
+        <w:jc w:val="both"/>
+        <w:rPr>
+          <w:bCs/>
+        </w:rPr>
+      </w:pPr>
+    </w:p>
+    <w:p>
+      <w:pPr>
+        <w:spacing w:line="240" w:lineRule="auto"/>
+        <w:ind w:right="0"/>
+        <w:jc w:val="both"/>
+        <w:rPr>
+          <w:bCs/>
+        </w:rPr>
+      </w:pPr>
+    </w:p>
+    <w:p>
+      <w:pPr>
+        <w:spacing w:line="240" w:lineRule="auto"/>
+        <w:ind w:right="0"/>
+        <w:jc w:val="both"/>
+        <w:rPr>
+          <w:bCs/>
+        </w:rPr>
+      </w:pPr>
+    </w:p>
+    <w:p>
+      <w:pPr>
+        <w:spacing w:line="240" w:lineRule="auto"/>
+        <w:ind w:right="0"/>
+        <w:jc w:val="both"/>
+        <w:rPr>
+          <w:bCs/>
+        </w:rPr>
+      </w:pPr>
+    </w:p>
+    <w:p>
+      <w:pPr>
+        <w:spacing w:line="240" w:lineRule="auto"/>
+        <w:ind w:right="0"/>
+        <w:jc w:val="both"/>
+        <w:rPr>
+          <w:bCs/>
+        </w:rPr>
+      </w:pPr>
+    </w:p>
+    <w:p>
+      <w:pPr>
+        <w:spacing w:line="240" w:lineRule="auto"/>
+        <w:ind w:left="0" w:right="0" w:firstLine="0"/>
+        <w:jc w:val="both"/>
+        <w:rPr>
+          <w:bCs/>
+        </w:rPr>
+      </w:pPr>
     </w:p>
     <w:sectPr>
       <w:pgSz w:w="12240" w:h="15840" w:code="1"/>
@@ -5801,42 +5047,42 @@
         <v:path o:extrusionok="f" gradientshapeok="t" o:connecttype="rect"/>
         <o:lock v:ext="edit" aspectratio="t"/>
       </v:shapetype>
-      <v:shape id="_x0000_i1494" type="#_x0000_t75" style="width:513pt;height:513pt;rotation:180;flip:x y;visibility:visible;mso-wrap-style:square" o:bullet="t">
+      <v:shape id="_x0000_i1320" type="#_x0000_t75" style="width:513pt;height:513pt;rotation:180;flip:x y;visibility:visible;mso-wrap-style:square" o:bullet="t">
         <v:imagedata r:id="rId1" o:title="107161_circle_github_icon"/>
       </v:shape>
     </w:pict>
   </w:numPicBullet>
   <w:numPicBullet w:numPicBulletId="1">
     <w:pict>
-      <v:shape id="_x0000_i1495" type="#_x0000_t75" style="width:169pt;height:169pt;visibility:visible;mso-wrap-style:square" o:bullet="t">
+      <v:shape id="_x0000_i1321" type="#_x0000_t75" style="width:169pt;height:169pt;visibility:visible;mso-wrap-style:square" o:bullet="t">
         <v:imagedata r:id="rId2" o:title="941C13C7"/>
       </v:shape>
     </w:pict>
   </w:numPicBullet>
   <w:numPicBullet w:numPicBulletId="2">
     <w:pict>
-      <v:shape id="_x0000_i1496" type="#_x0000_t75" style="width:29pt;height:16.5pt;visibility:visible;mso-wrap-style:square" o:bullet="t">
+      <v:shape id="_x0000_i1322" type="#_x0000_t75" style="width:29pt;height:16.5pt;visibility:visible;mso-wrap-style:square" o:bullet="t">
         <v:imagedata r:id="rId3" o:title="107161_circle_github_icon"/>
       </v:shape>
     </w:pict>
   </w:numPicBullet>
   <w:numPicBullet w:numPicBulletId="3">
     <w:pict>
-      <v:shape id="_x0000_i1497" type="#_x0000_t75" style="width:240pt;height:234pt;visibility:visible;mso-wrap-style:square" o:bullet="t">
+      <v:shape id="_x0000_i1323" type="#_x0000_t75" style="width:240pt;height:234pt;visibility:visible;mso-wrap-style:square" o:bullet="t">
         <v:imagedata r:id="rId4" o:title="Indian_Institute_of_Technology_Bombay_Logo"/>
       </v:shape>
     </w:pict>
   </w:numPicBullet>
   <w:numPicBullet w:numPicBulletId="4">
     <w:pict>
-      <v:shape id="_x0000_i1498" type="#_x0000_t75" style="width:22.5pt;height:16.5pt;visibility:visible;mso-wrap-style:square" o:bullet="t">
+      <v:shape id="_x0000_i1324" type="#_x0000_t75" style="width:22.5pt;height:16.5pt;visibility:visible;mso-wrap-style:square" o:bullet="t">
         <v:imagedata r:id="rId5" o:title="Indian_Institute_of_Technology_Bombay_Logo"/>
       </v:shape>
     </w:pict>
   </w:numPicBullet>
   <w:numPicBullet w:numPicBulletId="5">
     <w:pict>
-      <v:shape id="_x0000_i1499" type="#_x0000_t75" style="width:76.5pt;height:76.5pt;visibility:visible;mso-wrap-style:square" o:bullet="t">
+      <v:shape id="_x0000_i1325" type="#_x0000_t75" style="width:76.5pt;height:76.5pt;visibility:visible;mso-wrap-style:square" o:bullet="t">
         <v:imagedata r:id="rId6" o:title=""/>
       </v:shape>
     </w:pict>
@@ -6549,17 +5795,16 @@
   <w:abstractNum w:abstractNumId="6" w15:restartNumberingAfterBreak="0">
     <w:nsid w:val="1A974193"/>
     <w:multiLevelType w:val="hybridMultilevel"/>
-    <w:tmpl w:val="0D7CC7FA"/>
-    <w:lvl w:ilvl="0" w:tplc="04090001">
-      <w:start w:val="1"/>
-      <w:numFmt w:val="bullet"/>
-      <w:lvlText w:val=""/>
+    <w:tmpl w:val="E80819EC"/>
+    <w:lvl w:ilvl="0" w:tplc="4232C782">
+      <w:numFmt w:val="bullet"/>
+      <w:lvlText w:val="–"/>
       <w:lvlJc w:val="left"/>
       <w:pPr>
         <w:ind w:left="720" w:hanging="360"/>
       </w:pPr>
       <w:rPr>
-        <w:rFonts w:ascii="Symbol" w:hAnsi="Symbol" w:hint="default"/>
+        <w:rFonts w:ascii="Arial" w:eastAsia="Arial" w:hAnsi="Arial" w:cs="Arial" w:hint="default"/>
       </w:rPr>
     </w:lvl>
     <w:lvl w:ilvl="1" w:tplc="04090003" w:tentative="1">
@@ -8699,7 +7944,7 @@
   <w:abstractNum w:abstractNumId="24" w15:restartNumberingAfterBreak="0">
     <w:nsid w:val="4C5517AE"/>
     <w:multiLevelType w:val="hybridMultilevel"/>
-    <w:tmpl w:val="5AC6DAC8"/>
+    <w:tmpl w:val="B7105F76"/>
     <w:lvl w:ilvl="0" w:tplc="4232C782">
       <w:numFmt w:val="bullet"/>
       <w:lvlText w:val="–"/>
@@ -10793,7 +10038,7 @@
   <w:style w:type="paragraph" w:default="1" w:styleId="Normal">
     <w:name w:val="Normal"/>
     <w:qFormat/>
-    <w:rsid w:val="00CA5586"/>
+    <w:rsid w:val="00132917"/>
     <w:pPr>
       <w:spacing w:after="2" w:line="292" w:lineRule="auto"/>
       <w:ind w:left="10" w:right="4549" w:hanging="10"/>
@@ -10871,6 +10116,7 @@
   <w:style w:type="character" w:default="1" w:styleId="DefaultParagraphFont">
     <w:name w:val="Default Paragraph Font"/>
     <w:uiPriority w:val="1"/>
+    <w:semiHidden/>
     <w:unhideWhenUsed/>
   </w:style>
   <w:style w:type="table" w:default="1" w:styleId="TableNormal">

</xml_diff>

<commit_message>
Comma from firebase removed
</commit_message>
<xml_diff>
--- a/Resume_latest - Copy.docx
+++ b/Resume_latest - Copy.docx
@@ -1591,7 +1591,7 @@
           <w:bCs/>
           <w:szCs w:val="20"/>
         </w:rPr>
-        <w:t xml:space="preserve">, </w:t>
+        <w:t xml:space="preserve"> </w:t>
       </w:r>
       <w:r>
         <w:rPr>
@@ -5159,42 +5159,42 @@
         <v:path o:extrusionok="f" gradientshapeok="t" o:connecttype="rect"/>
         <o:lock v:ext="edit" aspectratio="t"/>
       </v:shapetype>
-      <v:shape id="_x0000_i1548" type="#_x0000_t75" style="width:513pt;height:513pt;rotation:180;flip:x y;visibility:visible;mso-wrap-style:square" o:bullet="t">
+      <v:shape id="_x0000_i1224" type="#_x0000_t75" style="width:513pt;height:513pt;rotation:180;flip:x y;visibility:visible;mso-wrap-style:square" o:bullet="t">
         <v:imagedata r:id="rId1" o:title="107161_circle_github_icon"/>
       </v:shape>
     </w:pict>
   </w:numPicBullet>
   <w:numPicBullet w:numPicBulletId="1">
     <w:pict>
-      <v:shape id="_x0000_i1549" type="#_x0000_t75" style="width:169pt;height:169pt;visibility:visible;mso-wrap-style:square" o:bullet="t">
+      <v:shape id="_x0000_i1225" type="#_x0000_t75" style="width:169pt;height:169pt;visibility:visible;mso-wrap-style:square" o:bullet="t">
         <v:imagedata r:id="rId2" o:title="941C13C7"/>
       </v:shape>
     </w:pict>
   </w:numPicBullet>
   <w:numPicBullet w:numPicBulletId="2">
     <w:pict>
-      <v:shape id="_x0000_i1550" type="#_x0000_t75" style="width:29pt;height:16.5pt;visibility:visible;mso-wrap-style:square" o:bullet="t">
+      <v:shape id="_x0000_i1226" type="#_x0000_t75" style="width:29pt;height:16.5pt;visibility:visible;mso-wrap-style:square" o:bullet="t">
         <v:imagedata r:id="rId3" o:title="107161_circle_github_icon"/>
       </v:shape>
     </w:pict>
   </w:numPicBullet>
   <w:numPicBullet w:numPicBulletId="3">
     <w:pict>
-      <v:shape id="_x0000_i1551" type="#_x0000_t75" style="width:240pt;height:234pt;visibility:visible;mso-wrap-style:square" o:bullet="t">
+      <v:shape id="_x0000_i1227" type="#_x0000_t75" style="width:240pt;height:234pt;visibility:visible;mso-wrap-style:square" o:bullet="t">
         <v:imagedata r:id="rId4" o:title="Indian_Institute_of_Technology_Bombay_Logo"/>
       </v:shape>
     </w:pict>
   </w:numPicBullet>
   <w:numPicBullet w:numPicBulletId="4">
     <w:pict>
-      <v:shape id="_x0000_i1552" type="#_x0000_t75" style="width:22.5pt;height:16.5pt;visibility:visible;mso-wrap-style:square" o:bullet="t">
+      <v:shape id="_x0000_i1228" type="#_x0000_t75" style="width:22.5pt;height:16.5pt;visibility:visible;mso-wrap-style:square" o:bullet="t">
         <v:imagedata r:id="rId5" o:title="Indian_Institute_of_Technology_Bombay_Logo"/>
       </v:shape>
     </w:pict>
   </w:numPicBullet>
   <w:numPicBullet w:numPicBulletId="5">
     <w:pict>
-      <v:shape id="_x0000_i1553" type="#_x0000_t75" style="width:76.5pt;height:76.5pt;visibility:visible;mso-wrap-style:square" o:bullet="t">
+      <v:shape id="_x0000_i1229" type="#_x0000_t75" style="width:76.5pt;height:76.5pt;visibility:visible;mso-wrap-style:square" o:bullet="t">
         <v:imagedata r:id="rId6" o:title=""/>
       </v:shape>
     </w:pict>

</xml_diff>

<commit_message>
dash added in ..non-english-speaking..
</commit_message>
<xml_diff>
--- a/Resume_latest - Copy.docx
+++ b/Resume_latest - Copy.docx
@@ -2866,7 +2866,13 @@
         <w:t>E</w:t>
       </w:r>
       <w:r>
-        <w:t xml:space="preserve">nglish speaking population </w:t>
+        <w:t>nglish</w:t>
+      </w:r>
+      <w:r>
+        <w:t>-</w:t>
+      </w:r>
+      <w:r>
+        <w:t xml:space="preserve">speaking population </w:t>
       </w:r>
       <w:r>
         <w:t xml:space="preserve">to </w:t>
@@ -5159,42 +5165,42 @@
         <v:path o:extrusionok="f" gradientshapeok="t" o:connecttype="rect"/>
         <o:lock v:ext="edit" aspectratio="t"/>
       </v:shapetype>
-      <v:shape id="_x0000_i1224" type="#_x0000_t75" style="width:513pt;height:513pt;rotation:180;flip:x y;visibility:visible;mso-wrap-style:square" o:bullet="t">
+      <v:shape id="_x0000_i1320" type="#_x0000_t75" style="width:513pt;height:513pt;rotation:180;flip:x y;visibility:visible;mso-wrap-style:square" o:bullet="t">
         <v:imagedata r:id="rId1" o:title="107161_circle_github_icon"/>
       </v:shape>
     </w:pict>
   </w:numPicBullet>
   <w:numPicBullet w:numPicBulletId="1">
     <w:pict>
-      <v:shape id="_x0000_i1225" type="#_x0000_t75" style="width:169pt;height:169pt;visibility:visible;mso-wrap-style:square" o:bullet="t">
+      <v:shape id="_x0000_i1321" type="#_x0000_t75" style="width:169pt;height:169pt;visibility:visible;mso-wrap-style:square" o:bullet="t">
         <v:imagedata r:id="rId2" o:title="941C13C7"/>
       </v:shape>
     </w:pict>
   </w:numPicBullet>
   <w:numPicBullet w:numPicBulletId="2">
     <w:pict>
-      <v:shape id="_x0000_i1226" type="#_x0000_t75" style="width:29pt;height:16.5pt;visibility:visible;mso-wrap-style:square" o:bullet="t">
+      <v:shape id="_x0000_i1322" type="#_x0000_t75" style="width:29pt;height:16.5pt;visibility:visible;mso-wrap-style:square" o:bullet="t">
         <v:imagedata r:id="rId3" o:title="107161_circle_github_icon"/>
       </v:shape>
     </w:pict>
   </w:numPicBullet>
   <w:numPicBullet w:numPicBulletId="3">
     <w:pict>
-      <v:shape id="_x0000_i1227" type="#_x0000_t75" style="width:240pt;height:234pt;visibility:visible;mso-wrap-style:square" o:bullet="t">
+      <v:shape id="_x0000_i1323" type="#_x0000_t75" style="width:240pt;height:234pt;visibility:visible;mso-wrap-style:square" o:bullet="t">
         <v:imagedata r:id="rId4" o:title="Indian_Institute_of_Technology_Bombay_Logo"/>
       </v:shape>
     </w:pict>
   </w:numPicBullet>
   <w:numPicBullet w:numPicBulletId="4">
     <w:pict>
-      <v:shape id="_x0000_i1228" type="#_x0000_t75" style="width:22.5pt;height:16.5pt;visibility:visible;mso-wrap-style:square" o:bullet="t">
+      <v:shape id="_x0000_i1324" type="#_x0000_t75" style="width:22.5pt;height:16.5pt;visibility:visible;mso-wrap-style:square" o:bullet="t">
         <v:imagedata r:id="rId5" o:title="Indian_Institute_of_Technology_Bombay_Logo"/>
       </v:shape>
     </w:pict>
   </w:numPicBullet>
   <w:numPicBullet w:numPicBulletId="5">
     <w:pict>
-      <v:shape id="_x0000_i1229" type="#_x0000_t75" style="width:76.5pt;height:76.5pt;visibility:visible;mso-wrap-style:square" o:bullet="t">
+      <v:shape id="_x0000_i1325" type="#_x0000_t75" style="width:76.5pt;height:76.5pt;visibility:visible;mso-wrap-style:square" o:bullet="t">
         <v:imagedata r:id="rId6" o:title=""/>
       </v:shape>
     </w:pict>

</xml_diff>